<commit_message>
Sync build 28.0.44324.0 (#15)
* New artifact

* Update Layer

* Update SysApp, BusApp etc

* Update apps

* Update appjsons

* uptake issue

* Update package versions in Packages.json

* Remove internal

* Delete Dynamics SL Migration Tests

* Deleted Sustainability Copilot Tests

* Avoid publishing library no transactions

* Temporarily remove 1st party apps

* Update filtering

* string

* Write-Host

* Update settings.json
</commit_message>
<xml_diff>
--- a/src/Apps/W1/Quality Management/app/src/Reports/QltyCertificateOfAnalysis.docx
+++ b/src/Apps/W1/Quality Management/app/src/Reports/QltyCertificateOfAnalysis.docx
@@ -922,13 +922,13 @@
               <w:sz w:val="16"/>
               <w:szCs w:val="16"/>
             </w:rPr>
-            <w:alias w:val="#Nav: /CurrentTest/CurrentTestLine/PromptedGradeCaption_1"/>
+            <w:alias w:val="#Nav: /CurrentInspection/CurrentInspectionLine/PromptedGradeCaption_1"/>
             <w:tag w:val="#Nav: Qlty_Certificate_of_Analysis/20401"/>
             <w:id w:val="79952599"/>
             <w:placeholder>
               <w:docPart w:val="DefaultPlaceholder_-1854013440"/>
             </w:placeholder>
-            <w:dataBinding w:prefixMappings="xmlns:ns0='urn:microsoft-dynamics-nav/reports/Qlty_Certificate_of_Analysis/20401/' " w:xpath="/ns0:NavWordReportXmlPart[1]/ns0:CurrentTest[1]/ns0:CurrentTestLine[1]/ns0:PromptedGradeCaption_1[1]" w:storeItemID="{F00BF611-06BA-436C-902A-C0D5E8DF929B}"/>
+            <w:dataBinding w:prefixMappings="xmlns:ns0='urn:microsoft-dynamics-nav/reports/Qlty_Certificate_of_Analysis/20401/' " w:xpath="/ns0:NavWordReportXmlPart[1]/ns0:CurrentInspection[1]/ns0:CurrentInspectionLine[1]/ns0:PromptedGradeCaption_1[1]" w:storeItemID="{F00BF611-06BA-436C-902A-C0D5E8DF929B}"/>
             <w:text/>
           </w:sdtPr>
           <w:sdtContent>
@@ -987,13 +987,13 @@
                   <w:sz w:val="16"/>
                   <w:szCs w:val="16"/>
                 </w:rPr>
-                <w:alias w:val="#Nav: /CurrentTest/CurrentTestLine/PromptedGradeCaption_2"/>
+                <w:alias w:val="#Nav: /CurrentInspection/CurrentInspectionLine/PromptedGradeCaption_2"/>
                 <w:tag w:val="#Nav: Qlty_Certificate_of_Analysis/20401"/>
                 <w:id w:val="991833888"/>
                 <w:placeholder>
                   <w:docPart w:val="DefaultPlaceholder_-1854013440"/>
                 </w:placeholder>
-                <w:dataBinding w:prefixMappings="xmlns:ns0='urn:microsoft-dynamics-nav/reports/Qlty_Certificate_of_Analysis/20401/' " w:xpath="/ns0:NavWordReportXmlPart[1]/ns0:CurrentTest[1]/ns0:CurrentTestLine[1]/ns0:PromptedGradeCaption_2[1]" w:storeItemID="{F00BF611-06BA-436C-902A-C0D5E8DF929B}"/>
+                <w:dataBinding w:prefixMappings="xmlns:ns0='urn:microsoft-dynamics-nav/reports/Qlty_Certificate_of_Analysis/20401/' " w:xpath="/ns0:NavWordReportXmlPart[1]/ns0:CurrentInspection[1]/ns0:CurrentInspectionLine[1]/ns0:PromptedGradeCaption_2[1]" w:storeItemID="{F00BF611-06BA-436C-902A-C0D5E8DF929B}"/>
                 <w:text/>
               </w:sdtPr>
               <w:sdtContent>
@@ -1040,7 +1040,7 @@
           <w:alias w:val="#Nav: /CurrentTest/CurrentTestLine"/>
           <w:tag w:val="#Nav: Qlty_Certificate_of_Analysis/20401"/>
           <w:id w:val="1839039731"/>
-          <w15:dataBinding w:prefixMappings="xmlns:ns0='urn:microsoft-dynamics-businesscentral/internal/extended/reports/Qlty_Certificate_of_Analysis/20401/'" w:xpath="/ns0:NavWordReportXmlPart[1]/ns0:CurrentTest[1]/ns0:CurrentTestLine" w:storeItemID="{F00BF611-06BA-436C-902A-C0D5E8DF929B}"/>
+          <w15:dataBinding w:prefixMappings="xmlns:ns0='urn:microsoft-dynamics-nav/reports/Qlty_Certificate_of_Analysis/20401/'" w:xpath="/ns0:NavWordReportXmlPart[1]/ns0:CurrentTest[1]/ns0:CurrentTestLine" w:storeItemID="{F00BF611-06BA-436C-902A-C0D5E8DF929B}"/>
           <w15:repeatingSection/>
         </w:sdtPr>
         <w:sdtContent>
@@ -1096,13 +1096,13 @@
                             <w:sz w:val="16"/>
                             <w:szCs w:val="16"/>
                           </w:rPr>
-                          <w:alias w:val="#Nav: /CurrentTest/CurrentTestLine/LabelField_Description"/>
+                          <w:alias w:val="#Nav: /CurrentInspection/CurrentInspectionLine/LabelField_Description"/>
                           <w:tag w:val="#Nav: Qlty_Certificate_of_Analysis/20401"/>
                           <w:id w:val="-1671324806"/>
                           <w:placeholder>
                             <w:docPart w:val="DefaultPlaceholder_-1854013440"/>
                           </w:placeholder>
-                          <w:dataBinding w:prefixMappings="xmlns:ns0='urn:microsoft-dynamics-nav/reports/Qlty_Certificate_of_Analysis/20401/' " w:xpath="/ns0:NavWordReportXmlPart[1]/ns0:CurrentTest[1]/ns0:CurrentTestLine[1]/ns0:LabelField_Description[1]" w:storeItemID="{F00BF611-06BA-436C-902A-C0D5E8DF929B}"/>
+                          <w:dataBinding w:prefixMappings="xmlns:ns0='urn:microsoft-dynamics-nav/reports/Qlty_Certificate_of_Analysis/20401/' " w:xpath="/ns0:NavWordReportXmlPart[1]/ns0:CurrentInspection[1]/ns0:CurrentInspectionLine[1]/ns0:LabelField_Description[1]" w:storeItemID="{F00BF611-06BA-436C-902A-C0D5E8DF929B}"/>
                           <w:text/>
                         </w:sdtPr>
                         <w:sdtContent>
@@ -1196,13 +1196,13 @@
                             <w:sz w:val="16"/>
                             <w:szCs w:val="16"/>
                           </w:rPr>
-                          <w:alias w:val="#Nav: /CurrentTest/CurrentTestLine/Field_Description"/>
+                          <w:alias w:val="#Nav: /CurrentInspection/CurrentInspectionLine/Field_Description"/>
                           <w:tag w:val="#Nav: Qlty_Certificate_of_Analysis/20401"/>
                           <w:id w:val="-886718243"/>
                           <w:placeholder>
                             <w:docPart w:val="DefaultPlaceholder_-1854013440"/>
                           </w:placeholder>
-                          <w:dataBinding w:prefixMappings="xmlns:ns0='urn:microsoft-dynamics-nav/reports/Qlty_Certificate_of_Analysis/20401/' " w:xpath="/ns0:NavWordReportXmlPart[1]/ns0:CurrentTest[1]/ns0:CurrentTestLine[1]/ns0:Field_Description[1]" w:storeItemID="{F00BF611-06BA-436C-902A-C0D5E8DF929B}"/>
+                          <w:dataBinding w:prefixMappings="xmlns:ns0='urn:microsoft-dynamics-nav/reports/Qlty_Certificate_of_Analysis/20401/' " w:xpath="/ns0:NavWordReportXmlPart[1]/ns0:CurrentInspection[1]/ns0:CurrentInspectionLine[1]/ns0:Field_Description[1]" w:storeItemID="{F00BF611-06BA-436C-902A-C0D5E8DF929B}"/>
                           <w:text/>
                         </w:sdtPr>
                         <w:sdtContent>
@@ -1245,13 +1245,13 @@
                             <w:sz w:val="16"/>
                             <w:szCs w:val="16"/>
                           </w:rPr>
-                          <w:alias w:val="#Nav: /CurrentTest/CurrentTestLine/Test_Value"/>
+                          <w:alias w:val="#Nav: /CurrentInspection/CurrentInspectionLine/Test_Value"/>
                           <w:tag w:val="#Nav: Qlty_Certificate_of_Analysis/20401"/>
                           <w:id w:val="-14851881"/>
                           <w:placeholder>
                             <w:docPart w:val="DefaultPlaceholder_-1854013440"/>
                           </w:placeholder>
-                          <w:dataBinding w:prefixMappings="xmlns:ns0='urn:microsoft-dynamics-nav/reports/Qlty_Certificate_of_Analysis/20401/' " w:xpath="/ns0:NavWordReportXmlPart[1]/ns0:CurrentTest[1]/ns0:CurrentTestLine[1]/ns0:Test_Value[1]" w:storeItemID="{F00BF611-06BA-436C-902A-C0D5E8DF929B}"/>
+                          <w:dataBinding w:prefixMappings="xmlns:ns0='urn:microsoft-dynamics-nav/reports/Qlty_Certificate_of_Analysis/20401/' " w:xpath="/ns0:NavWordReportXmlPart[1]/ns0:CurrentInspection[1]/ns0:CurrentInspectionLine[1]/ns0:Test_Value[1]" w:storeItemID="{F00BF611-06BA-436C-902A-C0D5E8DF929B}"/>
                           <w:text/>
                         </w:sdtPr>
                         <w:sdtContent>
@@ -1294,13 +1294,13 @@
                             <w:sz w:val="16"/>
                             <w:szCs w:val="16"/>
                           </w:rPr>
-                          <w:alias w:val="#Nav: /CurrentTest/CurrentTestLine/Test_GradeDescription"/>
+                          <w:alias w:val="#Nav: /CurrentInspection/CurrentInspectionLine/Test_GradeDescription"/>
                           <w:tag w:val="#Nav: Qlty_Certificate_of_Analysis/20401"/>
                           <w:id w:val="82736827"/>
                           <w:placeholder>
                             <w:docPart w:val="DefaultPlaceholder_-1854013440"/>
                           </w:placeholder>
-                          <w:dataBinding w:prefixMappings="xmlns:ns0='urn:microsoft-dynamics-nav/reports/Qlty_Certificate_of_Analysis/20401/' " w:xpath="/ns0:NavWordReportXmlPart[1]/ns0:CurrentTest[1]/ns0:CurrentTestLine[1]/ns0:Test_GradeDescription[1]" w:storeItemID="{F00BF611-06BA-436C-902A-C0D5E8DF929B}"/>
+                          <w:dataBinding w:prefixMappings="xmlns:ns0='urn:microsoft-dynamics-nav/reports/Qlty_Certificate_of_Analysis/20401/' " w:xpath="/ns0:NavWordReportXmlPart[1]/ns0:CurrentInspection[1]/ns0:CurrentInspectionLine[1]/ns0:Test_GradeDescription[1]" w:storeItemID="{F00BF611-06BA-436C-902A-C0D5E8DF929B}"/>
                           <w:text/>
                         </w:sdtPr>
                         <w:sdtContent>
@@ -1343,13 +1343,13 @@
                             <w:sz w:val="16"/>
                             <w:szCs w:val="16"/>
                           </w:rPr>
-                          <w:alias w:val="#Nav: /CurrentTest/CurrentTestLine/PromptedGradeConditionDescription_1"/>
+                          <w:alias w:val="#Nav: /CurrentInspection/CurrentInspectionLine/PromptedGradeConditionDescription_1"/>
                           <w:tag w:val="#Nav: Qlty_Certificate_of_Analysis/20401"/>
                           <w:id w:val="-379475906"/>
                           <w:placeholder>
                             <w:docPart w:val="DefaultPlaceholder_-1854013440"/>
                           </w:placeholder>
-                          <w:dataBinding w:prefixMappings="xmlns:ns0='urn:microsoft-dynamics-nav/reports/Qlty_Certificate_of_Analysis/20401/' " w:xpath="/ns0:NavWordReportXmlPart[1]/ns0:CurrentTest[1]/ns0:CurrentTestLine[1]/ns0:PromptedGradeConditionDescription_1[1]" w:storeItemID="{F00BF611-06BA-436C-902A-C0D5E8DF929B}"/>
+                          <w:dataBinding w:prefixMappings="xmlns:ns0='urn:microsoft-dynamics-nav/reports/Qlty_Certificate_of_Analysis/20401/' " w:xpath="/ns0:NavWordReportXmlPart[1]/ns0:CurrentInspection[1]/ns0:CurrentInspectionLine[1]/ns0:PromptedGradeConditionDescription_1[1]" w:storeItemID="{F00BF611-06BA-436C-902A-C0D5E8DF929B}"/>
                           <w:text/>
                         </w:sdtPr>
                         <w:sdtContent>
@@ -1390,13 +1390,13 @@
                             <w:sz w:val="16"/>
                             <w:szCs w:val="16"/>
                           </w:rPr>
-                          <w:alias w:val="#Nav: /CurrentTest/CurrentTestLine/PromptedGradeConditionDescription_2"/>
+                          <w:alias w:val="#Nav: /CurrentInspection/CurrentInspectionLine/PromptedGradeConditionDescription_2"/>
                           <w:tag w:val="#Nav: Qlty_Certificate_of_Analysis/20401"/>
                           <w:id w:val="-85468036"/>
                           <w:placeholder>
                             <w:docPart w:val="DefaultPlaceholder_-1854013440"/>
                           </w:placeholder>
-                          <w:dataBinding w:prefixMappings="xmlns:ns0='urn:microsoft-dynamics-nav/reports/Qlty_Certificate_of_Analysis/20401/' " w:xpath="/ns0:NavWordReportXmlPart[1]/ns0:CurrentTest[1]/ns0:CurrentTestLine[1]/ns0:PromptedGradeConditionDescription_2[1]" w:storeItemID="{F00BF611-06BA-436C-902A-C0D5E8DF929B}"/>
+                          <w:dataBinding w:prefixMappings="xmlns:ns0='urn:microsoft-dynamics-nav/reports/Qlty_Certificate_of_Analysis/20401/' " w:xpath="/ns0:NavWordReportXmlPart[1]/ns0:CurrentInspection[1]/ns0:CurrentInspectionLine[1]/ns0:PromptedGradeConditionDescription_2[1]" w:storeItemID="{F00BF611-06BA-436C-902A-C0D5E8DF929B}"/>
                           <w:text/>
                         </w:sdtPr>
                         <w:sdtContent>
@@ -2800,13 +2800,13 @@
                   <w:sz w:val="16"/>
                   <w:szCs w:val="16"/>
                 </w:rPr>
-                <w:alias w:val="#Nav: /CurrentTest/CompanyInformation_All"/>
+                <w:alias w:val="#Nav: /CurrentInspection/CompanyInformation_All"/>
                 <w:tag w:val="#Nav: Qlty_Certificate_of_Analysis/20401"/>
                 <w:id w:val="-649127276"/>
                 <w:placeholder>
                   <w:docPart w:val="DefaultPlaceholder_-1854013440"/>
                 </w:placeholder>
-                <w:dataBinding w:prefixMappings="xmlns:ns0='urn:microsoft-dynamics-nav/reports/Qlty_Certificate_of_Analysis/20401/' " w:xpath="/ns0:NavWordReportXmlPart[1]/ns0:CurrentTest[1]/ns0:CompanyInformation_All[1]" w:storeItemID="{F00BF611-06BA-436C-902A-C0D5E8DF929B}"/>
+                <w:dataBinding w:prefixMappings="xmlns:ns0='urn:microsoft-dynamics-nav/reports/Qlty_Certificate_of_Analysis/20401/' " w:xpath="/ns0:NavWordReportXmlPart[1]/ns0:CurrentInspection[1]/ns0:CompanyInformation_All[1]" w:storeItemID="{F00BF611-06BA-436C-902A-C0D5E8DF929B}"/>
                 <w:text/>
               </w:sdtPr>
               <w:sdtContent>
@@ -2850,13 +2850,13 @@
                   <w:sz w:val="16"/>
                   <w:szCs w:val="16"/>
                 </w:rPr>
-                <w:alias w:val="#Nav: /CurrentTest/COAContact_All"/>
+                <w:alias w:val="#Nav: /CurrentInspection/COAContact_All"/>
                 <w:tag w:val="#Nav: Qlty_Certificate_of_Analysis/20401"/>
                 <w:id w:val="-640889971"/>
                 <w:placeholder>
                   <w:docPart w:val="DefaultPlaceholder_-1854013440"/>
                 </w:placeholder>
-                <w:dataBinding w:prefixMappings="xmlns:ns0='urn:microsoft-dynamics-nav/reports/Qlty_Certificate_of_Analysis/20401/' " w:xpath="/ns0:NavWordReportXmlPart[1]/ns0:CurrentTest[1]/ns0:COAContact_All[1]" w:storeItemID="{F00BF611-06BA-436C-902A-C0D5E8DF929B}"/>
+                <w:dataBinding w:prefixMappings="xmlns:ns0='urn:microsoft-dynamics-nav/reports/Qlty_Certificate_of_Analysis/20401/' " w:xpath="/ns0:NavWordReportXmlPart[1]/ns0:CurrentInspection[1]/ns0:COAContact_All[1]" w:storeItemID="{F00BF611-06BA-436C-902A-C0D5E8DF929B}"/>
                 <w:text/>
               </w:sdtPr>
               <w:sdtContent>
@@ -4472,151 +4472,151 @@
  
      < T o o l t i p s >   
-         < T o o l t i p   c o l u m n = " Q I T e m p l a t e _ D e s c r i p t i o n "   E l e m e n t I d = " 8 1 5 0 5 6 4 0 4 " > +         < T o o l t i p   c o l u m n = " Q l t y I n s p e c t i o n T e m p l a t e _ D e s c r i p t i o n "   E l e m e n t I d = " 1 6 5 2 0 6 9 5 9 8 " >   
              < T o o l t i p T e x t   l a n g = " e n - U S " > S p e c i f i e s   a n   e x p l a n a t i o n   o f   t h e   Q u a l i t y   I n s p e c t i o n   T e m p l a t e .   Y o u   c a n   e n t e r   a   m a x i m u m   o f   1 0 0   c h a r a c t e r s ,   b o t h   n u m b e r s   a n d   l e t t e r s . < / T o o l t i p T e x t >   
          < / T o o l t i p >   
-         < T o o l t i p   c o l u m n = " Q I T e s t _ D e s c r i p t i o n "   E l e m e n t I d = " 1 1 3 6 4 6 5 5 3 8 " > - 
-             < T o o l t i p T e x t   l a n g = " e n - U S " > S p e c i f i e s   a   d e s c r i p t i o n   o f   t h e   t e s t   i t s e l f . < / T o o l t i p T e x t > +         < T o o l t i p   c o l u m n = " Q l t y I n s p e c t i o n _ D e s c r i p t i o n "   E l e m e n t I d = " 7 3 9 0 1 9 9 1 0 " > + 
+             < T o o l t i p T e x t   l a n g = " e n - U S " > S p e c i f i e s   a   d e s c r i p t i o n   o f   t h e   Q u a l i t y   I n s p e c t i o n   i t s e l f . < / T o o l t i p T e x t >   
          < / T o o l t i p >   
-         < T o o l t i p   c o l u m n = " Q I T e s t _ S t a t u s "   E l e m e n t I d = " 2 1 0 2 3 4 6 9 5 2 " > - 
-             < T o o l t i p T e x t   l a n g = " e n - U S " > S p e c i f i e s   t h e   s t a t u s   o f   t h e   t e s t .   N o   a d d i t i o n a l   c h a n g e s   c a n   b e   m a d e   t o   a   f i n i s h e d   Q u a l i t y   I n s p e c t i o n   T e s t . < / T o o l t i p T e x t > +         < T o o l t i p   c o l u m n = " Q l t y I n s p e c t i o n _ S t a t u s "   E l e m e n t I d = " 8 5 1 7 5 2 7 6 8 " > + 
+             < T o o l t i p T e x t   l a n g = " e n - U S " > S p e c i f i e s   t h e   s t a t u s   o f   t h e   i n s p e c t i o n .   N o   a d d i t i o n a l   c h a n g e s   c a n   b e   m a d e   t o   a   f i n i s h e d   Q u a l i t y   I n s p e c t i o n . < / T o o l t i p T e x t >   
          < / T o o l t i p >   
-         < T o o l t i p   c o l u m n = " Q I T e s t _ G r a d e _ C o d e "   E l e m e n t I d = " 5 9 5 4 2 7 8 3 5 " > - 
-             < T o o l t i p T e x t   l a n g = " e n - U S " > S p e c i f i e s   t h e   g r a d e   i s   a u t o m a t i c a l l y   d e t e r m i n e d   b a s e d   o n   t h e   t e s t   v a l u e   a n d   g r a d e   c o n f i g u r a t i o n . < / T o o l t i p T e x t > +         < T o o l t i p   c o l u m n = " Q l t y I n s p e c t i o n _ R e s u l t _ C o d e "   E l e m e n t I d = " 1 8 0 7 0 7 7 0 6 5 " > + 
+             < T o o l t i p T e x t   l a n g = " e n - U S " > S p e c i f i e s   t h e   r e s u l t   i s   a u t o m a t i c a l l y   d e t e r m i n e d   b a s e d   o n   t h e   t e s t   v a l u e   a n d   r e s u l t   c o n f i g u r a t i o n . < / T o o l t i p T e x t >   
          < / T o o l t i p >   
-         < T o o l t i p   c o l u m n = " Q I T e s t _ G r a d e _ D e s c r i p t i o n "   E l e m e n t I d = " 6 4 0 1 4 2 6 8 8 " > - 
-             < T o o l t i p T e x t   l a n g = " e n - U S " > S p e c i f i e s   t h e   g r a d e   d e s c r i p t i o n   f o r   t h i s   t e s t   r e s u l t .   T h e   g r a d e   i s   a u t o m a t i c a l l y   d e t e r m i n e d   b a s e d   o n   t h e   t e s t   v a l u e   a n d   g r a d e   c o n f i g u r a t i o n . < / T o o l t i p T e x t > +         < T o o l t i p   c o l u m n = " Q l t y I n s p e c t i o n _ R e s u l t _ D e s c r i p t i o n "   E l e m e n t I d = " 8 1 0 5 3 8 1 8 8 " > + 
+             < T o o l t i p T e x t   l a n g = " e n - U S " > S p e c i f i e s   t h e   r e s u l t   d e s c r i p t i o n   f o r   t h i s   t e s t   r e s u l t .   T h e   r e s u l t   i s   a u t o m a t i c a l l y   d e t e r m i n e d   b a s e d   o n   t h e   t e s t   v a l u e   a n d   r e s u l t   c o n f i g u r a t i o n . < / T o o l t i p T e x t >   
          < / T o o l t i p >   
-         < T o o l t i p   c o l u m n = " Q I T e s t _ N o "   E l e m e n t I d = " 1 0 7 6 3 1 2 2 3 7 " > +         < T o o l t i p   c o l u m n = " Q l t y I n s p e c t i o n _ N o "   E l e m e n t I d = " 2 1 2 0 6 1 5 7 4 9 " >   
              < T o o l t i p T e x t   l a n g = " e n - U S " > S p e c i f i e s   t h e   q u a l i t y   i n s p e c t i o n   d o c u m e n t   n u m b e r . < / T o o l t i p T e x t >   
          < / T o o l t i p >   
-         < T o o l t i p   c o l u m n = " Q I T e s t _ R e t e s t N o "   E l e m e n t I d = " 1 3 6 2 8 8 4 4 4 4 " > - 
-             < T o o l t i p T e x t   l a n g = " e n - U S " > S p e c i f i e s   w h i c h   r e t e s t   t h i s   i s   f o r . < / T o o l t i p T e x t > +         < T o o l t i p   c o l u m n = " Q l t y I n s p e c t i o n _ R e i n s p e c t i o n N o "   E l e m e n t I d = " 7 5 1 7 3 5 6 " > + 
+             < T o o l t i p T e x t   l a n g = " e n - U S " > S p e c i f i e s   w h i c h   r e - i n s p e c t i o n   t h i s   i s   f o r . < / T o o l t i p T e x t >   
          < / T o o l t i p >   
-         < T o o l t i p   c o l u m n = " Q I T e s t _ F i n i s h e d _ B y _ U s e r _ I D "   E l e m e n t I d = " 1 0 8 5 9 8 0 0 0 6 " > - 
-             < T o o l t i p T e x t   l a n g = " e n - U S " > S p e c i f i e s   t h e   u s e r   t h a t   f i n i s h e d   t h e   t e s t < / T o o l t i p T e x t > +         < T o o l t i p   c o l u m n = " Q l t y I n s p e c t i o n _ F i n i s h e d _ B y _ U s e r _ I D "   E l e m e n t I d = " 1 7 5 0 5 1 6 3 3 8 " > + 
+             < T o o l t i p T e x t   l a n g = " e n - U S " > S p e c i f i e s   t h e   u s e r   t h a t   f i n i s h e d   t h e   i n s p e c t i o n < / T o o l t i p T e x t >   
          < / T o o l t i p >   
-         < T o o l t i p   c o l u m n = " Q I T e s t _ F i n i s h e d _ D a t e "   E l e m e n t I d = " 1 6 2 5 6 7 4 7 2 5 " > - 
-             < T o o l t i p T e x t   l a n g = " e n - U S " > S p e c i f i e s   t h e   d a t e   t h a t   t h e   t e s t   w a s   f i n i s h e d . < / T o o l t i p T e x t > +         < T o o l t i p   c o l u m n = " Q l t y I n s p e c t i o n _ F i n i s h e d _ D a t e "   E l e m e n t I d = " 1 8 3 4 1 2 2 7 6 5 " > + 
+             < T o o l t i p T e x t   l a n g = " e n - U S " > S p e c i f i e s   t h e   d a t e   t h a t   t h e   i n s p e c t i o n   w a s   f i n i s h e d . < / T o o l t i p T e x t >   
          < / T o o l t i p >   
-         < T o o l t i p   c o l u m n = " Q I T e s t _ S o u r c e _ I t e m _ N o _ "   E l e m e n t I d = " 1 9 0 7 0 9 9 1 8 2 " > - 
-             < T o o l t i p T e x t   l a n g = " e n - U S " > S p e c i f i e s   t h e   i t e m   t h a t   t h e   Q u a l i t y   I n s p e c t i o n   T e s t   i s   f o r .   W h e n   u s e d   w i t h   p r o d u c t i o n   o r d e r s   t h i s   t y p i c a l l y   r e f e r s   t o   t h e   i t e m   b e i n g   p r o d u c e d . < / T o o l t i p T e x t > +         < T o o l t i p   c o l u m n = " Q l t y I n s p e c t i o n _ S o u r c e _ I t e m _ N o _ "   E l e m e n t I d = " 1 2 6 8 0 5 0 5 1 8 " > + 
+             < T o o l t i p T e x t   l a n g = " e n - U S " > S p e c i f i e s   t h e   i t e m   t h a t   t h e   Q u a l i t y   I n s p e c t i o n   i s   f o r .   W h e n   u s e d   w i t h   p r o d u c t i o n   o r d e r s   t h i s   t y p i c a l l y   r e f e r s   t o   t h e   i t e m   b e i n g   p r o d u c e d . < / T o o l t i p T e x t >   
          < / T o o l t i p >   
-         < T o o l t i p   c o l u m n = " Q I T e s t _ S o u r c e _ V a r i a n t _ C o d e "   E l e m e n t I d = " 9 9 8 9 8 3 9 4 1 " > - 
-             < T o o l t i p T e x t   l a n g = " e n - U S " > S p e c i f i e s   t h e   i t e m   v a r i a n t   t h a t   t h e   Q u a l i t y   I n s p e c t i o n   T e s t   i s   f o r .   W h e n   u s e d   w i t h   p r o d u c t i o n   o r d e r s   t h i s   t y p i c a l l y   r e f e r s   t o   t h e   i t e m   b e i n g   p r o d u c e d . < / T o o l t i p T e x t > +         < T o o l t i p   c o l u m n = " Q l t y I n s p e c t i o n _ S o u r c e _ V a r i a n t _ C o d e "   E l e m e n t I d = " 1 6 0 8 4 0 3 8 2 1 " > + 
+             < T o o l t i p T e x t   l a n g = " e n - U S " > S p e c i f i e s   t h e   i t e m   v a r i a n t   t h a t   t h e   Q u a l i t y   I n s p e c t i o n   i s   f o r .   W h e n   u s e d   w i t h   p r o d u c t i o n   o r d e r s   t h i s   t y p i c a l l y   r e f e r s   t o   t h e   i t e m   b e i n g   p r o d u c e d . < / T o o l t i p T e x t >   
          < / T o o l t i p >   
-         < T o o l t i p   c o l u m n = " Q I T e s t _ S o u r c e _ L o t _ N o _ "   E l e m e n t I d = " 1 9 8 2 8 4 7 1 7 6 " > +         < T o o l t i p   c o l u m n = " Q l t y I n s p e c t i o n _ S o u r c e _ L o t _ N o _ "   E l e m e n t I d = " 1 1 2 3 5 5 1 3 1 2 " >   
              < T o o l t i p T e x t   l a n g = " e n - U S " > S p e c i f i e s   t h e   l o t   n u m b e r   t h a t   t h e   q u a l i t y   i n s p e c t i o n   i s   f o r .   T h i s   i s   o n l y   u s e d   f o r   l o t   t r a c k e d   i t e m s . < / T o o l t i p T e x t >   
          < / T o o l t i p >   
-         < T o o l t i p   c o l u m n = " Q I T e s t _ S o u r c e _ S e r i a l _ N o _ "   E l e m e n t I d = " 1 1 8 2 4 4 1 4 3 9 " > +         < T o o l t i p   c o l u m n = " Q l t y I n s p e c t i o n _ S o u r c e _ S e r i a l _ N o _ "   E l e m e n t I d = " 1 5 2 0 5 9 1 4 4 7 " >   
              < T o o l t i p T e x t   l a n g = " e n - U S " > S p e c i f i e s   t h e   s e r i a l   n u m b e r   t h a t   t h e   q u a l i t y   i n s p e c t i o n   i s   f o r .   T h i s   i s   o n l y   u s e d   f o r   s e r i a l   t r a c k e d   i t e m s . < / T o o l t i p T e x t >   
          < / T o o l t i p >   
-         < T o o l t i p   c o l u m n = " Q I T e s t _ S o u r c e _ D o c u m e n t _ N o _ "   E l e m e n t I d = " 3 5 2 1 6 1 1 6 0 " > - 
-             < T o o l t i p T e x t   l a n g = " e n - U S " > S p e c i f i e s   a   r e f e r e n c e   t o   t h e   d o c u m e n t   t h a t   t h i s   Q u a l i t y   I n s p e c t i o n   T e s t   i s   r e f e r r i n g   t o .   T h i s   t y p i c a l l y   r e f e r s   t o   a   p r o d u c t i o n   o r d e r   d o c u m e n t   n u m b e r . < / T o o l t i p T e x t > +         < T o o l t i p   c o l u m n = " Q l t y I n s p e c t i o n _ S o u r c e _ D o c u m e n t _ N o _ "   E l e m e n t I d = " 1 6 7 5 9 1 6 2 8 8 " > + 
+             < T o o l t i p T e x t   l a n g = " e n - U S " > S p e c i f i e s   a   r e f e r e n c e   t o   t h e   d o c u m e n t   t h a t   t h i s   Q u a l i t y   I n s p e c t i o n   i s   r e f e r r i n g   t o .   T h i s   t y p i c a l l y   r e f e r s   t o   a   p r o d u c t i o n   o r d e r   d o c u m e n t   n u m b e r . < / T o o l t i p T e x t >   
          < / T o o l t i p >   
-         < T o o l t i p   c o l u m n = " Q I T e s t _ S o u r c e _ T a s k _ N o _ "   E l e m e n t I d = " 1 8 5 8 9 1 4 7 8 2 " > - 
-             < T o o l t i p T e x t   l a n g = " e n - U S " > S p e c i f i e s   a   r e f e r e n c e   t o   t h e   s o u r c e   t a s k   n o .   t h a t   t h i s   Q u a l i t y   I n s p e c t i o n   T e s t   i s   r e f e r r i n g   t o .   T h i s   t y p i c a l l y   r e f e r s   t o   a n   o p e r a t i o n . < / T o o l t i p T e x t > +         < T o o l t i p   c o l u m n = " Q l t y I n s p e c t i o n _ S o u r c e _ T a s k _ N o _ "   E l e m e n t I d = " 3 8 4 6 4 4 1 8 2 " > + 
+             < T o o l t i p T e x t   l a n g = " e n - U S " > S p e c i f i e s   a   r e f e r e n c e   t o   t h e   s o u r c e   t a s k   n o .   t h a t   t h i s   Q u a l i t y   I n s p e c t i o n   i s   r e f e r r i n g   t o .   T h i s   t y p i c a l l y   r e f e r s   t o   a n   o p e r a t i o n . < / T o o l t i p T e x t >   
          < / T o o l t i p >   
-         < T o o l t i p   c o l u m n = " Q I T e s t _ S o u r c e _ C u s t o m _ 1 "   E l e m e n t I d = " 6 5 4 5 1 0 9 1 " > +         < T o o l t i p   c o l u m n = " Q l t y I n s p e c t i o n _ S o u r c e _ C u s t o m _ 1 "   E l e m e n t I d = " 5 4 6 4 5 3 7 6 5 " >   
              < T o o l t i p T e x t   l a n g = " e n - U S " > S p e c i f i e s   a d d i t i o n a l   i n f o r m a t i o n   f r o m   a   s o u r c e   r e c o r d . < / T o o l t i p T e x t >   
          < / T o o l t i p >   
-         < T o o l t i p   c o l u m n = " Q I T e s t _ S o u r c e _ C u s t o m _ 2 "   E l e m e n t I d = " 1 8 4 7 6 3 8 7 6 0 " > +         < T o o l t i p   c o l u m n = " Q l t y I n s p e c t i o n _ S o u r c e _ C u s t o m _ 2 "   E l e m e n t I d = " 1 8 3 5 4 2 3 6 8 0 " >   
              < T o o l t i p T e x t   l a n g = " e n - U S " > S p e c i f i e s   a d d i t i o n a l   i n f o r m a t i o n   f r o m   a   s o u r c e   r e c o r d . < / T o o l t i p T e x t >   
          < / T o o l t i p >   
-         < T o o l t i p   c o l u m n = " Q I T e s t _ S o u r c e _ C u s t o m _ 3 "   E l e m e n t I d = " 1 2 0 9 9 4 2 1 4 3 " > +         < T o o l t i p   c o l u m n = " Q l t y I n s p e c t i o n _ S o u r c e _ C u s t o m _ 3 "   E l e m e n t I d = " 1 8 2 1 8 4 6 9 9 9 " >   
              < T o o l t i p T e x t   l a n g = " e n - U S " > S p e c i f i e s   a d d i t i o n a l   i n f o r m a t i o n   f r o m   a   s o u r c e   r e c o r d . < / T o o l t i p T e x t >   
          < / T o o l t i p >   
-         < T o o l t i p   c o l u m n = " Q I T e s t _ S o u r c e _ C u s t o m _ 4 "   E l e m e n t I d = " 1 9 7 8 5 4 0 9 4 2 " > +         < T o o l t i p   c o l u m n = " Q l t y I n s p e c t i o n _ S o u r c e _ C u s t o m _ 4 "   E l e m e n t I d = " 1 3 6 6 6 3 6 0 8 6 " >   
              < T o o l t i p T e x t   l a n g = " e n - U S " > S p e c i f i e s   a d d i t i o n a l   i n f o r m a t i o n   f r o m   a   s o u r c e   r e c o r d . < / T o o l t i p T e x t >   
          < / T o o l t i p >   
-         < T o o l t i p   c o l u m n = " Q I T e s t _ S o u r c e _ C u s t o m _ 5 "   E l e m e n t I d = " 1 6 7 8 7 2 9 7 3 7 " > +         < T o o l t i p   c o l u m n = " Q l t y I n s p e c t i o n _ S o u r c e _ C u s t o m _ 5 "   E l e m e n t I d = " 2 0 0 4 3 3 2 7 0 3 " >   
              < T o o l t i p T e x t   l a n g = " e n - U S " > S p e c i f i e s   a d d i t i o n a l   i n f o r m a t i o n   f r o m   a   s o u r c e   r e c o r d . < / T o o l t i p T e x t >   
          < / T o o l t i p >   
-         < T o o l t i p   c o l u m n = " Q I T e s t _ S o u r c e _ C u s t o m _ 6 "   E l e m e n t I d = " 7 0 3 1 4 7 7 0 8 " > +         < T o o l t i p   c o l u m n = " Q l t y I n s p e c t i o n _ S o u r c e _ C u s t o m _ 6 "   E l e m e n t I d = " 9 1 2 4 2 8 5 2 " >   
              < T o o l t i p T e x t   l a n g = " e n - U S " > S p e c i f i e s   a d d i t i o n a l   i n f o r m a t i o n   f r o m   a   s o u r c e   r e c o r d . < / T o o l t i p T e x t >   
          < / T o o l t i p >   
-         < T o o l t i p   c o l u m n = " Q I T e s t _ S o u r c e _ C u s t o m _ 7 "   E l e m e n t I d = " 1 3 4 0 8 4 4 3 2 5 " > +         < T o o l t i p   c o l u m n = " Q l t y I n s p e c t i o n _ S o u r c e _ C u s t o m _ 7 "   E l e m e n t I d = " 7 2 8 9 3 9 4 6 9 " >   
              < T o o l t i p T e x t   l a n g = " e n - U S " > S p e c i f i e s   a d d i t i o n a l   i n f o r m a t i o n   f r o m   a   s o u r c e   r e c o r d . < / T o o l t i p T e x t >   
          < / T o o l t i p >   
-         < T o o l t i p   c o l u m n = " Q I T e s t _ S o u r c e _ C u s t o m _ 8 "   E l e m e n t I d = " 1 3 7 8 8 5 1 1 6 6 " > +         < T o o l t i p   c o l u m n = " Q l t y I n s p e c t i o n _ S o u r c e _ C u s t o m _ 8 "   E l e m e n t I d = " 3 7 7 5 4 4 7 4 2 " >   
              < T o o l t i p T e x t   l a n g = " e n - U S " > S p e c i f i e s   a d d i t i o n a l   i n f o r m a t i o n   f r o m   a   s o u r c e   r e c o r d . < / T o o l t i p T e x t >   
          < / T o o l t i p >   
-         < T o o l t i p   c o l u m n = " Q I T e s t _ S o u r c e _ C u s t o m _ 9 "   E l e m e n t I d = " 7 4 1 1 5 4 5 4 9 " > +         < T o o l t i p   c o l u m n = " Q l t y I n s p e c t i o n _ S o u r c e _ C u s t o m _ 9 "   E l e m e n t I d = " 2 6 0 1 5 1 8 7 5 " >   
              < T o o l t i p T e x t   l a n g = " e n - U S " > S p e c i f i e s   a d d i t i o n a l   i n f o r m a t i o n   f r o m   a   s o u r c e   r e c o r d . < / T o o l t i p T e x t >   
          < / T o o l t i p >   
-         < T o o l t i p   c o l u m n = " Q I T e s t _ S o u r c e _ C u s t o m _ 1 0 "   E l e m e n t I d = " 1 5 0 3 8 4 3 6 8 5 " > +         < T o o l t i p   c o l u m n = " Q l t y I n s p e c t i o n _ S o u r c e _ C u s t o m _ 1 0 "   E l e m e n t I d = " 1 5 3 7 6 5 2 9 2 5 " >   
              < T o o l t i p T e x t   l a n g = " e n - U S " > S p e c i f i e s   a d d i t i o n a l   i n f o r m a t i o n   f r o m   a   s o u r c e   r e c o r d . < / T o o l t i p T e x t >   
@@ -4642,19 +4642,19 @@
  
          < T o o l t i p   c o l u m n = " F i e l d _ T y p e "   E l e m e n t I d = " 1 3 2 8 1 6 4 0 1 6 " >   
-             < T o o l t i p T e x t   l a n g = " e n - U S " > S p e c i f i e s   t h e   d a t a   t y p e   o f   t h e   v a l u e s   y o u   c a n   e n t e r   o r   s e l e c t   f o r   t h i s   f i e l d .   U s e   D e c i m a l   f o r   n u m e r i c a l   m e a s u r e m e n t s .   U s e   C h o i c e   t o   g i v e   a   l i s t   o f   o p t i o n s   t o   c h o o s e   f r o m .   I f   y o u   w a n t   t o   c h o o s e   o p t i o n s   f r o m   a n   e x i s t i n g   t a b l e ,   u s e   T a b l e   L o o k u p . < / T o o l t i p T e x t > +             < T o o l t i p T e x t   l a n g = " e n - U S " > S p e c i f i e s   t h e   d a t a   t y p e   o f   t h e   v a l u e s   y o u   c a n   e n t e r   o r   s e l e c t   f o r   t h i s   t e s t .   U s e   D e c i m a l   f o r   n u m e r i c a l   m e a s u r e m e n t s .   U s e   C h o i c e   t o   g i v e   a   l i s t   o f   o p t i o n s   t o   c h o o s e   f r o m .   I f   y o u   w a n t   t o   c h o o s e   o p t i o n s   f r o m   a n   e x i s t i n g   t a b l e ,   u s e   T a b l e   L o o k u p . < / T o o l t i p T e x t >   
          < / T o o l t i p >   
-         < T o o l t i p   c o l u m n = " T e s t _ G r a d e "   E l e m e n t I d = " 1 6 7 8 0 2 0 5 0 3 " > - 
-             < T o o l t i p T e x t   l a n g = " e n - U S " > S p e c i f i e s   t h e   g r a d e   i s   a u t o m a t i c a l l y   d e t e r m i n e d   b a s e d   o n   t h e   t e s t   v a l u e   a n d   g r a d e   c o n f i g u r a t i o n . < / T o o l t i p T e x t > +         < T o o l t i p   c o l u m n = " T e s t _ R e s u l t "   E l e m e n t I d = " 1 2 7 1 0 6 2 1 4 1 " > + 
+             < T o o l t i p T e x t   l a n g = " e n - U S " > S p e c i f i e s   t h e   r e s u l t   i s   a u t o m a t i c a l l y   d e t e r m i n e d   b a s e d   o n   t h e   t e s t   v a l u e   a n d   r e s u l t   c o n f i g u r a t i o n . < / T o o l t i p T e x t >   
          < / T o o l t i p >   
      < / T o o l t i p s >   
-     < C u r r e n t T e s t   E l e m e n t T y p e = " D a t a I t e m "   E l e m e n t I d = " 2 2 5 3 9 2 1 0 6 " > +     < C u r r e n t I n s p e c t i o n   E l e m e n t T y p e = " D a t a I t e m "   E l e m e n t I d = " 1 7 4 7 8 9 7 9 7 8 " >   
          < C O A C o n t a c t _ A l l   E l e m e n t T y p e = " C o l u m n "   E l e m e n t I d = " 1 5 9 3 9 3 0 3 4 6 "   D a t a T y p e = " T e x t " > C O A C o n t a c t _ A l l < / C O A C o n t a c t _ A l l >   
@@ -4692,73 +4692,73 @@
  
          < C o m p a n y I n f o r m a t i o n _ R o w 8   E l e m e n t T y p e = " C o l u m n "   E l e m e n t I d = " 3 9 8 9 1 0 6 3 7 "   D a t a T y p e = " T e x t " > C o m p a n y I n f o r m a t i o n _ R o w 8 < / C o m p a n y I n f o r m a t i o n _ R o w 8 >   
-         < Q I T e m p l a t e _ D e s c r i p t i o n   E l e m e n t T y p e = " C o l u m n "   E l e m e n t I d = " 8 1 5 0 5 6 4 0 4 "   D a t a T y p e = " T e x t " > Q I T e m p l a t e _ D e s c r i p t i o n < / Q I T e m p l a t e _ D e s c r i p t i o n > - 
-         < Q I T e s t _ D e s c r i p t i o n   E l e m e n t T y p e = " C o l u m n "   E l e m e n t I d = " 1 1 3 6 4 6 5 5 3 8 "   D a t a T y p e = " T e x t " > Q I T e s t _ D e s c r i p t i o n < / Q I T e s t _ D e s c r i p t i o n > - 
-         < Q I T e s t _ D i r e c t o r _ N a m e   E l e m e n t T y p e = " C o l u m n "   E l e m e n t I d = " 7 6 1 2 9 8 9 8 0 "   D a t a T y p e = " T e x t " > Q I T e s t _ D i r e c t o r _ N a m e < / Q I T e s t _ D i r e c t o r _ N a m e > - 
-         < Q I T e s t _ D i r e c t o r _ T i t l e   E l e m e n t T y p e = " C o l u m n "   E l e m e n t I d = " 1 8 1 8 3 7 2 4 7 7 "   D a t a T y p e = " T e x t " > Q I T e s t _ D i r e c t o r _ T i t l e < / Q I T e s t _ D i r e c t o r _ T i t l e > - 
-         < Q I T e s t _ F i n i s h e d _ B y _ E m a i l   E l e m e n t T y p e = " C o l u m n "   E l e m e n t I d = " 1 9 8 4 6 7 6 7 3 5 "   D a t a T y p e = " T e x t " > Q I T e s t _ F i n i s h e d _ B y _ E m a i l < / Q I T e s t _ F i n i s h e d _ B y _ E m a i l > - 
-         < Q I T e s t _ F i n i s h e d _ B y _ P h o n e   E l e m e n t T y p e = " C o l u m n "   E l e m e n t I d = " 4 1 0 7 2 3 1 0 3 "   D a t a T y p e = " T e x t " > Q I T e s t _ F i n i s h e d _ B y _ P h o n e < / Q I T e s t _ F i n i s h e d _ B y _ P h o n e > - 
-         < Q I T e s t _ F i n i s h e d _ B y _ T i t l e   E l e m e n t T y p e = " C o l u m n "   E l e m e n t I d = " 1 3 1 5 7 3 0 7 1 5 "   D a t a T y p e = " T e x t " > Q I T e s t _ F i n i s h e d _ B y _ T i t l e < / Q I T e s t _ F i n i s h e d _ B y _ T i t l e > - 
-         < Q I T e s t _ F i n i s h e d _ B y _ U s e r N a m e   E l e m e n t T y p e = " C o l u m n "   E l e m e n t I d = " 1 2 1 5 2 0 7 5 3 1 "   D a t a T y p e = " T e x t " > Q I T e s t _ F i n i s h e d _ B y _ U s e r N a m e < / Q I T e s t _ F i n i s h e d _ B y _ U s e r N a m e > - 
-         < Q I T e s t _ F i n i s h e d _ B y _ U s e r _ I D   E l e m e n t T y p e = " C o l u m n "   E l e m e n t I d = " 1 0 8 5 9 8 0 0 0 6 "   D a t a T y p e = " C o d e " > Q I T e s t _ F i n i s h e d _ B y _ U s e r _ I D < / Q I T e s t _ F i n i s h e d _ B y _ U s e r _ I D > - 
-         < Q I T e s t _ F i n i s h e d _ D a t e   E l e m e n t T y p e = " C o l u m n "   E l e m e n t I d = " 1 6 2 5 6 7 4 7 2 5 "   D a t a T y p e = " D a t e T i m e " > Q I T e s t _ F i n i s h e d _ D a t e < / Q I T e s t _ F i n i s h e d _ D a t e > - 
-         < Q I T e s t _ G r a d e _ C o d e   E l e m e n t T y p e = " C o l u m n "   E l e m e n t I d = " 5 9 5 4 2 7 8 3 5 "   D a t a T y p e = " C o d e " > Q I T e s t _ G r a d e _ C o d e < / Q I T e s t _ G r a d e _ C o d e > - 
-         < Q I T e s t _ G r a d e _ D e s c r i p t i o n   E l e m e n t T y p e = " C o l u m n "   E l e m e n t I d = " 6 4 0 1 4 2 6 8 8 "   D a t a T y p e = " T e x t " > Q I T e s t _ G r a d e _ D e s c r i p t i o n < / Q I T e s t _ G r a d e _ D e s c r i p t i o n > - 
-         < Q I T e s t _ N o   E l e m e n t T y p e = " C o l u m n "   E l e m e n t I d = " 1 0 7 6 3 1 2 2 3 7 "   D a t a T y p e = " C o d e " > Q I T e s t _ N o < / Q I T e s t _ N o > - 
-         < Q I T e s t _ R e t e s t N o   E l e m e n t T y p e = " C o l u m n "   E l e m e n t I d = " 1 3 6 2 8 8 4 4 4 4 "   D a t a T y p e = " I n t e g e r " > Q I T e s t _ R e t e s t N o < / Q I T e s t _ R e t e s t N o > - 
-         < Q I T e s t _ S o u r c e _ C u s t o m _ 1   E l e m e n t T y p e = " C o l u m n "   E l e m e n t I d = " 6 5 4 5 1 0 9 1 "   D a t a T y p e = " T e x t " > Q I T e s t _ S o u r c e _ C u s t o m _ 1 < / Q I T e s t _ S o u r c e _ C u s t o m _ 1 > - 
-         < Q I T e s t _ S o u r c e _ C u s t o m _ 1 0   E l e m e n t T y p e = " C o l u m n "   E l e m e n t I d = " 1 5 0 3 8 4 3 6 8 5 "   D a t a T y p e = " D e c i m a l " > Q I T e s t _ S o u r c e _ C u s t o m _ 1 0 < / Q I T e s t _ S o u r c e _ C u s t o m _ 1 0 > - 
-         < Q I T e s t _ S o u r c e _ C u s t o m _ 2   E l e m e n t T y p e = " C o l u m n "   E l e m e n t I d = " 1 8 4 7 6 3 8 7 6 0 "   D a t a T y p e = " T e x t " > Q I T e s t _ S o u r c e _ C u s t o m _ 2 < / Q I T e s t _ S o u r c e _ C u s t o m _ 2 > - 
-         < Q I T e s t _ S o u r c e _ C u s t o m _ 3   E l e m e n t T y p e = " C o l u m n "   E l e m e n t I d = " 1 2 0 9 9 4 2 1 4 3 "   D a t a T y p e = " T e x t " > Q I T e s t _ S o u r c e _ C u s t o m _ 3 < / Q I T e s t _ S o u r c e _ C u s t o m _ 3 > - 
-         < Q I T e s t _ S o u r c e _ C u s t o m _ 4   E l e m e n t T y p e = " C o l u m n "   E l e m e n t I d = " 1 9 7 8 5 4 0 9 4 2 "   D a t a T y p e = " T e x t " > Q I T e s t _ S o u r c e _ C u s t o m _ 4 < / Q I T e s t _ S o u r c e _ C u s t o m _ 4 > - 
-         < Q I T e s t _ S o u r c e _ C u s t o m _ 5   E l e m e n t T y p e = " C o l u m n "   E l e m e n t I d = " 1 6 7 8 7 2 9 7 3 7 "   D a t a T y p e = " T e x t " > Q I T e s t _ S o u r c e _ C u s t o m _ 5 < / Q I T e s t _ S o u r c e _ C u s t o m _ 5 > - 
-         < Q I T e s t _ S o u r c e _ C u s t o m _ 6   E l e m e n t T y p e = " C o l u m n "   E l e m e n t I d = " 7 0 3 1 4 7 7 0 8 "   D a t a T y p e = " T e x t " > Q I T e s t _ S o u r c e _ C u s t o m _ 6 < / Q I T e s t _ S o u r c e _ C u s t o m _ 6 > - 
-         < Q I T e s t _ S o u r c e _ C u s t o m _ 7   E l e m e n t T y p e = " C o l u m n "   E l e m e n t I d = " 1 3 4 0 8 4 4 3 2 5 "   D a t a T y p e = " I n t e g e r " > Q I T e s t _ S o u r c e _ C u s t o m _ 7 < / Q I T e s t _ S o u r c e _ C u s t o m _ 7 > - 
-         < Q I T e s t _ S o u r c e _ C u s t o m _ 8   E l e m e n t T y p e = " C o l u m n "   E l e m e n t I d = " 1 3 7 8 8 5 1 1 6 6 "   D a t a T y p e = " I n t e g e r " > Q I T e s t _ S o u r c e _ C u s t o m _ 8 < / Q I T e s t _ S o u r c e _ C u s t o m _ 8 > - 
-         < Q I T e s t _ S o u r c e _ C u s t o m _ 9   E l e m e n t T y p e = " C o l u m n "   E l e m e n t I d = " 7 4 1 1 5 4 5 4 9 "   D a t a T y p e = " D e c i m a l " > Q I T e s t _ S o u r c e _ C u s t o m _ 9 < / Q I T e s t _ S o u r c e _ C u s t o m _ 9 > - 
-         < Q I T e s t _ S o u r c e _ D o c u m e n t _ N o _   E l e m e n t T y p e = " C o l u m n "   E l e m e n t I d = " 3 5 2 1 6 1 1 6 0 "   D a t a T y p e = " C o d e " > Q I T e s t _ S o u r c e _ D o c u m e n t _ N o _ < / Q I T e s t _ S o u r c e _ D o c u m e n t _ N o _ > - 
-         < Q I T e s t _ S o u r c e _ I t e m _ D e s c r i p t i o n   E l e m e n t T y p e = " C o l u m n "   E l e m e n t I d = " 9 5 4 9 4 5 6 5 0 "   D a t a T y p e = " T e x t " > Q I T e s t _ S o u r c e _ I t e m _ D e s c r i p t i o n < / Q I T e s t _ S o u r c e _ I t e m _ D e s c r i p t i o n > - 
-         < Q I T e s t _ S o u r c e _ I t e m _ D e s c r i p t i o n 2   E l e m e n t T y p e = " C o l u m n "   E l e m e n t I d = " 1 6 5 6 5 9 1 8 0 8 "   D a t a T y p e = " T e x t " > Q I T e s t _ S o u r c e _ I t e m _ D e s c r i p t i o n 2 < / Q I T e s t _ S o u r c e _ I t e m _ D e s c r i p t i o n 2 > - 
-         < Q I T e s t _ S o u r c e _ I t e m _ N o _   E l e m e n t T y p e = " C o l u m n "   E l e m e n t I d = " 1 9 0 7 0 9 9 1 8 2 "   D a t a T y p e = " C o d e " > Q I T e s t _ S o u r c e _ I t e m _ N o _ < / Q I T e s t _ S o u r c e _ I t e m _ N o _ > - 
-         < Q I T e s t _ S o u r c e _ L o t _ N o _   E l e m e n t T y p e = " C o l u m n "   E l e m e n t I d = " 1 9 8 2 8 4 7 1 7 6 "   D a t a T y p e = " C o d e " > Q I T e s t _ S o u r c e _ L o t _ N o _ < / Q I T e s t _ S o u r c e _ L o t _ N o _ > - 
-         < Q I T e s t _ S o u r c e _ S e r i a l _ N o _   E l e m e n t T y p e = " C o l u m n "   E l e m e n t I d = " 1 1 8 2 4 4 1 4 3 9 "   D a t a T y p e = " C o d e " > Q I T e s t _ S o u r c e _ S e r i a l _ N o _ < / Q I T e s t _ S o u r c e _ S e r i a l _ N o _ > - 
-         < Q I T e s t _ S o u r c e _ T a s k _ N o _   E l e m e n t T y p e = " C o l u m n "   E l e m e n t I d = " 1 8 5 8 9 1 4 7 8 2 "   D a t a T y p e = " C o d e " > Q I T e s t _ S o u r c e _ T a s k _ N o _ < / Q I T e s t _ S o u r c e _ T a s k _ N o _ > - 
-         < Q I T e s t _ S o u r c e _ V a r i a n t _ C o d e   E l e m e n t T y p e = " C o l u m n "   E l e m e n t I d = " 9 9 8 9 8 3 9 4 1 "   D a t a T y p e = " C o d e " > Q I T e s t _ S o u r c e _ V a r i a n t _ C o d e < / Q I T e s t _ S o u r c e _ V a r i a n t _ C o d e > - 
-         < Q I T e s t _ S t a t u s   E l e m e n t T y p e = " C o l u m n "   E l e m e n t I d = " 2 1 0 2 3 4 6 9 5 2 "   D a t a T y p e = " E n u m " > Q I T e s t _ S t a t u s < / Q I T e s t _ S t a t u s > - 
-         < C u r r e n t T e s t L i n e   E l e m e n t T y p e = " D a t a I t e m "   E l e m e n t I d = " 7 8 5 1 8 8 8 4 " > +         < Q l t y I n s p e c t i o n T e m p l a t e _ D e s c r i p t i o n   E l e m e n t T y p e = " C o l u m n "   E l e m e n t I d = " 1 6 5 2 0 6 9 5 9 8 "   D a t a T y p e = " T e x t " > Q l t y I n s p e c t i o n T e m p l a t e _ D e s c r i p t i o n < / Q l t y I n s p e c t i o n T e m p l a t e _ D e s c r i p t i o n > + 
+         < Q l t y I n s p e c t i o n _ D e s c r i p t i o n   E l e m e n t T y p e = " C o l u m n "   E l e m e n t I d = " 7 3 9 0 1 9 9 1 0 "   D a t a T y p e = " T e x t " > Q l t y I n s p e c t i o n _ D e s c r i p t i o n < / Q l t y I n s p e c t i o n _ D e s c r i p t i o n > + 
+         < Q l t y I n s p e c t i o n _ D i r e c t o r _ N a m e   E l e m e n t T y p e = " C o l u m n "   E l e m e n t I d = " 1 2 5 9 7 6 1 4 6 0 "   D a t a T y p e = " T e x t " > Q l t y I n s p e c t i o n _ D i r e c t o r _ N a m e < / Q l t y I n s p e c t i o n _ D i r e c t o r _ N a m e > + 
+         < Q l t y I n s p e c t i o n _ D i r e c t o r _ T i t l e   E l e m e n t T y p e = " C o l u m n "   E l e m e n t I d = " 2 6 7 7 1 7 5 2 5 "   D a t a T y p e = " T e x t " > Q l t y I n s p e c t i o n _ D i r e c t o r _ T i t l e < / Q l t y I n s p e c t i o n _ D i r e c t o r _ T i t l e > + 
+         < Q l t y I n s p e c t i o n _ F i n i s h e d _ B y _ E m a i l   E l e m e n t T y p e = " C o l u m n "   E l e m e n t I d = " 1 5 2 1 1 3 4 6 3 1 "   D a t a T y p e = " T e x t " > Q l t y I n s p e c t i o n _ F i n i s h e d _ B y _ E m a i l < / Q l t y I n s p e c t i o n _ F i n i s h e d _ B y _ E m a i l > + 
+         < Q l t y I n s p e c t i o n _ F i n i s h e d _ B y _ P h o n e   E l e m e n t T y p e = " C o l u m n "   E l e m e n t I d = " 3 4 7 5 5 7 6 2 5 "   D a t a T y p e = " T e x t " > Q l t y I n s p e c t i o n _ F i n i s h e d _ B y _ P h o n e < / Q l t y I n s p e c t i o n _ F i n i s h e d _ B y _ P h o n e > + 
+         < Q l t y I n s p e c t i o n _ F i n i s h e d _ B y _ T i t l e   E l e m e n t T y p e = " C o l u m n "   E l e m e n t I d = " 4 6 0 0 4 5 6 8 3 "   D a t a T y p e = " T e x t " > Q l t y I n s p e c t i o n _ F i n i s h e d _ B y _ T i t l e < / Q l t y I n s p e c t i o n _ F i n i s h e d _ B y _ T i t l e > + 
+         < Q l t y I n s p e c t i o n _ F i n i s h e d _ B y _ U s e r N a m e   E l e m e n t T y p e = " C o l u m n "   E l e m e n t I d = " 1 9 5 3 6 1 2 5 3 1 "   D a t a T y p e = " T e x t " > Q l t y I n s p e c t i o n _ F i n i s h e d _ B y _ U s e r N a m e < / Q l t y I n s p e c t i o n _ F i n i s h e d _ B y _ U s e r N a m e > + 
+         < Q l t y I n s p e c t i o n _ F i n i s h e d _ B y _ U s e r _ I D   E l e m e n t T y p e = " C o l u m n "   E l e m e n t I d = " 1 7 5 0 5 1 6 3 3 8 "   D a t a T y p e = " C o d e " > Q l t y I n s p e c t i o n _ F i n i s h e d _ B y _ U s e r _ I D < / Q l t y I n s p e c t i o n _ F i n i s h e d _ B y _ U s e r _ I D > + 
+         < Q l t y I n s p e c t i o n _ F i n i s h e d _ D a t e   E l e m e n t T y p e = " C o l u m n "   E l e m e n t I d = " 1 8 3 4 1 2 2 7 6 5 "   D a t a T y p e = " D a t e T i m e " > Q l t y I n s p e c t i o n _ F i n i s h e d _ D a t e < / Q l t y I n s p e c t i o n _ F i n i s h e d _ D a t e > + 
+         < Q l t y I n s p e c t i o n _ N o   E l e m e n t T y p e = " C o l u m n "   E l e m e n t I d = " 2 1 2 0 6 1 5 7 4 9 "   D a t a T y p e = " C o d e " > Q l t y I n s p e c t i o n _ N o < / Q l t y I n s p e c t i o n _ N o > + 
+         < Q l t y I n s p e c t i o n _ R e i n s p e c t i o n N o   E l e m e n t T y p e = " C o l u m n "   E l e m e n t I d = " 7 5 1 7 3 5 6 "   D a t a T y p e = " I n t e g e r " > Q l t y I n s p e c t i o n _ R e i n s p e c t i o n N o < / Q l t y I n s p e c t i o n _ R e i n s p e c t i o n N o > + 
+         < Q l t y I n s p e c t i o n _ R e s u l t _ C o d e   E l e m e n t T y p e = " C o l u m n "   E l e m e n t I d = " 1 8 0 7 0 7 7 0 6 5 "   D a t a T y p e = " C o d e " > Q l t y I n s p e c t i o n _ R e s u l t _ C o d e < / Q l t y I n s p e c t i o n _ R e s u l t _ C o d e > + 
+         < Q l t y I n s p e c t i o n _ R e s u l t _ D e s c r i p t i o n   E l e m e n t T y p e = " C o l u m n "   E l e m e n t I d = " 8 1 0 5 3 8 1 8 8 "   D a t a T y p e = " T e x t " > Q l t y I n s p e c t i o n _ R e s u l t _ D e s c r i p t i o n < / Q l t y I n s p e c t i o n _ R e s u l t _ D e s c r i p t i o n > + 
+         < Q l t y I n s p e c t i o n _ S o u r c e _ C u s t o m _ 1   E l e m e n t T y p e = " C o l u m n "   E l e m e n t I d = " 5 4 6 4 5 3 7 6 5 "   D a t a T y p e = " T e x t " > Q l t y I n s p e c t i o n _ S o u r c e _ C u s t o m _ 1 < / Q l t y I n s p e c t i o n _ S o u r c e _ C u s t o m _ 1 > + 
+         < Q l t y I n s p e c t i o n _ S o u r c e _ C u s t o m _ 1 0   E l e m e n t T y p e = " C o l u m n "   E l e m e n t I d = " 1 5 3 7 6 5 2 9 2 5 "   D a t a T y p e = " D e c i m a l " > Q l t y I n s p e c t i o n _ S o u r c e _ C u s t o m _ 1 0 < / Q l t y I n s p e c t i o n _ S o u r c e _ C u s t o m _ 1 0 > + 
+         < Q l t y I n s p e c t i o n _ S o u r c e _ C u s t o m _ 2   E l e m e n t T y p e = " C o l u m n "   E l e m e n t I d = " 1 8 3 5 4 2 3 6 8 0 "   D a t a T y p e = " T e x t " > Q l t y I n s p e c t i o n _ S o u r c e _ C u s t o m _ 2 < / Q l t y I n s p e c t i o n _ S o u r c e _ C u s t o m _ 2 > + 
+         < Q l t y I n s p e c t i o n _ S o u r c e _ C u s t o m _ 3   E l e m e n t T y p e = " C o l u m n "   E l e m e n t I d = " 1 8 2 1 8 4 6 9 9 9 "   D a t a T y p e = " T e x t " > Q l t y I n s p e c t i o n _ S o u r c e _ C u s t o m _ 3 < / Q l t y I n s p e c t i o n _ S o u r c e _ C u s t o m _ 3 > + 
+         < Q l t y I n s p e c t i o n _ S o u r c e _ C u s t o m _ 4   E l e m e n t T y p e = " C o l u m n "   E l e m e n t I d = " 1 3 6 6 6 3 6 0 8 6 "   D a t a T y p e = " T e x t " > Q l t y I n s p e c t i o n _ S o u r c e _ C u s t o m _ 4 < / Q l t y I n s p e c t i o n _ S o u r c e _ C u s t o m _ 4 > + 
+         < Q l t y I n s p e c t i o n _ S o u r c e _ C u s t o m _ 5   E l e m e n t T y p e = " C o l u m n "   E l e m e n t I d = " 2 0 0 4 3 3 2 7 0 3 "   D a t a T y p e = " T e x t " > Q l t y I n s p e c t i o n _ S o u r c e _ C u s t o m _ 5 < / Q l t y I n s p e c t i o n _ S o u r c e _ C u s t o m _ 5 > + 
+         < Q l t y I n s p e c t i o n _ S o u r c e _ C u s t o m _ 6   E l e m e n t T y p e = " C o l u m n "   E l e m e n t I d = " 9 1 2 4 2 8 5 2 "   D a t a T y p e = " T e x t " > Q l t y I n s p e c t i o n _ S o u r c e _ C u s t o m _ 6 < / Q l t y I n s p e c t i o n _ S o u r c e _ C u s t o m _ 6 > + 
+         < Q l t y I n s p e c t i o n _ S o u r c e _ C u s t o m _ 7   E l e m e n t T y p e = " C o l u m n "   E l e m e n t I d = " 7 2 8 9 3 9 4 6 9 "   D a t a T y p e = " I n t e g e r " > Q l t y I n s p e c t i o n _ S o u r c e _ C u s t o m _ 7 < / Q l t y I n s p e c t i o n _ S o u r c e _ C u s t o m _ 7 > + 
+         < Q l t y I n s p e c t i o n _ S o u r c e _ C u s t o m _ 8   E l e m e n t T y p e = " C o l u m n "   E l e m e n t I d = " 3 7 7 5 4 4 7 4 2 "   D a t a T y p e = " I n t e g e r " > Q l t y I n s p e c t i o n _ S o u r c e _ C u s t o m _ 8 < / Q l t y I n s p e c t i o n _ S o u r c e _ C u s t o m _ 8 > + 
+         < Q l t y I n s p e c t i o n _ S o u r c e _ C u s t o m _ 9   E l e m e n t T y p e = " C o l u m n "   E l e m e n t I d = " 2 6 0 1 5 1 8 7 5 "   D a t a T y p e = " D e c i m a l " > Q l t y I n s p e c t i o n _ S o u r c e _ C u s t o m _ 9 < / Q l t y I n s p e c t i o n _ S o u r c e _ C u s t o m _ 9 > + 
+         < Q l t y I n s p e c t i o n _ S o u r c e _ D o c u m e n t _ N o _   E l e m e n t T y p e = " C o l u m n "   E l e m e n t I d = " 1 6 7 5 9 1 6 2 8 8 "   D a t a T y p e = " C o d e " > Q l t y I n s p e c t i o n _ S o u r c e _ D o c u m e n t _ N o _ < / Q l t y I n s p e c t i o n _ S o u r c e _ D o c u m e n t _ N o _ > + 
+         < Q l t y I n s p e c t i o n _ S o u r c e _ I t e m _ D e s c r i p t i o n   E l e m e n t T y p e = " C o l u m n "   E l e m e n t I d = " 6 4 6 8 9 0 6 3 0 "   D a t a T y p e = " T e x t " > Q l t y I n s p e c t i o n _ S o u r c e _ I t e m _ D e s c r i p t i o n < / Q l t y I n s p e c t i o n _ S o u r c e _ I t e m _ D e s c r i p t i o n > + 
+         < Q l t y I n s p e c t i o n _ S o u r c e _ I t e m _ D e s c r i p t i o n 2   E l e m e n t T y p e = " C o l u m n "   E l e m e n t I d = " 1 2 7 9 3 6 9 3 5 2 "   D a t a T y p e = " T e x t " > Q l t y I n s p e c t i o n _ S o u r c e _ I t e m _ D e s c r i p t i o n 2 < / Q l t y I n s p e c t i o n _ S o u r c e _ I t e m _ D e s c r i p t i o n 2 > + 
+         < Q l t y I n s p e c t i o n _ S o u r c e _ I t e m _ N o _   E l e m e n t T y p e = " C o l u m n "   E l e m e n t I d = " 1 2 6 8 0 5 0 5 1 8 "   D a t a T y p e = " C o d e " > Q l t y I n s p e c t i o n _ S o u r c e _ I t e m _ N o _ < / Q l t y I n s p e c t i o n _ S o u r c e _ I t e m _ N o _ > + 
+         < Q l t y I n s p e c t i o n _ S o u r c e _ L o t _ N o _   E l e m e n t T y p e = " C o l u m n "   E l e m e n t I d = " 1 1 2 3 5 5 1 3 1 2 "   D a t a T y p e = " C o d e " > Q l t y I n s p e c t i o n _ S o u r c e _ L o t _ N o _ < / Q l t y I n s p e c t i o n _ S o u r c e _ L o t _ N o _ > + 
+         < Q l t y I n s p e c t i o n _ S o u r c e _ S e r i a l _ N o _   E l e m e n t T y p e = " C o l u m n "   E l e m e n t I d = " 1 5 2 0 5 9 1 4 4 7 "   D a t a T y p e = " C o d e " > Q l t y I n s p e c t i o n _ S o u r c e _ S e r i a l _ N o _ < / Q l t y I n s p e c t i o n _ S o u r c e _ S e r i a l _ N o _ > + 
+         < Q l t y I n s p e c t i o n _ S o u r c e _ T a s k _ N o _   E l e m e n t T y p e = " C o l u m n "   E l e m e n t I d = " 3 8 4 6 4 4 1 8 2 "   D a t a T y p e = " C o d e " > Q l t y I n s p e c t i o n _ S o u r c e _ T a s k _ N o _ < / Q l t y I n s p e c t i o n _ S o u r c e _ T a s k _ N o _ > + 
+         < Q l t y I n s p e c t i o n _ S o u r c e _ V a r i a n t _ C o d e   E l e m e n t T y p e = " C o l u m n "   E l e m e n t I d = " 1 6 0 8 4 0 3 8 2 1 "   D a t a T y p e = " C o d e " > Q l t y I n s p e c t i o n _ S o u r c e _ V a r i a n t _ C o d e < / Q l t y I n s p e c t i o n _ S o u r c e _ V a r i a n t _ C o d e > + 
+         < Q l t y I n s p e c t i o n _ S t a t u s   E l e m e n t T y p e = " C o l u m n "   E l e m e n t I d = " 8 5 1 7 5 2 7 6 8 "   D a t a T y p e = " E n u m " > Q l t y I n s p e c t i o n _ S t a t u s < / Q l t y I n s p e c t i o n _ S t a t u s > + 
+         < C u r r e n t I n s p e c t i o n L i n e   E l e m e n t T y p e = " D a t a I t e m "   E l e m e n t I d = " 1 1 9 3 2 1 9 5 9 6 " >   
              < F i e l d _ C o d e   E l e m e n t T y p e = " C o l u m n "   E l e m e n t I d = " 1 3 2 7 2 5 5 7 3 "   D a t a T y p e = " C o d e " > F i e l d _ C o d e < / F i e l d _ C o d e >   
@@ -4800,80 +4800,82 @@
  
              < N u m e r i c _ V a l u e   E l e m e n t T y p e = " C o l u m n "   E l e m e n t I d = " 4 6 0 4 1 2 6 4 6 "   D a t a T y p e = " D e c i m a l " > N u m e r i c _ V a l u e < / N u m e r i c _ V a l u e >   
-             < P r o m p t e d G r a d e C a p t i o n _ 1   E l e m e n t T y p e = " C o l u m n "   E l e m e n t I d = " 6 8 4 7 5 0 8 3 "   D a t a T y p e = " T e x t " > P r o m p t e d G r a d e C a p t i o n _ 1 < / P r o m p t e d G r a d e C a p t i o n _ 1 > - 
-             < P r o m p t e d G r a d e C a p t i o n _ 1 0   E l e m e n t T y p e = " C o l u m n "   E l e m e n t I d = " 1 8 8 0 4 4 9 8 0 5 "   D a t a T y p e = " T e x t " > P r o m p t e d G r a d e C a p t i o n _ 1 0 < / P r o m p t e d G r a d e C a p t i o n _ 1 0 > - 
-             < P r o m p t e d G r a d e C a p t i o n _ 2   E l e m e n t T y p e = " C o l u m n "   E l e m e n t I d = " 5 6 9 2 2 1 5 3 4 "   D a t a T y p e = " T e x t " > P r o m p t e d G r a d e C a p t i o n _ 2 < / P r o m p t e d G r a d e C a p t i o n _ 2 > - 
-             < P r o m p t e d G r a d e C a p t i o n _ 3   E l e m e n t T y p e = " C o l u m n "   E l e m e n t I d = " 1 2 0 6 9 1 8 1 5 1 "   D a t a T y p e = " T e x t " > P r o m p t e d G r a d e C a p t i o n _ 3 < / P r o m p t e d G r a d e C a p t i o n _ 3 > - 
-             < P r o m p t e d G r a d e C a p t i o n _ 4   E l e m e n t T y p e = " C o l u m n "   E l e m e n t I d = " 1 0 3 8 0 0 9 1 2 8 "   D a t a T y p e = " T e x t " > P r o m p t e d G r a d e C a p t i o n _ 4 < / P r o m p t e d G r a d e C a p t i o n _ 4 > - 
-             < P r o m p t e d G r a d e C a p t i o n _ 5   E l e m e n t T y p e = " C o l u m n "   E l e m e n t I d = " 1 6 7 5 7 0 5 7 4 5 "   D a t a T y p e = " T e x t " > P r o m p t e d G r a d e C a p t i o n _ 5 < / P r o m p t e d G r a d e C a p t i o n _ 5 > - 
-             < P r o m p t e d G r a d e C a p t i o n _ 6   E l e m e n t T y p e = " C o l u m n "   E l e m e n t I d = " 1 9 8 1 5 6 4 9 3 4 "   D a t a T y p e = " T e x t " > P r o m p t e d G r a d e C a p t i o n _ 6 < / P r o m p t e d G r a d e C a p t i o n _ 6 > - 
-             < P r o m p t e d G r a d e C a p t i o n _ 7   E l e m e n t T y p e = " C o l u m n "   E l e m e n t I d = " 1 3 4 3 8 6 8 3 1 7 "   D a t a T y p e = " T e x t " > P r o m p t e d G r a d e C a p t i o n _ 7 < / P r o m p t e d G r a d e C a p t i o n _ 7 > - 
-             < P r o m p t e d G r a d e C a p t i o n _ 8   E l e m e n t T y p e = " C o l u m n "   E l e m e n t I d = " 1 5 1 2 7 7 7 3 4 0 "   D a t a T y p e = " T e x t " > P r o m p t e d G r a d e C a p t i o n _ 8 < / P r o m p t e d G r a d e C a p t i o n _ 8 > - 
-             < P r o m p t e d G r a d e C a p t i o n _ 9   E l e m e n t T y p e = " C o l u m n "   E l e m e n t I d = " 8 7 5 0 8 0 7 2 3 "   D a t a T y p e = " T e x t " > P r o m p t e d G r a d e C a p t i o n _ 9 < / P r o m p t e d G r a d e C a p t i o n _ 9 > - 
-             < P r o m p t e d G r a d e C o n d i t i o n D e s c r i p t i o n _ 1   E l e m e n t T y p e = " C o l u m n "   E l e m e n t I d = " 2 0 3 0 0 6 5 4 5 0 "   D a t a T y p e = " T e x t " > P r o m p t e d G r a d e C o n d i t i o n D e s c r i p t i o n _ 1 < / P r o m p t e d G r a d e C o n d i t i o n D e s c r i p t i o n _ 1 > - 
-             < P r o m p t e d G r a d e C o n d i t i o n D e s c r i p t i o n _ 1 0   E l e m e n t T y p e = " C o l u m n "   E l e m e n t I d = " 1 4 2 3 5 8 0 5 8 6 "   D a t a T y p e = " T e x t " > P r o m p t e d G r a d e C o n d i t i o n D e s c r i p t i o n _ 1 0 < / P r o m p t e d G r a d e C o n d i t i o n D e s c r i p t i o n _ 1 0 > - 
-             < P r o m p t e d G r a d e C o n d i t i o n D e s c r i p t i o n _ 2   E l e m e n t T y p e = " C o l u m n "   E l e m e n t I d = " 1 6 2 7 2 0 5 2 2 9 "   D a t a T y p e = " T e x t " > P r o m p t e d G r a d e C o n d i t i o n D e s c r i p t i o n _ 2 < / P r o m p t e d G r a d e C o n d i t i o n D e s c r i p t i o n _ 2 > - 
-             < P r o m p t e d G r a d e C o n d i t i o n D e s c r i p t i o n _ 3   E l e m e n t T y p e = " C o l u m n "   E l e m e n t I d = " 9 8 9 5 0 8 6 1 2 "   D a t a T y p e = " T e x t " > P r o m p t e d G r a d e C o n d i t i o n D e s c r i p t i o n _ 3 < / P r o m p t e d G r a d e C o n d i t i o n D e s c r i p t i o n _ 3 > - 
-             < P r o m p t e d G r a d e C o n d i t i o n D e s c r i p t i o n _ 4   E l e m e n t T y p e = " C o l u m n "   E l e m e n t I d = " 3 5 1 8 1 1 9 9 5 "   D a t a T y p e = " T e x t " > P r o m p t e d G r a d e C o n d i t i o n D e s c r i p t i o n _ 4 < / P r o m p t e d G r a d e C o n d i t i o n D e s c r i p t i o n _ 4 > - 
-             < P r o m p t e d G r a d e C o n d i t i o n D e s c r i p t i o n _ 5   E l e m e n t T y p e = " C o l u m n "   E l e m e n t I d = " 2 8 5 8 8 4 6 2 2 "   D a t a T y p e = " T e x t " > P r o m p t e d G r a d e C o n d i t i o n D e s c r i p t i o n _ 5 < / P r o m p t e d G r a d e C o n d i t i o n D e s c r i p t i o n _ 5 > - 
-             < P r o m p t e d G r a d e C o n d i t i o n D e s c r i p t i o n _ 6   E l e m e n t T y p e = " C o l u m n "   E l e m e n t I d = " 9 2 3 5 8 1 2 3 9 "   D a t a T y p e = " T e x t " > P r o m p t e d G r a d e C o n d i t i o n D e s c r i p t i o n _ 6 < / P r o m p t e d G r a d e C o n d i t i o n D e s c r i p t i o n _ 6 > - 
-             < P r o m p t e d G r a d e C o n d i t i o n D e s c r i p t i o n _ 7   E l e m e n t T y p e = " C o l u m n "   E l e m e n t I d = " 1 5 6 1 2 7 7 8 5 6 "   D a t a T y p e = " T e x t " > P r o m p t e d G r a d e C o n d i t i o n D e s c r i p t i o n _ 7 < / P r o m p t e d G r a d e C o n d i t i o n D e s c r i p t i o n _ 7 > - 
-             < P r o m p t e d G r a d e C o n d i t i o n D e s c r i p t i o n _ 8   E l e m e n t T y p e = " C o l u m n "   E l e m e n t I d = " 5 8 5 7 6 3 1 9 3 "   D a t a T y p e = " T e x t " > P r o m p t e d G r a d e C o n d i t i o n D e s c r i p t i o n _ 8 < / P r o m p t e d G r a d e C o n d i t i o n D e s c r i p t i o n _ 8 > - 
-             < P r o m p t e d G r a d e C o n d i t i o n D e s c r i p t i o n _ 9   E l e m e n t T y p e = " C o l u m n "   E l e m e n t I d = " 1 2 2 3 4 5 9 8 1 0 "   D a t a T y p e = " T e x t " > P r o m p t e d G r a d e C o n d i t i o n D e s c r i p t i o n _ 9 < / P r o m p t e d G r a d e C o n d i t i o n D e s c r i p t i o n _ 9 > - 
-             < P r o m p t e d G r a d e V i s i b l e _ 1   E l e m e n t T y p e = " C o l u m n "   E l e m e n t I d = " 9 8 9 3 4 0 6 9 9 "   D a t a T y p e = " B o o l e a n " > P r o m p t e d G r a d e V i s i b l e _ 1 < / P r o m p t e d G r a d e V i s i b l e _ 1 > - 
-             < P r o m p t e d G r a d e V i s i b l e _ 1 0   E l e m e n t T y p e = " C o l u m n "   E l e m e n t I d = " 4 5 8 8 3 8 9 4 7 "   D a t a T y p e = " B o o l e a n " > P r o m p t e d G r a d e V i s i b l e _ 1 0 < / P r o m p t e d G r a d e V i s i b l e _ 1 0 > - 
-             < P r o m p t e d G r a d e V i s i b l e _ 2   E l e m e n t T y p e = " C o l u m n "   E l e m e n t I d = " 3 5 1 6 4 4 0 8 2 "   D a t a T y p e = " B o o l e a n " > P r o m p t e d G r a d e V i s i b l e _ 2 < / P r o m p t e d G r a d e V i s i b l e _ 2 > - 
-             < P r o m p t e d G r a d e V i s i b l e _ 3   E l e m e n t T y p e = " C o l u m n "   E l e m e n t I d = " 2 8 6 0 5 2 5 3 5 "   D a t a T y p e = " B o o l e a n " > P r o m p t e d G r a d e V i s i b l e _ 3 < / P r o m p t e d G r a d e V i s i b l e _ 3 > - 
-             < P r o m p t e d G r a d e V i s i b l e _ 4   E l e m e n t T y p e = " C o l u m n "   E l e m e n t I d = " 1 1 7 1 4 3 5 1 2 "   D a t a T y p e = " B o o l e a n " > P r o m p t e d G r a d e V i s i b l e _ 4 < / P r o m p t e d G r a d e V i s i b l e _ 4 > - 
-             < P r o m p t e d G r a d e V i s i b l e _ 5   E l e m e n t T y p e = " C o l u m n "   E l e m e n t I d = " 7 5 4 8 4 0 1 2 9 "   D a t a T y p e = " B o o l e a n " > P r o m p t e d G r a d e V i s i b l e _ 5 < / P r o m p t e d G r a d e V i s i b l e _ 5 > - 
-             < P r o m p t e d G r a d e V i s i b l e _ 6   E l e m e n t T y p e = " C o l u m n "   E l e m e n t I d = " 1 3 9 2 5 3 6 7 4 6 "   D a t a T y p e = " B o o l e a n " > P r o m p t e d G r a d e V i s i b l e _ 6 < / P r o m p t e d G r a d e V i s i b l e _ 6 > - 
-             < P r o m p t e d G r a d e V i s i b l e _ 7   E l e m e n t T y p e = " C o l u m n "   E l e m e n t I d = " 2 0 3 0 2 3 3 3 6 3 "   D a t a T y p e = " B o o l e a n " > P r o m p t e d G r a d e V i s i b l e _ 7 < / P r o m p t e d G r a d e V i s i b l e _ 7 > - 
-             < P r o m p t e d G r a d e V i s i b l e _ 8   E l e m e n t T y p e = " C o l u m n "   E l e m e n t I d = " 1 8 6 1 3 2 4 3 4 0 "   D a t a T y p e = " B o o l e a n " > P r o m p t e d G r a d e V i s i b l e _ 8 < / P r o m p t e d G r a d e V i s i b l e _ 8 > - 
-             < P r o m p t e d G r a d e V i s i b l e _ 9   E l e m e n t T y p e = " C o l u m n "   E l e m e n t I d = " 1 7 9 5 9 4 6 3 3 9 "   D a t a T y p e = " B o o l e a n " > P r o m p t e d G r a d e V i s i b l e _ 9 < / P r o m p t e d G r a d e V i s i b l e _ 9 > - 
-             < T e s t _ G r a d e   E l e m e n t T y p e = " C o l u m n "   E l e m e n t I d = " 1 6 7 8 0 2 0 5 0 3 "   D a t a T y p e = " C o d e " > T e s t _ G r a d e < / T e s t _ G r a d e > - 
-             < T e s t _ G r a d e D e s c r i p t i o n   E l e m e n t T y p e = " C o l u m n "   E l e m e n t I d = " 1 2 6 2 6 4 0 3 4 3 "   D a t a T y p e = " T e x t " > T e s t _ G r a d e D e s c r i p t i o n < / T e s t _ G r a d e D e s c r i p t i o n > +             < P r o m p t e d R e s u l t C a p t i o n _ 1   E l e m e n t T y p e = " C o l u m n "   E l e m e n t I d = " 1 5 4 8 2 0 5 1 6 9 "   D a t a T y p e = " T e x t " > P r o m p t e d R e s u l t C a p t i o n _ 1 < / P r o m p t e d R e s u l t C a p t i o n _ 1 > + 
+             < P r o m p t e d R e s u l t C a p t i o n _ 1 0   E l e m e n t T y p e = " C o l u m n "   E l e m e n t I d = " 6 6 5 1 3 7 3 2 1 "   D a t a T y p e = " T e x t " > P r o m p t e d R e s u l t C a p t i o n _ 1 0 < / P r o m p t e d R e s u l t C a p t i o n _ 1 0 > + 
+             < P r o m p t e d R e s u l t C a p t i o n _ 2   E l e m e n t T y p e = " C o l u m n "   E l e m e n t I d = " 2 1 0 9 0 6 5 5 1 0 "   D a t a T y p e = " T e x t " > P r o m p t e d R e s u l t C a p t i o n _ 2 < / P r o m p t e d R e s u l t C a p t i o n _ 2 > + 
+             < P r o m p t e d R e s u l t C a p t i o n _ 3   E l e m e n t T y p e = " C o l u m n "   E l e m e n t I d = " 1 4 7 1 3 6 8 8 9 3 "   D a t a T y p e = " T e x t " > P r o m p t e d R e s u l t C a p t i o n _ 3 < / P r o m p t e d R e s u l t C a p t i o n _ 3 > + 
+             < P r o m p t e d R e s u l t C a p t i o n _ 4   E l e m e n t T y p e = " C o l u m n "   E l e m e n t I d = " 8 3 3 6 7 2 2 7 6 "   D a t a T y p e = " T e x t " > P r o m p t e d R e s u l t C a p t i o n _ 4 < / P r o m p t e d R e s u l t C a p t i o n _ 4 > + 
+             < P r o m p t e d R e s u l t C a p t i o n _ 5   E l e m e n t T y p e = " C o l u m n "   E l e m e n t I d = " 1 9 5 9 7 5 6 5 9 "   D a t a T y p e = " T e x t " > P r o m p t e d R e s u l t C a p t i o n _ 5 < / P r o m p t e d R e s u l t C a p t i o n _ 5 > + 
+             < P r o m p t e d R e s u l t C a p t i o n _ 6   E l e m e n t T y p e = " C o l u m n "   E l e m e n t I d = " 4 4 1 7 2 0 9 5 8 "   D a t a T y p e = " T e x t " > P r o m p t e d R e s u l t C a p t i o n _ 6 < / P r o m p t e d R e s u l t C a p t i o n _ 6 > + 
+             < P r o m p t e d R e s u l t C a p t i o n _ 7   E l e m e n t T y p e = " C o l u m n "   E l e m e n t I d = " 1 0 7 9 4 1 7 5 7 5 "   D a t a T y p e = " T e x t " > P r o m p t e d R e s u l t C a p t i o n _ 7 < / P r o m p t e d R e s u l t C a p t i o n _ 7 > + 
+             < P r o m p t e d R e s u l t C a p t i o n _ 8   E l e m e n t T y p e = " C o l u m n "   E l e m e n t I d = " 1 0 3 9 0 2 9 1 2 "   D a t a T y p e = " T e x t " > P r o m p t e d R e s u l t C a p t i o n _ 8 < / P r o m p t e d R e s u l t C a p t i o n _ 8 > + 
+             < P r o m p t e d R e s u l t C a p t i o n _ 9   E l e m e n t T y p e = " C o l u m n "   E l e m e n t I d = " 7 4 1 5 9 9 5 2 9 "   D a t a T y p e = " T e x t " > P r o m p t e d R e s u l t C a p t i o n _ 9 < / P r o m p t e d R e s u l t C a p t i o n _ 9 > + 
+             < P r o m p t e d R e s u l t C o n d i t i o n D e s c r i p t i o n _ 1   E l e m e n t T y p e = " C o l u m n "   E l e m e n t I d = " 1 7 7 6 7 4 4 4 3 4 "   D a t a T y p e = " T e x t " > P r o m p t e d R e s u l t C o n d i t i o n D e s c r i p t i o n _ 1 < / P r o m p t e d R e s u l t C o n d i t i o n D e s c r i p t i o n _ 1 > + 
+             < P r o m p t e d R e s u l t C o n d i t i o n D e s c r i p t i o n _ 1 0   E l e m e n t T y p e = " C o l u m n "   E l e m e n t I d = " 1 0 2 8 7 8 8 8 8 2 "   D a t a T y p e = " T e x t " > P r o m p t e d R e s u l t C o n d i t i o n D e s c r i p t i o n _ 1 0 < / P r o m p t e d R e s u l t C o n d i t i o n D e s c r i p t i o n _ 1 0 > + 
+             < P r o m p t e d R e s u l t C o n d i t i o n D e s c r i p t i o n _ 2   E l e m e n t T y p e = " C o l u m n "   E l e m e n t I d = " 1 1 3 9 0 4 7 8 1 7 "   D a t a T y p e = " T e x t " > P r o m p t e d R e s u l t C o n d i t i o n D e s c r i p t i o n _ 2 < / P r o m p t e d R e s u l t C o n d i t i o n D e s c r i p t i o n _ 2 > + 
+             < P r o m p t e d R e s u l t C o n d i t i o n D e s c r i p t i o n _ 3   E l e m e n t T y p e = " C o l u m n "   E l e m e n t I d = " 5 0 1 3 5 1 2 0 0 "   D a t a T y p e = " T e x t " > P r o m p t e d R e s u l t C o n d i t i o n D e s c r i p t i o n _ 3 < / P r o m p t e d R e s u l t C o n d i t i o n D e s c r i p t i o n _ 3 > + 
+             < P r o m p t e d R e s u l t C o n d i t i o n D e s c r i p t i o n _ 4   E l e m e n t T y p e = " C o l u m n "   E l e m e n t I d = " 6 7 0 2 6 0 2 2 3 "   D a t a T y p e = " T e x t " > P r o m p t e d R e s u l t C o n d i t i o n D e s c r i p t i o n _ 4 < / P r o m p t e d R e s u l t C o n d i t i o n D e s c r i p t i o n _ 4 > + 
+             < P r o m p t e d R e s u l t C o n d i t i o n D e s c r i p t i o n _ 5   E l e m e n t T y p e = " C o l u m n "   E l e m e n t I d = " 3 2 5 6 3 6 0 6 "   D a t a T y p e = " T e x t " > P r o m p t e d R e s u l t C o n d i t i o n D e s c r i p t i o n _ 5 < / P r o m p t e d R e s u l t C o n d i t i o n D e s c r i p t i o n _ 5 > + 
+             < P r o m p t e d R e s u l t C o n d i t i o n D e s c r i p t i o n _ 6   E l e m e n t T y p e = " C o l u m n "   E l e m e n t I d = " 6 0 5 1 3 3 0 1 1 "   D a t a T y p e = " T e x t " > P r o m p t e d R e s u l t C o n d i t i o n D e s c r i p t i o n _ 6 < / P r o m p t e d R e s u l t C o n d i t i o n D e s c r i p t i o n _ 6 > + 
+             < P r o m p t e d R e s u l t C o n d i t i o n D e s c r i p t i o n _ 7   E l e m e n t T y p e = " C o l u m n "   E l e m e n t I d = " 1 2 4 2 8 2 9 6 2 8 "   D a t a T y p e = " T e x t " > P r o m p t e d R e s u l t C o n d i t i o n D e s c r i p t i o n _ 7 < / P r o m p t e d R e s u l t C o n d i t i o n D e s c r i p t i o n _ 7 > + 
+             < P r o m p t e d R e s u l t C o n d i t i o n D e s c r i p t i o n _ 8   E l e m e n t T y p e = " C o l u m n "   E l e m e n t I d = " 1 0 7 3 9 2 0 6 0 5 "   D a t a T y p e = " T e x t " > P r o m p t e d R e s u l t C o n d i t i o n D e s c r i p t i o n _ 8 < / P r o m p t e d R e s u l t C o n d i t i o n D e s c r i p t i o n _ 8 > + 
+             < P r o m p t e d R e s u l t C o n d i t i o n D e s c r i p t i o n _ 9   E l e m e n t T y p e = " C o l u m n "   E l e m e n t I d = " 1 7 1 1 6 1 7 2 2 2 "   D a t a T y p e = " T e x t " > P r o m p t e d R e s u l t C o n d i t i o n D e s c r i p t i o n _ 9 < / P r o m p t e d R e s u l t C o n d i t i o n D e s c r i p t i o n _ 9 > + 
+             < P r o m p t e d R e s u l t V i s i b l e _ 1   E l e m e n t T y p e = " C o l u m n "   E l e m e n t I d = " 1 3 9 9 7 0 4 4 1 7 "   D a t a T y p e = " B o o l e a n " > P r o m p t e d R e s u l t V i s i b l e _ 1 < / P r o m p t e d R e s u l t V i s i b l e _ 1 > + 
+             < P r o m p t e d R e s u l t V i s i b l e _ 1 0   E l e m e n t T y p e = " C o l u m n "   E l e m e n t I d = " 6 6 3 6 8 2 6 1 7 "   D a t a T y p e = " B o o l e a n " > P r o m p t e d R e s u l t V i s i b l e _ 1 0 < / P r o m p t e d R e s u l t V i s i b l e _ 1 0 > + 
+             < P r o m p t e d R e s u l t V i s i b l e _ 2   E l e m e n t T y p e = " C o l u m n "   E l e m e n t I d = " 2 0 3 7 4 0 1 0 3 4 "   D a t a T y p e = " B o o l e a n " > P r o m p t e d R e s u l t V i s i b l e _ 2 < / P r o m p t e d R e s u l t V i s i b l e _ 2 > + 
+             < P r o m p t e d R e s u l t V i s i b l e _ 3   E l e m e n t T y p e = " C o l u m n "   E l e m e n t I d = " 1 6 1 9 8 6 9 6 4 5 "   D a t a T y p e = " B o o l e a n " > P r o m p t e d R e s u l t V i s i b l e _ 3 < / P r o m p t e d R e s u l t V i s i b l e _ 3 > + 
+             < P r o m p t e d R e s u l t V i s i b l e _ 4   E l e m e n t T y p e = " C o l u m n "   E l e m e n t I d = " 9 8 2 1 7 3 0 2 8 "   D a t a T y p e = " B o o l e a n " > P r o m p t e d R e s u l t V i s i b l e _ 4 < / P r o m p t e d R e s u l t V i s i b l e _ 4 > + 
+             < P r o m p t e d R e s u l t V i s i b l e _ 5   E l e m e n t T y p e = " C o l u m n "   E l e m e n t I d = " 3 4 4 4 7 6 4 1 1 "   D a t a T y p e = " B o o l e a n " > P r o m p t e d R e s u l t V i s i b l e _ 5 < / P r o m p t e d R e s u l t V i s i b l e _ 5 > + 
+             < P r o m p t e d R e s u l t V i s i b l e _ 6   E l e m e n t T y p e = " C o l u m n "   E l e m e n t I d = " 2 9 3 2 2 0 2 0 6 "   D a t a T y p e = " B o o l e a n " > P r o m p t e d R e s u l t V i s i b l e _ 6 < / P r o m p t e d R e s u l t V i s i b l e _ 6 > + 
+             < P r o m p t e d R e s u l t V i s i b l e _ 7   E l e m e n t T y p e = " C o l u m n "   E l e m e n t I d = " 9 3 0 9 1 6 8 2 3 "   D a t a T y p e = " B o o l e a n " > P r o m p t e d R e s u l t V i s i b l e _ 7 < / P r o m p t e d R e s u l t V i s i b l e _ 7 > + 
+             < P r o m p t e d R e s u l t V i s i b l e _ 8   E l e m e n t T y p e = " C o l u m n "   E l e m e n t I d = " 4 4 5 9 7 8 4 0 "   D a t a T y p e = " B o o l e a n " > P r o m p t e d R e s u l t V i s i b l e _ 8 < / P r o m p t e d R e s u l t V i s i b l e _ 8 > + 
+             < P r o m p t e d R e s u l t V i s i b l e _ 9   E l e m e n t T y p e = " C o l u m n "   E l e m e n t I d = " 5 9 3 0 9 8 7 7 7 "   D a t a T y p e = " B o o l e a n " > P r o m p t e d R e s u l t V i s i b l e _ 9 < / P r o m p t e d R e s u l t V i s i b l e _ 9 > + 
+             < T e s t _ R e s u l t   E l e m e n t T y p e = " C o l u m n "   E l e m e n t I d = " 1 2 7 1 0 6 2 1 4 1 "   D a t a T y p e = " C o d e " > T e s t _ R e s u l t < / T e s t _ R e s u l t > + 
+             < T e s t _ R e s u l t D e s c r i p t i o n   E l e m e n t T y p e = " C o l u m n "   E l e m e n t I d = " 1 9 4 3 4 5 8 6 8 5 "   D a t a T y p e = " T e x t " > T e s t _ R e s u l t D e s c r i p t i o n < / T e s t _ R e s u l t D e s c r i p t i o n >   
              < T e s t _ V a l u e   E l e m e n t T y p e = " C o l u m n "   E l e m e n t I d = " 8 1 3 5 6 4 5 2 1 "   D a t a T y p e = " T e x t " > T e s t _ V a l u e < / T e s t _ V a l u e >   
-         < / C u r r e n t T e s t L i n e > - 
-     < / C u r r e n t T e s t > +         < / C u r r e n t I n s p e c t i o n L i n e > + 
+     < / C u r r e n t I n s p e c t i o n >   
  < / N a v W o r d R e p o r t X m l P a r t > 
 </file>
 
-<file path=customXml/item2.xml>��< ? x m l   v e r s i o n = " 1 . 0 "   e n c o d i n g = " u t f - 1 6 " ? > < N a v W o r d R e p o r t X m l P a r t   x m l n s = " u r n : m i c r o s o f t - d y n a m i c s - n a v / r e p o r t s / Q l t y _ C e r t i f i c a t e _ o f _ A n a l y s i s / 2 0 4 0 1 / " > +<file path=customXml/item2.xml>��< ? x m l   v e r s i o n = " 1 . 0 "   e n c o d i n g = " u t f - 1 6 " ? > + 
+ < N a v W o r d R e p o r t X m l P a r t   x m l n s = " u r n : m i c r o s o f t - d y n a m i c s - n a v / r e p o r t s / Q l t y _ C e r t i f i c a t e _ o f _ A n a l y s i s / 2 0 4 0 1 / " >   
      < B C R e p o r t I n f o r m a t i o n >   
@@ -4939,7 +4941,7 @@
  
      < / B C R e p o r t I n f o r m a t i o n >   
-     < C u r r e n t T e s t > +     < C u r r e n t I n s p e c t i o n >   
          < C O A C o n t a c t _ A l l > C O A C o n t a c t _ A l l < / C O A C o n t a c t _ A l l >   
@@ -4977,73 +4979,73 @@
  
          < C o m p a n y I n f o r m a t i o n _ R o w 8 > C o m p a n y I n f o r m a t i o n _ R o w 8 < / C o m p a n y I n f o r m a t i o n _ R o w 8 >   
-         < Q I T e m p l a t e _ D e s c r i p t i o n > Q I T e m p l a t e _ D e s c r i p t i o n < / Q I T e m p l a t e _ D e s c r i p t i o n > - 
-         < Q I T e s t _ D e s c r i p t i o n > Q I T e s t _ D e s c r i p t i o n < / Q I T e s t _ D e s c r i p t i o n > - 
-         < Q I T e s t _ D i r e c t o r _ N a m e > Q I T e s t _ D i r e c t o r _ N a m e < / Q I T e s t _ D i r e c t o r _ N a m e > - 
-         < Q I T e s t _ D i r e c t o r _ T i t l e > Q I T e s t _ D i r e c t o r _ T i t l e < / Q I T e s t _ D i r e c t o r _ T i t l e > - 
-         < Q I T e s t _ F i n i s h e d _ B y _ E m a i l > Q I T e s t _ F i n i s h e d _ B y _ E m a i l < / Q I T e s t _ F i n i s h e d _ B y _ E m a i l > - 
-         < Q I T e s t _ F i n i s h e d _ B y _ P h o n e > Q I T e s t _ F i n i s h e d _ B y _ P h o n e < / Q I T e s t _ F i n i s h e d _ B y _ P h o n e > - 
-         < Q I T e s t _ F i n i s h e d _ B y _ T i t l e > Q I T e s t _ F i n i s h e d _ B y _ T i t l e < / Q I T e s t _ F i n i s h e d _ B y _ T i t l e > - 
-         < Q I T e s t _ F i n i s h e d _ B y _ U s e r N a m e > Q I T e s t _ F i n i s h e d _ B y _ U s e r N a m e < / Q I T e s t _ F i n i s h e d _ B y _ U s e r N a m e > - 
-         < Q I T e s t _ F i n i s h e d _ B y _ U s e r _ I D > Q I T e s t _ F i n i s h e d _ B y _ U s e r _ I D < / Q I T e s t _ F i n i s h e d _ B y _ U s e r _ I D > - 
-         < Q I T e s t _ F i n i s h e d _ D a t e > Q I T e s t _ F i n i s h e d _ D a t e < / Q I T e s t _ F i n i s h e d _ D a t e > - 
-         < Q I T e s t _ G r a d e _ C o d e > Q I T e s t _ G r a d e _ C o d e < / Q I T e s t _ G r a d e _ C o d e > - 
-         < Q I T e s t _ G r a d e _ D e s c r i p t i o n > Q I T e s t _ G r a d e _ D e s c r i p t i o n < / Q I T e s t _ G r a d e _ D e s c r i p t i o n > - 
-         < Q I T e s t _ N o > Q I T e s t _ N o < / Q I T e s t _ N o > - 
-         < Q I T e s t _ R e t e s t N o > Q I T e s t _ R e t e s t N o < / Q I T e s t _ R e t e s t N o > - 
-         < Q I T e s t _ S o u r c e _ C u s t o m _ 1 > Q I T e s t _ S o u r c e _ C u s t o m _ 1 < / Q I T e s t _ S o u r c e _ C u s t o m _ 1 > - 
-         < Q I T e s t _ S o u r c e _ C u s t o m _ 1 0 > Q I T e s t _ S o u r c e _ C u s t o m _ 1 0 < / Q I T e s t _ S o u r c e _ C u s t o m _ 1 0 > - 
-         < Q I T e s t _ S o u r c e _ C u s t o m _ 2 > Q I T e s t _ S o u r c e _ C u s t o m _ 2 < / Q I T e s t _ S o u r c e _ C u s t o m _ 2 > - 
-         < Q I T e s t _ S o u r c e _ C u s t o m _ 3 > Q I T e s t _ S o u r c e _ C u s t o m _ 3 < / Q I T e s t _ S o u r c e _ C u s t o m _ 3 > - 
-         < Q I T e s t _ S o u r c e _ C u s t o m _ 4 > Q I T e s t _ S o u r c e _ C u s t o m _ 4 < / Q I T e s t _ S o u r c e _ C u s t o m _ 4 > - 
-         < Q I T e s t _ S o u r c e _ C u s t o m _ 5 > Q I T e s t _ S o u r c e _ C u s t o m _ 5 < / Q I T e s t _ S o u r c e _ C u s t o m _ 5 > - 
-         < Q I T e s t _ S o u r c e _ C u s t o m _ 6 > Q I T e s t _ S o u r c e _ C u s t o m _ 6 < / Q I T e s t _ S o u r c e _ C u s t o m _ 6 > - 
-         < Q I T e s t _ S o u r c e _ C u s t o m _ 7 > Q I T e s t _ S o u r c e _ C u s t o m _ 7 < / Q I T e s t _ S o u r c e _ C u s t o m _ 7 > - 
-         < Q I T e s t _ S o u r c e _ C u s t o m _ 8 > Q I T e s t _ S o u r c e _ C u s t o m _ 8 < / Q I T e s t _ S o u r c e _ C u s t o m _ 8 > - 
-         < Q I T e s t _ S o u r c e _ C u s t o m _ 9 > Q I T e s t _ S o u r c e _ C u s t o m _ 9 < / Q I T e s t _ S o u r c e _ C u s t o m _ 9 > - 
-         < Q I T e s t _ S o u r c e _ D o c u m e n t _ N o _ > Q I T e s t _ S o u r c e _ D o c u m e n t _ N o _ < / Q I T e s t _ S o u r c e _ D o c u m e n t _ N o _ > - 
-         < Q I T e s t _ S o u r c e _ I t e m _ D e s c r i p t i o n > Q I T e s t _ S o u r c e _ I t e m _ D e s c r i p t i o n < / Q I T e s t _ S o u r c e _ I t e m _ D e s c r i p t i o n > - 
-         < Q I T e s t _ S o u r c e _ I t e m _ D e s c r i p t i o n 2 > Q I T e s t _ S o u r c e _ I t e m _ D e s c r i p t i o n 2 < / Q I T e s t _ S o u r c e _ I t e m _ D e s c r i p t i o n 2 > - 
-         < Q I T e s t _ S o u r c e _ I t e m _ N o _ > Q I T e s t _ S o u r c e _ I t e m _ N o _ < / Q I T e s t _ S o u r c e _ I t e m _ N o _ > - 
-         < Q I T e s t _ S o u r c e _ L o t _ N o _ > Q I T e s t _ S o u r c e _ L o t _ N o _ < / Q I T e s t _ S o u r c e _ L o t _ N o _ > - 
-         < Q I T e s t _ S o u r c e _ S e r i a l _ N o _ > Q I T e s t _ S o u r c e _ S e r i a l _ N o _ < / Q I T e s t _ S o u r c e _ S e r i a l _ N o _ > - 
-         < Q I T e s t _ S o u r c e _ T a s k _ N o _ > Q I T e s t _ S o u r c e _ T a s k _ N o _ < / Q I T e s t _ S o u r c e _ T a s k _ N o _ > - 
-         < Q I T e s t _ S o u r c e _ V a r i a n t _ C o d e > Q I T e s t _ S o u r c e _ V a r i a n t _ C o d e < / Q I T e s t _ S o u r c e _ V a r i a n t _ C o d e > - 
-         < Q I T e s t _ S t a t u s > Q I T e s t _ S t a t u s < / Q I T e s t _ S t a t u s > - 
-         < C u r r e n t T e s t L i n e > +         < Q l t y I n s p e c t i o n T e m p l a t e _ D e s c r i p t i o n > Q l t y I n s p e c t i o n T e m p l a t e _ D e s c r i p t i o n < / Q l t y I n s p e c t i o n T e m p l a t e _ D e s c r i p t i o n > + 
+         < Q l t y I n s p e c t i o n _ D e s c r i p t i o n > Q l t y I n s p e c t i o n _ D e s c r i p t i o n < / Q l t y I n s p e c t i o n _ D e s c r i p t i o n > + 
+         < Q l t y I n s p e c t i o n _ D i r e c t o r _ N a m e > Q l t y I n s p e c t i o n _ D i r e c t o r _ N a m e < / Q l t y I n s p e c t i o n _ D i r e c t o r _ N a m e > + 
+         < Q l t y I n s p e c t i o n _ D i r e c t o r _ T i t l e > Q l t y I n s p e c t i o n _ D i r e c t o r _ T i t l e < / Q l t y I n s p e c t i o n _ D i r e c t o r _ T i t l e > + 
+         < Q l t y I n s p e c t i o n _ F i n i s h e d _ B y _ E m a i l > Q l t y I n s p e c t i o n _ F i n i s h e d _ B y _ E m a i l < / Q l t y I n s p e c t i o n _ F i n i s h e d _ B y _ E m a i l > + 
+         < Q l t y I n s p e c t i o n _ F i n i s h e d _ B y _ P h o n e > Q l t y I n s p e c t i o n _ F i n i s h e d _ B y _ P h o n e < / Q l t y I n s p e c t i o n _ F i n i s h e d _ B y _ P h o n e > + 
+         < Q l t y I n s p e c t i o n _ F i n i s h e d _ B y _ T i t l e > Q l t y I n s p e c t i o n _ F i n i s h e d _ B y _ T i t l e < / Q l t y I n s p e c t i o n _ F i n i s h e d _ B y _ T i t l e > + 
+         < Q l t y I n s p e c t i o n _ F i n i s h e d _ B y _ U s e r N a m e > Q l t y I n s p e c t i o n _ F i n i s h e d _ B y _ U s e r N a m e < / Q l t y I n s p e c t i o n _ F i n i s h e d _ B y _ U s e r N a m e > + 
+         < Q l t y I n s p e c t i o n _ F i n i s h e d _ B y _ U s e r _ I D > Q l t y I n s p e c t i o n _ F i n i s h e d _ B y _ U s e r _ I D < / Q l t y I n s p e c t i o n _ F i n i s h e d _ B y _ U s e r _ I D > + 
+         < Q l t y I n s p e c t i o n _ F i n i s h e d _ D a t e > Q l t y I n s p e c t i o n _ F i n i s h e d _ D a t e < / Q l t y I n s p e c t i o n _ F i n i s h e d _ D a t e > + 
+         < Q l t y I n s p e c t i o n _ N o > Q l t y I n s p e c t i o n _ N o < / Q l t y I n s p e c t i o n _ N o > + 
+         < Q l t y I n s p e c t i o n _ R e i n s p e c t i o n N o > Q l t y I n s p e c t i o n _ R e i n s p e c t i o n N o < / Q l t y I n s p e c t i o n _ R e i n s p e c t i o n N o > + 
+         < Q l t y I n s p e c t i o n _ R e s u l t _ C o d e > Q l t y I n s p e c t i o n _ R e s u l t _ C o d e < / Q l t y I n s p e c t i o n _ R e s u l t _ C o d e > + 
+         < Q l t y I n s p e c t i o n _ R e s u l t _ D e s c r i p t i o n > Q l t y I n s p e c t i o n _ R e s u l t _ D e s c r i p t i o n < / Q l t y I n s p e c t i o n _ R e s u l t _ D e s c r i p t i o n > + 
+         < Q l t y I n s p e c t i o n _ S o u r c e _ C u s t o m _ 1 > Q l t y I n s p e c t i o n _ S o u r c e _ C u s t o m _ 1 < / Q l t y I n s p e c t i o n _ S o u r c e _ C u s t o m _ 1 > + 
+         < Q l t y I n s p e c t i o n _ S o u r c e _ C u s t o m _ 1 0 > Q l t y I n s p e c t i o n _ S o u r c e _ C u s t o m _ 1 0 < / Q l t y I n s p e c t i o n _ S o u r c e _ C u s t o m _ 1 0 > + 
+         < Q l t y I n s p e c t i o n _ S o u r c e _ C u s t o m _ 2 > Q l t y I n s p e c t i o n _ S o u r c e _ C u s t o m _ 2 < / Q l t y I n s p e c t i o n _ S o u r c e _ C u s t o m _ 2 > + 
+         < Q l t y I n s p e c t i o n _ S o u r c e _ C u s t o m _ 3 > Q l t y I n s p e c t i o n _ S o u r c e _ C u s t o m _ 3 < / Q l t y I n s p e c t i o n _ S o u r c e _ C u s t o m _ 3 > + 
+         < Q l t y I n s p e c t i o n _ S o u r c e _ C u s t o m _ 4 > Q l t y I n s p e c t i o n _ S o u r c e _ C u s t o m _ 4 < / Q l t y I n s p e c t i o n _ S o u r c e _ C u s t o m _ 4 > + 
+         < Q l t y I n s p e c t i o n _ S o u r c e _ C u s t o m _ 5 > Q l t y I n s p e c t i o n _ S o u r c e _ C u s t o m _ 5 < / Q l t y I n s p e c t i o n _ S o u r c e _ C u s t o m _ 5 > + 
+         < Q l t y I n s p e c t i o n _ S o u r c e _ C u s t o m _ 6 > Q l t y I n s p e c t i o n _ S o u r c e _ C u s t o m _ 6 < / Q l t y I n s p e c t i o n _ S o u r c e _ C u s t o m _ 6 > + 
+         < Q l t y I n s p e c t i o n _ S o u r c e _ C u s t o m _ 7 > Q l t y I n s p e c t i o n _ S o u r c e _ C u s t o m _ 7 < / Q l t y I n s p e c t i o n _ S o u r c e _ C u s t o m _ 7 > + 
+         < Q l t y I n s p e c t i o n _ S o u r c e _ C u s t o m _ 8 > Q l t y I n s p e c t i o n _ S o u r c e _ C u s t o m _ 8 < / Q l t y I n s p e c t i o n _ S o u r c e _ C u s t o m _ 8 > + 
+         < Q l t y I n s p e c t i o n _ S o u r c e _ C u s t o m _ 9 > Q l t y I n s p e c t i o n _ S o u r c e _ C u s t o m _ 9 < / Q l t y I n s p e c t i o n _ S o u r c e _ C u s t o m _ 9 > + 
+         < Q l t y I n s p e c t i o n _ S o u r c e _ D o c u m e n t _ N o _ > Q l t y I n s p e c t i o n _ S o u r c e _ D o c u m e n t _ N o _ < / Q l t y I n s p e c t i o n _ S o u r c e _ D o c u m e n t _ N o _ > + 
+         < Q l t y I n s p e c t i o n _ S o u r c e _ I t e m _ D e s c r i p t i o n > Q l t y I n s p e c t i o n _ S o u r c e _ I t e m _ D e s c r i p t i o n < / Q l t y I n s p e c t i o n _ S o u r c e _ I t e m _ D e s c r i p t i o n > + 
+         < Q l t y I n s p e c t i o n _ S o u r c e _ I t e m _ D e s c r i p t i o n 2 > Q l t y I n s p e c t i o n _ S o u r c e _ I t e m _ D e s c r i p t i o n 2 < / Q l t y I n s p e c t i o n _ S o u r c e _ I t e m _ D e s c r i p t i o n 2 > + 
+         < Q l t y I n s p e c t i o n _ S o u r c e _ I t e m _ N o _ > Q l t y I n s p e c t i o n _ S o u r c e _ I t e m _ N o _ < / Q l t y I n s p e c t i o n _ S o u r c e _ I t e m _ N o _ > + 
+         < Q l t y I n s p e c t i o n _ S o u r c e _ L o t _ N o _ > Q l t y I n s p e c t i o n _ S o u r c e _ L o t _ N o _ < / Q l t y I n s p e c t i o n _ S o u r c e _ L o t _ N o _ > + 
+         < Q l t y I n s p e c t i o n _ S o u r c e _ S e r i a l _ N o _ > Q l t y I n s p e c t i o n _ S o u r c e _ S e r i a l _ N o _ < / Q l t y I n s p e c t i o n _ S o u r c e _ S e r i a l _ N o _ > + 
+         < Q l t y I n s p e c t i o n _ S o u r c e _ T a s k _ N o _ > Q l t y I n s p e c t i o n _ S o u r c e _ T a s k _ N o _ < / Q l t y I n s p e c t i o n _ S o u r c e _ T a s k _ N o _ > + 
+         < Q l t y I n s p e c t i o n _ S o u r c e _ V a r i a n t _ C o d e > Q l t y I n s p e c t i o n _ S o u r c e _ V a r i a n t _ C o d e < / Q l t y I n s p e c t i o n _ S o u r c e _ V a r i a n t _ C o d e > + 
+         < Q l t y I n s p e c t i o n _ S t a t u s > Q l t y I n s p e c t i o n _ S t a t u s < / Q l t y I n s p e c t i o n _ S t a t u s > + 
+         < C u r r e n t I n s p e c t i o n L i n e >   
              < F i e l d _ C o d e > F i e l d _ C o d e < / F i e l d _ C o d e >   
@@ -5085,75 +5087,75 @@
  
              < N u m e r i c _ V a l u e > N u m e r i c _ V a l u e < / N u m e r i c _ V a l u e >   
-             < P r o m p t e d G r a d e C a p t i o n _ 1 > P r o m p t e d G r a d e C a p t i o n _ 1 < / P r o m p t e d G r a d e C a p t i o n _ 1 > - 
-             < P r o m p t e d G r a d e C a p t i o n _ 1 0 > P r o m p t e d G r a d e C a p t i o n _ 1 0 < / P r o m p t e d G r a d e C a p t i o n _ 1 0 > - 
-             < P r o m p t e d G r a d e C a p t i o n _ 2 > P r o m p t e d G r a d e C a p t i o n _ 2 < / P r o m p t e d G r a d e C a p t i o n _ 2 > - 
-             < P r o m p t e d G r a d e C a p t i o n _ 3 > P r o m p t e d G r a d e C a p t i o n _ 3 < / P r o m p t e d G r a d e C a p t i o n _ 3 > - 
-             < P r o m p t e d G r a d e C a p t i o n _ 4 > P r o m p t e d G r a d e C a p t i o n _ 4 < / P r o m p t e d G r a d e C a p t i o n _ 4 > - 
-             < P r o m p t e d G r a d e C a p t i o n _ 5 > P r o m p t e d G r a d e C a p t i o n _ 5 < / P r o m p t e d G r a d e C a p t i o n _ 5 > - 
-             < P r o m p t e d G r a d e C a p t i o n _ 6 > P r o m p t e d G r a d e C a p t i o n _ 6 < / P r o m p t e d G r a d e C a p t i o n _ 6 > - 
-             < P r o m p t e d G r a d e C a p t i o n _ 7 > P r o m p t e d G r a d e C a p t i o n _ 7 < / P r o m p t e d G r a d e C a p t i o n _ 7 > - 
-             < P r o m p t e d G r a d e C a p t i o n _ 8 > P r o m p t e d G r a d e C a p t i o n _ 8 < / P r o m p t e d G r a d e C a p t i o n _ 8 > - 
-             < P r o m p t e d G r a d e C a p t i o n _ 9 > P r o m p t e d G r a d e C a p t i o n _ 9 < / P r o m p t e d G r a d e C a p t i o n _ 9 > - 
-             < P r o m p t e d G r a d e C o n d i t i o n D e s c r i p t i o n _ 1 > P r o m p t e d G r a d e C o n d i t i o n D e s c r i p t i o n _ 1 < / P r o m p t e d G r a d e C o n d i t i o n D e s c r i p t i o n _ 1 > - 
-             < P r o m p t e d G r a d e C o n d i t i o n D e s c r i p t i o n _ 1 0 > P r o m p t e d G r a d e C o n d i t i o n D e s c r i p t i o n _ 1 0 < / P r o m p t e d G r a d e C o n d i t i o n D e s c r i p t i o n _ 1 0 > - 
-             < P r o m p t e d G r a d e C o n d i t i o n D e s c r i p t i o n _ 2 > P r o m p t e d G r a d e C o n d i t i o n D e s c r i p t i o n _ 2 < / P r o m p t e d G r a d e C o n d i t i o n D e s c r i p t i o n _ 2 > - 
-             < P r o m p t e d G r a d e C o n d i t i o n D e s c r i p t i o n _ 3 > P r o m p t e d G r a d e C o n d i t i o n D e s c r i p t i o n _ 3 < / P r o m p t e d G r a d e C o n d i t i o n D e s c r i p t i o n _ 3 > - 
-             < P r o m p t e d G r a d e C o n d i t i o n D e s c r i p t i o n _ 4 > P r o m p t e d G r a d e C o n d i t i o n D e s c r i p t i o n _ 4 < / P r o m p t e d G r a d e C o n d i t i o n D e s c r i p t i o n _ 4 > - 
-             < P r o m p t e d G r a d e C o n d i t i o n D e s c r i p t i o n _ 5 > P r o m p t e d G r a d e C o n d i t i o n D e s c r i p t i o n _ 5 < / P r o m p t e d G r a d e C o n d i t i o n D e s c r i p t i o n _ 5 > - 
-             < P r o m p t e d G r a d e C o n d i t i o n D e s c r i p t i o n _ 6 > P r o m p t e d G r a d e C o n d i t i o n D e s c r i p t i o n _ 6 < / P r o m p t e d G r a d e C o n d i t i o n D e s c r i p t i o n _ 6 > - 
-             < P r o m p t e d G r a d e C o n d i t i o n D e s c r i p t i o n _ 7 > P r o m p t e d G r a d e C o n d i t i o n D e s c r i p t i o n _ 7 < / P r o m p t e d G r a d e C o n d i t i o n D e s c r i p t i o n _ 7 > - 
-             < P r o m p t e d G r a d e C o n d i t i o n D e s c r i p t i o n _ 8 > P r o m p t e d G r a d e C o n d i t i o n D e s c r i p t i o n _ 8 < / P r o m p t e d G r a d e C o n d i t i o n D e s c r i p t i o n _ 8 > - 
-             < P r o m p t e d G r a d e C o n d i t i o n D e s c r i p t i o n _ 9 > P r o m p t e d G r a d e C o n d i t i o n D e s c r i p t i o n _ 9 < / P r o m p t e d G r a d e C o n d i t i o n D e s c r i p t i o n _ 9 > - 
-             < P r o m p t e d G r a d e V i s i b l e _ 1 > P r o m p t e d G r a d e V i s i b l e _ 1 < / P r o m p t e d G r a d e V i s i b l e _ 1 > - 
-             < P r o m p t e d G r a d e V i s i b l e _ 1 0 > P r o m p t e d G r a d e V i s i b l e _ 1 0 < / P r o m p t e d G r a d e V i s i b l e _ 1 0 > - 
-             < P r o m p t e d G r a d e V i s i b l e _ 2 > P r o m p t e d G r a d e V i s i b l e _ 2 < / P r o m p t e d G r a d e V i s i b l e _ 2 > - 
-             < P r o m p t e d G r a d e V i s i b l e _ 3 > P r o m p t e d G r a d e V i s i b l e _ 3 < / P r o m p t e d G r a d e V i s i b l e _ 3 > - 
-             < P r o m p t e d G r a d e V i s i b l e _ 4 > P r o m p t e d G r a d e V i s i b l e _ 4 < / P r o m p t e d G r a d e V i s i b l e _ 4 > - 
-             < P r o m p t e d G r a d e V i s i b l e _ 5 > P r o m p t e d G r a d e V i s i b l e _ 5 < / P r o m p t e d G r a d e V i s i b l e _ 5 > - 
-             < P r o m p t e d G r a d e V i s i b l e _ 6 > P r o m p t e d G r a d e V i s i b l e _ 6 < / P r o m p t e d G r a d e V i s i b l e _ 6 > - 
-             < P r o m p t e d G r a d e V i s i b l e _ 7 > P r o m p t e d G r a d e V i s i b l e _ 7 < / P r o m p t e d G r a d e V i s i b l e _ 7 > - 
-             < P r o m p t e d G r a d e V i s i b l e _ 8 > P r o m p t e d G r a d e V i s i b l e _ 8 < / P r o m p t e d G r a d e V i s i b l e _ 8 > - 
-             < P r o m p t e d G r a d e V i s i b l e _ 9 > P r o m p t e d G r a d e V i s i b l e _ 9 < / P r o m p t e d G r a d e V i s i b l e _ 9 > - 
-             < T e s t _ G r a d e > T e s t _ G r a d e < / T e s t _ G r a d e > - 
-             < T e s t _ G r a d e D e s c r i p t i o n > T e s t _ G r a d e D e s c r i p t i o n < / T e s t _ G r a d e D e s c r i p t i o n > +             < P r o m p t e d R e s u l t C a p t i o n _ 1 > P r o m p t e d R e s u l t C a p t i o n _ 1 < / P r o m p t e d R e s u l t C a p t i o n _ 1 > + 
+             < P r o m p t e d R e s u l t C a p t i o n _ 1 0 > P r o m p t e d R e s u l t C a p t i o n _ 1 0 < / P r o m p t e d R e s u l t C a p t i o n _ 1 0 > + 
+             < P r o m p t e d R e s u l t C a p t i o n _ 2 > P r o m p t e d R e s u l t C a p t i o n _ 2 < / P r o m p t e d R e s u l t C a p t i o n _ 2 > + 
+             < P r o m p t e d R e s u l t C a p t i o n _ 3 > P r o m p t e d R e s u l t C a p t i o n _ 3 < / P r o m p t e d R e s u l t C a p t i o n _ 3 > + 
+             < P r o m p t e d R e s u l t C a p t i o n _ 4 > P r o m p t e d R e s u l t C a p t i o n _ 4 < / P r o m p t e d R e s u l t C a p t i o n _ 4 > + 
+             < P r o m p t e d R e s u l t C a p t i o n _ 5 > P r o m p t e d R e s u l t C a p t i o n _ 5 < / P r o m p t e d R e s u l t C a p t i o n _ 5 > + 
+             < P r o m p t e d R e s u l t C a p t i o n _ 6 > P r o m p t e d R e s u l t C a p t i o n _ 6 < / P r o m p t e d R e s u l t C a p t i o n _ 6 > + 
+             < P r o m p t e d R e s u l t C a p t i o n _ 7 > P r o m p t e d R e s u l t C a p t i o n _ 7 < / P r o m p t e d R e s u l t C a p t i o n _ 7 > + 
+             < P r o m p t e d R e s u l t C a p t i o n _ 8 > P r o m p t e d R e s u l t C a p t i o n _ 8 < / P r o m p t e d R e s u l t C a p t i o n _ 8 > + 
+             < P r o m p t e d R e s u l t C a p t i o n _ 9 > P r o m p t e d R e s u l t C a p t i o n _ 9 < / P r o m p t e d R e s u l t C a p t i o n _ 9 > + 
+             < P r o m p t e d R e s u l t C o n d i t i o n D e s c r i p t i o n _ 1 > P r o m p t e d R e s u l t C o n d i t i o n D e s c r i p t i o n _ 1 < / P r o m p t e d R e s u l t C o n d i t i o n D e s c r i p t i o n _ 1 > + 
+             < P r o m p t e d R e s u l t C o n d i t i o n D e s c r i p t i o n _ 1 0 > P r o m p t e d R e s u l t C o n d i t i o n D e s c r i p t i o n _ 1 0 < / P r o m p t e d R e s u l t C o n d i t i o n D e s c r i p t i o n _ 1 0 > + 
+             < P r o m p t e d R e s u l t C o n d i t i o n D e s c r i p t i o n _ 2 > P r o m p t e d R e s u l t C o n d i t i o n D e s c r i p t i o n _ 2 < / P r o m p t e d R e s u l t C o n d i t i o n D e s c r i p t i o n _ 2 > + 
+             < P r o m p t e d R e s u l t C o n d i t i o n D e s c r i p t i o n _ 3 > P r o m p t e d R e s u l t C o n d i t i o n D e s c r i p t i o n _ 3 < / P r o m p t e d R e s u l t C o n d i t i o n D e s c r i p t i o n _ 3 > + 
+             < P r o m p t e d R e s u l t C o n d i t i o n D e s c r i p t i o n _ 4 > P r o m p t e d R e s u l t C o n d i t i o n D e s c r i p t i o n _ 4 < / P r o m p t e d R e s u l t C o n d i t i o n D e s c r i p t i o n _ 4 > + 
+             < P r o m p t e d R e s u l t C o n d i t i o n D e s c r i p t i o n _ 5 > P r o m p t e d R e s u l t C o n d i t i o n D e s c r i p t i o n _ 5 < / P r o m p t e d R e s u l t C o n d i t i o n D e s c r i p t i o n _ 5 > + 
+             < P r o m p t e d R e s u l t C o n d i t i o n D e s c r i p t i o n _ 6 > P r o m p t e d R e s u l t C o n d i t i o n D e s c r i p t i o n _ 6 < / P r o m p t e d R e s u l t C o n d i t i o n D e s c r i p t i o n _ 6 > + 
+             < P r o m p t e d R e s u l t C o n d i t i o n D e s c r i p t i o n _ 7 > P r o m p t e d R e s u l t C o n d i t i o n D e s c r i p t i o n _ 7 < / P r o m p t e d R e s u l t C o n d i t i o n D e s c r i p t i o n _ 7 > + 
+             < P r o m p t e d R e s u l t C o n d i t i o n D e s c r i p t i o n _ 8 > P r o m p t e d R e s u l t C o n d i t i o n D e s c r i p t i o n _ 8 < / P r o m p t e d R e s u l t C o n d i t i o n D e s c r i p t i o n _ 8 > + 
+             < P r o m p t e d R e s u l t C o n d i t i o n D e s c r i p t i o n _ 9 > P r o m p t e d R e s u l t C o n d i t i o n D e s c r i p t i o n _ 9 < / P r o m p t e d R e s u l t C o n d i t i o n D e s c r i p t i o n _ 9 > + 
+             < P r o m p t e d R e s u l t V i s i b l e _ 1 > P r o m p t e d R e s u l t V i s i b l e _ 1 < / P r o m p t e d R e s u l t V i s i b l e _ 1 > + 
+             < P r o m p t e d R e s u l t V i s i b l e _ 1 0 > P r o m p t e d R e s u l t V i s i b l e _ 1 0 < / P r o m p t e d R e s u l t V i s i b l e _ 1 0 > + 
+             < P r o m p t e d R e s u l t V i s i b l e _ 2 > P r o m p t e d R e s u l t V i s i b l e _ 2 < / P r o m p t e d R e s u l t V i s i b l e _ 2 > + 
+             < P r o m p t e d R e s u l t V i s i b l e _ 3 > P r o m p t e d R e s u l t V i s i b l e _ 3 < / P r o m p t e d R e s u l t V i s i b l e _ 3 > + 
+             < P r o m p t e d R e s u l t V i s i b l e _ 4 > P r o m p t e d R e s u l t V i s i b l e _ 4 < / P r o m p t e d R e s u l t V i s i b l e _ 4 > + 
+             < P r o m p t e d R e s u l t V i s i b l e _ 5 > P r o m p t e d R e s u l t V i s i b l e _ 5 < / P r o m p t e d R e s u l t V i s i b l e _ 5 > + 
+             < P r o m p t e d R e s u l t V i s i b l e _ 6 > P r o m p t e d R e s u l t V i s i b l e _ 6 < / P r o m p t e d R e s u l t V i s i b l e _ 6 > + 
+             < P r o m p t e d R e s u l t V i s i b l e _ 7 > P r o m p t e d R e s u l t V i s i b l e _ 7 < / P r o m p t e d R e s u l t V i s i b l e _ 7 > + 
+             < P r o m p t e d R e s u l t V i s i b l e _ 8 > P r o m p t e d R e s u l t V i s i b l e _ 8 < / P r o m p t e d R e s u l t V i s i b l e _ 8 > + 
+             < P r o m p t e d R e s u l t V i s i b l e _ 9 > P r o m p t e d R e s u l t V i s i b l e _ 9 < / P r o m p t e d R e s u l t V i s i b l e _ 9 > + 
+             < T e s t _ R e s u l t > T e s t _ R e s u l t < / T e s t _ R e s u l t > + 
+             < T e s t _ R e s u l t D e s c r i p t i o n > T e s t _ R e s u l t D e s c r i p t i o n < / T e s t _ R e s u l t D e s c r i p t i o n >   
              < T e s t _ V a l u e > T e s t _ V a l u e < / T e s t _ V a l u e >   
-         < / C u r r e n t T e s t L i n e > - 
-     < / C u r r e n t T e s t > +         < / C u r r e n t I n s p e c t i o n L i n e > + 
+     < / C u r r e n t I n s p e c t i o n >   
  < / N a v W o r d R e p o r t X m l P a r t > 
 </file>

</xml_diff>

<commit_message>
Sync with NAV version 28.0.45485.0 (#24)
</commit_message>
<xml_diff>
--- a/src/Apps/W1/Quality Management/app/src/Reports/QltyCertificateOfAnalysis.docx
+++ b/src/Apps/W1/Quality Management/app/src/Reports/QltyCertificateOfAnalysis.docx
@@ -4510,13 +4510,13 @@
  
          < T o o l t i p   c o l u m n = " Q l t y I n s p e c t i o n _ R e i n s p e c t i o n N o "   E l e m e n t I d = " 7 5 1 7 3 5 6 " >   
-             < T o o l t i p T e x t   l a n g = " e n - U S " > S p e c i f i e s   w h i c h   r e - i n s p e c t i o n   t h i s   i s   f o r . < / T o o l t i p T e x t > +             < T o o l t i p T e x t   l a n g = " e n - U S " > S p e c i f i e s   t h e   r e - i n s p e c t i o n   c o u n t e r . < / T o o l t i p T e x t >   
          < / T o o l t i p >   
          < T o o l t i p   c o l u m n = " Q l t y I n s p e c t i o n _ F i n i s h e d _ B y _ U s e r _ I D "   E l e m e n t I d = " 1 7 5 0 5 1 6 3 3 8 " >   
-             < T o o l t i p T e x t   l a n g = " e n - U S " > S p e c i f i e s   t h e   u s e r   t h a t   f i n i s h e d   t h e   i n s p e c t i o n < / T o o l t i p T e x t > +             < T o o l t i p T e x t   l a n g = " e n - U S " > S p e c i f i e s   t h e   u s e r   t h a t   f i n i s h e d   t h e   i n s p e c t i o n . < / T o o l t i p T e x t >   
          < / T o o l t i p >   

</xml_diff>

<commit_message>
Certificate of Analysis complete
</commit_message>
<xml_diff>
--- a/src/Apps/W1/Quality Management/app/src/Reports/QltyCertificateOfAnalysis.docx
+++ b/src/Apps/W1/Quality Management/app/src/Reports/QltyCertificateOfAnalysis.docx
@@ -6,12 +6,15 @@
       <w:tblPr>
         <w:tblStyle w:val="TableGrid"/>
         <w:tblW w:w="0" w:type="auto"/>
+        <w:tblLayout w:type="fixed"/>
         <w:tblLook w:val="04A0" w:firstRow="1" w:lastRow="0" w:firstColumn="1" w:lastColumn="0" w:noHBand="0" w:noVBand="1"/>
       </w:tblPr>
       <w:tblGrid>
-        <w:gridCol w:w="2875"/>
-        <w:gridCol w:w="3780"/>
-        <w:gridCol w:w="3780"/>
+        <w:gridCol w:w="2819"/>
+        <w:gridCol w:w="236"/>
+        <w:gridCol w:w="3724"/>
+        <w:gridCol w:w="236"/>
+        <w:gridCol w:w="3441"/>
       </w:tblGrid>
       <w:tr>
         <w:trPr>
@@ -21,14 +24,13 @@
         <w:sdt>
           <w:sdtPr>
             <w:rPr>
-              <w:b w:val="0"/>
               <w:bCs/>
             </w:rPr>
             <w:alias w:val="InspectionLabel"/>
             <w:tag w:val="#BC:InsertDataItem,Labels/InspectionLabel"/>
-            <w:id w:val="553434006"/>
+            <w:id w:val="1793091244"/>
             <w:placeholder>
-              <w:docPart w:val="1CA98067E53C40E9A075D6D0FF2C2B68"/>
+              <w:docPart w:val="689BE888BFF1472D8E27C8760F1B47BA"/>
             </w:placeholder>
             <w:dataBinding w:prefixMappings="xmlns:ns0='urn:microsoft-dynamics-nav/reports/Qlty_Certificate_of_Analysis/20401/'" w:xpath="/ns0:NavWordReportXmlPart[1]/ns0:Labels[1]/ns0:InspectionLabel[1]" w:storeItemID="{F00BF611-06BA-436C-902A-C0D5E8DF929B}"/>
             <w15:color w:val="808080"/>
@@ -37,7 +39,7 @@
           <w:sdtContent>
             <w:tc>
               <w:tcPr>
-                <w:tcW w:w="2875" w:type="dxa"/>
+                <w:tcW w:w="2819" w:type="dxa"/>
                 <w:vAlign w:val="bottom"/>
               </w:tcPr>
               <w:p>
@@ -58,6 +60,18 @@
             </w:tc>
           </w:sdtContent>
         </w:sdt>
+        <w:tc>
+          <w:tcPr>
+            <w:tcW w:w="236" w:type="dxa"/>
+          </w:tcPr>
+          <w:p>
+            <w:pPr>
+              <w:rPr>
+                <w:bCs/>
+              </w:rPr>
+            </w:pPr>
+          </w:p>
+        </w:tc>
         <w:sdt>
           <w:sdtPr>
             <w:rPr>
@@ -65,9 +79,9 @@
             </w:rPr>
             <w:alias w:val="ItemLabel"/>
             <w:tag w:val="#BC:InsertDataItem,Labels/ItemLabel"/>
-            <w:id w:val="-175350019"/>
+            <w:id w:val="498628940"/>
             <w:placeholder>
-              <w:docPart w:val="E6FA60A5C98E4F749DA4ED93BFE20312"/>
+              <w:docPart w:val="FF71EE4101DE474BB9E0488A463E2526"/>
             </w:placeholder>
             <w:dataBinding w:prefixMappings="xmlns:ns0='urn:microsoft-dynamics-nav/reports/Qlty_Certificate_of_Analysis/20401/'" w:xpath="/ns0:NavWordReportXmlPart[1]/ns0:Labels[1]/ns0:ItemLabel[1]" w:storeItemID="{F00BF611-06BA-436C-902A-C0D5E8DF929B}"/>
             <w15:color w:val="808080"/>
@@ -76,7 +90,7 @@
           <w:sdtContent>
             <w:tc>
               <w:tcPr>
-                <w:tcW w:w="3780" w:type="dxa"/>
+                <w:tcW w:w="3724" w:type="dxa"/>
               </w:tcPr>
               <w:p>
                 <w:pPr>
@@ -98,7 +112,19 @@
         </w:sdt>
         <w:tc>
           <w:tcPr>
-            <w:tcW w:w="3780" w:type="dxa"/>
+            <w:tcW w:w="236" w:type="dxa"/>
+          </w:tcPr>
+          <w:p>
+            <w:pPr>
+              <w:rPr>
+                <w:bCs/>
+              </w:rPr>
+            </w:pPr>
+          </w:p>
+        </w:tc>
+        <w:tc>
+          <w:tcPr>
+            <w:tcW w:w="3441" w:type="dxa"/>
           </w:tcPr>
           <w:p>
             <w:pPr>
@@ -113,9 +139,9 @@
                 </w:rPr>
                 <w:alias w:val="ItemTrackingLabel"/>
                 <w:tag w:val="#BC:InsertDataItem,Labels/ItemTrackingLabel"/>
-                <w:id w:val="-307089438"/>
+                <w:id w:val="-1559471266"/>
                 <w:placeholder>
-                  <w:docPart w:val="5B417DC4BDDF47D5BAF07F17E837C7AE"/>
+                  <w:docPart w:val="720D8BC7856F435891DBD9A3EFEBC90B"/>
                 </w:placeholder>
                 <w:dataBinding w:prefixMappings="xmlns:ns0='urn:microsoft-dynamics-nav/reports/Qlty_Certificate_of_Analysis/20401/'" w:xpath="/ns0:NavWordReportXmlPart[1]/ns0:Labels[1]/ns0:ItemTrackingLabel[1]" w:storeItemID="{F00BF611-06BA-436C-902A-C0D5E8DF929B}"/>
                 <w15:color w:val="808080"/>
@@ -138,42 +164,69 @@
       <w:tr>
         <w:tc>
           <w:tcPr>
-            <w:tcW w:w="2875" w:type="dxa"/>
+            <w:tcW w:w="2819" w:type="dxa"/>
           </w:tcPr>
-          <w:sdt>
-            <w:sdtPr>
-              <w:alias w:val="QltyInspection_No"/>
-              <w:tag w:val="#BC:InsertDataItem,DataItems/CurrentInspection/QltyInspection_No"/>
-              <w:id w:val="51897518"/>
-              <w:placeholder>
-                <w:docPart w:val="696A088E51534793916EB4D173AB0EDB"/>
-              </w:placeholder>
-              <w:dataBinding w:prefixMappings="xmlns:ns0='urn:microsoft-dynamics-nav/reports/Qlty_Certificate_of_Analysis/20401/'" w:xpath="/ns0:NavWordReportXmlPart[1]/ns0:CurrentInspection[1]/ns0:QltyInspection_No[1]" w:storeItemID="{F00BF611-06BA-436C-902A-C0D5E8DF929B}"/>
-              <w15:color w:val="808080"/>
-              <w:text/>
-            </w:sdtPr>
-            <w:sdtContent>
-              <w:p>
+          <w:p>
+            <w:sdt>
+              <w:sdtPr>
+                <w:alias w:val="QltyInspection_No"/>
+                <w:tag w:val="#BC:InsertDataItem,DataItems/CurrentInspection/QltyInspection_No"/>
+                <w:id w:val="1961220263"/>
+                <w:placeholder>
+                  <w:docPart w:val="653C3B5A1DC9455CAC82A8C31CEEA911"/>
+                </w:placeholder>
+                <w:dataBinding w:prefixMappings="xmlns:ns0='urn:microsoft-dynamics-nav/reports/Qlty_Certificate_of_Analysis/20401/'" w:xpath="/ns0:NavWordReportXmlPart[1]/ns0:CurrentInspection[1]/ns0:QltyInspection_No[1]" w:storeItemID="{F00BF611-06BA-436C-902A-C0D5E8DF929B}"/>
+                <w15:color w:val="808080"/>
+                <w:text/>
+              </w:sdtPr>
+              <w:sdtContent>
                 <w:proofErr w:type="spellStart"/>
                 <w:r>
                   <w:t>QltyInspection_No</w:t>
                 </w:r>
                 <w:proofErr w:type="spellEnd"/>
-              </w:p>
-            </w:sdtContent>
-          </w:sdt>
+              </w:sdtContent>
+            </w:sdt>
+            <w:r>
+              <w:t xml:space="preserve"> </w:t>
+            </w:r>
+            <w:sdt>
+              <w:sdtPr>
+                <w:alias w:val="ReinspectionSequenceInformation"/>
+                <w:tag w:val="#BC:InsertDataItem,DataItems/CurrentInspection/ReinspectionSequenceInformation"/>
+                <w:id w:val="-602108974"/>
+                <w:placeholder>
+                  <w:docPart w:val="CCFB25846BB14C249ED55F1742B218CA"/>
+                </w:placeholder>
+                <w15:dataBinding w:prefixMappings="xmlns:ns0='urn:microsoft-dynamics-nav/reports/Qlty_Certificate_of_Analysis/20401/' " w:xpath="/ns0:NavWordReportXmlPart[1]/ns0:CurrentInspection[1]/ns0:ReinspectionSequenceInformation[1]" w:storeItemID="{F00BF611-06BA-436C-902A-C0D5E8DF929B}" w16sdtdh:storeItemChecksum="0BxWsQ=="/>
+              </w:sdtPr>
+              <w:sdtContent>
+                <w:proofErr w:type="spellStart"/>
+                <w:r>
+                  <w:t>ReinspectionSequenceInformation</w:t>
+                </w:r>
+                <w:proofErr w:type="spellEnd"/>
+              </w:sdtContent>
+            </w:sdt>
+          </w:p>
         </w:tc>
         <w:tc>
           <w:tcPr>
-            <w:tcW w:w="3780" w:type="dxa"/>
+            <w:tcW w:w="236" w:type="dxa"/>
+          </w:tcPr>
+          <w:p/>
+        </w:tc>
+        <w:tc>
+          <w:tcPr>
+            <w:tcW w:w="3724" w:type="dxa"/>
           </w:tcPr>
           <w:sdt>
             <w:sdtPr>
               <w:alias w:val="ItemDescription"/>
               <w:tag w:val="#BC:InsertDataItem,DataItems/CurrentInspection/ItemDescription"/>
-              <w:id w:val="-417326594"/>
+              <w:id w:val="1230270698"/>
               <w:placeholder>
-                <w:docPart w:val="CAF2966426F1429B9BF7DAAA424ABD99"/>
+                <w:docPart w:val="A13A81114EF64334B8E51A09F947B1C5"/>
               </w:placeholder>
               <w:dataBinding w:prefixMappings="xmlns:ns0='urn:microsoft-dynamics-nav/reports/Qlty_Certificate_of_Analysis/20401/'" w:xpath="/ns0:NavWordReportXmlPart[1]/ns0:CurrentInspection[1]/ns0:ItemDescription[1]" w:storeItemID="{F00BF611-06BA-436C-902A-C0D5E8DF929B}"/>
               <w15:color w:val="808080"/>
@@ -192,15 +245,21 @@
         </w:tc>
         <w:tc>
           <w:tcPr>
-            <w:tcW w:w="3780" w:type="dxa"/>
+            <w:tcW w:w="236" w:type="dxa"/>
+          </w:tcPr>
+          <w:p/>
+        </w:tc>
+        <w:tc>
+          <w:tcPr>
+            <w:tcW w:w="3441" w:type="dxa"/>
           </w:tcPr>
           <w:sdt>
             <w:sdtPr>
               <w:alias w:val="ItemTrackingDescription"/>
               <w:tag w:val="#BC:InsertDataItem,DataItems/CurrentInspection/ItemTrackingDescription"/>
-              <w:id w:val="-1500492688"/>
+              <w:id w:val="-1388635032"/>
               <w:placeholder>
-                <w:docPart w:val="8DC9B09F32944319ACD1DDBB518C0F54"/>
+                <w:docPart w:val="969E5DE1EBD540C9BA10B6F7575C6F06"/>
               </w:placeholder>
               <w:dataBinding w:prefixMappings="xmlns:ns0='urn:microsoft-dynamics-nav/reports/Qlty_Certificate_of_Analysis/20401/'" w:xpath="/ns0:NavWordReportXmlPart[1]/ns0:CurrentInspection[1]/ns0:ItemTrackingDescription[1]" w:storeItemID="{F00BF611-06BA-436C-902A-C0D5E8DF929B}"/>
               <w15:color w:val="808080"/>
@@ -221,40 +280,100 @@
       <w:tr>
         <w:tc>
           <w:tcPr>
-            <w:tcW w:w="2875" w:type="dxa"/>
+            <w:tcW w:w="2819" w:type="dxa"/>
           </w:tcPr>
-          <w:p/>
+          <w:p>
+            <w:pPr>
+              <w:rPr>
+                <w:sz w:val="16"/>
+                <w:szCs w:val="16"/>
+              </w:rPr>
+            </w:pPr>
+          </w:p>
         </w:tc>
         <w:tc>
           <w:tcPr>
-            <w:tcW w:w="3780" w:type="dxa"/>
+            <w:tcW w:w="236" w:type="dxa"/>
           </w:tcPr>
-          <w:p/>
+          <w:p>
+            <w:pPr>
+              <w:rPr>
+                <w:sz w:val="16"/>
+                <w:szCs w:val="16"/>
+              </w:rPr>
+            </w:pPr>
+          </w:p>
         </w:tc>
         <w:tc>
           <w:tcPr>
-            <w:tcW w:w="3780" w:type="dxa"/>
+            <w:tcW w:w="3724" w:type="dxa"/>
           </w:tcPr>
-          <w:p/>
+          <w:p>
+            <w:pPr>
+              <w:rPr>
+                <w:sz w:val="16"/>
+                <w:szCs w:val="16"/>
+              </w:rPr>
+            </w:pPr>
+          </w:p>
+        </w:tc>
+        <w:tc>
+          <w:tcPr>
+            <w:tcW w:w="236" w:type="dxa"/>
+          </w:tcPr>
+          <w:p>
+            <w:pPr>
+              <w:rPr>
+                <w:sz w:val="16"/>
+                <w:szCs w:val="16"/>
+              </w:rPr>
+            </w:pPr>
+          </w:p>
+        </w:tc>
+        <w:tc>
+          <w:tcPr>
+            <w:tcW w:w="3441" w:type="dxa"/>
+          </w:tcPr>
+          <w:p>
+            <w:pPr>
+              <w:rPr>
+                <w:sz w:val="16"/>
+                <w:szCs w:val="16"/>
+              </w:rPr>
+            </w:pPr>
+          </w:p>
         </w:tc>
       </w:tr>
       <w:tr>
         <w:tc>
           <w:tcPr>
-            <w:tcW w:w="2875" w:type="dxa"/>
+            <w:tcW w:w="2819" w:type="dxa"/>
+          </w:tcPr>
+          <w:p>
+            <w:pPr>
+              <w:tabs>
+                <w:tab w:val="left" w:pos="2016"/>
+              </w:tabs>
+            </w:pPr>
+          </w:p>
+        </w:tc>
+        <w:tc>
+          <w:tcPr>
+            <w:tcW w:w="236" w:type="dxa"/>
           </w:tcPr>
           <w:p>
             <w:pPr>
               <w:rPr>
                 <w:b/>
                 <w:bCs/>
+                <w:lang w:val="da-DK"/>
               </w:rPr>
             </w:pPr>
           </w:p>
         </w:tc>
         <w:tc>
           <w:tcPr>
-            <w:tcW w:w="3780" w:type="dxa"/>
+            <w:tcW w:w="3724" w:type="dxa"/>
           </w:tcPr>
           <w:p>
             <w:pPr>
@@ -270,13 +389,13 @@
                   <w:bCs/>
                   <w:lang w:val="da-DK"/>
                 </w:rPr>
-                <w:alias w:val="CompletedDateLabel"/>
-                <w:tag w:val="#BC:InsertDataItem,Labels/CompletedDateLabel"/>
-                <w:id w:val="652809157"/>
+                <w:alias w:val="FinishedOnLabel"/>
+                <w:tag w:val="#BC:InsertDataItem,Labels/FinishedOnLabel"/>
+                <w:id w:val="500931782"/>
                 <w:placeholder>
-                  <w:docPart w:val="ECB3F27933724B1A8C630965E6024B65"/>
+                  <w:docPart w:val="956387B830824AAFBBDA5B13096155E3"/>
                 </w:placeholder>
-                <w:dataBinding w:prefixMappings="xmlns:ns0='urn:microsoft-dynamics-nav/reports/Qlty_Certificate_of_Analysis/20401/'" w:xpath="/ns0:NavWordReportXmlPart[1]/ns0:Labels[1]/ns0:CompletedDateLabel[1]" w:storeItemID="{F00BF611-06BA-436C-902A-C0D5E8DF929B}"/>
+                <w:dataBinding w:prefixMappings="xmlns:ns0='urn:microsoft-dynamics-nav/reports/Qlty_Certificate_of_Analysis/20401/'" w:xpath="/ns0:NavWordReportXmlPart[1]/ns0:Labels[1]/ns0:FinishedOnLabel[1]" w:storeItemID="{F00BF611-06BA-436C-902A-C0D5E8DF929B}"/>
                 <w15:color w:val="808080"/>
                 <w:text/>
               </w:sdtPr>
@@ -287,7 +406,15 @@
                     <w:bCs/>
                     <w:lang w:val="da-DK"/>
                   </w:rPr>
-                  <w:t>CompletedDateLabel</w:t>
+                  <w:t>FinishedOn</w:t>
+                </w:r>
+                <w:r>
+                  <w:rPr>
+                    <w:b/>
+                    <w:bCs/>
+                    <w:lang w:val="da-DK"/>
+                  </w:rPr>
+                  <w:t>Label</w:t>
                 </w:r>
               </w:sdtContent>
             </w:sdt>
@@ -295,7 +422,21 @@
         </w:tc>
         <w:tc>
           <w:tcPr>
-            <w:tcW w:w="3780" w:type="dxa"/>
+            <w:tcW w:w="236" w:type="dxa"/>
+          </w:tcPr>
+          <w:p>
+            <w:pPr>
+              <w:rPr>
+                <w:b/>
+                <w:bCs/>
+                <w:lang w:val="da-DK"/>
+              </w:rPr>
+            </w:pPr>
+          </w:p>
+        </w:tc>
+        <w:tc>
+          <w:tcPr>
+            <w:tcW w:w="3441" w:type="dxa"/>
           </w:tcPr>
           <w:p>
             <w:pPr>
@@ -311,13 +452,13 @@
                   <w:bCs/>
                   <w:lang w:val="da-DK"/>
                 </w:rPr>
-                <w:alias w:val="CompletedByLabel"/>
-                <w:tag w:val="#BC:InsertDataItem,Labels/CompletedByLabel"/>
-                <w:id w:val="1722473971"/>
+                <w:alias w:val="FinishedByLabel"/>
+                <w:tag w:val="#BC:InsertDataItem,Labels/FinishedByLabel"/>
+                <w:id w:val="-927343786"/>
                 <w:placeholder>
-                  <w:docPart w:val="6621457B887942D580412561915523CD"/>
+                  <w:docPart w:val="16673B5D3190471B982ACDE7EF77C1F7"/>
                 </w:placeholder>
-                <w:dataBinding w:prefixMappings="xmlns:ns0='urn:microsoft-dynamics-nav/reports/Qlty_Certificate_of_Analysis/20401/'" w:xpath="/ns0:NavWordReportXmlPart[1]/ns0:Labels[1]/ns0:CompletedByLabel[1]" w:storeItemID="{F00BF611-06BA-436C-902A-C0D5E8DF929B}"/>
+                <w:dataBinding w:prefixMappings="xmlns:ns0='urn:microsoft-dynamics-nav/reports/Qlty_Certificate_of_Analysis/20401/'" w:xpath="/ns0:NavWordReportXmlPart[1]/ns0:Labels[1]/ns0:FinishedByLabel[1]" w:storeItemID="{F00BF611-06BA-436C-902A-C0D5E8DF929B}"/>
                 <w15:color w:val="808080"/>
                 <w:text/>
               </w:sdtPr>
@@ -328,7 +469,15 @@
                     <w:bCs/>
                     <w:lang w:val="da-DK"/>
                   </w:rPr>
-                  <w:t>CompletedByLabel</w:t>
+                  <w:t>Finished</w:t>
+                </w:r>
+                <w:r>
+                  <w:rPr>
+                    <w:b/>
+                    <w:bCs/>
+                    <w:lang w:val="da-DK"/>
+                  </w:rPr>
+                  <w:t>ByLabel</w:t>
                 </w:r>
               </w:sdtContent>
             </w:sdt>
@@ -338,52 +487,25 @@
       <w:tr>
         <w:sdt>
           <w:sdtPr>
-            <w:alias w:val="InspectionDescription"/>
-            <w:tag w:val="#BC:InsertDataItem,DataItems/CurrentInspection/InspectionDescription"/>
-            <w:id w:val="-2129159897"/>
+            <w:alias w:val="InspectionInformation"/>
+            <w:tag w:val="#BC:InsertDataItem,DataItems/CurrentInspection/InspectionInformation"/>
+            <w:id w:val="-289510379"/>
             <w:placeholder>
-              <w:docPart w:val="C19E5EA0C249448891F06468EC7ACA72"/>
+              <w:docPart w:val="D7D6E4B6FD5543DA89CF0B73B6E30292"/>
             </w:placeholder>
-            <w:dataBinding w:prefixMappings="xmlns:ns0='urn:microsoft-dynamics-nav/reports/Qlty_Certificate_of_Analysis/20401/'" w:xpath="/ns0:NavWordReportXmlPart[1]/ns0:CurrentInspection[1]/ns0:InspectionDescription[1]" w:storeItemID="{F00BF611-06BA-436C-902A-C0D5E8DF929B}"/>
+            <w:dataBinding w:prefixMappings="xmlns:ns0='urn:microsoft-dynamics-nav/reports/Qlty_Certificate_of_Analysis/20401/'" w:xpath="/ns0:NavWordReportXmlPart[1]/ns0:CurrentInspection[1]/ns0:InspectionInformation[1]" w:storeItemID="{F00BF611-06BA-436C-902A-C0D5E8DF929B}"/>
             <w15:color w:val="808080"/>
             <w:text/>
           </w:sdtPr>
           <w:sdtContent>
             <w:tc>
               <w:tcPr>
-                <w:tcW w:w="2875" w:type="dxa"/>
+                <w:tcW w:w="2819" w:type="dxa"/>
               </w:tcPr>
               <w:p>
                 <w:proofErr w:type="spellStart"/>
                 <w:r>
-                  <w:t>InspectionDescription</w:t>
-                </w:r>
-                <w:proofErr w:type="spellEnd"/>
-              </w:p>
-            </w:tc>
-          </w:sdtContent>
-        </w:sdt>
-        <w:sdt>
-          <w:sdtPr>
-            <w:alias w:val="FinishedDateOnly"/>
-            <w:tag w:val="#BC:InsertDataItem,DataItems/CurrentInspection/FinishedDateOnly"/>
-            <w:id w:val="1674536395"/>
-            <w:placeholder>
-              <w:docPart w:val="8214464B04194E819F152F5CA1E6D069"/>
-            </w:placeholder>
-            <w:dataBinding w:prefixMappings="xmlns:ns0='urn:microsoft-dynamics-nav/reports/Qlty_Certificate_of_Analysis/20401/'" w:xpath="/ns0:NavWordReportXmlPart[1]/ns0:CurrentInspection[1]/ns0:FinishedDateOnly[1]" w:storeItemID="{F00BF611-06BA-436C-902A-C0D5E8DF929B}"/>
-            <w15:color w:val="808080"/>
-            <w:text/>
-          </w:sdtPr>
-          <w:sdtContent>
-            <w:tc>
-              <w:tcPr>
-                <w:tcW w:w="3780" w:type="dxa"/>
-              </w:tcPr>
-              <w:p>
-                <w:proofErr w:type="spellStart"/>
-                <w:r>
-                  <w:t>FinishedDateOnly</w:t>
+                  <w:t>InspectionInformation</w:t>
                 </w:r>
                 <w:proofErr w:type="spellEnd"/>
               </w:p>
@@ -392,15 +514,53 @@
         </w:sdt>
         <w:tc>
           <w:tcPr>
-            <w:tcW w:w="3780" w:type="dxa"/>
+            <w:tcW w:w="236" w:type="dxa"/>
+          </w:tcPr>
+          <w:p/>
+        </w:tc>
+        <w:sdt>
+          <w:sdtPr>
+            <w:alias w:val="#Nav: /CurrentInspection/QltyInspection_Finished_Date"/>
+            <w:tag w:val="#Nav: Qlty_Certificate_of_Analysis/20401"/>
+            <w:id w:val="-850415512"/>
+            <w:placeholder>
+              <w:docPart w:val="2C3F2D2C612B4B84910A5B67FA64B631"/>
+            </w:placeholder>
+            <w:dataBinding w:prefixMappings="xmlns:ns0='urn:microsoft-dynamics-nav/reports/Qlty_Certificate_of_Analysis/20401/' " w:xpath="/ns0:NavWordReportXmlPart[1]/ns0:CurrentInspection[1]/ns0:QltyInspection_Finished_Date[1]" w:storeItemID="{F00BF611-06BA-436C-902A-C0D5E8DF929B}"/>
+            <w:text/>
+          </w:sdtPr>
+          <w:sdtContent>
+            <w:tc>
+              <w:tcPr>
+                <w:tcW w:w="3724" w:type="dxa"/>
+              </w:tcPr>
+              <w:p>
+                <w:proofErr w:type="spellStart"/>
+                <w:r>
+                  <w:t>QltyInspection_Finished_Date</w:t>
+                </w:r>
+                <w:proofErr w:type="spellEnd"/>
+              </w:p>
+            </w:tc>
+          </w:sdtContent>
+        </w:sdt>
+        <w:tc>
+          <w:tcPr>
+            <w:tcW w:w="236" w:type="dxa"/>
+          </w:tcPr>
+          <w:p/>
+        </w:tc>
+        <w:tc>
+          <w:tcPr>
+            <w:tcW w:w="3441" w:type="dxa"/>
           </w:tcPr>
           <w:sdt>
             <w:sdtPr>
               <w:alias w:val="QltyInspection_Finished_By_User_ID"/>
               <w:tag w:val="#BC:InsertDataItem,DataItems/CurrentInspection/QltyInspection_Finished_By_User_ID"/>
-              <w:id w:val="-995874738"/>
+              <w:id w:val="-140812418"/>
               <w:placeholder>
-                <w:docPart w:val="30F240CE45B1491C92022A68B3085E55"/>
+                <w:docPart w:val="356FDA147C3941778F5CECA01441805A"/>
               </w:placeholder>
               <w:dataBinding w:prefixMappings="xmlns:ns0='urn:microsoft-dynamics-nav/reports/Qlty_Certificate_of_Analysis/20401/'" w:xpath="/ns0:NavWordReportXmlPart[1]/ns0:CurrentInspection[1]/ns0:QltyInspection_Finished_By_User_ID[1]" w:storeItemID="{F00BF611-06BA-436C-902A-C0D5E8DF929B}"/>
               <w15:color w:val="808080"/>
@@ -419,49 +579,53 @@
         </w:tc>
       </w:tr>
     </w:tbl>
-    <w:p/>
     <w:tbl>
       <w:tblPr>
         <w:tblStyle w:val="BCDefaulttable"/>
-        <w:tblW w:w="10483" w:type="dxa"/>
+        <w:tblpPr w:leftFromText="180" w:rightFromText="180" w:vertAnchor="text" w:tblpY="230"/>
+        <w:tblW w:w="10460" w:type="dxa"/>
         <w:tblLayout w:type="fixed"/>
         <w:tblLook w:val="0420" w:firstRow="1" w:lastRow="0" w:firstColumn="0" w:lastColumn="0" w:noHBand="0" w:noVBand="1"/>
       </w:tblPr>
       <w:tblGrid>
-        <w:gridCol w:w="224"/>
+        <w:gridCol w:w="20"/>
         <w:gridCol w:w="2004"/>
         <w:gridCol w:w="2004"/>
         <w:gridCol w:w="2004"/>
         <w:gridCol w:w="2004"/>
-        <w:gridCol w:w="2004"/>
-        <w:gridCol w:w="239"/>
+        <w:gridCol w:w="2224"/>
+        <w:gridCol w:w="180"/>
+        <w:gridCol w:w="20"/>
       </w:tblGrid>
       <w:tr>
         <w:trPr>
+          <w:gridAfter w:val="1"/>
           <w:cnfStyle w:val="100000000000" w:firstRow="1" w:lastRow="0" w:firstColumn="0" w:lastColumn="0" w:oddVBand="0" w:evenVBand="0" w:oddHBand="0" w:evenHBand="0" w:firstRowFirstColumn="0" w:firstRowLastColumn="0" w:lastRowFirstColumn="0" w:lastRowLastColumn="0"/>
+          <w:wAfter w:w="20" w:type="dxa"/>
+          <w:tblHeader/>
         </w:trPr>
         <w:tc>
           <w:tcPr>
-            <w:tcW w:w="194" w:type="dxa"/>
+            <w:tcW w:w="20" w:type="dxa"/>
           </w:tcPr>
           <w:p/>
         </w:tc>
         <w:sdt>
           <w:sdtPr>
-            <w:alias w:val="MetricLabel"/>
-            <w:tag w:val="#BC:InsertDataItem,Labels/MetricLabel"/>
+            <w:alias w:val="TestLabel"/>
+            <w:tag w:val="#BC:InsertDataItem,Labels/TestLabel"/>
             <w:id w:val="-1546216342"/>
             <w:placeholder>
-              <w:docPart w:val="DefaultPlaceholder_-1854013440"/>
+              <w:docPart w:val="3790034039614CA58B671ACF9F890A21"/>
             </w:placeholder>
-            <w:dataBinding w:prefixMappings="xmlns:ns0='urn:microsoft-dynamics-nav/reports/Qlty_Certificate_of_Analysis/20401/'" w:xpath="/ns0:NavWordReportXmlPart[1]/ns0:Labels[1]/ns0:MetricLabel[1]" w:storeItemID="{F00BF611-06BA-436C-902A-C0D5E8DF929B}"/>
+            <w:dataBinding w:prefixMappings="xmlns:ns0='urn:microsoft-dynamics-nav/reports/Qlty_Certificate_of_Analysis/20401/'" w:xpath="/ns0:NavWordReportXmlPart[1]/ns0:Labels[1]/ns0:TestLabel[1]" w:storeItemID="{F00BF611-06BA-436C-902A-C0D5E8DF929B}"/>
             <w15:color w:val="808080"/>
             <w:text/>
           </w:sdtPr>
           <w:sdtContent>
             <w:tc>
               <w:tcPr>
-                <w:tcW w:w="1728" w:type="dxa"/>
+                <w:tcW w:w="2004" w:type="dxa"/>
                 <w:vAlign w:val="bottom"/>
               </w:tcPr>
               <w:p>
@@ -471,7 +635,7 @@
                 </w:pPr>
                 <w:proofErr w:type="spellStart"/>
                 <w:r>
-                  <w:t>MetricLabel</w:t>
+                  <w:t>TestLabel</w:t>
                 </w:r>
                 <w:proofErr w:type="spellEnd"/>
               </w:p>
@@ -480,7 +644,7 @@
         </w:sdt>
         <w:tc>
           <w:tcPr>
-            <w:tcW w:w="1728" w:type="dxa"/>
+            <w:tcW w:w="2004" w:type="dxa"/>
             <w:vAlign w:val="bottom"/>
           </w:tcPr>
           <w:p>
@@ -490,20 +654,20 @@
             </w:pPr>
             <w:sdt>
               <w:sdtPr>
-                <w:alias w:val="MeasurementLabel"/>
-                <w:tag w:val="#BC:InsertDataItem,Labels/MeasurementLabel"/>
+                <w:alias w:val="TestValueLabel"/>
+                <w:tag w:val="#BC:InsertDataItem,Labels/TestValueLabel"/>
                 <w:id w:val="-473916647"/>
                 <w:placeholder>
-                  <w:docPart w:val="54E88215FCB04D4A96ECA2EDA736E877"/>
+                  <w:docPart w:val="DC1D345B68CF4F25A790AF73852A64DC"/>
                 </w:placeholder>
-                <w:dataBinding w:prefixMappings="xmlns:ns0='urn:microsoft-dynamics-nav/reports/Qlty_Certificate_of_Analysis/20401/'" w:xpath="/ns0:NavWordReportXmlPart[1]/ns0:Labels[1]/ns0:MeasurementLabel[1]" w:storeItemID="{F00BF611-06BA-436C-902A-C0D5E8DF929B}"/>
+                <w:dataBinding w:prefixMappings="xmlns:ns0='urn:microsoft-dynamics-nav/reports/Qlty_Certificate_of_Analysis/20401/'" w:xpath="/ns0:NavWordReportXmlPart[1]/ns0:Labels[1]/ns0:TestValueLabel[1]" w:storeItemID="{F00BF611-06BA-436C-902A-C0D5E8DF929B}"/>
                 <w15:color w:val="808080"/>
                 <w:text/>
               </w:sdtPr>
               <w:sdtContent>
                 <w:proofErr w:type="spellStart"/>
                 <w:r>
-                  <w:t>MeasurementLabel</w:t>
+                  <w:t>TestValueLabel</w:t>
                 </w:r>
                 <w:proofErr w:type="spellEnd"/>
               </w:sdtContent>
@@ -512,7 +676,7 @@
         </w:tc>
         <w:tc>
           <w:tcPr>
-            <w:tcW w:w="1728" w:type="dxa"/>
+            <w:tcW w:w="2004" w:type="dxa"/>
             <w:vAlign w:val="bottom"/>
           </w:tcPr>
           <w:p>
@@ -526,7 +690,7 @@
                 <w:tag w:val="#BC:InsertDataItem,Labels/ResultLabel"/>
                 <w:id w:val="1536853362"/>
                 <w:placeholder>
-                  <w:docPart w:val="9A399367765C4525A49DC7400980BF31"/>
+                  <w:docPart w:val="B5812A426F6C434FB5023271BAAD75FE"/>
                 </w:placeholder>
                 <w:dataBinding w:prefixMappings="xmlns:ns0='urn:microsoft-dynamics-nav/reports/Qlty_Certificate_of_Analysis/20401/'" w:xpath="/ns0:NavWordReportXmlPart[1]/ns0:Labels[1]/ns0:ResultLabel[1]" w:storeItemID="{F00BF611-06BA-436C-902A-C0D5E8DF929B}"/>
                 <w15:color w:val="808080"/>
@@ -544,7 +708,7 @@
         </w:tc>
         <w:tc>
           <w:tcPr>
-            <w:tcW w:w="1728" w:type="dxa"/>
+            <w:tcW w:w="2004" w:type="dxa"/>
             <w:vAlign w:val="bottom"/>
           </w:tcPr>
           <w:p>
@@ -558,7 +722,7 @@
                 <w:tag w:val="#BC:InsertDataItem,DataItems/CurrentInspection/CurrentInspectionLine/ConditionLabel_1"/>
                 <w:id w:val="-121542516"/>
                 <w:placeholder>
-                  <w:docPart w:val="ED80FB550E0B43FB90A910C8E1F18367"/>
+                  <w:docPart w:val="B46C77011B1F4E29A3244128A7B78C77"/>
                 </w:placeholder>
                 <w:dataBinding w:prefixMappings="xmlns:ns0='urn:microsoft-dynamics-nav/reports/Qlty_Certificate_of_Analysis/20401/'" w:xpath="/ns0:NavWordReportXmlPart[1]/ns0:CurrentInspection[1]/ns0:CurrentInspectionLine[1]/ns0:ConditionLabel_1[1]" w:storeItemID="{F00BF611-06BA-436C-902A-C0D5E8DF929B}"/>
                 <w15:color w:val="808080"/>
@@ -566,13 +730,8 @@
               </w:sdtPr>
               <w:sdtContent>
                 <w:r>
-                  <w:t>ConditionLabel_</w:t>
+                  <w:t>ConditionLabel_1</w:t>
                 </w:r>
-                <w:proofErr w:type="gramStart"/>
-                <w:r>
-                  <w:t>1</w:t>
-                </w:r>
-                <w:proofErr w:type="gramEnd"/>
               </w:sdtContent>
             </w:sdt>
           </w:p>
@@ -583,7 +742,7 @@
             <w:tag w:val="#BC:InsertDataItem,DataItems/CurrentInspection/CurrentInspectionLine/ConditionLabel_2"/>
             <w:id w:val="499695823"/>
             <w:placeholder>
-              <w:docPart w:val="48487D8740B241C192207B9B8EDAA979"/>
+              <w:docPart w:val="013B7F4C8B4A4874B1B2A8A6586E445C"/>
             </w:placeholder>
             <w:dataBinding w:prefixMappings="xmlns:ns0='urn:microsoft-dynamics-nav/reports/Qlty_Certificate_of_Analysis/20401/'" w:xpath="/ns0:NavWordReportXmlPart[1]/ns0:CurrentInspection[1]/ns0:CurrentInspectionLine[1]/ns0:ConditionLabel_2[1]" w:storeItemID="{F00BF611-06BA-436C-902A-C0D5E8DF929B}"/>
             <w15:color w:val="808080"/>
@@ -592,7 +751,7 @@
           <w:sdtContent>
             <w:tc>
               <w:tcPr>
-                <w:tcW w:w="1728" w:type="dxa"/>
+                <w:tcW w:w="2224" w:type="dxa"/>
                 <w:vAlign w:val="bottom"/>
               </w:tcPr>
               <w:p>
@@ -601,20 +760,15 @@
                   <w:ind w:left="0"/>
                 </w:pPr>
                 <w:r>
-                  <w:t>ConditionLabel_</w:t>
+                  <w:t>ConditionLabel_2</w:t>
                 </w:r>
-                <w:proofErr w:type="gramStart"/>
-                <w:r>
-                  <w:t>2</w:t>
-                </w:r>
-                <w:proofErr w:type="gramEnd"/>
               </w:p>
             </w:tc>
           </w:sdtContent>
         </w:sdt>
         <w:tc>
           <w:tcPr>
-            <w:tcW w:w="206" w:type="dxa"/>
+            <w:tcW w:w="180" w:type="dxa"/>
           </w:tcPr>
           <w:p>
             <w:pPr>
@@ -632,7 +786,7 @@
           <w:tag w:val="#BC:InsertRepeater,DataItems/CurrentInspection/CurrentInspectionLine"/>
           <w:id w:val="-275636358"/>
           <w:placeholder>
-            <w:docPart w:val="4FE64E645A5A4B2AACD126E30041900B"/>
+            <w:docPart w:val="EAFA4C3784BF42259E73179BCF3AB036"/>
           </w:placeholder>
           <w15:dataBinding w:prefixMappings="xmlns:ns0='urn:microsoft-dynamics-nav/reports/Qlty_Certificate_of_Analysis/20401/' " w:xpath="/ns0:NavWordReportXmlPart[1]/ns0:CurrentInspection[1]/ns0:CurrentInspectionLine" w:storeItemID="{F00BF611-06BA-436C-902A-C0D5E8DF929B}"/>
           <w15:color w:val="808080"/>
@@ -652,19 +806,19 @@
                 </w:trPr>
                 <w:tc>
                   <w:tcPr>
-                    <w:tcW w:w="194" w:type="dxa"/>
+                    <w:tcW w:w="20" w:type="dxa"/>
                   </w:tcPr>
                   <w:p/>
                 </w:tc>
                 <w:tc>
                   <w:tcPr>
-                    <w:tcW w:w="1728" w:type="dxa"/>
-                    <w:gridSpan w:val="5"/>
+                    <w:tcW w:w="10420" w:type="dxa"/>
+                    <w:gridSpan w:val="6"/>
                   </w:tcPr>
                   <w:tbl>
                     <w:tblPr>
                       <w:tblStyle w:val="BCThemev1"/>
-                      <w:tblW w:w="10035" w:type="dxa"/>
+                      <w:tblW w:w="10326" w:type="dxa"/>
                       <w:tblLook w:val="0600" w:firstRow="0" w:lastRow="0" w:firstColumn="0" w:lastColumn="0" w:noHBand="1" w:noVBand="1"/>
                     </w:tblPr>
                     <w:tblGrid>
@@ -672,7 +826,7 @@
                       <w:gridCol w:w="1980"/>
                       <w:gridCol w:w="1980"/>
                       <w:gridCol w:w="1980"/>
-                      <w:gridCol w:w="2070"/>
+                      <w:gridCol w:w="2361"/>
                     </w:tblGrid>
                     <w:tr>
                       <w:tc>
@@ -680,6 +834,9 @@
                           <w:tcW w:w="2025" w:type="dxa"/>
                         </w:tcPr>
                         <w:p>
+                          <w:pPr>
+                            <w:framePr w:hSpace="180" w:wrap="around" w:hAnchor="text" w:vAnchor="text" w:y="230"/>
+                          </w:pPr>
                           <w:sdt>
                             <w:sdtPr>
                               <w:rPr>
@@ -690,7 +847,7 @@
                               <w:tag w:val="#BC:InsertDataItem,DataItems/CurrentInspection/CurrentInspectionLine/LabelField_Description"/>
                               <w:id w:val="765736160"/>
                               <w:placeholder>
-                                <w:docPart w:val="DefaultPlaceholder_-1854013440"/>
+                                <w:docPart w:val="3790034039614CA58B671ACF9F890A21"/>
                               </w:placeholder>
                               <w:dataBinding w:prefixMappings="xmlns:ns0='urn:microsoft-dynamics-nav/reports/Qlty_Certificate_of_Analysis/20401/'" w:xpath="/ns0:NavWordReportXmlPart[1]/ns0:CurrentInspection[1]/ns0:CurrentInspectionLine[1]/ns0:LabelField_Description[1]" w:storeItemID="{F00BF611-06BA-436C-902A-C0D5E8DF929B}"/>
                               <w15:color w:val="808080"/>
@@ -713,7 +870,7 @@
                               <w:tag w:val="#BC:InsertDataItem,DataItems/CurrentInspection/CurrentInspectionLine/WordDescription"/>
                               <w:id w:val="137690003"/>
                               <w:placeholder>
-                                <w:docPart w:val="DefaultPlaceholder_-1854013440"/>
+                                <w:docPart w:val="3790034039614CA58B671ACF9F890A21"/>
                               </w:placeholder>
                               <w:dataBinding w:prefixMappings="xmlns:ns0='urn:microsoft-dynamics-nav/reports/Qlty_Certificate_of_Analysis/20401/'" w:xpath="/ns0:NavWordReportXmlPart[1]/ns0:CurrentInspection[1]/ns0:CurrentInspectionLine[1]/ns0:WordDescription[1]" w:storeItemID="{F00BF611-06BA-436C-902A-C0D5E8DF929B}"/>
                               <w15:color w:val="808080"/>
@@ -741,7 +898,7 @@
                             <w:tag w:val="#BC:InsertDataItem,DataItems/CurrentInspection/CurrentInspectionLine/Test_Value"/>
                             <w:id w:val="-689456924"/>
                             <w:placeholder>
-                              <w:docPart w:val="20B0D5AFBB5E4DC4B8EAD8AAD6C206EF"/>
+                              <w:docPart w:val="74E56A02732E4B85B41C3B4B19F9A846"/>
                             </w:placeholder>
                             <w:dataBinding w:prefixMappings="xmlns:ns0='urn:microsoft-dynamics-nav/reports/Qlty_Certificate_of_Analysis/20401/'" w:xpath="/ns0:NavWordReportXmlPart[1]/ns0:CurrentInspection[1]/ns0:CurrentInspectionLine[1]/ns0:Test_Value[1]" w:storeItemID="{F00BF611-06BA-436C-902A-C0D5E8DF929B}"/>
                             <w15:color w:val="808080"/>
@@ -749,62 +906,85 @@
                           </w:sdtPr>
                           <w:sdtContent>
                             <w:p>
+                              <w:pPr>
+                                <w:framePr w:hSpace="180" w:wrap="around" w:hAnchor="text" w:vAnchor="text" w:y="230"/>
+                              </w:pPr>
                               <w:proofErr w:type="spellStart"/>
-                              <w:proofErr w:type="gramStart"/>
                               <w:r>
                                 <w:rPr>
                                   <w:bCs/>
                                 </w:rPr>
-                                <w:t>Test</w:t>
-                              </w:r>
-                              <w:proofErr w:type="gramEnd"/>
-                              <w:r>
-                                <w:rPr>
-                                  <w:bCs/>
-                                </w:rPr>
-                                <w:t>_Value</w:t>
+                                <w:t>Test_Value</w:t>
                               </w:r>
                               <w:proofErr w:type="spellEnd"/>
                             </w:p>
                           </w:sdtContent>
                         </w:sdt>
                       </w:tc>
-                      <w:sdt>
-                        <w:sdtPr>
-                          <w:rPr>
-                            <w:lang w:val="da-DK"/>
-                          </w:rPr>
-                          <w:alias w:val="WordResultDescription"/>
-                          <w:tag w:val="#BC:InsertDataItem,DataItems/CurrentInspection/CurrentInspectionLine/WordResultDescription"/>
-                          <w:id w:val="-926574762"/>
-                          <w:placeholder>
-                            <w:docPart w:val="DefaultPlaceholder_-1854013440"/>
-                          </w:placeholder>
-                          <w:dataBinding w:prefixMappings="xmlns:ns0='urn:microsoft-dynamics-nav/reports/Qlty_Certificate_of_Analysis/20401/'" w:xpath="/ns0:NavWordReportXmlPart[1]/ns0:CurrentInspection[1]/ns0:CurrentInspectionLine[1]/ns0:WordResultDescription[1]" w:storeItemID="{F00BF611-06BA-436C-902A-C0D5E8DF929B}"/>
-                          <w15:color w:val="808080"/>
-                          <w:text/>
-                        </w:sdtPr>
-                        <w:sdtContent>
-                          <w:tc>
-                            <w:tcPr>
-                              <w:tcW w:w="1980" w:type="dxa"/>
-                            </w:tcPr>
-                            <w:p>
-                              <w:pPr>
-                                <w:rPr>
-                                  <w:lang w:val="da-DK"/>
-                                </w:rPr>
-                              </w:pPr>
+                      <w:tc>
+                        <w:tcPr>
+                          <w:tcW w:w="1980" w:type="dxa"/>
+                        </w:tcPr>
+                        <w:p>
+                          <w:pPr>
+                            <w:framePr w:hSpace="180" w:wrap="around" w:hAnchor="text" w:vAnchor="text" w:y="230"/>
+                            <w:rPr>
+                              <w:lang w:val="da-DK"/>
+                            </w:rPr>
+                          </w:pPr>
+                          <w:sdt>
+                            <w:sdtPr>
+                              <w:rPr>
+                                <w:lang w:val="da-DK"/>
+                              </w:rPr>
+                              <w:alias w:val="WordResultDescription"/>
+                              <w:tag w:val="#BC:InsertDataItem,DataItems/CurrentInspection/CurrentInspectionLine/WordResultDescription"/>
+                              <w:id w:val="-926574762"/>
+                              <w:placeholder>
+                                <w:docPart w:val="3790034039614CA58B671ACF9F890A21"/>
+                              </w:placeholder>
+                              <w:dataBinding w:prefixMappings="xmlns:ns0='urn:microsoft-dynamics-nav/reports/Qlty_Certificate_of_Analysis/20401/'" w:xpath="/ns0:NavWordReportXmlPart[1]/ns0:CurrentInspection[1]/ns0:CurrentInspectionLine[1]/ns0:WordResultDescription[1]" w:storeItemID="{F00BF611-06BA-436C-902A-C0D5E8DF929B}"/>
+                              <w15:color w:val="808080"/>
+                              <w:text/>
+                            </w:sdtPr>
+                            <w:sdtContent>
                               <w:r>
                                 <w:rPr>
                                   <w:lang w:val="da-DK"/>
                                 </w:rPr>
                                 <w:t>WordResultDescription</w:t>
                               </w:r>
-                            </w:p>
-                          </w:tc>
-                        </w:sdtContent>
-                      </w:sdt>
+                            </w:sdtContent>
+                          </w:sdt>
+                          <w:sdt>
+                            <w:sdtPr>
+                              <w:rPr>
+                                <w:lang w:val="da-DK"/>
+                              </w:rPr>
+                              <w:alias w:val="WordUnfavorableResultDescription"/>
+                              <w:tag w:val="#BC:InsertDataItem,DataItems/CurrentInspection/CurrentInspectionLine/WordUnfavorableResultDescription"/>
+                              <w:id w:val="-897057968"/>
+                              <w:placeholder>
+                                <w:docPart w:val="DefaultPlaceholder_-1854013440"/>
+                              </w:placeholder>
+                              <w15:dataBinding w:prefixMappings="xmlns:ns0='urn:microsoft-dynamics-nav/reports/Qlty_Certificate_of_Analysis/20401/' " w:xpath="/ns0:NavWordReportXmlPart[1]/ns0:CurrentInspection[1]/ns0:CurrentInspectionLine[1]/ns0:WordUnfavorableResultDescription[1]" w:storeItemID="{F00BF611-06BA-436C-902A-C0D5E8DF929B}" w16sdtdh:storeItemChecksum="0BxWsQ=="/>
+                            </w:sdtPr>
+                            <w:sdtContent>
+                              <w:r>
+                                <w:rPr>
+                                  <w:b/>
+                                  <w:bCs/>
+                                  <w:i/>
+                                  <w:iCs/>
+                                  <w:color w:val="C00000"/>
+                                  <w:lang w:val="da-DK"/>
+                                </w:rPr>
+                                <w:t>WordUnfavorableResultDescription</w:t>
+                              </w:r>
+                            </w:sdtContent>
+                          </w:sdt>
+                        </w:p>
+                      </w:tc>
                       <w:sdt>
                         <w:sdtPr>
                           <w:rPr>
@@ -814,7 +994,7 @@
                           <w:tag w:val="#BC:InsertDataItem,DataItems/CurrentInspection/CurrentInspectionLine/PromptedResultConditionDescription_1"/>
                           <w:id w:val="-1047610993"/>
                           <w:placeholder>
-                            <w:docPart w:val="DefaultPlaceholder_-1854013440"/>
+                            <w:docPart w:val="3790034039614CA58B671ACF9F890A21"/>
                           </w:placeholder>
                           <w:dataBinding w:prefixMappings="xmlns:ns0='urn:microsoft-dynamics-nav/reports/Qlty_Certificate_of_Analysis/20401/'" w:xpath="/ns0:NavWordReportXmlPart[1]/ns0:CurrentInspection[1]/ns0:CurrentInspectionLine[1]/ns0:PromptedResultConditionDescription_1[1]" w:storeItemID="{F00BF611-06BA-436C-902A-C0D5E8DF929B}"/>
                           <w15:color w:val="808080"/>
@@ -827,6 +1007,7 @@
                             </w:tcPr>
                             <w:p>
                               <w:pPr>
+                                <w:framePr w:hSpace="180" w:wrap="around" w:hAnchor="text" w:vAnchor="text" w:y="230"/>
                                 <w:rPr>
                                   <w:bCs/>
                                 </w:rPr>
@@ -835,16 +1016,8 @@
                                 <w:rPr>
                                   <w:bCs/>
                                 </w:rPr>
-                                <w:t>PromptedResultConditionDescription_</w:t>
+                                <w:t>PromptedResultConditionDescription_1</w:t>
                               </w:r>
-                              <w:proofErr w:type="gramStart"/>
-                              <w:r>
-                                <w:rPr>
-                                  <w:bCs/>
-                                </w:rPr>
-                                <w:t>1</w:t>
-                              </w:r>
-                              <w:proofErr w:type="gramEnd"/>
                             </w:p>
                           </w:tc>
                         </w:sdtContent>
@@ -855,7 +1028,7 @@
                           <w:tag w:val="#BC:InsertDataItem,DataItems/CurrentInspection/CurrentInspectionLine/PromptedResultConditionDescription_2"/>
                           <w:id w:val="759945394"/>
                           <w:placeholder>
-                            <w:docPart w:val="DefaultPlaceholder_-1854013440"/>
+                            <w:docPart w:val="3790034039614CA58B671ACF9F890A21"/>
                           </w:placeholder>
                           <w:dataBinding w:prefixMappings="xmlns:ns0='urn:microsoft-dynamics-nav/reports/Qlty_Certificate_of_Analysis/20401/'" w:xpath="/ns0:NavWordReportXmlPart[1]/ns0:CurrentInspection[1]/ns0:CurrentInspectionLine[1]/ns0:PromptedResultConditionDescription_2[1]" w:storeItemID="{F00BF611-06BA-436C-902A-C0D5E8DF929B}"/>
                           <w15:color w:val="808080"/>
@@ -864,17 +1037,15 @@
                         <w:sdtContent>
                           <w:tc>
                             <w:tcPr>
-                              <w:tcW w:w="2070" w:type="dxa"/>
+                              <w:tcW w:w="2361" w:type="dxa"/>
                             </w:tcPr>
                             <w:p>
+                              <w:pPr>
+                                <w:framePr w:hSpace="180" w:wrap="around" w:hAnchor="text" w:vAnchor="text" w:y="230"/>
+                              </w:pPr>
                               <w:r>
-                                <w:t>PromptedResultConditionDescription_</w:t>
+                                <w:t>PromptedResultConditionDescription_2</w:t>
                               </w:r>
-                              <w:proofErr w:type="gramStart"/>
-                              <w:r>
-                                <w:t>2</w:t>
-                              </w:r>
-                              <w:proofErr w:type="gramEnd"/>
                             </w:p>
                           </w:tc>
                         </w:sdtContent>
@@ -885,7 +1056,7 @@
                 </w:tc>
                 <w:tc>
                   <w:tcPr>
-                    <w:tcW w:w="206" w:type="dxa"/>
+                    <w:tcW w:w="20" w:type="dxa"/>
                   </w:tcPr>
                   <w:p/>
                 </w:tc>
@@ -895,6 +1066,7 @@
         </w:sdtContent>
       </w:sdt>
     </w:tbl>
+    <w:p/>
     <w:p>
       <w:pPr>
         <w:tabs>
@@ -1353,7 +1525,7 @@
                     <w:rFonts w:asciiTheme="majorHAnsi" w:hAnsiTheme="majorHAnsi"/>
                     <w:szCs w:val="18"/>
                   </w:rPr>
-                  <w:t>FinishedDateOnly</w:t>
+                  <w:t>QltyInspection_Finished_Date</w:t>
                 </w:r>
                 <w:proofErr w:type="spellEnd"/>
               </w:p>
@@ -1419,7 +1591,7 @@
                     <w:rFonts w:asciiTheme="majorHAnsi" w:hAnsiTheme="majorHAnsi"/>
                     <w:szCs w:val="18"/>
                   </w:rPr>
-                  <w:t>FinishedDateOnly</w:t>
+                  <w:t>QltyInspection_Finished_Date</w:t>
                 </w:r>
                 <w:proofErr w:type="spellEnd"/>
               </w:p>
@@ -1621,11 +1793,36 @@
           <w:pStyle w:val="Style1"/>
           <w:jc w:val="right"/>
         </w:pPr>
+        <w:sdt>
+          <w:sdtPr>
+            <w:rPr>
+              <w:rStyle w:val="SidetalpaginaChar"/>
+            </w:rPr>
+            <w:alias w:val="PageLabel"/>
+            <w:tag w:val="#BC:InsertDataItem,Labels/PageLabel"/>
+            <w:id w:val="-934898807"/>
+            <w:placeholder>
+              <w:docPart w:val="D749E14C960744E2B461D0D5C759A3D1"/>
+            </w:placeholder>
+            <w:dataBinding w:prefixMappings="xmlns:ns0='urn:microsoft-dynamics-nav/reports/Qlty_Certificate_of_Analysis/20401/' " w:xpath="/ns0:NavWordReportXmlPart[1]/ns0:Labels[1]/ns0:PageLabel[1]" w:storeItemID="{F00BF611-06BA-436C-902A-C0D5E8DF929B}"/>
+            <w:text/>
+          </w:sdtPr>
+          <w:sdtContent>
+            <w:proofErr w:type="spellStart"/>
+            <w:r>
+              <w:rPr>
+                <w:rStyle w:val="SidetalpaginaChar"/>
+              </w:rPr>
+              <w:t>PageLabel</w:t>
+            </w:r>
+            <w:proofErr w:type="spellEnd"/>
+          </w:sdtContent>
+        </w:sdt>
         <w:r>
           <w:rPr>
             <w:rStyle w:val="SidetalpaginaChar"/>
           </w:rPr>
-          <w:t xml:space="preserve">Page </w:t>
+          <w:t xml:space="preserve"> </w:t>
         </w:r>
         <w:r>
           <w:rPr>
@@ -1661,7 +1858,19 @@
           <w:rPr>
             <w:rStyle w:val="SidetalpaginaChar"/>
           </w:rPr>
-          <w:t xml:space="preserve"> of </w:t>
+          <w:t xml:space="preserve"> </w:t>
+        </w:r>
+        <w:r>
+          <w:rPr>
+            <w:rStyle w:val="SidetalpaginaChar"/>
+          </w:rPr>
+          <w:t>/</w:t>
+        </w:r>
+        <w:r>
+          <w:rPr>
+            <w:rStyle w:val="SidetalpaginaChar"/>
+          </w:rPr>
+          <w:t xml:space="preserve"> </w:t>
         </w:r>
         <w:r>
           <w:rPr>
@@ -1723,10 +1932,10 @@
       <w:tblLook w:val="04A0" w:firstRow="1" w:lastRow="0" w:firstColumn="1" w:lastColumn="0" w:noHBand="0" w:noVBand="1"/>
     </w:tblPr>
     <w:tblGrid>
-      <w:gridCol w:w="3504"/>
-      <w:gridCol w:w="3423"/>
+      <w:gridCol w:w="3503"/>
+      <w:gridCol w:w="3421"/>
       <w:gridCol w:w="1010"/>
-      <w:gridCol w:w="2529"/>
+      <w:gridCol w:w="2532"/>
     </w:tblGrid>
     <w:tr>
       <w:trPr>
@@ -1972,11 +2181,36 @@
               </w:rPr>
             </w:sdtEndPr>
             <w:sdtContent>
+              <w:sdt>
+                <w:sdtPr>
+                  <w:rPr>
+                    <w:rStyle w:val="SidetalpaginaChar"/>
+                  </w:rPr>
+                  <w:alias w:val="PageLabel"/>
+                  <w:tag w:val="#BC:InsertDataItem,Labels/PageLabel"/>
+                  <w:id w:val="-2060774807"/>
+                  <w:placeholder>
+                    <w:docPart w:val="DefaultPlaceholder_-1854013440"/>
+                  </w:placeholder>
+                  <w:dataBinding w:prefixMappings="xmlns:ns0='urn:microsoft-dynamics-nav/reports/Qlty_Certificate_of_Analysis/20401/' " w:xpath="/ns0:NavWordReportXmlPart[1]/ns0:Labels[1]/ns0:PageLabel[1]" w:storeItemID="{F00BF611-06BA-436C-902A-C0D5E8DF929B}"/>
+                  <w:text/>
+                </w:sdtPr>
+                <w:sdtContent>
+                  <w:proofErr w:type="spellStart"/>
+                  <w:r>
+                    <w:rPr>
+                      <w:rStyle w:val="SidetalpaginaChar"/>
+                    </w:rPr>
+                    <w:t>PageLabel</w:t>
+                  </w:r>
+                  <w:proofErr w:type="spellEnd"/>
+                </w:sdtContent>
+              </w:sdt>
               <w:r>
                 <w:rPr>
                   <w:rStyle w:val="SidetalpaginaChar"/>
                 </w:rPr>
-                <w:t xml:space="preserve">Page </w:t>
+                <w:t xml:space="preserve"> </w:t>
               </w:r>
               <w:r>
                 <w:rPr>
@@ -2012,7 +2246,19 @@
                 <w:rPr>
                   <w:rStyle w:val="SidetalpaginaChar"/>
                 </w:rPr>
-                <w:t xml:space="preserve"> of </w:t>
+                <w:t xml:space="preserve"> </w:t>
+              </w:r>
+              <w:r>
+                <w:rPr>
+                  <w:rStyle w:val="SidetalpaginaChar"/>
+                </w:rPr>
+                <w:t>/</w:t>
+              </w:r>
+              <w:r>
+                <w:rPr>
+                  <w:rStyle w:val="SidetalpaginaChar"/>
+                </w:rPr>
+                <w:t xml:space="preserve"> </w:t>
               </w:r>
               <w:r>
                 <w:rPr>
@@ -2196,7 +2442,7 @@
       </w:tblPrEx>
       <w:trPr>
         <w:gridAfter w:val="2"/>
-        <w:wAfter w:w="6856" w:type="dxa"/>
+        <w:wAfter w:w="6861" w:type="dxa"/>
       </w:trPr>
       <w:tc>
         <w:tcPr>
@@ -2225,6 +2471,40 @@
           </w:sdtContent>
         </w:sdt>
       </w:tc>
+    </w:tr>
+    <w:tr>
+      <w:tblPrEx>
+        <w:tblLook w:val="04A0" w:firstRow="1" w:lastRow="0" w:firstColumn="1" w:lastColumn="0" w:noHBand="0" w:noVBand="1"/>
+      </w:tblPrEx>
+      <w:trPr>
+        <w:gridAfter w:val="2"/>
+        <w:wAfter w:w="6861" w:type="dxa"/>
+      </w:trPr>
+      <w:sdt>
+        <w:sdtPr>
+          <w:alias w:val="ReinspectionSequenceInformation"/>
+          <w:tag w:val="#BC:InsertDataItem,DataItems/CurrentInspection/ReinspectionSequenceInformation"/>
+          <w:id w:val="2112705256"/>
+          <w:placeholder>
+            <w:docPart w:val="DefaultPlaceholder_-1854013440"/>
+          </w:placeholder>
+          <w15:dataBinding w:prefixMappings="xmlns:ns0='urn:microsoft-dynamics-nav/reports/Qlty_Certificate_of_Analysis/20401/' " w:xpath="/ns0:NavWordReportXmlPart[1]/ns0:CurrentInspection[1]/ns0:ReinspectionSequenceInformation[1]" w:storeItemID="{F00BF611-06BA-436C-902A-C0D5E8DF929B}" w16sdtdh:storeItemChecksum="0BxWsQ=="/>
+        </w:sdtPr>
+        <w:sdtContent>
+          <w:tc>
+            <w:tcPr>
+              <w:tcW w:w="3595" w:type="dxa"/>
+            </w:tcPr>
+            <w:p>
+              <w:proofErr w:type="spellStart"/>
+              <w:r>
+                <w:t>ReinspectionSequenceInformation</w:t>
+              </w:r>
+              <w:proofErr w:type="spellEnd"/>
+            </w:p>
+          </w:tc>
+        </w:sdtContent>
+      </w:sdt>
     </w:tr>
   </w:tbl>
   <w:p>
@@ -2258,7 +2538,7 @@
       <w:tc>
         <w:tcPr>
           <w:tcW w:w="5485" w:type="dxa"/>
-          <w:vAlign w:val="bottom"/>
+          <w:vAlign w:val="center"/>
         </w:tcPr>
         <w:p>
           <w:pPr>
@@ -2406,22 +2686,48 @@
       <w:trPr>
         <w:trHeight w:val="529"/>
       </w:trPr>
-      <w:tc>
-        <w:tcPr>
-          <w:tcW w:w="5485" w:type="dxa"/>
-        </w:tcPr>
-        <w:p>
-          <w:pPr>
-            <w:pStyle w:val="BodytekstinHeaderFooter"/>
-            <w:tabs>
-              <w:tab w:val="left" w:pos="1030"/>
-            </w:tabs>
-            <w:rPr>
-              <w:rStyle w:val="TitleChar"/>
-            </w:rPr>
-          </w:pPr>
-        </w:p>
-      </w:tc>
+      <w:sdt>
+        <w:sdtPr>
+          <w:alias w:val="COAContact_All"/>
+          <w:tag w:val="#BC:InsertDataItem,DataItems/COAContact_All"/>
+          <w:id w:val="-1661616009"/>
+          <w:placeholder>
+            <w:docPart w:val="DefaultPlaceholder_-1854013440"/>
+          </w:placeholder>
+          <w15:dataBinding w:prefixMappings="xmlns:ns0='urn:microsoft-dynamics-nav/reports/Qlty_Certificate_of_Analysis/20401/' " w:xpath="/ns0:NavWordReportXmlPart[1]/ns0:CurrentInspection[1]/ns0:COAContact_All[1]" w:storeItemID="{F00BF611-06BA-436C-902A-C0D5E8DF929B}" w16sdtdh:storeItemChecksum="0BxWsQ=="/>
+        </w:sdtPr>
+        <w:sdtContent>
+          <w:tc>
+            <w:tcPr>
+              <w:tcW w:w="5485" w:type="dxa"/>
+            </w:tcPr>
+            <w:p>
+              <w:pPr>
+                <w:pStyle w:val="BodytekstinHeaderFooter"/>
+                <w:tabs>
+                  <w:tab w:val="left" w:pos="1030"/>
+                </w:tabs>
+                <w:spacing w:before="240"/>
+                <w:rPr>
+                  <w:rStyle w:val="TitleChar"/>
+                  <w:rFonts w:eastAsiaTheme="minorEastAsia" w:cstheme="minorBidi"/>
+                  <w:b w:val="0"/>
+                  <w:spacing w:val="0"/>
+                  <w:kern w:val="0"/>
+                  <w:sz w:val="18"/>
+                  <w:szCs w:val="22"/>
+                  <w14:ligatures w14:val="none"/>
+                </w:rPr>
+              </w:pPr>
+              <w:proofErr w:type="spellStart"/>
+              <w:r>
+                <w:t>COAContact_All</w:t>
+              </w:r>
+              <w:proofErr w:type="spellEnd"/>
+            </w:p>
+          </w:tc>
+        </w:sdtContent>
+      </w:sdt>
       <w:tc>
         <w:tcPr>
           <w:tcW w:w="4971" w:type="dxa"/>
@@ -4323,177 +4629,6 @@
     </w:docPart>
     <w:docPart>
       <w:docPartPr>
-        <w:name w:val="54E88215FCB04D4A96ECA2EDA736E877"/>
-        <w:category>
-          <w:name w:val="General"/>
-          <w:gallery w:val="placeholder"/>
-        </w:category>
-        <w:types>
-          <w:type w:val="bbPlcHdr"/>
-        </w:types>
-        <w:behaviors>
-          <w:behavior w:val="content"/>
-        </w:behaviors>
-        <w:guid w:val="{77542940-7748-4545-90FF-73FC5F65E036}"/>
-      </w:docPartPr>
-      <w:docPartBody>
-        <w:p>
-          <w:pPr>
-            <w:pStyle w:val="54E88215FCB04D4A96ECA2EDA736E877"/>
-          </w:pPr>
-          <w:r>
-            <w:rPr>
-              <w:rStyle w:val="PlaceholderText"/>
-            </w:rPr>
-            <w:t>Klik eller tryk her for at skrive tekst.</w:t>
-          </w:r>
-        </w:p>
-      </w:docPartBody>
-    </w:docPart>
-    <w:docPart>
-      <w:docPartPr>
-        <w:name w:val="9A399367765C4525A49DC7400980BF31"/>
-        <w:category>
-          <w:name w:val="General"/>
-          <w:gallery w:val="placeholder"/>
-        </w:category>
-        <w:types>
-          <w:type w:val="bbPlcHdr"/>
-        </w:types>
-        <w:behaviors>
-          <w:behavior w:val="content"/>
-        </w:behaviors>
-        <w:guid w:val="{45F04230-012E-4F5A-AF27-C8B302801E5B}"/>
-      </w:docPartPr>
-      <w:docPartBody>
-        <w:p>
-          <w:pPr>
-            <w:pStyle w:val="9A399367765C4525A49DC7400980BF31"/>
-          </w:pPr>
-          <w:r>
-            <w:rPr>
-              <w:rStyle w:val="PlaceholderText"/>
-            </w:rPr>
-            <w:t>Klik eller tryk her for at skrive tekst.</w:t>
-          </w:r>
-        </w:p>
-      </w:docPartBody>
-    </w:docPart>
-    <w:docPart>
-      <w:docPartPr>
-        <w:name w:val="ED80FB550E0B43FB90A910C8E1F18367"/>
-        <w:category>
-          <w:name w:val="General"/>
-          <w:gallery w:val="placeholder"/>
-        </w:category>
-        <w:types>
-          <w:type w:val="bbPlcHdr"/>
-        </w:types>
-        <w:behaviors>
-          <w:behavior w:val="content"/>
-        </w:behaviors>
-        <w:guid w:val="{BF9B7CB7-4967-4D20-BA4C-18AFC35A75C3}"/>
-      </w:docPartPr>
-      <w:docPartBody>
-        <w:p>
-          <w:pPr>
-            <w:pStyle w:val="ED80FB550E0B43FB90A910C8E1F18367"/>
-          </w:pPr>
-          <w:r>
-            <w:rPr>
-              <w:rStyle w:val="PlaceholderText"/>
-            </w:rPr>
-            <w:t>Klik eller tryk her for at skrive tekst.</w:t>
-          </w:r>
-        </w:p>
-      </w:docPartBody>
-    </w:docPart>
-    <w:docPart>
-      <w:docPartPr>
-        <w:name w:val="48487D8740B241C192207B9B8EDAA979"/>
-        <w:category>
-          <w:name w:val="General"/>
-          <w:gallery w:val="placeholder"/>
-        </w:category>
-        <w:types>
-          <w:type w:val="bbPlcHdr"/>
-        </w:types>
-        <w:behaviors>
-          <w:behavior w:val="content"/>
-        </w:behaviors>
-        <w:guid w:val="{9BDFDA11-A552-4678-B0D2-4A377F68CAD7}"/>
-      </w:docPartPr>
-      <w:docPartBody>
-        <w:p>
-          <w:pPr>
-            <w:pStyle w:val="48487D8740B241C192207B9B8EDAA979"/>
-          </w:pPr>
-          <w:r>
-            <w:rPr>
-              <w:rStyle w:val="PlaceholderText"/>
-            </w:rPr>
-            <w:t>Klik eller tryk her for at skrive tekst.</w:t>
-          </w:r>
-        </w:p>
-      </w:docPartBody>
-    </w:docPart>
-    <w:docPart>
-      <w:docPartPr>
-        <w:name w:val="4FE64E645A5A4B2AACD126E30041900B"/>
-        <w:category>
-          <w:name w:val="General"/>
-          <w:gallery w:val="placeholder"/>
-        </w:category>
-        <w:types>
-          <w:type w:val="bbPlcHdr"/>
-        </w:types>
-        <w:behaviors>
-          <w:behavior w:val="content"/>
-        </w:behaviors>
-        <w:guid w:val="{ABB50139-B90B-4C4E-A845-CE6BBF106705}"/>
-      </w:docPartPr>
-      <w:docPartBody>
-        <w:p>
-          <w:r>
-            <w:rPr>
-              <w:rStyle w:val="PlaceholderText"/>
-            </w:rPr>
-            <w:t>CurrentInspectionLine: Insert any data item you want to repeat.</w:t>
-          </w:r>
-        </w:p>
-      </w:docPartBody>
-    </w:docPart>
-    <w:docPart>
-      <w:docPartPr>
-        <w:name w:val="20B0D5AFBB5E4DC4B8EAD8AAD6C206EF"/>
-        <w:category>
-          <w:name w:val="General"/>
-          <w:gallery w:val="placeholder"/>
-        </w:category>
-        <w:types>
-          <w:type w:val="bbPlcHdr"/>
-        </w:types>
-        <w:behaviors>
-          <w:behavior w:val="content"/>
-        </w:behaviors>
-        <w:guid w:val="{9682E5DF-4968-4473-955C-D11B2BD84381}"/>
-      </w:docPartPr>
-      <w:docPartBody>
-        <w:p>
-          <w:pPr>
-            <w:pStyle w:val="20B0D5AFBB5E4DC4B8EAD8AAD6C206EF"/>
-          </w:pPr>
-          <w:r>
-            <w:rPr>
-              <w:rStyle w:val="PlaceholderText"/>
-            </w:rPr>
-            <w:t>Click or tap here to enter text.</w:t>
-          </w:r>
-        </w:p>
-      </w:docPartBody>
-    </w:docPart>
-    <w:docPart>
-      <w:docPartPr>
         <w:name w:val="D8C12B4B2CFA4E57A92BC5E3C7E4BC19"/>
         <w:category>
           <w:name w:val="General"/>
@@ -4784,7 +4919,7 @@
     </w:docPart>
     <w:docPart>
       <w:docPartPr>
-        <w:name w:val="696A088E51534793916EB4D173AB0EDB"/>
+        <w:name w:val="3790034039614CA58B671ACF9F890A21"/>
         <w:category>
           <w:name w:val="General"/>
           <w:gallery w:val="placeholder"/>
@@ -4795,12 +4930,12 @@
         <w:behaviors>
           <w:behavior w:val="content"/>
         </w:behaviors>
-        <w:guid w:val="{94E15D5D-C268-46BD-8C8B-49372B67F1D8}"/>
+        <w:guid w:val="{1CEE7C03-A9C4-46EC-A2C9-FD2FC35CF70D}"/>
       </w:docPartPr>
       <w:docPartBody>
         <w:p>
           <w:pPr>
-            <w:pStyle w:val="696A088E51534793916EB4D173AB0EDB"/>
+            <w:pStyle w:val="3790034039614CA58B671ACF9F890A21"/>
           </w:pPr>
           <w:r>
             <w:rPr>
@@ -4813,7 +4948,7 @@
     </w:docPart>
     <w:docPart>
       <w:docPartPr>
-        <w:name w:val="E6FA60A5C98E4F749DA4ED93BFE20312"/>
+        <w:name w:val="DC1D345B68CF4F25A790AF73852A64DC"/>
         <w:category>
           <w:name w:val="General"/>
           <w:gallery w:val="placeholder"/>
@@ -4824,12 +4959,12 @@
         <w:behaviors>
           <w:behavior w:val="content"/>
         </w:behaviors>
-        <w:guid w:val="{F469DB16-F280-49FD-9C24-49C03AC71C5C}"/>
+        <w:guid w:val="{6BA2A8C0-5862-4B32-9249-41A2B1352FC8}"/>
       </w:docPartPr>
       <w:docPartBody>
         <w:p>
           <w:pPr>
-            <w:pStyle w:val="E6FA60A5C98E4F749DA4ED93BFE20312"/>
+            <w:pStyle w:val="DC1D345B68CF4F25A790AF73852A64DC"/>
           </w:pPr>
           <w:r>
             <w:rPr>
@@ -4842,7 +4977,7 @@
     </w:docPart>
     <w:docPart>
       <w:docPartPr>
-        <w:name w:val="ECB3F27933724B1A8C630965E6024B65"/>
+        <w:name w:val="B5812A426F6C434FB5023271BAAD75FE"/>
         <w:category>
           <w:name w:val="General"/>
           <w:gallery w:val="placeholder"/>
@@ -4853,12 +4988,12 @@
         <w:behaviors>
           <w:behavior w:val="content"/>
         </w:behaviors>
-        <w:guid w:val="{C04D9FF0-878E-4B9C-A49B-249903C33040}"/>
+        <w:guid w:val="{6BE39E14-A48C-4EE1-9BE6-CBE87AAE227F}"/>
       </w:docPartPr>
       <w:docPartBody>
         <w:p>
           <w:pPr>
-            <w:pStyle w:val="ECB3F27933724B1A8C630965E6024B65"/>
+            <w:pStyle w:val="B5812A426F6C434FB5023271BAAD75FE"/>
           </w:pPr>
           <w:r>
             <w:rPr>
@@ -4871,7 +5006,7 @@
     </w:docPart>
     <w:docPart>
       <w:docPartPr>
-        <w:name w:val="CAF2966426F1429B9BF7DAAA424ABD99"/>
+        <w:name w:val="B46C77011B1F4E29A3244128A7B78C77"/>
         <w:category>
           <w:name w:val="General"/>
           <w:gallery w:val="placeholder"/>
@@ -4882,12 +5017,12 @@
         <w:behaviors>
           <w:behavior w:val="content"/>
         </w:behaviors>
-        <w:guid w:val="{3D99F8D3-74F6-4486-8DC8-4212B7AFF326}"/>
+        <w:guid w:val="{905FB412-0D6B-4309-AE25-D6E589538244}"/>
       </w:docPartPr>
       <w:docPartBody>
         <w:p>
           <w:pPr>
-            <w:pStyle w:val="CAF2966426F1429B9BF7DAAA424ABD99"/>
+            <w:pStyle w:val="B46C77011B1F4E29A3244128A7B78C77"/>
           </w:pPr>
           <w:r>
             <w:rPr>
@@ -4900,7 +5035,7 @@
     </w:docPart>
     <w:docPart>
       <w:docPartPr>
-        <w:name w:val="6621457B887942D580412561915523CD"/>
+        <w:name w:val="013B7F4C8B4A4874B1B2A8A6586E445C"/>
         <w:category>
           <w:name w:val="General"/>
           <w:gallery w:val="placeholder"/>
@@ -4911,12 +5046,12 @@
         <w:behaviors>
           <w:behavior w:val="content"/>
         </w:behaviors>
-        <w:guid w:val="{711FEF7F-DED2-4301-9479-6910D9DE560F}"/>
+        <w:guid w:val="{98418E1C-D424-4347-92A5-A204F7083EFE}"/>
       </w:docPartPr>
       <w:docPartBody>
         <w:p>
           <w:pPr>
-            <w:pStyle w:val="6621457B887942D580412561915523CD"/>
+            <w:pStyle w:val="013B7F4C8B4A4874B1B2A8A6586E445C"/>
           </w:pPr>
           <w:r>
             <w:rPr>
@@ -4929,7 +5064,7 @@
     </w:docPart>
     <w:docPart>
       <w:docPartPr>
-        <w:name w:val="5B417DC4BDDF47D5BAF07F17E837C7AE"/>
+        <w:name w:val="EAFA4C3784BF42259E73179BCF3AB036"/>
         <w:category>
           <w:name w:val="General"/>
           <w:gallery w:val="placeholder"/>
@@ -4940,12 +5075,99 @@
         <w:behaviors>
           <w:behavior w:val="content"/>
         </w:behaviors>
-        <w:guid w:val="{AB1B9D90-C6B8-48ED-8507-B702ABF891B2}"/>
+        <w:guid w:val="{DE95B5C7-93A7-478F-829B-56C885BF47EE}"/>
       </w:docPartPr>
       <w:docPartBody>
         <w:p>
           <w:pPr>
-            <w:pStyle w:val="5B417DC4BDDF47D5BAF07F17E837C7AE"/>
+            <w:pStyle w:val="EAFA4C3784BF42259E73179BCF3AB036"/>
+          </w:pPr>
+          <w:r>
+            <w:rPr>
+              <w:rStyle w:val="PlaceholderText"/>
+            </w:rPr>
+            <w:t>CurrentInspectionLine: Insert any data item you want to repeat.</w:t>
+          </w:r>
+        </w:p>
+      </w:docPartBody>
+    </w:docPart>
+    <w:docPart>
+      <w:docPartPr>
+        <w:name w:val="74E56A02732E4B85B41C3B4B19F9A846"/>
+        <w:category>
+          <w:name w:val="General"/>
+          <w:gallery w:val="placeholder"/>
+        </w:category>
+        <w:types>
+          <w:type w:val="bbPlcHdr"/>
+        </w:types>
+        <w:behaviors>
+          <w:behavior w:val="content"/>
+        </w:behaviors>
+        <w:guid w:val="{EA13EB77-5434-4CEA-919C-6C58F3D00B7D}"/>
+      </w:docPartPr>
+      <w:docPartBody>
+        <w:p>
+          <w:pPr>
+            <w:pStyle w:val="74E56A02732E4B85B41C3B4B19F9A846"/>
+          </w:pPr>
+          <w:r>
+            <w:rPr>
+              <w:rStyle w:val="PlaceholderText"/>
+            </w:rPr>
+            <w:t>Click or tap here to enter text.</w:t>
+          </w:r>
+        </w:p>
+      </w:docPartBody>
+    </w:docPart>
+    <w:docPart>
+      <w:docPartPr>
+        <w:name w:val="689BE888BFF1472D8E27C8760F1B47BA"/>
+        <w:category>
+          <w:name w:val="General"/>
+          <w:gallery w:val="placeholder"/>
+        </w:category>
+        <w:types>
+          <w:type w:val="bbPlcHdr"/>
+        </w:types>
+        <w:behaviors>
+          <w:behavior w:val="content"/>
+        </w:behaviors>
+        <w:guid w:val="{A1F0653A-C052-44AD-9295-FAD10A9BB649}"/>
+      </w:docPartPr>
+      <w:docPartBody>
+        <w:p>
+          <w:pPr>
+            <w:pStyle w:val="689BE888BFF1472D8E27C8760F1B47BA"/>
+          </w:pPr>
+          <w:r>
+            <w:rPr>
+              <w:rStyle w:val="PlaceholderText"/>
+            </w:rPr>
+            <w:t>Click or tap here to enter text.</w:t>
+          </w:r>
+        </w:p>
+      </w:docPartBody>
+    </w:docPart>
+    <w:docPart>
+      <w:docPartPr>
+        <w:name w:val="FF71EE4101DE474BB9E0488A463E2526"/>
+        <w:category>
+          <w:name w:val="General"/>
+          <w:gallery w:val="placeholder"/>
+        </w:category>
+        <w:types>
+          <w:type w:val="bbPlcHdr"/>
+        </w:types>
+        <w:behaviors>
+          <w:behavior w:val="content"/>
+        </w:behaviors>
+        <w:guid w:val="{885FA53D-DC76-4ACB-90FD-8ED0014F6AF5}"/>
+      </w:docPartPr>
+      <w:docPartBody>
+        <w:p>
+          <w:pPr>
+            <w:pStyle w:val="FF71EE4101DE474BB9E0488A463E2526"/>
           </w:pPr>
           <w:r>
             <w:rPr>
@@ -4958,7 +5180,7 @@
     </w:docPart>
     <w:docPart>
       <w:docPartPr>
-        <w:name w:val="C19E5EA0C249448891F06468EC7ACA72"/>
+        <w:name w:val="720D8BC7856F435891DBD9A3EFEBC90B"/>
         <w:category>
           <w:name w:val="General"/>
           <w:gallery w:val="placeholder"/>
@@ -4969,12 +5191,41 @@
         <w:behaviors>
           <w:behavior w:val="content"/>
         </w:behaviors>
-        <w:guid w:val="{6485C809-EE89-4300-B89E-C799C8ADF8C8}"/>
+        <w:guid w:val="{0BAA0E83-380E-47BA-8E79-E8470EECB0AE}"/>
       </w:docPartPr>
       <w:docPartBody>
         <w:p>
           <w:pPr>
-            <w:pStyle w:val="C19E5EA0C249448891F06468EC7ACA72"/>
+            <w:pStyle w:val="720D8BC7856F435891DBD9A3EFEBC90B"/>
+          </w:pPr>
+          <w:r>
+            <w:rPr>
+              <w:rStyle w:val="PlaceholderText"/>
+            </w:rPr>
+            <w:t>Klik eller tryk her for at skrive tekst.</w:t>
+          </w:r>
+        </w:p>
+      </w:docPartBody>
+    </w:docPart>
+    <w:docPart>
+      <w:docPartPr>
+        <w:name w:val="653C3B5A1DC9455CAC82A8C31CEEA911"/>
+        <w:category>
+          <w:name w:val="General"/>
+          <w:gallery w:val="placeholder"/>
+        </w:category>
+        <w:types>
+          <w:type w:val="bbPlcHdr"/>
+        </w:types>
+        <w:behaviors>
+          <w:behavior w:val="content"/>
+        </w:behaviors>
+        <w:guid w:val="{78ECC3D2-67C0-4F6C-A4AF-8D75E94F5270}"/>
+      </w:docPartPr>
+      <w:docPartBody>
+        <w:p>
+          <w:pPr>
+            <w:pStyle w:val="653C3B5A1DC9455CAC82A8C31CEEA911"/>
           </w:pPr>
           <w:r>
             <w:rPr>
@@ -4987,7 +5238,7 @@
     </w:docPart>
     <w:docPart>
       <w:docPartPr>
-        <w:name w:val="8214464B04194E819F152F5CA1E6D069"/>
+        <w:name w:val="CCFB25846BB14C249ED55F1742B218CA"/>
         <w:category>
           <w:name w:val="General"/>
           <w:gallery w:val="placeholder"/>
@@ -4998,12 +5249,12 @@
         <w:behaviors>
           <w:behavior w:val="content"/>
         </w:behaviors>
-        <w:guid w:val="{2E667B8D-7C58-4EDE-BDA4-51EF5C573C48}"/>
+        <w:guid w:val="{97F9C261-1C55-447E-BD94-2A9036B9DFA8}"/>
       </w:docPartPr>
       <w:docPartBody>
         <w:p>
           <w:pPr>
-            <w:pStyle w:val="8214464B04194E819F152F5CA1E6D069"/>
+            <w:pStyle w:val="CCFB25846BB14C249ED55F1742B218CA"/>
           </w:pPr>
           <w:r>
             <w:rPr>
@@ -5016,7 +5267,7 @@
     </w:docPart>
     <w:docPart>
       <w:docPartPr>
-        <w:name w:val="30F240CE45B1491C92022A68B3085E55"/>
+        <w:name w:val="A13A81114EF64334B8E51A09F947B1C5"/>
         <w:category>
           <w:name w:val="General"/>
           <w:gallery w:val="placeholder"/>
@@ -5027,12 +5278,128 @@
         <w:behaviors>
           <w:behavior w:val="content"/>
         </w:behaviors>
-        <w:guid w:val="{DD084DB9-BA8F-408C-B544-27B044AE208A}"/>
+        <w:guid w:val="{770ABB21-54B2-4E80-8F14-544C7E352971}"/>
       </w:docPartPr>
       <w:docPartBody>
         <w:p>
           <w:pPr>
-            <w:pStyle w:val="30F240CE45B1491C92022A68B3085E55"/>
+            <w:pStyle w:val="A13A81114EF64334B8E51A09F947B1C5"/>
+          </w:pPr>
+          <w:r>
+            <w:rPr>
+              <w:rStyle w:val="PlaceholderText"/>
+            </w:rPr>
+            <w:t>Klik eller tryk her for at skrive tekst.</w:t>
+          </w:r>
+        </w:p>
+      </w:docPartBody>
+    </w:docPart>
+    <w:docPart>
+      <w:docPartPr>
+        <w:name w:val="969E5DE1EBD540C9BA10B6F7575C6F06"/>
+        <w:category>
+          <w:name w:val="General"/>
+          <w:gallery w:val="placeholder"/>
+        </w:category>
+        <w:types>
+          <w:type w:val="bbPlcHdr"/>
+        </w:types>
+        <w:behaviors>
+          <w:behavior w:val="content"/>
+        </w:behaviors>
+        <w:guid w:val="{BA95A577-9AEF-454B-B61C-43D2C16BA4D9}"/>
+      </w:docPartPr>
+      <w:docPartBody>
+        <w:p>
+          <w:pPr>
+            <w:pStyle w:val="969E5DE1EBD540C9BA10B6F7575C6F06"/>
+          </w:pPr>
+          <w:r>
+            <w:rPr>
+              <w:rStyle w:val="PlaceholderText"/>
+            </w:rPr>
+            <w:t>Klik eller tryk her for at skrive tekst.</w:t>
+          </w:r>
+        </w:p>
+      </w:docPartBody>
+    </w:docPart>
+    <w:docPart>
+      <w:docPartPr>
+        <w:name w:val="956387B830824AAFBBDA5B13096155E3"/>
+        <w:category>
+          <w:name w:val="General"/>
+          <w:gallery w:val="placeholder"/>
+        </w:category>
+        <w:types>
+          <w:type w:val="bbPlcHdr"/>
+        </w:types>
+        <w:behaviors>
+          <w:behavior w:val="content"/>
+        </w:behaviors>
+        <w:guid w:val="{0A062631-35CA-417A-A6C0-7DD31A412C14}"/>
+      </w:docPartPr>
+      <w:docPartBody>
+        <w:p>
+          <w:pPr>
+            <w:pStyle w:val="956387B830824AAFBBDA5B13096155E3"/>
+          </w:pPr>
+          <w:r>
+            <w:rPr>
+              <w:rStyle w:val="PlaceholderText"/>
+            </w:rPr>
+            <w:t>Klik eller tryk her for at skrive tekst.</w:t>
+          </w:r>
+        </w:p>
+      </w:docPartBody>
+    </w:docPart>
+    <w:docPart>
+      <w:docPartPr>
+        <w:name w:val="16673B5D3190471B982ACDE7EF77C1F7"/>
+        <w:category>
+          <w:name w:val="General"/>
+          <w:gallery w:val="placeholder"/>
+        </w:category>
+        <w:types>
+          <w:type w:val="bbPlcHdr"/>
+        </w:types>
+        <w:behaviors>
+          <w:behavior w:val="content"/>
+        </w:behaviors>
+        <w:guid w:val="{4E6C41D8-90D6-4F74-8EAF-163AD75C750E}"/>
+      </w:docPartPr>
+      <w:docPartBody>
+        <w:p>
+          <w:pPr>
+            <w:pStyle w:val="16673B5D3190471B982ACDE7EF77C1F7"/>
+          </w:pPr>
+          <w:r>
+            <w:rPr>
+              <w:rStyle w:val="PlaceholderText"/>
+            </w:rPr>
+            <w:t>Klik eller tryk her for at skrive tekst.</w:t>
+          </w:r>
+        </w:p>
+      </w:docPartBody>
+    </w:docPart>
+    <w:docPart>
+      <w:docPartPr>
+        <w:name w:val="D7D6E4B6FD5543DA89CF0B73B6E30292"/>
+        <w:category>
+          <w:name w:val="General"/>
+          <w:gallery w:val="placeholder"/>
+        </w:category>
+        <w:types>
+          <w:type w:val="bbPlcHdr"/>
+        </w:types>
+        <w:behaviors>
+          <w:behavior w:val="content"/>
+        </w:behaviors>
+        <w:guid w:val="{0E8A05FA-7D2D-4DA0-AF3D-47E7024D56E4}"/>
+      </w:docPartPr>
+      <w:docPartBody>
+        <w:p>
+          <w:pPr>
+            <w:pStyle w:val="D7D6E4B6FD5543DA89CF0B73B6E30292"/>
           </w:pPr>
           <w:r>
             <w:rPr>
@@ -5045,7 +5412,7 @@
     </w:docPart>
     <w:docPart>
       <w:docPartPr>
-        <w:name w:val="8DC9B09F32944319ACD1DDBB518C0F54"/>
+        <w:name w:val="2C3F2D2C612B4B84910A5B67FA64B631"/>
         <w:category>
           <w:name w:val="General"/>
           <w:gallery w:val="placeholder"/>
@@ -5056,25 +5423,25 @@
         <w:behaviors>
           <w:behavior w:val="content"/>
         </w:behaviors>
-        <w:guid w:val="{B3B162C5-E9AB-41E2-8030-6F3137CC8342}"/>
+        <w:guid w:val="{9EA15297-DEA2-4C56-BFB7-C10750BA00A6}"/>
       </w:docPartPr>
       <w:docPartBody>
         <w:p>
           <w:pPr>
-            <w:pStyle w:val="8DC9B09F32944319ACD1DDBB518C0F54"/>
+            <w:pStyle w:val="2C3F2D2C612B4B84910A5B67FA64B631"/>
           </w:pPr>
           <w:r>
             <w:rPr>
               <w:rStyle w:val="PlaceholderText"/>
             </w:rPr>
-            <w:t>Klik eller tryk her for at skrive tekst.</w:t>
+            <w:t>Click or tap here to enter text.</w:t>
           </w:r>
         </w:p>
       </w:docPartBody>
     </w:docPart>
     <w:docPart>
       <w:docPartPr>
-        <w:name w:val="1CA98067E53C40E9A075D6D0FF2C2B68"/>
+        <w:name w:val="356FDA147C3941778F5CECA01441805A"/>
         <w:category>
           <w:name w:val="General"/>
           <w:gallery w:val="placeholder"/>
@@ -5085,12 +5452,41 @@
         <w:behaviors>
           <w:behavior w:val="content"/>
         </w:behaviors>
-        <w:guid w:val="{D3A9FDC5-327A-40C3-9D1F-F72E1517529D}"/>
+        <w:guid w:val="{44A92BCB-BBA1-4289-9168-270D71CD3829}"/>
       </w:docPartPr>
       <w:docPartBody>
         <w:p>
           <w:pPr>
-            <w:pStyle w:val="1CA98067E53C40E9A075D6D0FF2C2B68"/>
+            <w:pStyle w:val="356FDA147C3941778F5CECA01441805A"/>
+          </w:pPr>
+          <w:r>
+            <w:rPr>
+              <w:rStyle w:val="PlaceholderText"/>
+            </w:rPr>
+            <w:t>Click or tap here to enter text.</w:t>
+          </w:r>
+        </w:p>
+      </w:docPartBody>
+    </w:docPart>
+    <w:docPart>
+      <w:docPartPr>
+        <w:name w:val="D749E14C960744E2B461D0D5C759A3D1"/>
+        <w:category>
+          <w:name w:val="General"/>
+          <w:gallery w:val="placeholder"/>
+        </w:category>
+        <w:types>
+          <w:type w:val="bbPlcHdr"/>
+        </w:types>
+        <w:behaviors>
+          <w:behavior w:val="content"/>
+        </w:behaviors>
+        <w:guid w:val="{C79382A5-D287-428E-BFE4-0446122FBC2A}"/>
+      </w:docPartPr>
+      <w:docPartBody>
+        <w:p>
+          <w:pPr>
+            <w:pStyle w:val="D749E14C960744E2B461D0D5C759A3D1"/>
           </w:pPr>
           <w:r>
             <w:rPr>
@@ -5166,41 +5562,57 @@
   </w:compat>
   <w:rsids>
     <w:rsidRoot w:val="00026C03"/>
+    <w:rsid w:val="00016B46"/>
     <w:rsid w:val="00026C03"/>
+    <w:rsid w:val="000374C8"/>
     <w:rsid w:val="000522FC"/>
     <w:rsid w:val="00054952"/>
     <w:rsid w:val="000A48AF"/>
     <w:rsid w:val="000B64D8"/>
+    <w:rsid w:val="000B7E6A"/>
     <w:rsid w:val="000C1471"/>
     <w:rsid w:val="000D1880"/>
     <w:rsid w:val="000F3B43"/>
+    <w:rsid w:val="000F7F1B"/>
     <w:rsid w:val="00102FEE"/>
     <w:rsid w:val="00111389"/>
     <w:rsid w:val="00113F8A"/>
+    <w:rsid w:val="00155323"/>
+    <w:rsid w:val="001716C0"/>
     <w:rsid w:val="00171F81"/>
     <w:rsid w:val="0017542B"/>
     <w:rsid w:val="001917C7"/>
     <w:rsid w:val="001C1EF7"/>
     <w:rsid w:val="001D1B62"/>
+    <w:rsid w:val="001E6374"/>
+    <w:rsid w:val="001E775F"/>
     <w:rsid w:val="001F0D00"/>
     <w:rsid w:val="001F1068"/>
+    <w:rsid w:val="00217EA5"/>
     <w:rsid w:val="00271A97"/>
+    <w:rsid w:val="00286B44"/>
     <w:rsid w:val="002A015A"/>
     <w:rsid w:val="002A0E84"/>
     <w:rsid w:val="002A6A1E"/>
     <w:rsid w:val="002B3DF6"/>
+    <w:rsid w:val="002E5CAE"/>
     <w:rsid w:val="002F3254"/>
     <w:rsid w:val="00311401"/>
     <w:rsid w:val="00317E31"/>
     <w:rsid w:val="00325189"/>
     <w:rsid w:val="003636BB"/>
+    <w:rsid w:val="003666A7"/>
+    <w:rsid w:val="0037228B"/>
     <w:rsid w:val="0039081A"/>
+    <w:rsid w:val="0039155B"/>
     <w:rsid w:val="003A4934"/>
     <w:rsid w:val="003B13C1"/>
     <w:rsid w:val="003E239B"/>
     <w:rsid w:val="003E653C"/>
     <w:rsid w:val="003F3F22"/>
+    <w:rsid w:val="00411B2A"/>
     <w:rsid w:val="004271BE"/>
+    <w:rsid w:val="00451506"/>
     <w:rsid w:val="004B593F"/>
     <w:rsid w:val="004D1299"/>
     <w:rsid w:val="004D73D0"/>
@@ -5209,45 +5621,79 @@
     <w:rsid w:val="00501962"/>
     <w:rsid w:val="00521E26"/>
     <w:rsid w:val="00551A5E"/>
+    <w:rsid w:val="005548F3"/>
     <w:rsid w:val="00586B0D"/>
+    <w:rsid w:val="005D1B53"/>
     <w:rsid w:val="005F0F84"/>
+    <w:rsid w:val="005F4FF1"/>
+    <w:rsid w:val="00605CE1"/>
     <w:rsid w:val="00676D3F"/>
     <w:rsid w:val="0069271F"/>
+    <w:rsid w:val="006A2829"/>
     <w:rsid w:val="006E63E7"/>
     <w:rsid w:val="00711164"/>
     <w:rsid w:val="007168A2"/>
+    <w:rsid w:val="007572CE"/>
+    <w:rsid w:val="007575E0"/>
+    <w:rsid w:val="0077434C"/>
     <w:rsid w:val="007956A8"/>
     <w:rsid w:val="007B47D9"/>
+    <w:rsid w:val="007D165C"/>
+    <w:rsid w:val="007D65A1"/>
+    <w:rsid w:val="007F2C78"/>
     <w:rsid w:val="007F589A"/>
     <w:rsid w:val="00802793"/>
     <w:rsid w:val="00805504"/>
+    <w:rsid w:val="008603D5"/>
+    <w:rsid w:val="0088055D"/>
     <w:rsid w:val="00890CEF"/>
+    <w:rsid w:val="008C7882"/>
+    <w:rsid w:val="008D0B19"/>
     <w:rsid w:val="008D1223"/>
+    <w:rsid w:val="008D2625"/>
     <w:rsid w:val="008D2B27"/>
     <w:rsid w:val="008E6AF9"/>
     <w:rsid w:val="008F3354"/>
     <w:rsid w:val="008F47B3"/>
     <w:rsid w:val="00922075"/>
+    <w:rsid w:val="00957FA4"/>
+    <w:rsid w:val="00963504"/>
+    <w:rsid w:val="009657E7"/>
+    <w:rsid w:val="00974DD3"/>
+    <w:rsid w:val="00981B73"/>
     <w:rsid w:val="009958A5"/>
     <w:rsid w:val="009C43D8"/>
     <w:rsid w:val="009F310E"/>
     <w:rsid w:val="009F3CE2"/>
+    <w:rsid w:val="009F5A7A"/>
     <w:rsid w:val="00A06F7B"/>
+    <w:rsid w:val="00A101D6"/>
+    <w:rsid w:val="00A21A4F"/>
     <w:rsid w:val="00A22ACD"/>
+    <w:rsid w:val="00A23822"/>
+    <w:rsid w:val="00A327DB"/>
+    <w:rsid w:val="00A42588"/>
+    <w:rsid w:val="00A5657A"/>
     <w:rsid w:val="00A70A2D"/>
     <w:rsid w:val="00A74A58"/>
     <w:rsid w:val="00A94A03"/>
+    <w:rsid w:val="00A960A0"/>
     <w:rsid w:val="00AB35DC"/>
+    <w:rsid w:val="00AB6BFF"/>
     <w:rsid w:val="00AC7C22"/>
     <w:rsid w:val="00AD5F1E"/>
     <w:rsid w:val="00AF1BF3"/>
+    <w:rsid w:val="00AF7276"/>
     <w:rsid w:val="00B01B39"/>
     <w:rsid w:val="00B05DFF"/>
     <w:rsid w:val="00B06C5E"/>
     <w:rsid w:val="00B205B5"/>
     <w:rsid w:val="00B26145"/>
+    <w:rsid w:val="00B30603"/>
     <w:rsid w:val="00B33746"/>
+    <w:rsid w:val="00B461C7"/>
     <w:rsid w:val="00B51E34"/>
+    <w:rsid w:val="00B52A3F"/>
     <w:rsid w:val="00B606BE"/>
     <w:rsid w:val="00B83A35"/>
     <w:rsid w:val="00C014EB"/>
@@ -5255,16 +5701,21 @@
     <w:rsid w:val="00C3763E"/>
     <w:rsid w:val="00C579E4"/>
     <w:rsid w:val="00C739F7"/>
+    <w:rsid w:val="00C8300E"/>
     <w:rsid w:val="00C85FFE"/>
+    <w:rsid w:val="00C92C5C"/>
+    <w:rsid w:val="00CA1DF8"/>
     <w:rsid w:val="00CA76BB"/>
     <w:rsid w:val="00CC1C0E"/>
     <w:rsid w:val="00CC1DAE"/>
     <w:rsid w:val="00D16B36"/>
+    <w:rsid w:val="00D267B3"/>
     <w:rsid w:val="00D422E3"/>
     <w:rsid w:val="00D5446D"/>
     <w:rsid w:val="00D855FC"/>
     <w:rsid w:val="00D91F2E"/>
     <w:rsid w:val="00DB4460"/>
+    <w:rsid w:val="00DB47C4"/>
     <w:rsid w:val="00DC6E86"/>
     <w:rsid w:val="00E077BC"/>
     <w:rsid w:val="00E14C23"/>
@@ -5273,6 +5724,7 @@
     <w:rsid w:val="00E96395"/>
     <w:rsid w:val="00EC7422"/>
     <w:rsid w:val="00ED6B2E"/>
+    <w:rsid w:val="00EF476B"/>
     <w:rsid w:val="00F019AE"/>
     <w:rsid w:val="00F1246A"/>
     <w:rsid w:val="00F22E08"/>
@@ -5280,6 +5732,7 @@
     <w:rsid w:val="00F42D0E"/>
     <w:rsid w:val="00F736EC"/>
     <w:rsid w:val="00FA67B4"/>
+    <w:rsid w:val="00FB23A7"/>
     <w:rsid w:val="00FC34CE"/>
     <w:rsid w:val="00FD0CC1"/>
     <w:rsid w:val="00FD2374"/>
@@ -5741,7 +6194,7 @@
     <w:basedOn w:val="DefaultParagraphFont"/>
     <w:uiPriority w:val="99"/>
     <w:semiHidden/>
-    <w:rsid w:val="00AF1BF3"/>
+    <w:rsid w:val="008D0B19"/>
     <w:rPr>
       <w:color w:val="666666"/>
     </w:rPr>
@@ -5869,6 +6322,346 @@
   <w:style w:type="paragraph" w:customStyle="1" w:styleId="1CA98067E53C40E9A075D6D0FF2C2B68">
     <w:name w:val="1CA98067E53C40E9A075D6D0FF2C2B68"/>
     <w:rsid w:val="00AF1BF3"/>
+  </w:style>
+  <w:style w:type="paragraph" w:customStyle="1" w:styleId="B5DC83432E794B5B81AD532F12349938">
+    <w:name w:val="B5DC83432E794B5B81AD532F12349938"/>
+    <w:rsid w:val="00AB6BFF"/>
+  </w:style>
+  <w:style w:type="paragraph" w:customStyle="1" w:styleId="79AD06837BD840FAAA0CE49021DEA585">
+    <w:name w:val="79AD06837BD840FAAA0CE49021DEA585"/>
+    <w:rsid w:val="00AB6BFF"/>
+  </w:style>
+  <w:style w:type="paragraph" w:customStyle="1" w:styleId="8FAF74FED8534777A1927F22527F78AC">
+    <w:name w:val="8FAF74FED8534777A1927F22527F78AC"/>
+    <w:rsid w:val="00AB6BFF"/>
+    <w:rPr>
+      <w:rFonts w:ascii="Segoe UI" w:eastAsiaTheme="minorHAnsi" w:hAnsi="Segoe UI"/>
+      <w:sz w:val="20"/>
+    </w:rPr>
+  </w:style>
+  <w:style w:type="paragraph" w:customStyle="1" w:styleId="8FAF74FED8534777A1927F22527F78AC1">
+    <w:name w:val="8FAF74FED8534777A1927F22527F78AC1"/>
+    <w:rsid w:val="00AB6BFF"/>
+    <w:rPr>
+      <w:rFonts w:ascii="Segoe UI" w:eastAsiaTheme="minorHAnsi" w:hAnsi="Segoe UI"/>
+      <w:sz w:val="20"/>
+    </w:rPr>
+  </w:style>
+  <w:style w:type="paragraph" w:customStyle="1" w:styleId="0DAD9EE1C059450F8487A7A4EA67435A">
+    <w:name w:val="0DAD9EE1C059450F8487A7A4EA67435A"/>
+    <w:rsid w:val="00AB6BFF"/>
+  </w:style>
+  <w:style w:type="paragraph" w:customStyle="1" w:styleId="73EC30FFC52B4105925192B218BF4079">
+    <w:name w:val="73EC30FFC52B4105925192B218BF4079"/>
+    <w:rsid w:val="00AB6BFF"/>
+  </w:style>
+  <w:style w:type="paragraph" w:customStyle="1" w:styleId="28CDCB34C342488AB32D7366B167AB5C">
+    <w:name w:val="28CDCB34C342488AB32D7366B167AB5C"/>
+    <w:rsid w:val="00AB6BFF"/>
+  </w:style>
+  <w:style w:type="paragraph" w:customStyle="1" w:styleId="E0413CE24C204700AFEDB79E43A61AB2">
+    <w:name w:val="E0413CE24C204700AFEDB79E43A61AB2"/>
+    <w:rsid w:val="00AB6BFF"/>
+  </w:style>
+  <w:style w:type="paragraph" w:customStyle="1" w:styleId="1E473A4D4578456D90C3F7C65672FD8F">
+    <w:name w:val="1E473A4D4578456D90C3F7C65672FD8F"/>
+    <w:rsid w:val="00AB6BFF"/>
+  </w:style>
+  <w:style w:type="paragraph" w:customStyle="1" w:styleId="2B9B941FB52C47669CBE7EAA7A8B73F5">
+    <w:name w:val="2B9B941FB52C47669CBE7EAA7A8B73F5"/>
+    <w:rsid w:val="00AB6BFF"/>
+  </w:style>
+  <w:style w:type="paragraph" w:customStyle="1" w:styleId="3154DFA9CA3D480D89DB85196955F908">
+    <w:name w:val="3154DFA9CA3D480D89DB85196955F908"/>
+    <w:rsid w:val="00AB6BFF"/>
+  </w:style>
+  <w:style w:type="paragraph" w:customStyle="1" w:styleId="3790034039614CA58B671ACF9F890A21">
+    <w:name w:val="3790034039614CA58B671ACF9F890A21"/>
+    <w:rsid w:val="00AB6BFF"/>
+  </w:style>
+  <w:style w:type="paragraph" w:customStyle="1" w:styleId="DC1D345B68CF4F25A790AF73852A64DC">
+    <w:name w:val="DC1D345B68CF4F25A790AF73852A64DC"/>
+    <w:rsid w:val="00AB6BFF"/>
+  </w:style>
+  <w:style w:type="paragraph" w:customStyle="1" w:styleId="B5812A426F6C434FB5023271BAAD75FE">
+    <w:name w:val="B5812A426F6C434FB5023271BAAD75FE"/>
+    <w:rsid w:val="00AB6BFF"/>
+  </w:style>
+  <w:style w:type="paragraph" w:customStyle="1" w:styleId="B46C77011B1F4E29A3244128A7B78C77">
+    <w:name w:val="B46C77011B1F4E29A3244128A7B78C77"/>
+    <w:rsid w:val="00AB6BFF"/>
+  </w:style>
+  <w:style w:type="paragraph" w:customStyle="1" w:styleId="013B7F4C8B4A4874B1B2A8A6586E445C">
+    <w:name w:val="013B7F4C8B4A4874B1B2A8A6586E445C"/>
+    <w:rsid w:val="00AB6BFF"/>
+  </w:style>
+  <w:style w:type="paragraph" w:customStyle="1" w:styleId="EAFA4C3784BF42259E73179BCF3AB036">
+    <w:name w:val="EAFA4C3784BF42259E73179BCF3AB036"/>
+    <w:rsid w:val="00AB6BFF"/>
+  </w:style>
+  <w:style w:type="paragraph" w:customStyle="1" w:styleId="74E56A02732E4B85B41C3B4B19F9A846">
+    <w:name w:val="74E56A02732E4B85B41C3B4B19F9A846"/>
+    <w:rsid w:val="00AB6BFF"/>
+  </w:style>
+  <w:style w:type="paragraph" w:customStyle="1" w:styleId="29FE41B505B840328E79EDD08CE06BBC">
+    <w:name w:val="29FE41B505B840328E79EDD08CE06BBC"/>
+    <w:rsid w:val="0037228B"/>
+  </w:style>
+  <w:style w:type="paragraph" w:customStyle="1" w:styleId="A5F8369C75C14F91992C696D1B6DA63E">
+    <w:name w:val="A5F8369C75C14F91992C696D1B6DA63E"/>
+    <w:rsid w:val="00EF476B"/>
+  </w:style>
+  <w:style w:type="paragraph" w:customStyle="1" w:styleId="9A8F12ACEE3A43368E4AC13289E8815E">
+    <w:name w:val="9A8F12ACEE3A43368E4AC13289E8815E"/>
+    <w:rsid w:val="00EF476B"/>
+  </w:style>
+  <w:style w:type="paragraph" w:customStyle="1" w:styleId="0A2C54EC52D140BCA40A58FAD3FBD9A8">
+    <w:name w:val="0A2C54EC52D140BCA40A58FAD3FBD9A8"/>
+    <w:rsid w:val="00EF476B"/>
+  </w:style>
+  <w:style w:type="paragraph" w:customStyle="1" w:styleId="7CF44D2866194EDDA8D0493DC288BEAA">
+    <w:name w:val="7CF44D2866194EDDA8D0493DC288BEAA"/>
+    <w:rsid w:val="00EF476B"/>
+  </w:style>
+  <w:style w:type="paragraph" w:customStyle="1" w:styleId="83A08B0EB8164087AFD14FE41BE29920">
+    <w:name w:val="83A08B0EB8164087AFD14FE41BE29920"/>
+    <w:rsid w:val="00EF476B"/>
+  </w:style>
+  <w:style w:type="paragraph" w:customStyle="1" w:styleId="E05F7696C06D4482B553A41B34F5EED4">
+    <w:name w:val="E05F7696C06D4482B553A41B34F5EED4"/>
+    <w:rsid w:val="00EF476B"/>
+  </w:style>
+  <w:style w:type="paragraph" w:customStyle="1" w:styleId="A7FDEC8160F049B993973635CD1BAA73">
+    <w:name w:val="A7FDEC8160F049B993973635CD1BAA73"/>
+    <w:rsid w:val="00EF476B"/>
+  </w:style>
+  <w:style w:type="paragraph" w:customStyle="1" w:styleId="8A59596FDF994A09BD7901CBA8E405CB">
+    <w:name w:val="8A59596FDF994A09BD7901CBA8E405CB"/>
+    <w:rsid w:val="00EF476B"/>
+  </w:style>
+  <w:style w:type="paragraph" w:customStyle="1" w:styleId="5EC99C319847420E858FAB319856EF91">
+    <w:name w:val="5EC99C319847420E858FAB319856EF91"/>
+    <w:rsid w:val="00EF476B"/>
+  </w:style>
+  <w:style w:type="paragraph" w:customStyle="1" w:styleId="C5255F8DB2C34928A02E6ABDD6FB17C1">
+    <w:name w:val="C5255F8DB2C34928A02E6ABDD6FB17C1"/>
+    <w:rsid w:val="00EF476B"/>
+  </w:style>
+  <w:style w:type="paragraph" w:customStyle="1" w:styleId="EB6B018AB941480BA6051C562C9B6EE4">
+    <w:name w:val="EB6B018AB941480BA6051C562C9B6EE4"/>
+    <w:rsid w:val="00EF476B"/>
+  </w:style>
+  <w:style w:type="paragraph" w:customStyle="1" w:styleId="1ED0DC6D939047D096A4D7D9CA7E4180">
+    <w:name w:val="1ED0DC6D939047D096A4D7D9CA7E4180"/>
+    <w:rsid w:val="00EF476B"/>
+  </w:style>
+  <w:style w:type="paragraph" w:customStyle="1" w:styleId="C338FA54A29446948078A02E2B6EA157">
+    <w:name w:val="C338FA54A29446948078A02E2B6EA157"/>
+    <w:rsid w:val="00EF476B"/>
+  </w:style>
+  <w:style w:type="paragraph" w:customStyle="1" w:styleId="62B81B045429435DB8425B302DF9D5E5">
+    <w:name w:val="62B81B045429435DB8425B302DF9D5E5"/>
+    <w:rsid w:val="00EF476B"/>
+  </w:style>
+  <w:style w:type="paragraph" w:customStyle="1" w:styleId="DAD666AC262343A0946635D5BAABDD4C">
+    <w:name w:val="DAD666AC262343A0946635D5BAABDD4C"/>
+    <w:rsid w:val="00EF476B"/>
+  </w:style>
+  <w:style w:type="paragraph" w:customStyle="1" w:styleId="79F4F4D275DC40D8B05E6E395BDB9BB6">
+    <w:name w:val="79F4F4D275DC40D8B05E6E395BDB9BB6"/>
+    <w:rsid w:val="00EF476B"/>
+  </w:style>
+  <w:style w:type="paragraph" w:customStyle="1" w:styleId="1F4642114FC841AAB46D90AF7309E30A">
+    <w:name w:val="1F4642114FC841AAB46D90AF7309E30A"/>
+    <w:rsid w:val="00EF476B"/>
+  </w:style>
+  <w:style w:type="paragraph" w:customStyle="1" w:styleId="48506863306D4A38BAC3CBE7B69EEF20">
+    <w:name w:val="48506863306D4A38BAC3CBE7B69EEF20"/>
+    <w:rsid w:val="00EF476B"/>
+  </w:style>
+  <w:style w:type="paragraph" w:customStyle="1" w:styleId="536B6AC6CE154E0294C56983E6C8880F">
+    <w:name w:val="536B6AC6CE154E0294C56983E6C8880F"/>
+    <w:rsid w:val="00EF476B"/>
+  </w:style>
+  <w:style w:type="paragraph" w:customStyle="1" w:styleId="745A73D301644ED4A4042943E43246D6">
+    <w:name w:val="745A73D301644ED4A4042943E43246D6"/>
+    <w:rsid w:val="00EF476B"/>
+  </w:style>
+  <w:style w:type="paragraph" w:customStyle="1" w:styleId="71CE818323854B37A9464B90FF553665">
+    <w:name w:val="71CE818323854B37A9464B90FF553665"/>
+    <w:rsid w:val="00EF476B"/>
+  </w:style>
+  <w:style w:type="paragraph" w:customStyle="1" w:styleId="BCF1F13CE4F34C98B5D010959913014B">
+    <w:name w:val="BCF1F13CE4F34C98B5D010959913014B"/>
+    <w:rsid w:val="00EF476B"/>
+  </w:style>
+  <w:style w:type="paragraph" w:customStyle="1" w:styleId="EC04074DCB894673812E6C2E8245A397">
+    <w:name w:val="EC04074DCB894673812E6C2E8245A397"/>
+    <w:rsid w:val="00EF476B"/>
+  </w:style>
+  <w:style w:type="paragraph" w:customStyle="1" w:styleId="BF9458AEE5E54A8D96815D1AE2A413D0">
+    <w:name w:val="BF9458AEE5E54A8D96815D1AE2A413D0"/>
+    <w:rsid w:val="00EF476B"/>
+  </w:style>
+  <w:style w:type="paragraph" w:customStyle="1" w:styleId="E4F88A86BFCD45639773505C745A3110">
+    <w:name w:val="E4F88A86BFCD45639773505C745A3110"/>
+    <w:rsid w:val="00A101D6"/>
+  </w:style>
+  <w:style w:type="paragraph" w:customStyle="1" w:styleId="183915604FE44F2BB40069A19CB3264E">
+    <w:name w:val="183915604FE44F2BB40069A19CB3264E"/>
+    <w:rsid w:val="00A23822"/>
+  </w:style>
+  <w:style w:type="paragraph" w:customStyle="1" w:styleId="117B8D8C4E4C4924986163415DFDFE4A">
+    <w:name w:val="117B8D8C4E4C4924986163415DFDFE4A"/>
+    <w:rsid w:val="00B52A3F"/>
+  </w:style>
+  <w:style w:type="paragraph" w:customStyle="1" w:styleId="7F2D967A0DFB4BCEAB2EE7AEEA106D01">
+    <w:name w:val="7F2D967A0DFB4BCEAB2EE7AEEA106D01"/>
+    <w:rsid w:val="00B52A3F"/>
+  </w:style>
+  <w:style w:type="paragraph" w:customStyle="1" w:styleId="D2825ED3DE4248CF8D2F7B81BF00D396">
+    <w:name w:val="D2825ED3DE4248CF8D2F7B81BF00D396"/>
+    <w:rsid w:val="00B52A3F"/>
+  </w:style>
+  <w:style w:type="paragraph" w:customStyle="1" w:styleId="035B5095F19D4C13B0E3361A2112B0BF">
+    <w:name w:val="035B5095F19D4C13B0E3361A2112B0BF"/>
+    <w:rsid w:val="00B52A3F"/>
+  </w:style>
+  <w:style w:type="paragraph" w:customStyle="1" w:styleId="410AEA417A1C4C5CA8ACCF2210434CAC">
+    <w:name w:val="410AEA417A1C4C5CA8ACCF2210434CAC"/>
+    <w:rsid w:val="00B52A3F"/>
+  </w:style>
+  <w:style w:type="paragraph" w:customStyle="1" w:styleId="6E0EAB7928E8442195BEBE534610B471">
+    <w:name w:val="6E0EAB7928E8442195BEBE534610B471"/>
+    <w:rsid w:val="00B52A3F"/>
+  </w:style>
+  <w:style w:type="paragraph" w:customStyle="1" w:styleId="7C343B2B636A44A5B293954D95B9D892">
+    <w:name w:val="7C343B2B636A44A5B293954D95B9D892"/>
+    <w:rsid w:val="00B52A3F"/>
+  </w:style>
+  <w:style w:type="paragraph" w:customStyle="1" w:styleId="7B63B75F7926471885D2C0DEA77DC3B5">
+    <w:name w:val="7B63B75F7926471885D2C0DEA77DC3B5"/>
+    <w:rsid w:val="00B52A3F"/>
+  </w:style>
+  <w:style w:type="paragraph" w:customStyle="1" w:styleId="170C34E06FF245BC8E56D26C6D440E81">
+    <w:name w:val="170C34E06FF245BC8E56D26C6D440E81"/>
+    <w:rsid w:val="00B52A3F"/>
+  </w:style>
+  <w:style w:type="paragraph" w:customStyle="1" w:styleId="2C2F93DCFE784E7EAA868D647A401F07">
+    <w:name w:val="2C2F93DCFE784E7EAA868D647A401F07"/>
+    <w:rsid w:val="00B52A3F"/>
+  </w:style>
+  <w:style w:type="paragraph" w:customStyle="1" w:styleId="E6E579045967417491365F19A03AE0E8">
+    <w:name w:val="E6E579045967417491365F19A03AE0E8"/>
+    <w:rsid w:val="00B52A3F"/>
+  </w:style>
+  <w:style w:type="paragraph" w:customStyle="1" w:styleId="4512318B8054412F8C577A83388D981A">
+    <w:name w:val="4512318B8054412F8C577A83388D981A"/>
+    <w:rsid w:val="00B52A3F"/>
+  </w:style>
+  <w:style w:type="paragraph" w:customStyle="1" w:styleId="72E0E4DF1A434B6FB1EC2ED436B08C1B">
+    <w:name w:val="72E0E4DF1A434B6FB1EC2ED436B08C1B"/>
+    <w:rsid w:val="00B52A3F"/>
+  </w:style>
+  <w:style w:type="paragraph" w:customStyle="1" w:styleId="605356F717ED4EA597FF9EA95EABD351">
+    <w:name w:val="605356F717ED4EA597FF9EA95EABD351"/>
+    <w:rsid w:val="00B52A3F"/>
+  </w:style>
+  <w:style w:type="paragraph" w:customStyle="1" w:styleId="D2EA4EEFD3574B1A8641E5109697638D">
+    <w:name w:val="D2EA4EEFD3574B1A8641E5109697638D"/>
+    <w:rsid w:val="00B52A3F"/>
+  </w:style>
+  <w:style w:type="paragraph" w:customStyle="1" w:styleId="809DE3C17D7A4ACFAC3FC8C01562C9BC">
+    <w:name w:val="809DE3C17D7A4ACFAC3FC8C01562C9BC"/>
+    <w:rsid w:val="00B52A3F"/>
+  </w:style>
+  <w:style w:type="paragraph" w:customStyle="1" w:styleId="6336894FAFB948A7894DFA146F9C9C84">
+    <w:name w:val="6336894FAFB948A7894DFA146F9C9C84"/>
+    <w:rsid w:val="00B52A3F"/>
+  </w:style>
+  <w:style w:type="paragraph" w:customStyle="1" w:styleId="97D6C4ABE7274493A5BF78D208EB92F4">
+    <w:name w:val="97D6C4ABE7274493A5BF78D208EB92F4"/>
+    <w:rsid w:val="00B52A3F"/>
+  </w:style>
+  <w:style w:type="paragraph" w:customStyle="1" w:styleId="D95C9778B2DB40B68EDBA2FB97EAD773">
+    <w:name w:val="D95C9778B2DB40B68EDBA2FB97EAD773"/>
+    <w:rsid w:val="00B52A3F"/>
+  </w:style>
+  <w:style w:type="paragraph" w:customStyle="1" w:styleId="FEDD1EFF441E4DE2A024FF47B9ADA5E9">
+    <w:name w:val="FEDD1EFF441E4DE2A024FF47B9ADA5E9"/>
+    <w:rsid w:val="00B52A3F"/>
+  </w:style>
+  <w:style w:type="paragraph" w:customStyle="1" w:styleId="3A10AC5BFCF54BF1852E508F8CBD4D0B">
+    <w:name w:val="3A10AC5BFCF54BF1852E508F8CBD4D0B"/>
+    <w:rsid w:val="00B52A3F"/>
+  </w:style>
+  <w:style w:type="paragraph" w:customStyle="1" w:styleId="FE5601A7BA4F40CAAEA0C32ED9F7366E">
+    <w:name w:val="FE5601A7BA4F40CAAEA0C32ED9F7366E"/>
+    <w:rsid w:val="00B52A3F"/>
+  </w:style>
+  <w:style w:type="paragraph" w:customStyle="1" w:styleId="C9C6ADE4518D48A2879A6E7AFD563C91">
+    <w:name w:val="C9C6ADE4518D48A2879A6E7AFD563C91"/>
+    <w:rsid w:val="00B52A3F"/>
+  </w:style>
+  <w:style w:type="paragraph" w:customStyle="1" w:styleId="65D0A7F4C7B44092B70B61AD790FA69A">
+    <w:name w:val="65D0A7F4C7B44092B70B61AD790FA69A"/>
+    <w:rsid w:val="00B52A3F"/>
+  </w:style>
+  <w:style w:type="paragraph" w:customStyle="1" w:styleId="689BE888BFF1472D8E27C8760F1B47BA">
+    <w:name w:val="689BE888BFF1472D8E27C8760F1B47BA"/>
+    <w:rsid w:val="00B52A3F"/>
+  </w:style>
+  <w:style w:type="paragraph" w:customStyle="1" w:styleId="FF71EE4101DE474BB9E0488A463E2526">
+    <w:name w:val="FF71EE4101DE474BB9E0488A463E2526"/>
+    <w:rsid w:val="00B52A3F"/>
+  </w:style>
+  <w:style w:type="paragraph" w:customStyle="1" w:styleId="720D8BC7856F435891DBD9A3EFEBC90B">
+    <w:name w:val="720D8BC7856F435891DBD9A3EFEBC90B"/>
+    <w:rsid w:val="00B52A3F"/>
+  </w:style>
+  <w:style w:type="paragraph" w:customStyle="1" w:styleId="653C3B5A1DC9455CAC82A8C31CEEA911">
+    <w:name w:val="653C3B5A1DC9455CAC82A8C31CEEA911"/>
+    <w:rsid w:val="00B52A3F"/>
+  </w:style>
+  <w:style w:type="paragraph" w:customStyle="1" w:styleId="CCFB25846BB14C249ED55F1742B218CA">
+    <w:name w:val="CCFB25846BB14C249ED55F1742B218CA"/>
+    <w:rsid w:val="00B52A3F"/>
+  </w:style>
+  <w:style w:type="paragraph" w:customStyle="1" w:styleId="A13A81114EF64334B8E51A09F947B1C5">
+    <w:name w:val="A13A81114EF64334B8E51A09F947B1C5"/>
+    <w:rsid w:val="00B52A3F"/>
+  </w:style>
+  <w:style w:type="paragraph" w:customStyle="1" w:styleId="969E5DE1EBD540C9BA10B6F7575C6F06">
+    <w:name w:val="969E5DE1EBD540C9BA10B6F7575C6F06"/>
+    <w:rsid w:val="00B52A3F"/>
+  </w:style>
+  <w:style w:type="paragraph" w:customStyle="1" w:styleId="956387B830824AAFBBDA5B13096155E3">
+    <w:name w:val="956387B830824AAFBBDA5B13096155E3"/>
+    <w:rsid w:val="00B52A3F"/>
+  </w:style>
+  <w:style w:type="paragraph" w:customStyle="1" w:styleId="16673B5D3190471B982ACDE7EF77C1F7">
+    <w:name w:val="16673B5D3190471B982ACDE7EF77C1F7"/>
+    <w:rsid w:val="00B52A3F"/>
+  </w:style>
+  <w:style w:type="paragraph" w:customStyle="1" w:styleId="D7D6E4B6FD5543DA89CF0B73B6E30292">
+    <w:name w:val="D7D6E4B6FD5543DA89CF0B73B6E30292"/>
+    <w:rsid w:val="00B52A3F"/>
+  </w:style>
+  <w:style w:type="paragraph" w:customStyle="1" w:styleId="2C3F2D2C612B4B84910A5B67FA64B631">
+    <w:name w:val="2C3F2D2C612B4B84910A5B67FA64B631"/>
+    <w:rsid w:val="00B52A3F"/>
+  </w:style>
+  <w:style w:type="paragraph" w:customStyle="1" w:styleId="356FDA147C3941778F5CECA01441805A">
+    <w:name w:val="356FDA147C3941778F5CECA01441805A"/>
+    <w:rsid w:val="00B52A3F"/>
+  </w:style>
+  <w:style w:type="paragraph" w:customStyle="1" w:styleId="D749E14C960744E2B461D0D5C759A3D1">
+    <w:name w:val="D749E14C960744E2B461D0D5C759A3D1"/>
+    <w:rsid w:val="008D0B19"/>
+  </w:style>
+  <w:style w:type="paragraph" w:customStyle="1" w:styleId="9EE4012110B64D64914C22BD21A18CFD">
+    <w:name w:val="9EE4012110B64D64914C22BD21A18CFD"/>
+    <w:rsid w:val="008D0B19"/>
   </w:style>
 </w:styles>
 </file>
@@ -6298,29 +7091,29 @@
  
      < L a b e l s >   
-         < C o m p l e t e d B y L a b e l > C o m p l e t e d B y L a b e l < / C o m p l e t e d B y L a b e l > - 
-         < C o m p l e t e d D a t e L a b e l > C o m p l e t e d D a t e L a b e l < / C o m p l e t e d D a t e L a b e l > - 
          < C o n d i t i o n L a b e l > C o n d i t i o n L a b e l < / C o n d i t i o n L a b e l >   
          < D a t e L a b e l > D a t e L a b e l < / D a t e L a b e l >   
+         < F i n i s h e d B y L a b e l > F i n i s h e d B y L a b e l < / F i n i s h e d B y L a b e l > + 
+         < F i n i s h e d O n L a b e l > F i n i s h e d O n L a b e l < / F i n i s h e d O n L a b e l > + 
          < I n s p e c t i o n L a b e l > I n s p e c t i o n L a b e l < / I n s p e c t i o n L a b e l >   
          < I t e m L a b e l > I t e m L a b e l < / I t e m L a b e l >   
          < I t e m T r a c k i n g L a b e l > I t e m T r a c k i n g L a b e l < / I t e m T r a c k i n g L a b e l >   
-         < M e a s u r e m e n t L a b e l > M e a s u r e m e n t L a b e l < / M e a s u r e m e n t L a b e l > - 
-         < M e t r i c L a b e l > M e t r i c L a b e l < / M e t r i c L a b e l > +         < P a g e L a b e l > P a g e L a b e l < / P a g e L a b e l >   
          < R e p o r t T i t l e L a b e l > R e p o r t T i t l e L a b e l < / R e p o r t T i t l e L a b e l >   
          < R e s u l t L a b e l > R e s u l t L a b e l < / R e s u l t L a b e l >   
-         < T e s t D o c u m e n t N o L a b e l > T e s t D o c u m e n t N o L a b e l < / T e s t D o c u m e n t N o L a b e l > +         < T e s t L a b e l > T e s t L a b e l < / T e s t L a b e l > + 
+         < T e s t V a l u e L a b e l > T e s t V a l u e L a b e l < / T e s t V a l u e L a b e l >   
      < / L a b e l s >   
@@ -6376,13 +7169,11 @@
  
          < F i n i s h e d B y S i g n a t u r e L a b e l > F i n i s h e d B y S i g n a t u r e L a b e l < / F i n i s h e d B y S i g n a t u r e L a b e l >   
-         < F i n i s h e d D a t e O n l y > F i n i s h e d D a t e O n l y < / F i n i s h e d D a t e O n l y > - 
          < H o m e P a g e L a b e l > H o m e P a g e L a b e l < / H o m e P a g e L a b e l >   
          < H o m e P a g e V a l u e > H o m e P a g e V a l u e < / H o m e P a g e V a l u e >   
-         < I n s p e c t i o n D e s c r i p t i o n > I n s p e c t i o n D e s c r i p t i o n < / I n s p e c t i o n D e s c r i p t i o n > +         < I n s p e c t i o n I n f o r m a t i o n > I n s p e c t i o n I n f o r m a t i o n < / I n s p e c t i o n I n f o r m a t i o n >   
          < I t e m D e s c r i p t i o n > I t e m D e s c r i p t i o n < / I t e m D e s c r i p t i o n >   
@@ -6460,6 +7251,8 @@
  
          < Q l t y I n s p e c t i o n _ S t a t u s > Q l t y I n s p e c t i o n _ S t a t u s < / Q l t y I n s p e c t i o n _ S t a t u s >   
+         < R e i n s p e c t i o n S e q u e n c e I n f o r m a t i o n > R e i n s p e c t i o n S e q u e n c e I n f o r m a t i o n < / R e i n s p e c t i o n S e q u e n c e I n f o r m a t i o n > + 
          < C u r r e n t I n s p e c t i o n L i n e >   
              < C o n d i t i o n L a b e l _ 1 > C o n d i t i o n L a b e l _ 1 < / C o n d i t i o n L a b e l _ 1 > @@ -6575,6 +7368,8 @@
              < W o r d D e s c r i p t i o n > W o r d D e s c r i p t i o n < / W o r d D e s c r i p t i o n >   
              < W o r d R e s u l t D e s c r i p t i o n > W o r d R e s u l t D e s c r i p t i o n < / W o r d R e s u l t D e s c r i p t i o n > + 
+             < W o r d U n f a v o r a b l e R e s u l t D e s c r i p t i o n > W o r d U n f a v o r a b l e R e s u l t D e s c r i p t i o n < / W o r d U n f a v o r a b l e R e s u l t D e s c r i p t i o n >   
          < / C u r r e n t I n s p e c t i o n L i n e >   
@@ -6587,7 +7382,9 @@
 <b:Sources xmlns:b="http://schemas.openxmlformats.org/officeDocument/2006/bibliography" xmlns="http://schemas.openxmlformats.org/officeDocument/2006/bibliography" SelectedStyle="\APASixthEditionOfficeOnline.xsl" StyleName="APA" Version="6"/>
 </file>
 
-<file path=customXml/item3.xml>��< ? x m l   v e r s i o n = " 1 . 0 "   e n c o d i n g = " u t f - 1 6 " ? > < N a v W o r d R e p o r t X m l P a r t   x m l n s = " u r n : m i c r o s o f t - d y n a m i c s - b u s i n e s s c e n t r a l / i n t e r n a l / e x t e n d e d / r e p o r t s / Q l t y _ C e r t i f i c a t e _ o f _ A n a l y s i s / 2 0 4 0 1 / " > +<file path=customXml/item3.xml>��< ? x m l   v e r s i o n = " 1 . 0 "   e n c o d i n g = " u t f - 1 6 " ? > + 
+ < N a v W o r d R e p o r t X m l P a r t   x m l n s = " u r n : m i c r o s o f t - d y n a m i c s - b u s i n e s s c e n t r a l / i n t e r n a l / e x t e n d e d / r e p o r t s / Q l t y _ C e r t i f i c a t e _ o f _ A n a l y s i s / 2 0 4 0 1 / " >   
      < B C R e p o r t I n f o r m a t i o n >   
@@ -6655,29 +7452,29 @@
  
      < L a b e l s >   
-         < C o m p l e t e d B y L a b e l   E l e m e n t T y p e = " P a r a m e t e r "   E l e m e n t I d = " 9 2 6 8 6 1 7 7 3 "   D a t a T y p e = " S t r i n g " > C o m p l e t e d B y L a b e l < / C o m p l e t e d B y L a b e l > - 
-         < C o m p l e t e d D a t e L a b e l   E l e m e n t T y p e = " P a r a m e t e r "   E l e m e n t I d = " 1 4 6 7 6 7 4 5 7 8 "   D a t a T y p e = " S t r i n g " > C o m p l e t e d D a t e L a b e l < / C o m p l e t e d D a t e L a b e l > - 
          < C o n d i t i o n L a b e l   E l e m e n t T y p e = " P a r a m e t e r "   E l e m e n t I d = " 1 4 2 4 6 4 8 2 8 8 "   D a t a T y p e = " S t r i n g " > C o n d i t i o n L a b e l < / C o n d i t i o n L a b e l >   
          < D a t e L a b e l   E l e m e n t T y p e = " P a r a m e t e r "   E l e m e n t I d = " 7 9 3 8 1 7 7 7 7 "   D a t a T y p e = " S t r i n g " > D a t e L a b e l < / D a t e L a b e l >   
+         < F i n i s h e d B y L a b e l   E l e m e n t T y p e = " P a r a m e t e r "   E l e m e n t I d = " 1 2 1 8 3 5 9 1 8 "   D a t a T y p e = " S t r i n g " > F i n i s h e d B y L a b e l < / F i n i s h e d B y L a b e l > + 
+         < F i n i s h e d O n L a b e l   E l e m e n t T y p e = " P a r a m e t e r "   E l e m e n t I d = " 1 9 3 5 3 2 6 4 3 2 "   D a t a T y p e = " S t r i n g " > F i n i s h e d O n L a b e l < / F i n i s h e d O n L a b e l > + 
          < I n s p e c t i o n L a b e l   E l e m e n t T y p e = " P a r a m e t e r "   E l e m e n t I d = " 1 5 4 9 8 3 1 5 2 5 "   D a t a T y p e = " S t r i n g " > I n s p e c t i o n L a b e l < / I n s p e c t i o n L a b e l >   
          < I t e m L a b e l   E l e m e n t T y p e = " P a r a m e t e r "   E l e m e n t I d = " 1 0 8 2 0 2 8 9 7 4 "   D a t a T y p e = " S t r i n g " > I t e m L a b e l < / I t e m L a b e l >   
          < I t e m T r a c k i n g L a b e l   E l e m e n t T y p e = " P a r a m e t e r "   E l e m e n t I d = " 9 3 5 5 3 4 6 7 1 "   D a t a T y p e = " S t r i n g " > I t e m T r a c k i n g L a b e l < / I t e m T r a c k i n g L a b e l >   
-         < M e a s u r e m e n t L a b e l   E l e m e n t T y p e = " P a r a m e t e r "   E l e m e n t I d = " 1 7 6 1 7 7 1 9 3 5 "   D a t a T y p e = " S t r i n g " > M e a s u r e m e n t L a b e l < / M e a s u r e m e n t L a b e l > - 
-         < M e t r i c L a b e l   E l e m e n t T y p e = " P a r a m e t e r "   E l e m e n t I d = " 2 7 1 2 2 7 7 7 5 "   D a t a T y p e = " S t r i n g " > M e t r i c L a b e l < / M e t r i c L a b e l > +         < P a g e L a b e l   E l e m e n t T y p e = " P a r a m e t e r "   E l e m e n t I d = " 1 8 8 0 8 2 7 5 0 4 "   D a t a T y p e = " S t r i n g " > P a g e L a b e l < / P a g e L a b e l >   
          < R e p o r t T i t l e L a b e l   E l e m e n t T y p e = " P a r a m e t e r "   E l e m e n t I d = " 1 2 9 7 0 8 9 6 2 7 "   D a t a T y p e = " S t r i n g " > R e p o r t T i t l e L a b e l < / R e p o r t T i t l e L a b e l >   
          < R e s u l t L a b e l   E l e m e n t T y p e = " P a r a m e t e r "   E l e m e n t I d = " 4 0 7 6 0 6 8 8 6 "   D a t a T y p e = " S t r i n g " > R e s u l t L a b e l < / R e s u l t L a b e l >   
-         < T e s t D o c u m e n t N o L a b e l   E l e m e n t T y p e = " P a r a m e t e r "   E l e m e n t I d = " 1 6 2 2 1 4 2 9 2 3 "   D a t a T y p e = " S t r i n g " > T e s t D o c u m e n t N o L a b e l < / T e s t D o c u m e n t N o L a b e l > +         < T e s t L a b e l   E l e m e n t T y p e = " P a r a m e t e r "   E l e m e n t I d = " 1 5 2 2 4 8 5 9 "   D a t a T y p e = " S t r i n g " > T e s t L a b e l < / T e s t L a b e l > + 
+         < T e s t V a l u e L a b e l   E l e m e n t T y p e = " P a r a m e t e r "   E l e m e n t I d = " 1 1 6 2 1 3 2 5 7 0 "   D a t a T y p e = " S t r i n g " > T e s t V a l u e L a b e l < / T e s t V a l u e L a b e l >   
      < / L a b e l s >   
@@ -6925,7 +7722,7 @@
  
          < C o m p a n y I n f o r m a t i o n _ R o w 8   E l e m e n t T y p e = " C o l u m n "   E l e m e n t I d = " 3 9 8 9 1 0 6 3 7 "   D a t a T y p e = " T e x t " > C o m p a n y I n f o r m a t i o n _ R o w 8 < / C o m p a n y I n f o r m a t i o n _ R o w 8 >   
-         < C o m p a n y L o g o   E l e m e n t T y p e = " C o l u m n "   E l e m e n t I d = " 2 3 7 6 9 1 5 1 "   D a t a T y p e = " B l o b " / > +         < C o m p a n y L o g o   E l e m e n t T y p e = " C o l u m n "   E l e m e n t I d = " 2 3 7 6 9 1 5 1 "   D a t a T y p e = " B l o b "   / >   
          < E m a i l L a b e l   E l e m e n t T y p e = " C o l u m n "   E l e m e n t I d = " 7 7 1 8 8 7 1 3 5 "   D a t a T y p e = " T e x t " > E m a i l L a b e l < / E m a i l L a b e l >   
@@ -6935,13 +7732,11 @@
  
          < F i n i s h e d B y S i g n a t u r e L a b e l   E l e m e n t T y p e = " C o l u m n "   E l e m e n t I d = " 2 0 7 1 3 1 2 7 2 2 "   D a t a T y p e = " T e x t " > F i n i s h e d B y S i g n a t u r e L a b e l < / F i n i s h e d B y S i g n a t u r e L a b e l >   
-         < F i n i s h e d D a t e O n l y   E l e m e n t T y p e = " C o l u m n "   E l e m e n t I d = " 2 0 0 8 0 4 4 9 4 3 "   D a t a T y p e = " D a t e " > F i n i s h e d D a t e O n l y < / F i n i s h e d D a t e O n l y > - 
          < H o m e P a g e L a b e l   E l e m e n t T y p e = " C o l u m n "   E l e m e n t I d = " 4 6 2 3 7 4 2 3 1 "   D a t a T y p e = " T e x t " > H o m e P a g e L a b e l < / H o m e P a g e L a b e l >   
          < H o m e P a g e V a l u e   E l e m e n t T y p e = " C o l u m n "   E l e m e n t I d = " 5 3 3 5 1 4 0 3 4 "   D a t a T y p e = " T e x t " > H o m e P a g e V a l u e < / H o m e P a g e V a l u e >   
-         < I n s p e c t i o n D e s c r i p t i o n   E l e m e n t T y p e = " C o l u m n "   E l e m e n t I d = " 1 3 0 9 2 5 3 9 2 5 "   D a t a T y p e = " T e x t " > I n s p e c t i o n D e s c r i p t i o n < / I n s p e c t i o n D e s c r i p t i o n > +         < I n s p e c t i o n I n f o r m a t i o n   E l e m e n t T y p e = " C o l u m n "   E l e m e n t I d = " 1 5 3 2 8 6 0 1 9 9 "   D a t a T y p e = " T e x t " > I n s p e c t i o n I n f o r m a t i o n < / I n s p e c t i o n I n f o r m a t i o n >   
          < I t e m D e s c r i p t i o n   E l e m e n t T y p e = " C o l u m n "   E l e m e n t I d = " 1 9 6 5 3 9 3 7 9 0 "   D a t a T y p e = " T e x t " > I t e m D e s c r i p t i o n < / I t e m D e s c r i p t i o n >   
@@ -7019,6 +7814,8 @@
  
          < Q l t y I n s p e c t i o n _ S t a t u s   E l e m e n t T y p e = " C o l u m n "   E l e m e n t I d = " 8 5 1 7 5 2 7 6 8 "   D a t a T y p e = " E n u m " > Q l t y I n s p e c t i o n _ S t a t u s < / Q l t y I n s p e c t i o n _ S t a t u s >   
+         < R e i n s p e c t i o n S e q u e n c e I n f o r m a t i o n   E l e m e n t T y p e = " C o l u m n "   E l e m e n t I d = " 7 4 9 5 1 6 5 4 3 "   D a t a T y p e = " T e x t " > R e i n s p e c t i o n S e q u e n c e I n f o r m a t i o n < / R e i n s p e c t i o n S e q u e n c e I n f o r m a t i o n > + 
          < C u r r e n t I n s p e c t i o n L i n e   E l e m e n t T y p e = " D a t a I t e m "   E l e m e n t I d = " 1 1 9 3 2 1 9 5 9 6 " >   
              < C o n d i t i o n L a b e l _ 1   E l e m e n t T y p e = " C o l u m n "   E l e m e n t I d = " 1 2 2 7 8 8 1 1 9 4 "   D a t a T y p e = " T e x t " > C o n d i t i o n L a b e l _ 1 < / C o n d i t i o n L a b e l _ 1 > @@ -7134,6 +7931,8 @@
              < W o r d D e s c r i p t i o n   E l e m e n t T y p e = " C o l u m n "   E l e m e n t I d = " 5 4 4 0 8 2 0 6 7 "   D a t a T y p e = " T e x t " > W o r d D e s c r i p t i o n < / W o r d D e s c r i p t i o n >   
              < W o r d R e s u l t D e s c r i p t i o n   E l e m e n t T y p e = " C o l u m n "   E l e m e n t I d = " 1 8 0 3 6 6 7 3 7 2 "   D a t a T y p e = " T e x t " > W o r d R e s u l t D e s c r i p t i o n < / W o r d R e s u l t D e s c r i p t i o n > + 
+             < W o r d U n f a v o r a b l e R e s u l t D e s c r i p t i o n   E l e m e n t T y p e = " C o l u m n "   E l e m e n t I d = " 1 9 9 9 9 7 2 3 5 3 "   D a t a T y p e = " T e x t " > W o r d U n f a v o r a b l e R e s u l t D e s c r i p t i o n < / W o r d U n f a v o r a b l e R e s u l t D e s c r i p t i o n >   
          < / C u r r e n t I n s p e c t i o n L i n e >   

</xml_diff>

<commit_message>
Document properties and style
</commit_message>
<xml_diff>
--- a/src/Apps/W1/Quality Management/app/src/Reports/QltyCertificateOfAnalysis.docx
+++ b/src/Apps/W1/Quality Management/app/src/Reports/QltyCertificateOfAnalysis.docx
@@ -198,7 +198,7 @@
                 <w:placeholder>
                   <w:docPart w:val="CCFB25846BB14C249ED55F1742B218CA"/>
                 </w:placeholder>
-                <w15:dataBinding w:prefixMappings="xmlns:ns0='urn:microsoft-dynamics-nav/reports/Qlty_Certificate_of_Analysis/20401/' " w:xpath="/ns0:NavWordReportXmlPart[1]/ns0:CurrentInspection[1]/ns0:ReinspectionSequenceInformation[1]" w:storeItemID="{F00BF611-06BA-436C-902A-C0D5E8DF929B}" w16sdtdh:storeItemChecksum="o2KQhw=="/>
+                <w15:dataBinding w:prefixMappings="xmlns:ns0='urn:microsoft-dynamics-nav/reports/Qlty_Certificate_of_Analysis/20401/' " w:xpath="/ns0:NavWordReportXmlPart[1]/ns0:CurrentInspection[1]/ns0:ReinspectionSequenceInformation[1]" w:storeItemID="{F00BF611-06BA-436C-902A-C0D5E8DF929B}" w16sdtdh:storeItemChecksum="2VS3aQ=="/>
               </w:sdtPr>
               <w:sdtContent>
                 <w:proofErr w:type="spellStart"/>
@@ -959,6 +959,11 @@
                           <w:sdt>
                             <w:sdtPr>
                               <w:rPr>
+                                <w:b/>
+                                <w:bCs/>
+                                <w:i/>
+                                <w:iCs/>
+                                <w:color w:val="C00000"/>
                                 <w:lang w:val="da-DK"/>
                               </w:rPr>
                               <w:alias w:val="WordUnfavorableResultDescription"/>
@@ -967,11 +972,16 @@
                               <w:placeholder>
                                 <w:docPart w:val="DefaultPlaceholder_-1854013440"/>
                               </w:placeholder>
-                              <w15:dataBinding w:prefixMappings="xmlns:ns0='urn:microsoft-dynamics-nav/reports/Qlty_Certificate_of_Analysis/20401/' " w:xpath="/ns0:NavWordReportXmlPart[1]/ns0:CurrentInspection[1]/ns0:CurrentInspectionLine[1]/ns0:WordUnfavorableResultDescription[1]" w:storeItemID="{F00BF611-06BA-436C-902A-C0D5E8DF929B}" w16sdtdh:storeItemChecksum="o2KQhw=="/>
+                              <w15:dataBinding w:prefixMappings="xmlns:ns0='urn:microsoft-dynamics-nav/reports/Qlty_Certificate_of_Analysis/20401/' " w:xpath="/ns0:NavWordReportXmlPart[1]/ns0:CurrentInspection[1]/ns0:CurrentInspectionLine[1]/ns0:WordUnfavorableResultDescription[1]" w:storeItemID="{F00BF611-06BA-436C-902A-C0D5E8DF929B}" w16sdtdh:storeItemChecksum="2VS3aQ=="/>
                             </w:sdtPr>
                             <w:sdtContent>
                               <w:r>
                                 <w:rPr>
+                                  <w:b/>
+                                  <w:bCs/>
+                                  <w:i/>
+                                  <w:iCs/>
+                                  <w:color w:val="C00000"/>
                                   <w:lang w:val="da-DK"/>
                                 </w:rPr>
                                 <w:t>WordUnfavorableResultDescription</w:t>
@@ -2483,7 +2493,7 @@
           <w:placeholder>
             <w:docPart w:val="DefaultPlaceholder_-1854013440"/>
           </w:placeholder>
-          <w15:dataBinding w:prefixMappings="xmlns:ns0='urn:microsoft-dynamics-nav/reports/Qlty_Certificate_of_Analysis/20401/' " w:xpath="/ns0:NavWordReportXmlPart[1]/ns0:CurrentInspection[1]/ns0:ReinspectionSequenceInformation[1]" w:storeItemID="{F00BF611-06BA-436C-902A-C0D5E8DF929B}" w16sdtdh:storeItemChecksum="o2KQhw=="/>
+          <w15:dataBinding w:prefixMappings="xmlns:ns0='urn:microsoft-dynamics-nav/reports/Qlty_Certificate_of_Analysis/20401/' " w:xpath="/ns0:NavWordReportXmlPart[1]/ns0:CurrentInspection[1]/ns0:ReinspectionSequenceInformation[1]" w:storeItemID="{F00BF611-06BA-436C-902A-C0D5E8DF929B}" w16sdtdh:storeItemChecksum="2VS3aQ=="/>
         </w:sdtPr>
         <w:sdtContent>
           <w:tc>
@@ -2689,7 +2699,7 @@
           <w:placeholder>
             <w:docPart w:val="DefaultPlaceholder_-1854013440"/>
           </w:placeholder>
-          <w15:dataBinding w:prefixMappings="xmlns:ns0='urn:microsoft-dynamics-nav/reports/Qlty_Certificate_of_Analysis/20401/' " w:xpath="/ns0:NavWordReportXmlPart[1]/ns0:CurrentInspection[1]/ns0:COAContact_All[1]" w:storeItemID="{F00BF611-06BA-436C-902A-C0D5E8DF929B}" w16sdtdh:storeItemChecksum="o2KQhw=="/>
+          <w15:dataBinding w:prefixMappings="xmlns:ns0='urn:microsoft-dynamics-nav/reports/Qlty_Certificate_of_Analysis/20401/' " w:xpath="/ns0:NavWordReportXmlPart[1]/ns0:CurrentInspection[1]/ns0:COAContact_All[1]" w:storeItemID="{F00BF611-06BA-436C-902A-C0D5E8DF929B}" w16sdtdh:storeItemChecksum="2VS3aQ=="/>
         </w:sdtPr>
         <w:sdtContent>
           <w:tc>
@@ -5681,6 +5691,7 @@
     <w:rsid w:val="00AD5F1E"/>
     <w:rsid w:val="00AF1BF3"/>
     <w:rsid w:val="00AF7276"/>
+    <w:rsid w:val="00AF7653"/>
     <w:rsid w:val="00B01B39"/>
     <w:rsid w:val="00B05DFF"/>
     <w:rsid w:val="00B06C5E"/>
@@ -5725,6 +5736,7 @@
     <w:rsid w:val="00F019AE"/>
     <w:rsid w:val="00F1246A"/>
     <w:rsid w:val="00F22E08"/>
+    <w:rsid w:val="00F33AC7"/>
     <w:rsid w:val="00F42812"/>
     <w:rsid w:val="00F42D0E"/>
     <w:rsid w:val="00F736EC"/>
@@ -7018,928 +7030,928 @@
 </we:webextension>
 </file>
 
-<file path=customXml/item1.xml><?xml version="1.0" encoding="utf-8"?>
+<file path=customXml/item1.xml>��< ? x m l   v e r s i o n = " 1 . 0 "   e n c o d i n g = " u t f - 1 6 " ? > < N a v W o r d R e p o r t X m l P a r t   x m l n s = " u r n : m i c r o s o f t - d y n a m i c s - b u s i n e s s c e n t r a l / i n t e r n a l / e x t e n d e d / r e p o r t s / Q l t y _ C e r t i f i c a t e _ o f _ A n a l y s i s / 2 0 4 0 1 / " > + 
+     < B C R e p o r t I n f o r m a t i o n > + 
+         < R e p o r t M e t a d a t a > + 
+             < E x t e n s i o n I d > E x t e n s i o n   I D < / E x t e n s i o n I d > + 
+             < E x t e n s i o n N a m e > E x t e n s i o n   N a m e < / E x t e n s i o n N a m e > + 
+             < E x t e n s i o n P u b l i s h e r > E x t e n s i o n   P u b l i s h e r < / E x t e n s i o n P u b l i s h e r > + 
+             < E x t e n s i o n V e r s i o n > E x t e n s i o n   V e r s i o n < / E x t e n s i o n V e r s i o n > + 
+             < R e p o r t I d > R e p o r t   I D < / R e p o r t I d > + 
+             < R e p o r t N a m e > R e p o r t   N a m e < / R e p o r t N a m e > + 
+             < A b o u t T h i s R e p o r t T i t l e > A b o u t   T h i s   R e p o r t   T i t l e < / A b o u t T h i s R e p o r t T i t l e > + 
+             < A b o u t T h i s R e p o r t T e x t > A b o u t   T h i s   R e p o r t   T e x t < / A b o u t T h i s R e p o r t T e x t > + 
+             < R e p o r t H e l p L i n k > R e p o r t   H e l p   L i n k < / R e p o r t H e l p L i n k > + 
+         < / R e p o r t M e t a d a t a > + 
+         < R e p o r t R e q u e s t > + 
+             < T e n a n t E n t r a I d > T e n a n t   E n t r a   I d < / T e n a n t E n t r a I d > + 
+             < E n v i r o n m e n t N a m e > E n v i r o n m e n t   N a m e < / E n v i r o n m e n t N a m e > + 
+             < E n v i r o n m e n t T y p e > E n v i r o n m e n t   T y p e < / E n v i r o n m e n t T y p e > + 
+             < C o m p a n y N a m e > C o m p a n y   N a m e < / C o m p a n y N a m e > + 
+             < C o m p a n y D i s p l a y N a m e > C o m p a n y   D i s p l a y   N a m e < / C o m p a n y D i s p l a y N a m e > + 
+             < C o m p a n y I d > C o m p a n y   I D < / C o m p a n y I d > + 
+             < U s e r N a m e > U s e r   N a m e < / U s e r N a m e > + 
+             < D a t e A n d T i m e > D a t e   a n d   T i m e < / D a t e A n d T i m e > + 
+             < L a n g u a g e > L a n g u a g e < / L a n g u a g e > + 
+             < F o r m a t R e g i o n > F o r m a t   R e g i o n < / F o r m a t R e g i o n > + 
+             < D a t e T i m e V a l u e s > + 
+                 < Y e a r > Y e a r < / Y e a r > + 
+                 < M o n t h N u m b e r > M o n t h   N u m b e r < / M o n t h N u m b e r > + 
+                 < D a y N u m b e r > D a y   N u m b e r < / D a y N u m b e r > + 
+                 < H o u r > H o u r < / H o u r > + 
+                 < M i n u t e > M i n u t e < / M i n u t e > + 
+             < / D a t e T i m e V a l u e s > + 
+         < / R e p o r t R e q u e s t > + 
+     < / B C R e p o r t I n f o r m a t i o n > + 
+     < L a b e l s > + 
+         < C o n d i t i o n L a b e l   E l e m e n t T y p e = " P a r a m e t e r "   E l e m e n t I d = " 1 4 2 4 6 4 8 2 8 8 "   D a t a T y p e = " S t r i n g " > C o n d i t i o n L a b e l < / C o n d i t i o n L a b e l > + 
+         < D a t e L a b e l   E l e m e n t T y p e = " P a r a m e t e r "   E l e m e n t I d = " 7 9 3 8 1 7 7 7 7 "   D a t a T y p e = " S t r i n g " > D a t e L a b e l < / D a t e L a b e l > + 
+         < F i n i s h e d B y L a b e l   E l e m e n t T y p e = " P a r a m e t e r "   E l e m e n t I d = " 1 2 1 8 3 5 9 1 8 "   D a t a T y p e = " S t r i n g " > F i n i s h e d B y L a b e l < / F i n i s h e d B y L a b e l > + 
+         < F i n i s h e d O n L a b e l   E l e m e n t T y p e = " P a r a m e t e r "   E l e m e n t I d = " 1 9 3 5 3 2 6 4 3 2 "   D a t a T y p e = " S t r i n g " > F i n i s h e d O n L a b e l < / F i n i s h e d O n L a b e l > + 
+         < I n s p e c t i o n L a b e l   E l e m e n t T y p e = " P a r a m e t e r "   E l e m e n t I d = " 1 5 4 9 8 3 1 5 2 5 "   D a t a T y p e = " S t r i n g " > I n s p e c t i o n L a b e l < / I n s p e c t i o n L a b e l > + 
+         < I t e m L a b e l   E l e m e n t T y p e = " P a r a m e t e r "   E l e m e n t I d = " 1 0 8 2 0 2 8 9 7 4 "   D a t a T y p e = " S t r i n g " > I t e m L a b e l < / I t e m L a b e l > + 
+         < I t e m T r a c k i n g L a b e l   E l e m e n t T y p e = " P a r a m e t e r "   E l e m e n t I d = " 9 3 5 5 3 4 6 7 1 "   D a t a T y p e = " S t r i n g " > I t e m T r a c k i n g L a b e l < / I t e m T r a c k i n g L a b e l > + 
+         < P a g e L a b e l   E l e m e n t T y p e = " P a r a m e t e r "   E l e m e n t I d = " 1 8 8 0 8 2 7 5 0 4 "   D a t a T y p e = " S t r i n g " > P a g e L a b e l < / P a g e L a b e l > + 
+         < R e p o r t T i t l e L a b e l   E l e m e n t T y p e = " P a r a m e t e r "   E l e m e n t I d = " 1 2 9 7 0 8 9 6 2 7 "   D a t a T y p e = " S t r i n g " > R e p o r t T i t l e L a b e l < / R e p o r t T i t l e L a b e l > + 
+         < R e s u l t L a b e l   E l e m e n t T y p e = " P a r a m e t e r "   E l e m e n t I d = " 4 0 7 6 0 6 8 8 6 "   D a t a T y p e = " S t r i n g " > R e s u l t L a b e l < / R e s u l t L a b e l > + 
+         < T e s t L a b e l   E l e m e n t T y p e = " P a r a m e t e r "   E l e m e n t I d = " 1 5 2 2 4 8 5 9 "   D a t a T y p e = " S t r i n g " > T e s t L a b e l < / T e s t L a b e l > + 
+         < T e s t V a l u e L a b e l   E l e m e n t T y p e = " P a r a m e t e r "   E l e m e n t I d = " 1 1 6 2 1 3 2 5 7 0 "   D a t a T y p e = " S t r i n g " > T e s t V a l u e L a b e l < / T e s t V a l u e L a b e l > + 
+     < / L a b e l s > + 
+     < T o o l t i p s > + 
+         < T o o l t i p   c o l u m n = " Q l t y I n s p e c t i o n T e m p l a t e _ D e s c r i p t i o n "   E l e m e n t I d = " 1 6 5 2 0 6 9 5 9 8 " > + 
+             < T o o l t i p T e x t   l a n g = " e n - U S " > S p e c i f i e s   a n   e x p l a n a t i o n   o f   t h e   Q u a l i t y   I n s p e c t i o n   T e m p l a t e .   Y o u   c a n   e n t e r   a   m a x i m u m   o f   1 0 0   c h a r a c t e r s ,   b o t h   n u m b e r s   a n d   l e t t e r s . < / T o o l t i p T e x t > + 
+         < / T o o l t i p > + 
+         < T o o l t i p   c o l u m n = " Q l t y I n s p e c t i o n _ D e s c r i p t i o n "   E l e m e n t I d = " 7 3 9 0 1 9 9 1 0 " > + 
+             < T o o l t i p T e x t   l a n g = " e n - U S " > S p e c i f i e s   a   d e s c r i p t i o n   o f   t h e   Q u a l i t y   I n s p e c t i o n   i t s e l f . < / T o o l t i p T e x t > + 
+         < / T o o l t i p > + 
+         < T o o l t i p   c o l u m n = " Q l t y I n s p e c t i o n _ S t a t u s "   E l e m e n t I d = " 8 5 1 7 5 2 7 6 8 " > + 
+             < T o o l t i p T e x t   l a n g = " e n - U S " > S p e c i f i e s   t h e   s t a t u s   o f   t h e   i n s p e c t i o n .   N o   a d d i t i o n a l   c h a n g e s   c a n   b e   m a d e   t o   a   f i n i s h e d   Q u a l i t y   I n s p e c t i o n . < / T o o l t i p T e x t > + 
+         < / T o o l t i p > + 
+         < T o o l t i p   c o l u m n = " Q l t y I n s p e c t i o n _ R e s u l t _ C o d e "   E l e m e n t I d = " 1 8 0 7 0 7 7 0 6 5 " > + 
+             < T o o l t i p T e x t   l a n g = " e n - U S " > S p e c i f i e s   t h e   r e s u l t   i s   a u t o m a t i c a l l y   d e t e r m i n e d   b a s e d   o n   t h e   t e s t   v a l u e   a n d   r e s u l t   c o n f i g u r a t i o n . < / T o o l t i p T e x t > + 
+         < / T o o l t i p > + 
+         < T o o l t i p   c o l u m n = " Q l t y I n s p e c t i o n _ R e s u l t _ D e s c r i p t i o n "   E l e m e n t I d = " 8 1 0 5 3 8 1 8 8 " > + 
+             < T o o l t i p T e x t   l a n g = " e n - U S " > S p e c i f i e s   t h e   r e s u l t   d e s c r i p t i o n   f o r   t h i s   t e s t   r e s u l t .   T h e   r e s u l t   i s   a u t o m a t i c a l l y   d e t e r m i n e d   b a s e d   o n   t h e   t e s t   v a l u e   a n d   r e s u l t   c o n f i g u r a t i o n . < / T o o l t i p T e x t > + 
+         < / T o o l t i p > + 
+         < T o o l t i p   c o l u m n = " Q l t y I n s p e c t i o n _ N o "   E l e m e n t I d = " 2 1 2 0 6 1 5 7 4 9 " > + 
+             < T o o l t i p T e x t   l a n g = " e n - U S " > S p e c i f i e s   t h e   q u a l i t y   i n s p e c t i o n   d o c u m e n t   n u m b e r . < / T o o l t i p T e x t > + 
+         < / T o o l t i p > + 
+         < T o o l t i p   c o l u m n = " Q l t y I n s p e c t i o n _ R e i n s p e c t i o n N o "   E l e m e n t I d = " 7 5 1 7 3 5 6 " > + 
+             < T o o l t i p T e x t   l a n g = " e n - U S " > S p e c i f i e s   t h e   r e - i n s p e c t i o n   c o u n t e r . < / T o o l t i p T e x t > + 
+         < / T o o l t i p > + 
+         < T o o l t i p   c o l u m n = " Q l t y I n s p e c t i o n _ F i n i s h e d _ B y _ U s e r _ I D "   E l e m e n t I d = " 1 7 5 0 5 1 6 3 3 8 " > + 
+             < T o o l t i p T e x t   l a n g = " e n - U S " > S p e c i f i e s   t h e   u s e r   t h a t   f i n i s h e d   t h e   i n s p e c t i o n . < / T o o l t i p T e x t > + 
+         < / T o o l t i p > + 
+         < T o o l t i p   c o l u m n = " Q l t y I n s p e c t i o n _ F i n i s h e d _ D a t e "   E l e m e n t I d = " 1 8 3 4 1 2 2 7 6 5 " > + 
+             < T o o l t i p T e x t   l a n g = " e n - U S " > S p e c i f i e s   t h e   d a t e   t h a t   t h e   i n s p e c t i o n   w a s   f i n i s h e d . < / T o o l t i p T e x t > + 
+         < / T o o l t i p > + 
+         < T o o l t i p   c o l u m n = " Q l t y I n s p e c t i o n _ S o u r c e _ I t e m _ N o _ "   E l e m e n t I d = " 1 2 6 8 0 5 0 5 1 8 " > + 
+             < T o o l t i p T e x t   l a n g = " e n - U S " > S p e c i f i e s   t h e   i t e m   t h a t   t h e   Q u a l i t y   I n s p e c t i o n   i s   f o r .   W h e n   u s e d   w i t h   p r o d u c t i o n   o r d e r s   t h i s   t y p i c a l l y   r e f e r s   t o   t h e   i t e m   b e i n g   p r o d u c e d . < / T o o l t i p T e x t > + 
+         < / T o o l t i p > + 
+         < T o o l t i p   c o l u m n = " Q l t y I n s p e c t i o n _ S o u r c e _ I t e m _ D e s c r i p t i o n "   E l e m e n t I d = " 6 4 6 8 9 0 6 3 0 " > + 
+             < T o o l t i p T e x t   l a n g = " e n - U S " > S p e c i f i e s   a   d e s c r i p t i o n   o f   t h e   i t e m . < / T o o l t i p T e x t > + 
+         < / T o o l t i p > + 
+         < T o o l t i p   c o l u m n = " Q l t y I n s p e c t i o n _ S o u r c e _ I t e m _ D e s c r i p t i o n 2 "   E l e m e n t I d = " 1 2 7 9 3 6 9 3 5 2 " > + 
+             < T o o l t i p T e x t   l a n g = " e n - U S " > S p e c i f i e s   i n f o r m a t i o n   i n   a d d i t i o n   t o   t h e   d e s c r i p t i o n . < / T o o l t i p T e x t > + 
+         < / T o o l t i p > + 
+         < T o o l t i p   c o l u m n = " Q l t y I n s p e c t i o n _ S o u r c e _ V a r i a n t _ C o d e "   E l e m e n t I d = " 1 6 0 8 4 0 3 8 2 1 " > + 
+             < T o o l t i p T e x t   l a n g = " e n - U S " > S p e c i f i e s   t h e   i t e m   v a r i a n t   t h a t   t h e   Q u a l i t y   I n s p e c t i o n   i s   f o r .   W h e n   u s e d   w i t h   p r o d u c t i o n   o r d e r s   t h i s   t y p i c a l l y   r e f e r s   t o   t h e   i t e m   b e i n g   p r o d u c e d . < / T o o l t i p T e x t > + 
+         < / T o o l t i p > + 
+         < T o o l t i p   c o l u m n = " Q l t y I n s p e c t i o n _ S o u r c e _ L o t _ N o _ "   E l e m e n t I d = " 1 1 2 3 5 5 1 3 1 2 " > + 
+             < T o o l t i p T e x t   l a n g = " e n - U S " > S p e c i f i e s   t h e   l o t   n u m b e r   t h a t   t h e   q u a l i t y   i n s p e c t i o n   i s   f o r .   T h i s   i s   o n l y   u s e d   f o r   l o t   t r a c k e d   i t e m s . < / T o o l t i p T e x t > + 
+         < / T o o l t i p > + 
+         < T o o l t i p   c o l u m n = " Q l t y I n s p e c t i o n _ S o u r c e _ S e r i a l _ N o _ "   E l e m e n t I d = " 1 5 2 0 5 9 1 4 4 7 " > + 
+             < T o o l t i p T e x t   l a n g = " e n - U S " > S p e c i f i e s   t h e   s e r i a l   n u m b e r   t h a t   t h e   q u a l i t y   i n s p e c t i o n   i s   f o r .   T h i s   i s   o n l y   u s e d   f o r   s e r i a l   t r a c k e d   i t e m s . < / T o o l t i p T e x t > + 
+         < / T o o l t i p > + 
+         < T o o l t i p   c o l u m n = " Q l t y I n s p e c t i o n _ S o u r c e _ P a c k a g e _ N o _ "   E l e m e n t I d = " 1 9 6 1 1 2 9 9 7 " > + 
+             < T o o l t i p T e x t   l a n g = " e n - U S " > S p e c i f i e s   t h e   p a c k a g e   n u m b e r   t h a t   t h e   q u a l i t y   i n s p e c t i o n   i s   f o r .   T h i s   i s   o n l y   u s e d   f o r   p a c k a g e   t r a c k e d   i t e m s . < / T o o l t i p T e x t > + 
+         < / T o o l t i p > + 
+         < T o o l t i p   c o l u m n = " Q l t y I n s p e c t i o n _ S o u r c e _ D o c u m e n t _ N o _ "   E l e m e n t I d = " 1 6 7 5 9 1 6 2 8 8 " > + 
+             < T o o l t i p T e x t   l a n g = " e n - U S " > S p e c i f i e s   a   r e f e r e n c e   t o   t h e   d o c u m e n t   t h a t   t h i s   Q u a l i t y   I n s p e c t i o n   i s   r e f e r r i n g   t o .   T h i s   t y p i c a l l y   r e f e r s   t o   a   p r o d u c t i o n   o r d e r   d o c u m e n t   n u m b e r . < / T o o l t i p T e x t > + 
+         < / T o o l t i p > + 
+         < T o o l t i p   c o l u m n = " Q l t y I n s p e c t i o n _ S o u r c e _ T a s k _ N o _ "   E l e m e n t I d = " 3 8 4 6 4 4 1 8 2 " > + 
+             < T o o l t i p T e x t   l a n g = " e n - U S " > S p e c i f i e s   a   r e f e r e n c e   t o   t h e   s o u r c e   t a s k   n o .   t h a t   t h i s   Q u a l i t y   I n s p e c t i o n   i s   r e f e r r i n g   t o .   T h i s   t y p i c a l l y   r e f e r s   t o   a n   o p e r a t i o n . < / T o o l t i p T e x t > + 
+         < / T o o l t i p > + 
+         < T o o l t i p   c o l u m n = " Q l t y I n s p e c t i o n _ S o u r c e _ C u s t o m _ 1 "   E l e m e n t I d = " 5 4 6 4 5 3 7 6 5 " > + 
+             < T o o l t i p T e x t   l a n g = " e n - U S " > S p e c i f i e s   a d d i t i o n a l   i n f o r m a t i o n   f r o m   a   s o u r c e   r e c o r d . < / T o o l t i p T e x t > + 
+         < / T o o l t i p > + 
+         < T o o l t i p   c o l u m n = " Q l t y I n s p e c t i o n _ S o u r c e _ C u s t o m _ 2 "   E l e m e n t I d = " 1 8 3 5 4 2 3 6 8 0 " > + 
+             < T o o l t i p T e x t   l a n g = " e n - U S " > S p e c i f i e s   a d d i t i o n a l   i n f o r m a t i o n   f r o m   a   s o u r c e   r e c o r d . < / T o o l t i p T e x t > + 
+         < / T o o l t i p > + 
+         < T o o l t i p   c o l u m n = " Q l t y I n s p e c t i o n _ S o u r c e _ C u s t o m _ 3 "   E l e m e n t I d = " 1 8 2 1 8 4 6 9 9 9 " > + 
+             < T o o l t i p T e x t   l a n g = " e n - U S " > S p e c i f i e s   a d d i t i o n a l   i n f o r m a t i o n   f r o m   a   s o u r c e   r e c o r d . < / T o o l t i p T e x t > + 
+         < / T o o l t i p > + 
+         < T o o l t i p   c o l u m n = " Q l t y I n s p e c t i o n _ S o u r c e _ C u s t o m _ 4 "   E l e m e n t I d = " 1 3 6 6 6 3 6 0 8 6 " > + 
+             < T o o l t i p T e x t   l a n g = " e n - U S " > S p e c i f i e s   a d d i t i o n a l   i n f o r m a t i o n   f r o m   a   s o u r c e   r e c o r d . < / T o o l t i p T e x t > + 
+         < / T o o l t i p > + 
+         < T o o l t i p   c o l u m n = " Q l t y I n s p e c t i o n _ S o u r c e _ C u s t o m _ 5 "   E l e m e n t I d = " 2 0 0 4 3 3 2 7 0 3 " > + 
+             < T o o l t i p T e x t   l a n g = " e n - U S " > S p e c i f i e s   a d d i t i o n a l   i n f o r m a t i o n   f r o m   a   s o u r c e   r e c o r d . < / T o o l t i p T e x t > + 
+         < / T o o l t i p > + 
+         < T o o l t i p   c o l u m n = " Q l t y I n s p e c t i o n _ S o u r c e _ C u s t o m _ 6 "   E l e m e n t I d = " 9 1 2 4 2 8 5 2 " > + 
+             < T o o l t i p T e x t   l a n g = " e n - U S " > S p e c i f i e s   a d d i t i o n a l   i n f o r m a t i o n   f r o m   a   s o u r c e   r e c o r d . < / T o o l t i p T e x t > + 
+         < / T o o l t i p > + 
+         < T o o l t i p   c o l u m n = " Q l t y I n s p e c t i o n _ S o u r c e _ C u s t o m _ 7 "   E l e m e n t I d = " 7 2 8 9 3 9 4 6 9 " > + 
+             < T o o l t i p T e x t   l a n g = " e n - U S " > S p e c i f i e s   a d d i t i o n a l   i n f o r m a t i o n   f r o m   a   s o u r c e   r e c o r d . < / T o o l t i p T e x t > + 
+         < / T o o l t i p > + 
+         < T o o l t i p   c o l u m n = " Q l t y I n s p e c t i o n _ S o u r c e _ C u s t o m _ 8 "   E l e m e n t I d = " 3 7 7 5 4 4 7 4 2 " > + 
+             < T o o l t i p T e x t   l a n g = " e n - U S " > S p e c i f i e s   a d d i t i o n a l   i n f o r m a t i o n   f r o m   a   s o u r c e   r e c o r d . < / T o o l t i p T e x t > + 
+         < / T o o l t i p > + 
+         < T o o l t i p   c o l u m n = " Q l t y I n s p e c t i o n _ S o u r c e _ C u s t o m _ 9 "   E l e m e n t I d = " 2 6 0 1 5 1 8 7 5 " > + 
+             < T o o l t i p T e x t   l a n g = " e n - U S " > S p e c i f i e s   a d d i t i o n a l   i n f o r m a t i o n   f r o m   a   s o u r c e   r e c o r d . < / T o o l t i p T e x t > + 
+         < / T o o l t i p > + 
+         < T o o l t i p   c o l u m n = " Q l t y I n s p e c t i o n _ S o u r c e _ C u s t o m _ 1 0 "   E l e m e n t I d = " 1 5 3 7 6 5 2 9 2 5 " > + 
+             < T o o l t i p T e x t   l a n g = " e n - U S " > S p e c i f i e s   a d d i t i o n a l   i n f o r m a t i o n   f r o m   a   s o u r c e   r e c o r d . < / T o o l t i p T e x t > + 
+         < / T o o l t i p > + 
+         < T o o l t i p   c o l u m n = " F i e l d _ C o d e "   E l e m e n t I d = " 1 3 2 7 2 5 5 7 3 " > + 
+             < T o o l t i p T e x t   l a n g = " e n - U S " > S p e c i f i e s   t h e   f i e l d / q u e s t i o n / m e t r i c   i n   t h i s   t e s t . < / T o o l t i p T e x t > + 
+         < / T o o l t i p > + 
+         < T o o l t i p   c o l u m n = " F i e l d _ D e s c r i p t i o n "   E l e m e n t I d = " 1 4 6 8 6 2 1 2 9 8 " > + 
+             < T o o l t i p T e x t   l a n g = " e n - U S " > S p e c i f i e s   a   d e s c r i p t i o n   o f   t h e   f i e l d   a s   i t   i s   u s e d   o n   t h e   t e s t . < / T o o l t i p T e x t > + 
+         < / T o o l t i p > + 
+         < T o o l t i p   c o l u m n = " N u m e r i c _ V a l u e "   E l e m e n t I d = " 4 6 0 4 1 2 6 4 6 " > + 
+             < T o o l t i p T e x t   l a n g = " e n - U S " > S p e c i f i e s   a n   e v a l u a t e d   n u m e r i c   v a l u e   o f   T e s t   V a l u e   f o r   u s e   i n   c a l c u l a t i o n s   a n d   a n a l y s i s .   T h i s   v a l u e   i s   a u t o m a t i c a l l y   c a l c u l a t e d   w h e n   t h e   T e s t   V a l u e   i s   e n t e r e d   o r   m o d i f i e d   b a s e d   o n   t h e   c o n f i g u r a t i o n   o f   t h e   T e s t   V a l u e   a n d   i s   n o t   d i r e c t l y   e d i t a b l e . < / T o o l t i p T e x t > + 
+         < / T o o l t i p > + 
+         < T o o l t i p   c o l u m n = " F i e l d _ T y p e "   E l e m e n t I d = " 1 3 2 8 1 6 4 0 1 6 " > + 
+             < T o o l t i p T e x t   l a n g = " e n - U S " > S p e c i f i e s   t h e   d a t a   t y p e   o f   t h e   v a l u e s   y o u   c a n   e n t e r   o r   s e l e c t   f o r   t h i s   t e s t .   U s e   D e c i m a l   f o r   n u m e r i c a l   m e a s u r e m e n t s .   U s e   C h o i c e   t o   g i v e   a   l i s t   o f   o p t i o n s   t o   c h o o s e   f r o m .   I f   y o u   w a n t   t o   c h o o s e   o p t i o n s   f r o m   a n   e x i s t i n g   t a b l e ,   u s e   T a b l e   L o o k u p . < / T o o l t i p T e x t > + 
+         < / T o o l t i p > + 
+         < T o o l t i p   c o l u m n = " T e s t _ R e s u l t "   E l e m e n t I d = " 1 2 7 1 0 6 2 1 4 1 " > + 
+             < T o o l t i p T e x t   l a n g = " e n - U S " > S p e c i f i e s   t h e   r e s u l t   i s   a u t o m a t i c a l l y   d e t e r m i n e d   b a s e d   o n   t h e   t e s t   v a l u e   a n d   r e s u l t   c o n f i g u r a t i o n . < / T o o l t i p T e x t > + 
+         < / T o o l t i p > + 
+     < / T o o l t i p s > + 
+     < C u r r e n t I n s p e c t i o n   E l e m e n t T y p e = " D a t a I t e m "   E l e m e n t I d = " 1 7 4 7 8 9 7 9 7 8 " > + 
+         < A p p r o v e r N a m e L a b e l   E l e m e n t T y p e = " C o l u m n "   E l e m e n t I d = " 1 8 9 7 9 9 2 7 8 5 "   D a t a T y p e = " T e x t " > A p p r o v e r N a m e L a b e l < / A p p r o v e r N a m e L a b e l > + 
+         < A p p r o v e r S i g n a t u r e L a b e l   E l e m e n t T y p e = " C o l u m n "   E l e m e n t I d = " 1 0 3 4 5 1 7 9 4 "   D a t a T y p e = " T e x t " > A p p r o v e r S i g n a t u r e L a b e l < / A p p r o v e r S i g n a t u r e L a b e l > + 
+         < C O A C o n t a c t _ A l l   E l e m e n t T y p e = " C o l u m n "   E l e m e n t I d = " 1 5 9 3 9 3 0 3 4 6 "   D a t a T y p e = " T e x t " > C O A C o n t a c t _ A l l < / C O A C o n t a c t _ A l l > + 
+         < C O A C o n t a c t _ R o w 1   E l e m e n t T y p e = " C o l u m n "   E l e m e n t I d = " 1 2 7 0 2 3 9 7 3 2 "   D a t a T y p e = " T e x t " > C O A C o n t a c t _ R o w 1 < / C O A C o n t a c t _ R o w 1 > + 
+         < C O A C o n t a c t _ R o w 2   E l e m e n t T y p e = " C o l u m n "   E l e m e n t I d = " 6 4 2 8 5 0 1 1 9 "   D a t a T y p e = " T e x t " > C O A C o n t a c t _ R o w 2 < / C O A C o n t a c t _ R o w 2 > + 
+         < C O A C o n t a c t _ R o w 3   E l e m e n t T y p e = " C o l u m n "   E l e m e n t I d = " 5 1 5 3 5 0 2 "   D a t a T y p e = " T e x t " > C O A C o n t a c t _ R o w 3 < / C O A C o n t a c t _ R o w 3 > + 
+         < C O A C o n t a c t _ R o w 4   E l e m e n t T y p e = " C o l u m n "   E l e m e n t I d = " 1 1 1 1 6 3 7 7 1 3 "   D a t a T y p e = " T e x t " > C O A C o n t a c t _ R o w 4 < / C O A C o n t a c t _ R o w 4 > + 
+         < C O A C o n t a c t _ R o w 5   E l e m e n t T y p e = " C o l u m n "   E l e m e n t I d = " 4 7 3 9 4 1 0 9 6 "   D a t a T y p e = " T e x t " > C O A C o n t a c t _ R o w 5 < / C O A C o n t a c t _ R o w 5 > + 
+         < C O A C o n t a c t _ R o w 6   E l e m e n t T y p e = " C o l u m n "   E l e m e n t I d = " 1 9 0 7 9 3 6 3 4 9 "   D a t a T y p e = " T e x t " > C O A C o n t a c t _ R o w 6 < / C O A C o n t a c t _ R o w 6 > + 
+         < C O A C o n t a c t _ R o w 7   E l e m e n t T y p e = " C o l u m n "   E l e m e n t I d = " 1 7 4 9 3 3 4 3 3 0 "   D a t a T y p e = " T e x t " > C O A C o n t a c t _ R o w 7 < / C O A C o n t a c t _ R o w 7 > + 
+         < C O A C o n t a c t _ R o w 8   E l e m e n t T y p e = " C o l u m n "   E l e m e n t I d = " 1 4 3 9 1 4 8 7 5 5 "   D a t a T y p e = " T e x t " > C O A C o n t a c t _ R o w 8 < / C O A C o n t a c t _ R o w 8 > + 
+         < C o m p a n y I n f o r m a t i o n _ A l l   E l e m e n t T y p e = " C o l u m n "   E l e m e n t I d = " 7 6 1 9 7 4 8 2 4 "   D a t a T y p e = " T e x t " > C o m p a n y I n f o r m a t i o n _ A l l < / C o m p a n y I n f o r m a t i o n _ A l l > + 
+         < C o m p a n y I n f o r m a t i o n _ R o w 1   E l e m e n t T y p e = " C o l u m n "   E l e m e n t I d = " 1 8 4 3 2 1 2 8 9 4 "   D a t a T y p e = " T e x t " > C o m p a n y I n f o r m a t i o n _ R o w 1 < / C o m p a n y I n f o r m a t i o n _ R o w 1 > + 
+         < C o m p a n y I n f o r m a t i o n _ R o w 2   E l e m e n t T y p e = " C o l u m n "   E l e m e n t I d = " 1 8 1 4 0 5 7 7 8 5 "   D a t a T y p e = " T e x t " > C o m p a n y I n f o r m a t i o n _ R o w 2 < / C o m p a n y I n f o r m a t i o n _ R o w 2 > + 
+         < C o m p a n y I n f o r m a t i o n _ R o w 3   E l e m e n t T y p e = " C o l u m n "   E l e m e n t I d = " 1 1 7 6 3 6 1 1 6 8 "   D a t a T y p e = " T e x t " > C o m p a n y I n f o r m a t i o n _ R o w 3 < / C o m p a n y I n f o r m a t i o n _ R o w 3 > + 
+         < C o m p a n y I n f o r m a t i o n _ R o w 4   E l e m e n t T y p e = " C o l u m n "   E l e m e n t I d = " 1 3 4 5 2 7 0 1 9 1 "   D a t a T y p e = " T e x t " > C o m p a n y I n f o r m a t i o n _ R o w 4 < / C o m p a n y I n f o r m a t i o n _ R o w 4 > + 
+         < C o m p a n y I n f o r m a t i o n _ R o w 5   E l e m e n t T y p e = " C o l u m n "   E l e m e n t I d = " 7 0 7 5 7 3 5 7 4 "   D a t a T y p e = " T e x t " > C o m p a n y I n f o r m a t i o n _ R o w 5 < / C o m p a n y I n f o r m a t i o n _ R o w 5 > + 
+         < C o m p a n y I n f o r m a t i o n _ R o w 6   E l e m e n t T y p e = " C o l u m n "   E l e m e n t I d = " 6 9 8 7 6 9 5 7 "   D a t a T y p e = " T e x t " > C o m p a n y I n f o r m a t i o n _ R o w 6 < / C o m p a n y I n f o r m a t i o n _ R o w 6 > + 
+         < C o m p a n y I n f o r m a t i o n _ R o w 7   E l e m e n t T y p e = " C o l u m n "   E l e m e n t I d = " 5 6 7 8 1 9 6 6 0 "   D a t a T y p e = " T e x t " > C o m p a n y I n f o r m a t i o n _ R o w 7 < / C o m p a n y I n f o r m a t i o n _ R o w 7 > + 
+         < C o m p a n y I n f o r m a t i o n _ R o w 8   E l e m e n t T y p e = " C o l u m n "   E l e m e n t I d = " 3 9 8 9 1 0 6 3 7 "   D a t a T y p e = " T e x t " > C o m p a n y I n f o r m a t i o n _ R o w 8 < / C o m p a n y I n f o r m a t i o n _ R o w 8 > + 
+         < C o m p a n y L o g o   E l e m e n t T y p e = " C o l u m n "   E l e m e n t I d = " 2 3 7 6 9 1 5 1 "   D a t a T y p e = " B l o b " / > + 
+         < E m a i l L a b e l   E l e m e n t T y p e = " C o l u m n "   E l e m e n t I d = " 7 7 1 8 8 7 1 3 5 "   D a t a T y p e = " T e x t " > E m a i l L a b e l < / E m a i l L a b e l > + 
+         < E m a i l V a l u e   E l e m e n t T y p e = " C o l u m n "   E l e m e n t I d = " 3 8 8 1 2 2 7 6 2 "   D a t a T y p e = " T e x t " > E m a i l V a l u e < / E m a i l V a l u e > + 
+         < F i n i s h e d B y N a m e L a b e l   E l e m e n t T y p e = " C o l u m n "   E l e m e n t I d = " 2 1 0 1 0 0 9 6 5 1 "   D a t a T y p e = " T e x t " > F i n i s h e d B y N a m e L a b e l < / F i n i s h e d B y N a m e L a b e l > + 
+         < F i n i s h e d B y S i g n a t u r e L a b e l   E l e m e n t T y p e = " C o l u m n "   E l e m e n t I d = " 2 0 7 1 3 1 2 7 2 2 "   D a t a T y p e = " T e x t " > F i n i s h e d B y S i g n a t u r e L a b e l < / F i n i s h e d B y S i g n a t u r e L a b e l > + 
+         < H o m e P a g e L a b e l   E l e m e n t T y p e = " C o l u m n "   E l e m e n t I d = " 4 6 2 3 7 4 2 3 1 "   D a t a T y p e = " T e x t " > H o m e P a g e L a b e l < / H o m e P a g e L a b e l > + 
+         < H o m e P a g e V a l u e   E l e m e n t T y p e = " C o l u m n "   E l e m e n t I d = " 5 3 3 5 1 4 0 3 4 "   D a t a T y p e = " T e x t " > H o m e P a g e V a l u e < / H o m e P a g e V a l u e > + 
+         < I n s p e c t i o n I n f o r m a t i o n   E l e m e n t T y p e = " C o l u m n "   E l e m e n t I d = " 1 5 3 2 8 6 0 1 9 9 "   D a t a T y p e = " T e x t " > I n s p e c t i o n I n f o r m a t i o n < / I n s p e c t i o n I n f o r m a t i o n > + 
+         < I t e m D e s c r i p t i o n   E l e m e n t T y p e = " C o l u m n "   E l e m e n t I d = " 1 9 6 5 3 9 3 7 9 0 "   D a t a T y p e = " T e x t " > I t e m D e s c r i p t i o n < / I t e m D e s c r i p t i o n > + 
+         < I t e m T r a c k i n g D e s c r i p t i o n   E l e m e n t T y p e = " C o l u m n "   E l e m e n t I d = " 1 1 1 7 1 0 3 3 4 5 "   D a t a T y p e = " T e x t " > I t e m T r a c k i n g D e s c r i p t i o n < / I t e m T r a c k i n g D e s c r i p t i o n > + 
+         < P h o n e N o L a b e l   E l e m e n t T y p e = " C o l u m n "   E l e m e n t I d = " 1 6 1 4 5 2 6 0 7 8 "   D a t a T y p e = " T e x t " > P h o n e N o L a b e l < / P h o n e N o L a b e l > + 
+         < P h o n e N o V a l u e   E l e m e n t T y p e = " C o l u m n "   E l e m e n t I d = " 1 2 8 6 6 4 9 7 8 1 "   D a t a T y p e = " T e x t " > P h o n e N o V a l u e < / P h o n e N o V a l u e > + 
+         < Q l t y I n s p e c t i o n T e m p l a t e _ D e s c r i p t i o n   E l e m e n t T y p e = " C o l u m n "   E l e m e n t I d = " 1 6 5 2 0 6 9 5 9 8 "   D a t a T y p e = " T e x t " > Q l t y I n s p e c t i o n T e m p l a t e _ D e s c r i p t i o n < / Q l t y I n s p e c t i o n T e m p l a t e _ D e s c r i p t i o n > + 
+         < Q l t y I n s p e c t i o n _ D e s c r i p t i o n   E l e m e n t T y p e = " C o l u m n "   E l e m e n t I d = " 7 3 9 0 1 9 9 1 0 "   D a t a T y p e = " T e x t " > Q l t y I n s p e c t i o n _ D e s c r i p t i o n < / Q l t y I n s p e c t i o n _ D e s c r i p t i o n > + 
+         < Q l t y I n s p e c t i o n _ D i r e c t o r _ N a m e   E l e m e n t T y p e = " C o l u m n "   E l e m e n t I d = " 1 2 5 9 7 6 1 4 6 0 "   D a t a T y p e = " T e x t " > Q l t y I n s p e c t i o n _ D i r e c t o r _ N a m e < / Q l t y I n s p e c t i o n _ D i r e c t o r _ N a m e > + 
+         < Q l t y I n s p e c t i o n _ D i r e c t o r _ T i t l e   E l e m e n t T y p e = " C o l u m n "   E l e m e n t I d = " 2 6 7 7 1 7 5 2 5 "   D a t a T y p e = " T e x t " > Q l t y I n s p e c t i o n _ D i r e c t o r _ T i t l e < / Q l t y I n s p e c t i o n _ D i r e c t o r _ T i t l e > + 
+         < Q l t y I n s p e c t i o n _ F i n i s h e d _ B y _ E m a i l   E l e m e n t T y p e = " C o l u m n "   E l e m e n t I d = " 1 5 2 1 1 3 4 6 3 1 "   D a t a T y p e = " T e x t " > Q l t y I n s p e c t i o n _ F i n i s h e d _ B y _ E m a i l < / Q l t y I n s p e c t i o n _ F i n i s h e d _ B y _ E m a i l > + 
+         < Q l t y I n s p e c t i o n _ F i n i s h e d _ B y _ P h o n e   E l e m e n t T y p e = " C o l u m n "   E l e m e n t I d = " 3 4 7 5 5 7 6 2 5 "   D a t a T y p e = " T e x t " > Q l t y I n s p e c t i o n _ F i n i s h e d _ B y _ P h o n e < / Q l t y I n s p e c t i o n _ F i n i s h e d _ B y _ P h o n e > + 
+         < Q l t y I n s p e c t i o n _ F i n i s h e d _ B y _ T i t l e   E l e m e n t T y p e = " C o l u m n "   E l e m e n t I d = " 4 6 0 0 4 5 6 8 3 "   D a t a T y p e = " T e x t " > Q l t y I n s p e c t i o n _ F i n i s h e d _ B y _ T i t l e < / Q l t y I n s p e c t i o n _ F i n i s h e d _ B y _ T i t l e > + 
+         < Q l t y I n s p e c t i o n _ F i n i s h e d _ B y _ U s e r N a m e   E l e m e n t T y p e = " C o l u m n "   E l e m e n t I d = " 1 9 5 3 6 1 2 5 3 1 "   D a t a T y p e = " T e x t " > Q l t y I n s p e c t i o n _ F i n i s h e d _ B y _ U s e r N a m e < / Q l t y I n s p e c t i o n _ F i n i s h e d _ B y _ U s e r N a m e > + 
+         < Q l t y I n s p e c t i o n _ F i n i s h e d _ B y _ U s e r _ I D   E l e m e n t T y p e = " C o l u m n "   E l e m e n t I d = " 1 7 5 0 5 1 6 3 3 8 "   D a t a T y p e = " C o d e " > Q l t y I n s p e c t i o n _ F i n i s h e d _ B y _ U s e r _ I D < / Q l t y I n s p e c t i o n _ F i n i s h e d _ B y _ U s e r _ I D > + 
+         < Q l t y I n s p e c t i o n _ F i n i s h e d _ D a t e   E l e m e n t T y p e = " C o l u m n "   E l e m e n t I d = " 1 8 3 4 1 2 2 7 6 5 "   D a t a T y p e = " D a t e T i m e " > Q l t y I n s p e c t i o n _ F i n i s h e d _ D a t e < / Q l t y I n s p e c t i o n _ F i n i s h e d _ D a t e > + 
+         < Q l t y I n s p e c t i o n _ N o   E l e m e n t T y p e = " C o l u m n "   E l e m e n t I d = " 2 1 2 0 6 1 5 7 4 9 "   D a t a T y p e = " C o d e " > Q l t y I n s p e c t i o n _ N o < / Q l t y I n s p e c t i o n _ N o > + 
+         < Q l t y I n s p e c t i o n _ R e i n s p e c t i o n N o   E l e m e n t T y p e = " C o l u m n "   E l e m e n t I d = " 7 5 1 7 3 5 6 "   D a t a T y p e = " I n t e g e r " > Q l t y I n s p e c t i o n _ R e i n s p e c t i o n N o < / Q l t y I n s p e c t i o n _ R e i n s p e c t i o n N o > + 
+         < Q l t y I n s p e c t i o n _ R e s u l t _ C o d e   E l e m e n t T y p e = " C o l u m n "   E l e m e n t I d = " 1 8 0 7 0 7 7 0 6 5 "   D a t a T y p e = " C o d e " > Q l t y I n s p e c t i o n _ R e s u l t _ C o d e < / Q l t y I n s p e c t i o n _ R e s u l t _ C o d e > + 
+         < Q l t y I n s p e c t i o n _ R e s u l t _ D e s c r i p t i o n   E l e m e n t T y p e = " C o l u m n "   E l e m e n t I d = " 8 1 0 5 3 8 1 8 8 "   D a t a T y p e = " T e x t " > Q l t y I n s p e c t i o n _ R e s u l t _ D e s c r i p t i o n < / Q l t y I n s p e c t i o n _ R e s u l t _ D e s c r i p t i o n > + 
+         < Q l t y I n s p e c t i o n _ S o u r c e _ C u s t o m _ 1   E l e m e n t T y p e = " C o l u m n "   E l e m e n t I d = " 5 4 6 4 5 3 7 6 5 "   D a t a T y p e = " T e x t " > Q l t y I n s p e c t i o n _ S o u r c e _ C u s t o m _ 1 < / Q l t y I n s p e c t i o n _ S o u r c e _ C u s t o m _ 1 > + 
+         < Q l t y I n s p e c t i o n _ S o u r c e _ C u s t o m _ 1 0   E l e m e n t T y p e = " C o l u m n "   E l e m e n t I d = " 1 5 3 7 6 5 2 9 2 5 "   D a t a T y p e = " D e c i m a l " > Q l t y I n s p e c t i o n _ S o u r c e _ C u s t o m _ 1 0 < / Q l t y I n s p e c t i o n _ S o u r c e _ C u s t o m _ 1 0 > + 
+         < Q l t y I n s p e c t i o n _ S o u r c e _ C u s t o m _ 2   E l e m e n t T y p e = " C o l u m n "   E l e m e n t I d = " 1 8 3 5 4 2 3 6 8 0 "   D a t a T y p e = " T e x t " > Q l t y I n s p e c t i o n _ S o u r c e _ C u s t o m _ 2 < / Q l t y I n s p e c t i o n _ S o u r c e _ C u s t o m _ 2 > + 
+         < Q l t y I n s p e c t i o n _ S o u r c e _ C u s t o m _ 3   E l e m e n t T y p e = " C o l u m n "   E l e m e n t I d = " 1 8 2 1 8 4 6 9 9 9 "   D a t a T y p e = " T e x t " > Q l t y I n s p e c t i o n _ S o u r c e _ C u s t o m _ 3 < / Q l t y I n s p e c t i o n _ S o u r c e _ C u s t o m _ 3 > + 
+         < Q l t y I n s p e c t i o n _ S o u r c e _ C u s t o m _ 4   E l e m e n t T y p e = " C o l u m n "   E l e m e n t I d = " 1 3 6 6 6 3 6 0 8 6 "   D a t a T y p e = " T e x t " > Q l t y I n s p e c t i o n _ S o u r c e _ C u s t o m _ 4 < / Q l t y I n s p e c t i o n _ S o u r c e _ C u s t o m _ 4 > + 
+         < Q l t y I n s p e c t i o n _ S o u r c e _ C u s t o m _ 5   E l e m e n t T y p e = " C o l u m n "   E l e m e n t I d = " 2 0 0 4 3 3 2 7 0 3 "   D a t a T y p e = " T e x t " > Q l t y I n s p e c t i o n _ S o u r c e _ C u s t o m _ 5 < / Q l t y I n s p e c t i o n _ S o u r c e _ C u s t o m _ 5 > + 
+         < Q l t y I n s p e c t i o n _ S o u r c e _ C u s t o m _ 6   E l e m e n t T y p e = " C o l u m n "   E l e m e n t I d = " 9 1 2 4 2 8 5 2 "   D a t a T y p e = " T e x t " > Q l t y I n s p e c t i o n _ S o u r c e _ C u s t o m _ 6 < / Q l t y I n s p e c t i o n _ S o u r c e _ C u s t o m _ 6 > + 
+         < Q l t y I n s p e c t i o n _ S o u r c e _ C u s t o m _ 7   E l e m e n t T y p e = " C o l u m n "   E l e m e n t I d = " 7 2 8 9 3 9 4 6 9 "   D a t a T y p e = " I n t e g e r " > Q l t y I n s p e c t i o n _ S o u r c e _ C u s t o m _ 7 < / Q l t y I n s p e c t i o n _ S o u r c e _ C u s t o m _ 7 > + 
+         < Q l t y I n s p e c t i o n _ S o u r c e _ C u s t o m _ 8   E l e m e n t T y p e = " C o l u m n "   E l e m e n t I d = " 3 7 7 5 4 4 7 4 2 "   D a t a T y p e = " I n t e g e r " > Q l t y I n s p e c t i o n _ S o u r c e _ C u s t o m _ 8 < / Q l t y I n s p e c t i o n _ S o u r c e _ C u s t o m _ 8 > + 
+         < Q l t y I n s p e c t i o n _ S o u r c e _ C u s t o m _ 9   E l e m e n t T y p e = " C o l u m n "   E l e m e n t I d = " 2 6 0 1 5 1 8 7 5 "   D a t a T y p e = " D e c i m a l " > Q l t y I n s p e c t i o n _ S o u r c e _ C u s t o m _ 9 < / Q l t y I n s p e c t i o n _ S o u r c e _ C u s t o m _ 9 > + 
+         < Q l t y I n s p e c t i o n _ S o u r c e _ D o c u m e n t _ N o _   E l e m e n t T y p e = " C o l u m n "   E l e m e n t I d = " 1 6 7 5 9 1 6 2 8 8 "   D a t a T y p e = " C o d e " > Q l t y I n s p e c t i o n _ S o u r c e _ D o c u m e n t _ N o _ < / Q l t y I n s p e c t i o n _ S o u r c e _ D o c u m e n t _ N o _ > + 
+         < Q l t y I n s p e c t i o n _ S o u r c e _ I t e m _ D e s c r i p t i o n   E l e m e n t T y p e = " C o l u m n "   E l e m e n t I d = " 6 4 6 8 9 0 6 3 0 "   D a t a T y p e = " T e x t " > Q l t y I n s p e c t i o n _ S o u r c e _ I t e m _ D e s c r i p t i o n < / Q l t y I n s p e c t i o n _ S o u r c e _ I t e m _ D e s c r i p t i o n > + 
+         < Q l t y I n s p e c t i o n _ S o u r c e _ I t e m _ D e s c r i p t i o n 2   E l e m e n t T y p e = " C o l u m n "   E l e m e n t I d = " 1 2 7 9 3 6 9 3 5 2 "   D a t a T y p e = " T e x t " > Q l t y I n s p e c t i o n _ S o u r c e _ I t e m _ D e s c r i p t i o n 2 < / Q l t y I n s p e c t i o n _ S o u r c e _ I t e m _ D e s c r i p t i o n 2 > + 
+         < Q l t y I n s p e c t i o n _ S o u r c e _ I t e m _ N o _   E l e m e n t T y p e = " C o l u m n "   E l e m e n t I d = " 1 2 6 8 0 5 0 5 1 8 "   D a t a T y p e = " C o d e " > Q l t y I n s p e c t i o n _ S o u r c e _ I t e m _ N o _ < / Q l t y I n s p e c t i o n _ S o u r c e _ I t e m _ N o _ > + 
+         < Q l t y I n s p e c t i o n _ S o u r c e _ L o t _ N o _   E l e m e n t T y p e = " C o l u m n "   E l e m e n t I d = " 1 1 2 3 5 5 1 3 1 2 "   D a t a T y p e = " C o d e " > Q l t y I n s p e c t i o n _ S o u r c e _ L o t _ N o _ < / Q l t y I n s p e c t i o n _ S o u r c e _ L o t _ N o _ > + 
+         < Q l t y I n s p e c t i o n _ S o u r c e _ P a c k a g e _ N o _   E l e m e n t T y p e = " C o l u m n "   E l e m e n t I d = " 1 9 6 1 1 2 9 9 7 "   D a t a T y p e = " C o d e " > Q l t y I n s p e c t i o n _ S o u r c e _ P a c k a g e _ N o _ < / Q l t y I n s p e c t i o n _ S o u r c e _ P a c k a g e _ N o _ > + 
+         < Q l t y I n s p e c t i o n _ S o u r c e _ S e r i a l _ N o _   E l e m e n t T y p e = " C o l u m n "   E l e m e n t I d = " 1 5 2 0 5 9 1 4 4 7 "   D a t a T y p e = " C o d e " > Q l t y I n s p e c t i o n _ S o u r c e _ S e r i a l _ N o _ < / Q l t y I n s p e c t i o n _ S o u r c e _ S e r i a l _ N o _ > + 
+         < Q l t y I n s p e c t i o n _ S o u r c e _ T a s k _ N o _   E l e m e n t T y p e = " C o l u m n "   E l e m e n t I d = " 3 8 4 6 4 4 1 8 2 "   D a t a T y p e = " C o d e " > Q l t y I n s p e c t i o n _ S o u r c e _ T a s k _ N o _ < / Q l t y I n s p e c t i o n _ S o u r c e _ T a s k _ N o _ > + 
+         < Q l t y I n s p e c t i o n _ S o u r c e _ V a r i a n t _ C o d e   E l e m e n t T y p e = " C o l u m n "   E l e m e n t I d = " 1 6 0 8 4 0 3 8 2 1 "   D a t a T y p e = " C o d e " > Q l t y I n s p e c t i o n _ S o u r c e _ V a r i a n t _ C o d e < / Q l t y I n s p e c t i o n _ S o u r c e _ V a r i a n t _ C o d e > + 
+         < Q l t y I n s p e c t i o n _ S t a t u s   E l e m e n t T y p e = " C o l u m n "   E l e m e n t I d = " 8 5 1 7 5 2 7 6 8 "   D a t a T y p e = " E n u m " > Q l t y I n s p e c t i o n _ S t a t u s < / Q l t y I n s p e c t i o n _ S t a t u s > + 
+         < R e i n s p e c t i o n S e q u e n c e I n f o r m a t i o n   E l e m e n t T y p e = " C o l u m n "   E l e m e n t I d = " 7 4 9 5 1 6 5 4 3 "   D a t a T y p e = " T e x t " > R e i n s p e c t i o n S e q u e n c e I n f o r m a t i o n < / R e i n s p e c t i o n S e q u e n c e I n f o r m a t i o n > + 
+         < C u r r e n t I n s p e c t i o n L i n e   E l e m e n t T y p e = " D a t a I t e m "   E l e m e n t I d = " 1 1 9 3 2 1 9 5 9 6 " > + 
+             < C o n d i t i o n L a b e l _ 1   E l e m e n t T y p e = " C o l u m n "   E l e m e n t I d = " 1 2 2 7 8 8 1 1 9 4 "   D a t a T y p e = " T e x t " > C o n d i t i o n L a b e l _ 1 < / C o n d i t i o n L a b e l _ 1 > + 
+             < C o n d i t i o n L a b e l _ 2   E l e m e n t T y p e = " C o l u m n "   E l e m e n t I d = " 1 8 6 5 5 7 7 8 1 1 "   D a t a T y p e = " T e x t " > C o n d i t i o n L a b e l _ 2 < / C o n d i t i o n L a b e l _ 2 > + 
+             < F i e l d _ C o d e   E l e m e n t T y p e = " C o l u m n "   E l e m e n t I d = " 1 3 2 7 2 5 5 7 3 "   D a t a T y p e = " C o d e " > F i e l d _ C o d e < / F i e l d _ C o d e > + 
+             < F i e l d _ D e s c r i p t i o n   E l e m e n t T y p e = " C o l u m n "   E l e m e n t I d = " 1 4 6 8 6 2 1 2 9 8 "   D a t a T y p e = " T e x t " > F i e l d _ D e s c r i p t i o n < / F i e l d _ D e s c r i p t i o n > + 
+             < F i e l d _ H a s E n t e r e d V a l u e   E l e m e n t T y p e = " C o l u m n "   E l e m e n t I d = " 1 7 1 6 2 6 5 8 2 4 "   D a t a T y p e = " B o o l e a n " > F i e l d _ H a s E n t e r e d V a l u e < / F i e l d _ H a s E n t e r e d V a l u e > + 
+             < F i e l d _ I f P e r s o n E m a i l   E l e m e n t T y p e = " C o l u m n "   E l e m e n t I d = " 1 3 4 6 0 5 7 6 5 0 "   D a t a T y p e = " T e x t " > F i e l d _ I f P e r s o n E m a i l < / F i e l d _ I f P e r s o n E m a i l > + 
+             < F i e l d _ I f P e r s o n N a m e   E l e m e n t T y p e = " C o l u m n "   E l e m e n t I d = " 4 1 4 7 0 2 4 4 3 "   D a t a T y p e = " T e x t " > F i e l d _ I f P e r s o n N a m e < / F i e l d _ I f P e r s o n N a m e > + 
+             < F i e l d _ I f P e r s o n P h o n e   E l e m e n t T y p e = " C o l u m n "   E l e m e n t I d = " 1 9 7 4 1 8 8 4 6 2 "   D a t a T y p e = " T e x t " > F i e l d _ I f P e r s o n P h o n e < / F i e l d _ I f P e r s o n P h o n e > + 
+             < F i e l d _ I f P e r s o n T i t l e   E l e m e n t T y p e = " C o l u m n "   E l e m e n t I d = " 1 0 0 4 6 0 9 5 4 2 "   D a t a T y p e = " T e x t " > F i e l d _ I f P e r s o n T i t l e < / F i e l d _ I f P e r s o n T i t l e > + 
+             < F i e l d _ I s L a b e l   E l e m e n t T y p e = " C o l u m n "   E l e m e n t I d = " 2 0 4 3 1 9 3 9 4 0 "   D a t a T y p e = " B o o l e a n " > F i e l d _ I s L a b e l < / F i e l d _ I s L a b e l > + 
+             < F i e l d _ I s P e r s o n F i e l d   E l e m e n t T y p e = " C o l u m n "   E l e m e n t I d = " 4 3 4 5 4 6 6 1 1 "   D a t a T y p e = " B o o l e a n " > F i e l d _ I s P e r s o n F i e l d < / F i e l d _ I s P e r s o n F i e l d > + 
+             < F i e l d _ I s T e x t   E l e m e n t T y p e = " C o l u m n "   E l e m e n t I d = " 5 9 3 6 9 2 0 1 "   D a t a T y p e = " B o o l e a n " > F i e l d _ I s T e x t < / F i e l d _ I s T e x t > + 
+             < F i e l d _ L i n e C o m m e n t a r y   E l e m e n t T y p e = " C o l u m n "   E l e m e n t I d = " 1 8 5 3 8 0 0 2 5 7 "   D a t a T y p e = " T e x t " > F i e l d _ L i n e C o m m e n t a r y < / F i e l d _ L i n e C o m m e n t a r y > + 
+             < F i e l d _ M o d i f i e d B y U s e r E m a i l   E l e m e n t T y p e = " C o l u m n "   E l e m e n t I d = " 2 0 5 3 4 9 0 5 4 5 "   D a t a T y p e = " T e x t " > F i e l d _ M o d i f i e d B y U s e r E m a i l < / F i e l d _ M o d i f i e d B y U s e r E m a i l > + 
+             < F i e l d _ M o d i f i e d B y U s e r I D   E l e m e n t T y p e = " C o l u m n "   E l e m e n t I d = " 1 3 6 3 9 8 7 2 2 2 "   D a t a T y p e = " C o d e " > F i e l d _ M o d i f i e d B y U s e r I D < / F i e l d _ M o d i f i e d B y U s e r I D > + 
+             < F i e l d _ M o d i f i e d B y U s e r J o b T i t l e   E l e m e n t T y p e = " C o l u m n "   E l e m e n t I d = " 7 1 3 3 5 4 3 4 0 "   D a t a T y p e = " T e x t " > F i e l d _ M o d i f i e d B y U s e r J o b T i t l e < / F i e l d _ M o d i f i e d B y U s e r J o b T i t l e > + 
+             < F i e l d _ M o d i f i e d B y U s e r N a m e   E l e m e n t T y p e = " C o l u m n "   E l e m e n t I d = " 7 9 8 2 2 1 9 1 6 "   D a t a T y p e = " T e x t " > F i e l d _ M o d i f i e d B y U s e r N a m e < / F i e l d _ M o d i f i e d B y U s e r N a m e > + 
+             < F i e l d _ M o d i f i e d B y U s e r P h o n e   E l e m e n t T y p e = " C o l u m n "   E l e m e n t I d = " 1 2 9 4 9 7 8 5 4 5 "   D a t a T y p e = " T e x t " > F i e l d _ M o d i f i e d B y U s e r P h o n e < / F i e l d _ M o d i f i e d B y U s e r P h o n e > + 
+             < F i e l d _ M o d i f i e d D a t e T i m e   E l e m e n t T y p e = " C o l u m n "   E l e m e n t I d = " 1 6 5 4 4 9 3 6 9 6 "   D a t a T y p e = " D a t e T i m e " > F i e l d _ M o d i f i e d D a t e T i m e < / F i e l d _ M o d i f i e d D a t e T i m e > + 
+             < F i e l d _ T y p e   E l e m e n t T y p e = " C o l u m n "   E l e m e n t I d = " 1 3 2 8 1 6 4 0 1 6 "   D a t a T y p e = " E n u m " > F i e l d _ T y p e < / F i e l d _ T y p e > + 
+             < L a b e l F i e l d _ D e s c r i p t i o n   E l e m e n t T y p e = " C o l u m n "   E l e m e n t I d = " 3 2 9 5 4 9 8 4 0 "   D a t a T y p e = " T e x t " > L a b e l F i e l d _ D e s c r i p t i o n < / L a b e l F i e l d _ D e s c r i p t i o n > + 
+             < N u m e r i c _ V a l u e   E l e m e n t T y p e = " C o l u m n "   E l e m e n t I d = " 4 6 0 4 1 2 6 4 6 "   D a t a T y p e = " D e c i m a l " > N u m e r i c _ V a l u e < / N u m e r i c _ V a l u e > + 
+             < P r o m p t e d R e s u l t C a p t i o n _ 1   E l e m e n t T y p e = " C o l u m n "   E l e m e n t I d = " 1 5 4 8 2 0 5 1 6 9 "   D a t a T y p e = " T e x t " > P r o m p t e d R e s u l t C a p t i o n _ 1 < / P r o m p t e d R e s u l t C a p t i o n _ 1 > + 
+             < P r o m p t e d R e s u l t C a p t i o n _ 1 0   E l e m e n t T y p e = " C o l u m n "   E l e m e n t I d = " 6 6 5 1 3 7 3 2 1 "   D a t a T y p e = " T e x t " > P r o m p t e d R e s u l t C a p t i o n _ 1 0 < / P r o m p t e d R e s u l t C a p t i o n _ 1 0 > + 
+             < P r o m p t e d R e s u l t C a p t i o n _ 2   E l e m e n t T y p e = " C o l u m n "   E l e m e n t I d = " 2 1 0 9 0 6 5 5 1 0 "   D a t a T y p e = " T e x t " > P r o m p t e d R e s u l t C a p t i o n _ 2 < / P r o m p t e d R e s u l t C a p t i o n _ 2 > + 
+             < P r o m p t e d R e s u l t C a p t i o n _ 3   E l e m e n t T y p e = " C o l u m n "   E l e m e n t I d = " 1 4 7 1 3 6 8 8 9 3 "   D a t a T y p e = " T e x t " > P r o m p t e d R e s u l t C a p t i o n _ 3 < / P r o m p t e d R e s u l t C a p t i o n _ 3 > + 
+             < P r o m p t e d R e s u l t C a p t i o n _ 4   E l e m e n t T y p e = " C o l u m n "   E l e m e n t I d = " 8 3 3 6 7 2 2 7 6 "   D a t a T y p e = " T e x t " > P r o m p t e d R e s u l t C a p t i o n _ 4 < / P r o m p t e d R e s u l t C a p t i o n _ 4 > + 
+             < P r o m p t e d R e s u l t C a p t i o n _ 5   E l e m e n t T y p e = " C o l u m n "   E l e m e n t I d = " 1 9 5 9 7 5 6 5 9 "   D a t a T y p e = " T e x t " > P r o m p t e d R e s u l t C a p t i o n _ 5 < / P r o m p t e d R e s u l t C a p t i o n _ 5 > + 
+             < P r o m p t e d R e s u l t C a p t i o n _ 6   E l e m e n t T y p e = " C o l u m n "   E l e m e n t I d = " 4 4 1 7 2 0 9 5 8 "   D a t a T y p e = " T e x t " > P r o m p t e d R e s u l t C a p t i o n _ 6 < / P r o m p t e d R e s u l t C a p t i o n _ 6 > + 
+             < P r o m p t e d R e s u l t C a p t i o n _ 7   E l e m e n t T y p e = " C o l u m n "   E l e m e n t I d = " 1 0 7 9 4 1 7 5 7 5 "   D a t a T y p e = " T e x t " > P r o m p t e d R e s u l t C a p t i o n _ 7 < / P r o m p t e d R e s u l t C a p t i o n _ 7 > + 
+             < P r o m p t e d R e s u l t C a p t i o n _ 8   E l e m e n t T y p e = " C o l u m n "   E l e m e n t I d = " 1 0 3 9 0 2 9 1 2 "   D a t a T y p e = " T e x t " > P r o m p t e d R e s u l t C a p t i o n _ 8 < / P r o m p t e d R e s u l t C a p t i o n _ 8 > + 
+             < P r o m p t e d R e s u l t C a p t i o n _ 9   E l e m e n t T y p e = " C o l u m n "   E l e m e n t I d = " 7 4 1 5 9 9 5 2 9 "   D a t a T y p e = " T e x t " > P r o m p t e d R e s u l t C a p t i o n _ 9 < / P r o m p t e d R e s u l t C a p t i o n _ 9 > + 
+             < P r o m p t e d R e s u l t C o n d i t i o n D e s c r i p t i o n _ 1   E l e m e n t T y p e = " C o l u m n "   E l e m e n t I d = " 1 7 7 6 7 4 4 4 3 4 "   D a t a T y p e = " T e x t " > P r o m p t e d R e s u l t C o n d i t i o n D e s c r i p t i o n _ 1 < / P r o m p t e d R e s u l t C o n d i t i o n D e s c r i p t i o n _ 1 > + 
+             < P r o m p t e d R e s u l t C o n d i t i o n D e s c r i p t i o n _ 1 0   E l e m e n t T y p e = " C o l u m n "   E l e m e n t I d = " 1 0 2 8 7 8 8 8 8 2 "   D a t a T y p e = " T e x t " > P r o m p t e d R e s u l t C o n d i t i o n D e s c r i p t i o n _ 1 0 < / P r o m p t e d R e s u l t C o n d i t i o n D e s c r i p t i o n _ 1 0 > + 
+             < P r o m p t e d R e s u l t C o n d i t i o n D e s c r i p t i o n _ 2   E l e m e n t T y p e = " C o l u m n "   E l e m e n t I d = " 1 1 3 9 0 4 7 8 1 7 "   D a t a T y p e = " T e x t " > P r o m p t e d R e s u l t C o n d i t i o n D e s c r i p t i o n _ 2 < / P r o m p t e d R e s u l t C o n d i t i o n D e s c r i p t i o n _ 2 > + 
+             < P r o m p t e d R e s u l t C o n d i t i o n D e s c r i p t i o n _ 3   E l e m e n t T y p e = " C o l u m n "   E l e m e n t I d = " 5 0 1 3 5 1 2 0 0 "   D a t a T y p e = " T e x t " > P r o m p t e d R e s u l t C o n d i t i o n D e s c r i p t i o n _ 3 < / P r o m p t e d R e s u l t C o n d i t i o n D e s c r i p t i o n _ 3 > + 
+             < P r o m p t e d R e s u l t C o n d i t i o n D e s c r i p t i o n _ 4   E l e m e n t T y p e = " C o l u m n "   E l e m e n t I d = " 6 7 0 2 6 0 2 2 3 "   D a t a T y p e = " T e x t " > P r o m p t e d R e s u l t C o n d i t i o n D e s c r i p t i o n _ 4 < / P r o m p t e d R e s u l t C o n d i t i o n D e s c r i p t i o n _ 4 > + 
+             < P r o m p t e d R e s u l t C o n d i t i o n D e s c r i p t i o n _ 5   E l e m e n t T y p e = " C o l u m n "   E l e m e n t I d = " 3 2 5 6 3 6 0 6 "   D a t a T y p e = " T e x t " > P r o m p t e d R e s u l t C o n d i t i o n D e s c r i p t i o n _ 5 < / P r o m p t e d R e s u l t C o n d i t i o n D e s c r i p t i o n _ 5 > + 
+             < P r o m p t e d R e s u l t C o n d i t i o n D e s c r i p t i o n _ 6   E l e m e n t T y p e = " C o l u m n "   E l e m e n t I d = " 6 0 5 1 3 3 0 1 1 "   D a t a T y p e = " T e x t " > P r o m p t e d R e s u l t C o n d i t i o n D e s c r i p t i o n _ 6 < / P r o m p t e d R e s u l t C o n d i t i o n D e s c r i p t i o n _ 6 > + 
+             < P r o m p t e d R e s u l t C o n d i t i o n D e s c r i p t i o n _ 7   E l e m e n t T y p e = " C o l u m n "   E l e m e n t I d = " 1 2 4 2 8 2 9 6 2 8 "   D a t a T y p e = " T e x t " > P r o m p t e d R e s u l t C o n d i t i o n D e s c r i p t i o n _ 7 < / P r o m p t e d R e s u l t C o n d i t i o n D e s c r i p t i o n _ 7 > + 
+             < P r o m p t e d R e s u l t C o n d i t i o n D e s c r i p t i o n _ 8   E l e m e n t T y p e = " C o l u m n "   E l e m e n t I d = " 1 0 7 3 9 2 0 6 0 5 "   D a t a T y p e = " T e x t " > P r o m p t e d R e s u l t C o n d i t i o n D e s c r i p t i o n _ 8 < / P r o m p t e d R e s u l t C o n d i t i o n D e s c r i p t i o n _ 8 > + 
+             < P r o m p t e d R e s u l t C o n d i t i o n D e s c r i p t i o n _ 9   E l e m e n t T y p e = " C o l u m n "   E l e m e n t I d = " 1 7 1 1 6 1 7 2 2 2 "   D a t a T y p e = " T e x t " > P r o m p t e d R e s u l t C o n d i t i o n D e s c r i p t i o n _ 9 < / P r o m p t e d R e s u l t C o n d i t i o n D e s c r i p t i o n _ 9 > + 
+             < P r o m p t e d R e s u l t V i s i b l e _ 1   E l e m e n t T y p e = " C o l u m n "   E l e m e n t I d = " 1 3 9 9 7 0 4 4 1 7 "   D a t a T y p e = " B o o l e a n " > P r o m p t e d R e s u l t V i s i b l e _ 1 < / P r o m p t e d R e s u l t V i s i b l e _ 1 > + 
+             < P r o m p t e d R e s u l t V i s i b l e _ 1 0   E l e m e n t T y p e = " C o l u m n "   E l e m e n t I d = " 6 6 3 6 8 2 6 1 7 "   D a t a T y p e = " B o o l e a n " > P r o m p t e d R e s u l t V i s i b l e _ 1 0 < / P r o m p t e d R e s u l t V i s i b l e _ 1 0 > + 
+             < P r o m p t e d R e s u l t V i s i b l e _ 2   E l e m e n t T y p e = " C o l u m n "   E l e m e n t I d = " 2 0 3 7 4 0 1 0 3 4 "   D a t a T y p e = " B o o l e a n " > P r o m p t e d R e s u l t V i s i b l e _ 2 < / P r o m p t e d R e s u l t V i s i b l e _ 2 > + 
+             < P r o m p t e d R e s u l t V i s i b l e _ 3   E l e m e n t T y p e = " C o l u m n "   E l e m e n t I d = " 1 6 1 9 8 6 9 6 4 5 "   D a t a T y p e = " B o o l e a n " > P r o m p t e d R e s u l t V i s i b l e _ 3 < / P r o m p t e d R e s u l t V i s i b l e _ 3 > + 
+             < P r o m p t e d R e s u l t V i s i b l e _ 4   E l e m e n t T y p e = " C o l u m n "   E l e m e n t I d = " 9 8 2 1 7 3 0 2 8 "   D a t a T y p e = " B o o l e a n " > P r o m p t e d R e s u l t V i s i b l e _ 4 < / P r o m p t e d R e s u l t V i s i b l e _ 4 > + 
+             < P r o m p t e d R e s u l t V i s i b l e _ 5   E l e m e n t T y p e = " C o l u m n "   E l e m e n t I d = " 3 4 4 4 7 6 4 1 1 "   D a t a T y p e = " B o o l e a n " > P r o m p t e d R e s u l t V i s i b l e _ 5 < / P r o m p t e d R e s u l t V i s i b l e _ 5 > + 
+             < P r o m p t e d R e s u l t V i s i b l e _ 6   E l e m e n t T y p e = " C o l u m n "   E l e m e n t I d = " 2 9 3 2 2 0 2 0 6 "   D a t a T y p e = " B o o l e a n " > P r o m p t e d R e s u l t V i s i b l e _ 6 < / P r o m p t e d R e s u l t V i s i b l e _ 6 > + 
+             < P r o m p t e d R e s u l t V i s i b l e _ 7   E l e m e n t T y p e = " C o l u m n "   E l e m e n t I d = " 9 3 0 9 1 6 8 2 3 "   D a t a T y p e = " B o o l e a n " > P r o m p t e d R e s u l t V i s i b l e _ 7 < / P r o m p t e d R e s u l t V i s i b l e _ 7 > + 
+             < P r o m p t e d R e s u l t V i s i b l e _ 8   E l e m e n t T y p e = " C o l u m n "   E l e m e n t I d = " 4 4 5 9 7 8 4 0 "   D a t a T y p e = " B o o l e a n " > P r o m p t e d R e s u l t V i s i b l e _ 8 < / P r o m p t e d R e s u l t V i s i b l e _ 8 > + 
+             < P r o m p t e d R e s u l t V i s i b l e _ 9   E l e m e n t T y p e = " C o l u m n "   E l e m e n t I d = " 5 9 3 0 9 8 7 7 7 "   D a t a T y p e = " B o o l e a n " > P r o m p t e d R e s u l t V i s i b l e _ 9 < / P r o m p t e d R e s u l t V i s i b l e _ 9 > + 
+             < T e s t _ R e s u l t   E l e m e n t T y p e = " C o l u m n "   E l e m e n t I d = " 1 2 7 1 0 6 2 1 4 1 "   D a t a T y p e = " C o d e " > T e s t _ R e s u l t < / T e s t _ R e s u l t > + 
+             < T e s t _ R e s u l t D e s c r i p t i o n   E l e m e n t T y p e = " C o l u m n "   E l e m e n t I d = " 1 9 4 3 4 5 8 6 8 5 "   D a t a T y p e = " T e x t " > T e s t _ R e s u l t D e s c r i p t i o n < / T e s t _ R e s u l t D e s c r i p t i o n > + 
+             < T e s t _ V a l u e   E l e m e n t T y p e = " C o l u m n "   E l e m e n t I d = " 8 1 3 5 6 4 5 2 1 "   D a t a T y p e = " T e x t " > T e s t _ V a l u e < / T e s t _ V a l u e > + 
+             < W o r d D e s c r i p t i o n   E l e m e n t T y p e = " C o l u m n "   E l e m e n t I d = " 5 4 4 0 8 2 0 6 7 "   D a t a T y p e = " T e x t " > W o r d D e s c r i p t i o n < / W o r d D e s c r i p t i o n > + 
+             < W o r d R e s u l t D e s c r i p t i o n   E l e m e n t T y p e = " C o l u m n "   E l e m e n t I d = " 1 8 0 3 6 6 7 3 7 2 "   D a t a T y p e = " T e x t " > W o r d R e s u l t D e s c r i p t i o n < / W o r d R e s u l t D e s c r i p t i o n > + 
+             < W o r d U n f a v o r a b l e R e s u l t D e s c r i p t i o n   E l e m e n t T y p e = " C o l u m n "   E l e m e n t I d = " 1 9 9 9 9 7 2 3 5 3 "   D a t a T y p e = " T e x t " > W o r d U n f a v o r a b l e R e s u l t D e s c r i p t i o n < / W o r d U n f a v o r a b l e R e s u l t D e s c r i p t i o n > + 
+         < / C u r r e n t I n s p e c t i o n L i n e > + 
+     < / C u r r e n t I n s p e c t i o n > + 
+ < / N a v W o r d R e p o r t X m l P a r t > 
+</file>
+
+<file path=customXml/item2.xml>��< ? x m l   v e r s i o n = " 1 . 0 "   e n c o d i n g = " u t f - 1 6 " ? > + 
+ < N a v W o r d R e p o r t X m l P a r t   x m l n s = " u r n : m i c r o s o f t - d y n a m i c s - n a v / r e p o r t s / Q l t y _ C e r t i f i c a t e _ o f _ A n a l y s i s / 2 0 4 0 1 / " > + 
+     < B C R e p o r t I n f o r m a t i o n > + 
+         < R e p o r t M e t a d a t a > + 
+             < E x t e n s i o n I d > E x t e n s i o n   I D < / E x t e n s i o n I d > + 
+             < E x t e n s i o n N a m e > E x t e n s i o n   N a m e < / E x t e n s i o n N a m e > + 
+             < E x t e n s i o n P u b l i s h e r > E x t e n s i o n   P u b l i s h e r < / E x t e n s i o n P u b l i s h e r > + 
+             < E x t e n s i o n V e r s i o n > E x t e n s i o n   V e r s i o n < / E x t e n s i o n V e r s i o n > + 
+             < R e p o r t I d > R e p o r t   I D < / R e p o r t I d > + 
+             < R e p o r t N a m e > R e p o r t   N a m e < / R e p o r t N a m e > + 
+             < A b o u t T h i s R e p o r t T i t l e > A b o u t   T h i s   R e p o r t   T i t l e < / A b o u t T h i s R e p o r t T i t l e > + 
+             < A b o u t T h i s R e p o r t T e x t > A b o u t   T h i s   R e p o r t   T e x t < / A b o u t T h i s R e p o r t T e x t > + 
+             < R e p o r t H e l p L i n k > R e p o r t   H e l p   L i n k < / R e p o r t H e l p L i n k > + 
+         < / R e p o r t M e t a d a t a > + 
+         < R e p o r t R e q u e s t > + 
+             < T e n a n t E n t r a I d > T e n a n t   E n t r a   I d < / T e n a n t E n t r a I d > + 
+             < E n v i r o n m e n t N a m e > E n v i r o n m e n t   N a m e < / E n v i r o n m e n t N a m e > + 
+             < E n v i r o n m e n t T y p e > E n v i r o n m e n t   T y p e < / E n v i r o n m e n t T y p e > + 
+             < C o m p a n y N a m e > C o m p a n y   N a m e < / C o m p a n y N a m e > + 
+             < C o m p a n y D i s p l a y N a m e > C o m p a n y   D i s p l a y   N a m e < / C o m p a n y D i s p l a y N a m e > + 
+             < C o m p a n y I d > C o m p a n y   I D < / C o m p a n y I d > + 
+             < U s e r N a m e > U s e r   N a m e < / U s e r N a m e > + 
+             < D a t e A n d T i m e > D a t e   a n d   T i m e < / D a t e A n d T i m e > + 
+             < L a n g u a g e > L a n g u a g e < / L a n g u a g e > + 
+             < F o r m a t R e g i o n > F o r m a t   R e g i o n < / F o r m a t R e g i o n > + 
+             < D a t e T i m e V a l u e s > + 
+                 < Y e a r > Y e a r < / Y e a r > + 
+                 < M o n t h N u m b e r > M o n t h   N u m b e r < / M o n t h N u m b e r > + 
+                 < D a y N u m b e r > D a y   N u m b e r < / D a y N u m b e r > + 
+                 < H o u r > H o u r < / H o u r > + 
+                 < M i n u t e > M i n u t e < / M i n u t e > + 
+             < / D a t e T i m e V a l u e s > + 
+         < / R e p o r t R e q u e s t > + 
+     < / B C R e p o r t I n f o r m a t i o n > + 
+     < L a b e l s > + 
+         < C o n d i t i o n L a b e l > C o n d i t i o n L a b e l < / C o n d i t i o n L a b e l > + 
+         < D a t e L a b e l > D a t e L a b e l < / D a t e L a b e l > + 
+         < F i n i s h e d B y L a b e l > F i n i s h e d B y L a b e l < / F i n i s h e d B y L a b e l > + 
+         < F i n i s h e d O n L a b e l > F i n i s h e d O n L a b e l < / F i n i s h e d O n L a b e l > + 
+         < I n s p e c t i o n L a b e l > I n s p e c t i o n L a b e l < / I n s p e c t i o n L a b e l > + 
+         < I t e m L a b e l > I t e m L a b e l < / I t e m L a b e l > + 
+         < I t e m T r a c k i n g L a b e l > I t e m T r a c k i n g L a b e l < / I t e m T r a c k i n g L a b e l > + 
+         < P a g e L a b e l > P a g e L a b e l < / P a g e L a b e l > + 
+         < R e p o r t T i t l e L a b e l > R e p o r t T i t l e L a b e l < / R e p o r t T i t l e L a b e l > + 
+         < R e s u l t L a b e l > R e s u l t L a b e l < / R e s u l t L a b e l > + 
+         < T e s t L a b e l > T e s t L a b e l < / T e s t L a b e l > + 
+         < T e s t V a l u e L a b e l > T e s t V a l u e L a b e l < / T e s t V a l u e L a b e l > + 
+     < / L a b e l s > + 
+     < C u r r e n t I n s p e c t i o n > + 
+         < A p p r o v e r N a m e L a b e l > A p p r o v e r N a m e L a b e l < / A p p r o v e r N a m e L a b e l > + 
+         < A p p r o v e r S i g n a t u r e L a b e l > A p p r o v e r S i g n a t u r e L a b e l < / A p p r o v e r S i g n a t u r e L a b e l > + 
+         < C O A C o n t a c t _ A l l > C O A C o n t a c t _ A l l < / C O A C o n t a c t _ A l l > + 
+         < C O A C o n t a c t _ R o w 1 > C O A C o n t a c t _ R o w 1 < / C O A C o n t a c t _ R o w 1 > + 
+         < C O A C o n t a c t _ R o w 2 > C O A C o n t a c t _ R o w 2 < / C O A C o n t a c t _ R o w 2 > + 
+         < C O A C o n t a c t _ R o w 3 > C O A C o n t a c t _ R o w 3 < / C O A C o n t a c t _ R o w 3 > + 
+         < C O A C o n t a c t _ R o w 4 > C O A C o n t a c t _ R o w 4 < / C O A C o n t a c t _ R o w 4 > + 
+         < C O A C o n t a c t _ R o w 5 > C O A C o n t a c t _ R o w 5 < / C O A C o n t a c t _ R o w 5 > + 
+         < C O A C o n t a c t _ R o w 6 > C O A C o n t a c t _ R o w 6 < / C O A C o n t a c t _ R o w 6 > + 
+         < C O A C o n t a c t _ R o w 7 > C O A C o n t a c t _ R o w 7 < / C O A C o n t a c t _ R o w 7 > + 
+         < C O A C o n t a c t _ R o w 8 > C O A C o n t a c t _ R o w 8 < / C O A C o n t a c t _ R o w 8 > + 
+         < C o m p a n y I n f o r m a t i o n _ A l l > C o m p a n y I n f o r m a t i o n _ A l l < / C o m p a n y I n f o r m a t i o n _ A l l > + 
+         < C o m p a n y I n f o r m a t i o n _ R o w 1 > C o m p a n y I n f o r m a t i o n _ R o w 1 < / C o m p a n y I n f o r m a t i o n _ R o w 1 > + 
+         < C o m p a n y I n f o r m a t i o n _ R o w 2 > C o m p a n y I n f o r m a t i o n _ R o w 2 < / C o m p a n y I n f o r m a t i o n _ R o w 2 > + 
+         < C o m p a n y I n f o r m a t i o n _ R o w 3 > C o m p a n y I n f o r m a t i o n _ R o w 3 < / C o m p a n y I n f o r m a t i o n _ R o w 3 > + 
+         < C o m p a n y I n f o r m a t i o n _ R o w 4 > C o m p a n y I n f o r m a t i o n _ R o w 4 < / C o m p a n y I n f o r m a t i o n _ R o w 4 > + 
+         < C o m p a n y I n f o r m a t i o n _ R o w 5 > C o m p a n y I n f o r m a t i o n _ R o w 5 < / C o m p a n y I n f o r m a t i o n _ R o w 5 > + 
+         < C o m p a n y I n f o r m a t i o n _ R o w 6 > C o m p a n y I n f o r m a t i o n _ R o w 6 < / C o m p a n y I n f o r m a t i o n _ R o w 6 > + 
+         < C o m p a n y I n f o r m a t i o n _ R o w 7 > C o m p a n y I n f o r m a t i o n _ R o w 7 < / C o m p a n y I n f o r m a t i o n _ R o w 7 > + 
+         < C o m p a n y I n f o r m a t i o n _ R o w 8 > C o m p a n y I n f o r m a t i o n _ R o w 8 < / C o m p a n y I n f o r m a t i o n _ R o w 8 > + 
+         < C o m p a n y L o g o   / > + 
+         < E m a i l L a b e l > E m a i l L a b e l < / E m a i l L a b e l > + 
+         < E m a i l V a l u e > E m a i l V a l u e < / E m a i l V a l u e > + 
+         < F i n i s h e d B y N a m e L a b e l > F i n i s h e d B y N a m e L a b e l < / F i n i s h e d B y N a m e L a b e l > + 
+         < F i n i s h e d B y S i g n a t u r e L a b e l > F i n i s h e d B y S i g n a t u r e L a b e l < / F i n i s h e d B y S i g n a t u r e L a b e l > + 
+         < H o m e P a g e L a b e l > H o m e P a g e L a b e l < / H o m e P a g e L a b e l > + 
+         < H o m e P a g e V a l u e > H o m e P a g e V a l u e < / H o m e P a g e V a l u e > + 
+         < I n s p e c t i o n I n f o r m a t i o n > I n s p e c t i o n I n f o r m a t i o n < / I n s p e c t i o n I n f o r m a t i o n > + 
+         < I t e m D e s c r i p t i o n > I t e m D e s c r i p t i o n < / I t e m D e s c r i p t i o n > + 
+         < I t e m T r a c k i n g D e s c r i p t i o n > I t e m T r a c k i n g D e s c r i p t i o n < / I t e m T r a c k i n g D e s c r i p t i o n > + 
+         < P h o n e N o L a b e l > P h o n e N o L a b e l < / P h o n e N o L a b e l > + 
+         < P h o n e N o V a l u e > P h o n e N o V a l u e < / P h o n e N o V a l u e > + 
+         < Q l t y I n s p e c t i o n T e m p l a t e _ D e s c r i p t i o n > Q l t y I n s p e c t i o n T e m p l a t e _ D e s c r i p t i o n < / Q l t y I n s p e c t i o n T e m p l a t e _ D e s c r i p t i o n > + 
+         < Q l t y I n s p e c t i o n _ D e s c r i p t i o n > Q l t y I n s p e c t i o n _ D e s c r i p t i o n < / Q l t y I n s p e c t i o n _ D e s c r i p t i o n > + 
+         < Q l t y I n s p e c t i o n _ D i r e c t o r _ N a m e > Q l t y I n s p e c t i o n _ D i r e c t o r _ N a m e < / Q l t y I n s p e c t i o n _ D i r e c t o r _ N a m e > + 
+         < Q l t y I n s p e c t i o n _ D i r e c t o r _ T i t l e > Q l t y I n s p e c t i o n _ D i r e c t o r _ T i t l e < / Q l t y I n s p e c t i o n _ D i r e c t o r _ T i t l e > + 
+         < Q l t y I n s p e c t i o n _ F i n i s h e d _ B y _ E m a i l > Q l t y I n s p e c t i o n _ F i n i s h e d _ B y _ E m a i l < / Q l t y I n s p e c t i o n _ F i n i s h e d _ B y _ E m a i l > + 
+         < Q l t y I n s p e c t i o n _ F i n i s h e d _ B y _ P h o n e > Q l t y I n s p e c t i o n _ F i n i s h e d _ B y _ P h o n e < / Q l t y I n s p e c t i o n _ F i n i s h e d _ B y _ P h o n e > + 
+         < Q l t y I n s p e c t i o n _ F i n i s h e d _ B y _ T i t l e > Q l t y I n s p e c t i o n _ F i n i s h e d _ B y _ T i t l e < / Q l t y I n s p e c t i o n _ F i n i s h e d _ B y _ T i t l e > + 
+         < Q l t y I n s p e c t i o n _ F i n i s h e d _ B y _ U s e r N a m e > Q l t y I n s p e c t i o n _ F i n i s h e d _ B y _ U s e r N a m e < / Q l t y I n s p e c t i o n _ F i n i s h e d _ B y _ U s e r N a m e > + 
+         < Q l t y I n s p e c t i o n _ F i n i s h e d _ B y _ U s e r _ I D > Q l t y I n s p e c t i o n _ F i n i s h e d _ B y _ U s e r _ I D < / Q l t y I n s p e c t i o n _ F i n i s h e d _ B y _ U s e r _ I D > + 
+         < Q l t y I n s p e c t i o n _ F i n i s h e d _ D a t e > Q l t y I n s p e c t i o n _ F i n i s h e d _ D a t e < / Q l t y I n s p e c t i o n _ F i n i s h e d _ D a t e > + 
+         < Q l t y I n s p e c t i o n _ N o > Q l t y I n s p e c t i o n _ N o < / Q l t y I n s p e c t i o n _ N o > + 
+         < Q l t y I n s p e c t i o n _ R e i n s p e c t i o n N o > Q l t y I n s p e c t i o n _ R e i n s p e c t i o n N o < / Q l t y I n s p e c t i o n _ R e i n s p e c t i o n N o > + 
+         < Q l t y I n s p e c t i o n _ R e s u l t _ C o d e > Q l t y I n s p e c t i o n _ R e s u l t _ C o d e < / Q l t y I n s p e c t i o n _ R e s u l t _ C o d e > + 
+         < Q l t y I n s p e c t i o n _ R e s u l t _ D e s c r i p t i o n > Q l t y I n s p e c t i o n _ R e s u l t _ D e s c r i p t i o n < / Q l t y I n s p e c t i o n _ R e s u l t _ D e s c r i p t i o n > + 
+         < Q l t y I n s p e c t i o n _ S o u r c e _ C u s t o m _ 1 > Q l t y I n s p e c t i o n _ S o u r c e _ C u s t o m _ 1 < / Q l t y I n s p e c t i o n _ S o u r c e _ C u s t o m _ 1 > + 
+         < Q l t y I n s p e c t i o n _ S o u r c e _ C u s t o m _ 1 0 > Q l t y I n s p e c t i o n _ S o u r c e _ C u s t o m _ 1 0 < / Q l t y I n s p e c t i o n _ S o u r c e _ C u s t o m _ 1 0 > + 
+         < Q l t y I n s p e c t i o n _ S o u r c e _ C u s t o m _ 2 > Q l t y I n s p e c t i o n _ S o u r c e _ C u s t o m _ 2 < / Q l t y I n s p e c t i o n _ S o u r c e _ C u s t o m _ 2 > + 
+         < Q l t y I n s p e c t i o n _ S o u r c e _ C u s t o m _ 3 > Q l t y I n s p e c t i o n _ S o u r c e _ C u s t o m _ 3 < / Q l t y I n s p e c t i o n _ S o u r c e _ C u s t o m _ 3 > + 
+         < Q l t y I n s p e c t i o n _ S o u r c e _ C u s t o m _ 4 > Q l t y I n s p e c t i o n _ S o u r c e _ C u s t o m _ 4 < / Q l t y I n s p e c t i o n _ S o u r c e _ C u s t o m _ 4 > + 
+         < Q l t y I n s p e c t i o n _ S o u r c e _ C u s t o m _ 5 > Q l t y I n s p e c t i o n _ S o u r c e _ C u s t o m _ 5 < / Q l t y I n s p e c t i o n _ S o u r c e _ C u s t o m _ 5 > + 
+         < Q l t y I n s p e c t i o n _ S o u r c e _ C u s t o m _ 6 > Q l t y I n s p e c t i o n _ S o u r c e _ C u s t o m _ 6 < / Q l t y I n s p e c t i o n _ S o u r c e _ C u s t o m _ 6 > + 
+         < Q l t y I n s p e c t i o n _ S o u r c e _ C u s t o m _ 7 > Q l t y I n s p e c t i o n _ S o u r c e _ C u s t o m _ 7 < / Q l t y I n s p e c t i o n _ S o u r c e _ C u s t o m _ 7 > + 
+         < Q l t y I n s p e c t i o n _ S o u r c e _ C u s t o m _ 8 > Q l t y I n s p e c t i o n _ S o u r c e _ C u s t o m _ 8 < / Q l t y I n s p e c t i o n _ S o u r c e _ C u s t o m _ 8 > + 
+         < Q l t y I n s p e c t i o n _ S o u r c e _ C u s t o m _ 9 > Q l t y I n s p e c t i o n _ S o u r c e _ C u s t o m _ 9 < / Q l t y I n s p e c t i o n _ S o u r c e _ C u s t o m _ 9 > + 
+         < Q l t y I n s p e c t i o n _ S o u r c e _ D o c u m e n t _ N o _ > Q l t y I n s p e c t i o n _ S o u r c e _ D o c u m e n t _ N o _ < / Q l t y I n s p e c t i o n _ S o u r c e _ D o c u m e n t _ N o _ > + 
+         < Q l t y I n s p e c t i o n _ S o u r c e _ I t e m _ D e s c r i p t i o n > Q l t y I n s p e c t i o n _ S o u r c e _ I t e m _ D e s c r i p t i o n < / Q l t y I n s p e c t i o n _ S o u r c e _ I t e m _ D e s c r i p t i o n > + 
+         < Q l t y I n s p e c t i o n _ S o u r c e _ I t e m _ D e s c r i p t i o n 2 > Q l t y I n s p e c t i o n _ S o u r c e _ I t e m _ D e s c r i p t i o n 2 < / Q l t y I n s p e c t i o n _ S o u r c e _ I t e m _ D e s c r i p t i o n 2 > + 
+         < Q l t y I n s p e c t i o n _ S o u r c e _ I t e m _ N o _ > Q l t y I n s p e c t i o n _ S o u r c e _ I t e m _ N o _ < / Q l t y I n s p e c t i o n _ S o u r c e _ I t e m _ N o _ > + 
+         < Q l t y I n s p e c t i o n _ S o u r c e _ L o t _ N o _ > Q l t y I n s p e c t i o n _ S o u r c e _ L o t _ N o _ < / Q l t y I n s p e c t i o n _ S o u r c e _ L o t _ N o _ > + 
+         < Q l t y I n s p e c t i o n _ S o u r c e _ P a c k a g e _ N o _ > Q l t y I n s p e c t i o n _ S o u r c e _ P a c k a g e _ N o _ < / Q l t y I n s p e c t i o n _ S o u r c e _ P a c k a g e _ N o _ > + 
+         < Q l t y I n s p e c t i o n _ S o u r c e _ S e r i a l _ N o _ > Q l t y I n s p e c t i o n _ S o u r c e _ S e r i a l _ N o _ < / Q l t y I n s p e c t i o n _ S o u r c e _ S e r i a l _ N o _ > + 
+         < Q l t y I n s p e c t i o n _ S o u r c e _ T a s k _ N o _ > Q l t y I n s p e c t i o n _ S o u r c e _ T a s k _ N o _ < / Q l t y I n s p e c t i o n _ S o u r c e _ T a s k _ N o _ > + 
+         < Q l t y I n s p e c t i o n _ S o u r c e _ V a r i a n t _ C o d e > Q l t y I n s p e c t i o n _ S o u r c e _ V a r i a n t _ C o d e < / Q l t y I n s p e c t i o n _ S o u r c e _ V a r i a n t _ C o d e > + 
+         < Q l t y I n s p e c t i o n _ S t a t u s > Q l t y I n s p e c t i o n _ S t a t u s < / Q l t y I n s p e c t i o n _ S t a t u s > + 
+         < R e i n s p e c t i o n S e q u e n c e I n f o r m a t i o n > R e i n s p e c t i o n S e q u e n c e I n f o r m a t i o n < / R e i n s p e c t i o n S e q u e n c e I n f o r m a t i o n > + 
+         < C u r r e n t I n s p e c t i o n L i n e > + 
+             < C o n d i t i o n L a b e l _ 1 > C o n d i t i o n L a b e l _ 1 < / C o n d i t i o n L a b e l _ 1 > + 
+             < C o n d i t i o n L a b e l _ 2 > C o n d i t i o n L a b e l _ 2 < / C o n d i t i o n L a b e l _ 2 > + 
+             < F i e l d _ C o d e > F i e l d _ C o d e < / F i e l d _ C o d e > + 
+             < F i e l d _ D e s c r i p t i o n > F i e l d _ D e s c r i p t i o n < / F i e l d _ D e s c r i p t i o n > + 
+             < F i e l d _ H a s E n t e r e d V a l u e > F i e l d _ H a s E n t e r e d V a l u e < / F i e l d _ H a s E n t e r e d V a l u e > + 
+             < F i e l d _ I f P e r s o n E m a i l > F i e l d _ I f P e r s o n E m a i l < / F i e l d _ I f P e r s o n E m a i l > + 
+             < F i e l d _ I f P e r s o n N a m e > F i e l d _ I f P e r s o n N a m e < / F i e l d _ I f P e r s o n N a m e > + 
+             < F i e l d _ I f P e r s o n P h o n e > F i e l d _ I f P e r s o n P h o n e < / F i e l d _ I f P e r s o n P h o n e > + 
+             < F i e l d _ I f P e r s o n T i t l e > F i e l d _ I f P e r s o n T i t l e < / F i e l d _ I f P e r s o n T i t l e > + 
+             < F i e l d _ I s L a b e l > F i e l d _ I s L a b e l < / F i e l d _ I s L a b e l > + 
+             < F i e l d _ I s P e r s o n F i e l d > F i e l d _ I s P e r s o n F i e l d < / F i e l d _ I s P e r s o n F i e l d > + 
+             < F i e l d _ I s T e x t > F i e l d _ I s T e x t < / F i e l d _ I s T e x t > + 
+             < F i e l d _ L i n e C o m m e n t a r y > F i e l d _ L i n e C o m m e n t a r y < / F i e l d _ L i n e C o m m e n t a r y > + 
+             < F i e l d _ M o d i f i e d B y U s e r E m a i l > F i e l d _ M o d i f i e d B y U s e r E m a i l < / F i e l d _ M o d i f i e d B y U s e r E m a i l > + 
+             < F i e l d _ M o d i f i e d B y U s e r I D > F i e l d _ M o d i f i e d B y U s e r I D < / F i e l d _ M o d i f i e d B y U s e r I D > + 
+             < F i e l d _ M o d i f i e d B y U s e r J o b T i t l e > F i e l d _ M o d i f i e d B y U s e r J o b T i t l e < / F i e l d _ M o d i f i e d B y U s e r J o b T i t l e > + 
+             < F i e l d _ M o d i f i e d B y U s e r N a m e > F i e l d _ M o d i f i e d B y U s e r N a m e < / F i e l d _ M o d i f i e d B y U s e r N a m e > + 
+             < F i e l d _ M o d i f i e d B y U s e r P h o n e > F i e l d _ M o d i f i e d B y U s e r P h o n e < / F i e l d _ M o d i f i e d B y U s e r P h o n e > + 
+             < F i e l d _ M o d i f i e d D a t e T i m e > F i e l d _ M o d i f i e d D a t e T i m e < / F i e l d _ M o d i f i e d D a t e T i m e > + 
+             < F i e l d _ T y p e > F i e l d _ T y p e < / F i e l d _ T y p e > + 
+             < L a b e l F i e l d _ D e s c r i p t i o n > L a b e l F i e l d _ D e s c r i p t i o n < / L a b e l F i e l d _ D e s c r i p t i o n > + 
+             < N u m e r i c _ V a l u e > N u m e r i c _ V a l u e < / N u m e r i c _ V a l u e > + 
+             < P r o m p t e d R e s u l t C a p t i o n _ 1 > P r o m p t e d R e s u l t C a p t i o n _ 1 < / P r o m p t e d R e s u l t C a p t i o n _ 1 > + 
+             < P r o m p t e d R e s u l t C a p t i o n _ 1 0 > P r o m p t e d R e s u l t C a p t i o n _ 1 0 < / P r o m p t e d R e s u l t C a p t i o n _ 1 0 > + 
+             < P r o m p t e d R e s u l t C a p t i o n _ 2 > P r o m p t e d R e s u l t C a p t i o n _ 2 < / P r o m p t e d R e s u l t C a p t i o n _ 2 > + 
+             < P r o m p t e d R e s u l t C a p t i o n _ 3 > P r o m p t e d R e s u l t C a p t i o n _ 3 < / P r o m p t e d R e s u l t C a p t i o n _ 3 > + 
+             < P r o m p t e d R e s u l t C a p t i o n _ 4 > P r o m p t e d R e s u l t C a p t i o n _ 4 < / P r o m p t e d R e s u l t C a p t i o n _ 4 > + 
+             < P r o m p t e d R e s u l t C a p t i o n _ 5 > P r o m p t e d R e s u l t C a p t i o n _ 5 < / P r o m p t e d R e s u l t C a p t i o n _ 5 > + 
+             < P r o m p t e d R e s u l t C a p t i o n _ 6 > P r o m p t e d R e s u l t C a p t i o n _ 6 < / P r o m p t e d R e s u l t C a p t i o n _ 6 > + 
+             < P r o m p t e d R e s u l t C a p t i o n _ 7 > P r o m p t e d R e s u l t C a p t i o n _ 7 < / P r o m p t e d R e s u l t C a p t i o n _ 7 > + 
+             < P r o m p t e d R e s u l t C a p t i o n _ 8 > P r o m p t e d R e s u l t C a p t i o n _ 8 < / P r o m p t e d R e s u l t C a p t i o n _ 8 > + 
+             < P r o m p t e d R e s u l t C a p t i o n _ 9 > P r o m p t e d R e s u l t C a p t i o n _ 9 < / P r o m p t e d R e s u l t C a p t i o n _ 9 > + 
+             < P r o m p t e d R e s u l t C o n d i t i o n D e s c r i p t i o n _ 1 > P r o m p t e d R e s u l t C o n d i t i o n D e s c r i p t i o n _ 1 < / P r o m p t e d R e s u l t C o n d i t i o n D e s c r i p t i o n _ 1 > + 
+             < P r o m p t e d R e s u l t C o n d i t i o n D e s c r i p t i o n _ 1 0 > P r o m p t e d R e s u l t C o n d i t i o n D e s c r i p t i o n _ 1 0 < / P r o m p t e d R e s u l t C o n d i t i o n D e s c r i p t i o n _ 1 0 > + 
+             < P r o m p t e d R e s u l t C o n d i t i o n D e s c r i p t i o n _ 2 > P r o m p t e d R e s u l t C o n d i t i o n D e s c r i p t i o n _ 2 < / P r o m p t e d R e s u l t C o n d i t i o n D e s c r i p t i o n _ 2 > + 
+             < P r o m p t e d R e s u l t C o n d i t i o n D e s c r i p t i o n _ 3 > P r o m p t e d R e s u l t C o n d i t i o n D e s c r i p t i o n _ 3 < / P r o m p t e d R e s u l t C o n d i t i o n D e s c r i p t i o n _ 3 > + 
+             < P r o m p t e d R e s u l t C o n d i t i o n D e s c r i p t i o n _ 4 > P r o m p t e d R e s u l t C o n d i t i o n D e s c r i p t i o n _ 4 < / P r o m p t e d R e s u l t C o n d i t i o n D e s c r i p t i o n _ 4 > + 
+             < P r o m p t e d R e s u l t C o n d i t i o n D e s c r i p t i o n _ 5 > P r o m p t e d R e s u l t C o n d i t i o n D e s c r i p t i o n _ 5 < / P r o m p t e d R e s u l t C o n d i t i o n D e s c r i p t i o n _ 5 > + 
+             < P r o m p t e d R e s u l t C o n d i t i o n D e s c r i p t i o n _ 6 > P r o m p t e d R e s u l t C o n d i t i o n D e s c r i p t i o n _ 6 < / P r o m p t e d R e s u l t C o n d i t i o n D e s c r i p t i o n _ 6 > + 
+             < P r o m p t e d R e s u l t C o n d i t i o n D e s c r i p t i o n _ 7 > P r o m p t e d R e s u l t C o n d i t i o n D e s c r i p t i o n _ 7 < / P r o m p t e d R e s u l t C o n d i t i o n D e s c r i p t i o n _ 7 > + 
+             < P r o m p t e d R e s u l t C o n d i t i o n D e s c r i p t i o n _ 8 > P r o m p t e d R e s u l t C o n d i t i o n D e s c r i p t i o n _ 8 < / P r o m p t e d R e s u l t C o n d i t i o n D e s c r i p t i o n _ 8 > + 
+             < P r o m p t e d R e s u l t C o n d i t i o n D e s c r i p t i o n _ 9 > P r o m p t e d R e s u l t C o n d i t i o n D e s c r i p t i o n _ 9 < / P r o m p t e d R e s u l t C o n d i t i o n D e s c r i p t i o n _ 9 > + 
+             < P r o m p t e d R e s u l t V i s i b l e _ 1 > P r o m p t e d R e s u l t V i s i b l e _ 1 < / P r o m p t e d R e s u l t V i s i b l e _ 1 > + 
+             < P r o m p t e d R e s u l t V i s i b l e _ 1 0 > P r o m p t e d R e s u l t V i s i b l e _ 1 0 < / P r o m p t e d R e s u l t V i s i b l e _ 1 0 > + 
+             < P r o m p t e d R e s u l t V i s i b l e _ 2 > P r o m p t e d R e s u l t V i s i b l e _ 2 < / P r o m p t e d R e s u l t V i s i b l e _ 2 > + 
+             < P r o m p t e d R e s u l t V i s i b l e _ 3 > P r o m p t e d R e s u l t V i s i b l e _ 3 < / P r o m p t e d R e s u l t V i s i b l e _ 3 > + 
+             < P r o m p t e d R e s u l t V i s i b l e _ 4 > P r o m p t e d R e s u l t V i s i b l e _ 4 < / P r o m p t e d R e s u l t V i s i b l e _ 4 > + 
+             < P r o m p t e d R e s u l t V i s i b l e _ 5 > P r o m p t e d R e s u l t V i s i b l e _ 5 < / P r o m p t e d R e s u l t V i s i b l e _ 5 > + 
+             < P r o m p t e d R e s u l t V i s i b l e _ 6 > P r o m p t e d R e s u l t V i s i b l e _ 6 < / P r o m p t e d R e s u l t V i s i b l e _ 6 > + 
+             < P r o m p t e d R e s u l t V i s i b l e _ 7 > P r o m p t e d R e s u l t V i s i b l e _ 7 < / P r o m p t e d R e s u l t V i s i b l e _ 7 > + 
+             < P r o m p t e d R e s u l t V i s i b l e _ 8 > P r o m p t e d R e s u l t V i s i b l e _ 8 < / P r o m p t e d R e s u l t V i s i b l e _ 8 > + 
+             < P r o m p t e d R e s u l t V i s i b l e _ 9 > P r o m p t e d R e s u l t V i s i b l e _ 9 < / P r o m p t e d R e s u l t V i s i b l e _ 9 > + 
+             < T e s t _ R e s u l t > T e s t _ R e s u l t < / T e s t _ R e s u l t > + 
+             < T e s t _ R e s u l t D e s c r i p t i o n > T e s t _ R e s u l t D e s c r i p t i o n < / T e s t _ R e s u l t D e s c r i p t i o n > + 
+             < T e s t _ V a l u e > T e s t _ V a l u e < / T e s t _ V a l u e > + 
+             < W o r d D e s c r i p t i o n > W o r d D e s c r i p t i o n < / W o r d D e s c r i p t i o n > + 
+             < W o r d R e s u l t D e s c r i p t i o n > W o r d R e s u l t D e s c r i p t i o n < / W o r d R e s u l t D e s c r i p t i o n > + 
+             < W o r d U n f a v o r a b l e R e s u l t D e s c r i p t i o n > W o r d U n f a v o r a b l e R e s u l t D e s c r i p t i o n < / W o r d U n f a v o r a b l e R e s u l t D e s c r i p t i o n > + 
+         < / C u r r e n t I n s p e c t i o n L i n e > + 
+     < / C u r r e n t I n s p e c t i o n > + 
+ < / N a v W o r d R e p o r t X m l P a r t > 
+</file>
+
+<file path=customXml/item3.xml><?xml version="1.0" encoding="utf-8"?>
 <b:Sources xmlns:b="http://schemas.openxmlformats.org/officeDocument/2006/bibliography" xmlns="http://schemas.openxmlformats.org/officeDocument/2006/bibliography" SelectedStyle="\APASixthEditionOfficeOnline.xsl" StyleName="APA" Version="6"/>
 </file>
 
-<file path=customXml/item2.xml>��< ? x m l   v e r s i o n = " 1 . 0 "   e n c o d i n g = " u t f - 1 6 " ? > - 
- < N a v W o r d R e p o r t X m l P a r t   x m l n s = " u r n : m i c r o s o f t - d y n a m i c s - n a v / r e p o r t s / Q l t y _ C e r t i f i c a t e _ o f _ A n a l y s i s / 2 0 4 0 1 / " > - 
-     < B C R e p o r t I n f o r m a t i o n > - 
-         < R e p o r t M e t a d a t a > - 
-             < E x t e n s i o n I d > E x t e n s i o n   I D < / E x t e n s i o n I d > - 
-             < E x t e n s i o n N a m e > E x t e n s i o n   N a m e < / E x t e n s i o n N a m e > - 
-             < E x t e n s i o n P u b l i s h e r > E x t e n s i o n   P u b l i s h e r < / E x t e n s i o n P u b l i s h e r > - 
-             < E x t e n s i o n V e r s i o n > E x t e n s i o n   V e r s i o n < / E x t e n s i o n V e r s i o n > - 
-             < R e p o r t I d > R e p o r t   I D < / R e p o r t I d > - 
-             < R e p o r t N a m e > R e p o r t   N a m e < / R e p o r t N a m e > - 
-             < A b o u t T h i s R e p o r t T i t l e > A b o u t   T h i s   R e p o r t   T i t l e < / A b o u t T h i s R e p o r t T i t l e > - 
-             < A b o u t T h i s R e p o r t T e x t > A b o u t   T h i s   R e p o r t   T e x t < / A b o u t T h i s R e p o r t T e x t > - 
-             < R e p o r t H e l p L i n k > R e p o r t   H e l p   L i n k < / R e p o r t H e l p L i n k > - 
-         < / R e p o r t M e t a d a t a > - 
-         < R e p o r t R e q u e s t > - 
-             < T e n a n t E n t r a I d > T e n a n t   E n t r a   I d < / T e n a n t E n t r a I d > - 
-             < E n v i r o n m e n t N a m e > E n v i r o n m e n t   N a m e < / E n v i r o n m e n t N a m e > - 
-             < E n v i r o n m e n t T y p e > E n v i r o n m e n t   T y p e < / E n v i r o n m e n t T y p e > - 
-             < C o m p a n y N a m e > C o m p a n y   N a m e < / C o m p a n y N a m e > - 
-             < C o m p a n y D i s p l a y N a m e > C o m p a n y   D i s p l a y   N a m e < / C o m p a n y D i s p l a y N a m e > - 
-             < C o m p a n y I d > C o m p a n y   I D < / C o m p a n y I d > - 
-             < U s e r N a m e > U s e r   N a m e < / U s e r N a m e > - 
-             < D a t e A n d T i m e > D a t e   a n d   T i m e < / D a t e A n d T i m e > - 
-             < L a n g u a g e > L a n g u a g e < / L a n g u a g e > - 
-             < F o r m a t R e g i o n > F o r m a t   R e g i o n < / F o r m a t R e g i o n > - 
-             < D a t e T i m e V a l u e s > - 
-                 < Y e a r > Y e a r < / Y e a r > - 
-                 < M o n t h N u m b e r > M o n t h   N u m b e r < / M o n t h N u m b e r > - 
-                 < D a y N u m b e r > D a y   N u m b e r < / D a y N u m b e r > - 
-                 < H o u r > H o u r < / H o u r > - 
-                 < M i n u t e > M i n u t e < / M i n u t e > - 
-             < / D a t e T i m e V a l u e s > - 
-         < / R e p o r t R e q u e s t > - 
-     < / B C R e p o r t I n f o r m a t i o n > - 
-     < L a b e l s > - 
-         < C o n d i t i o n L a b e l > C o n d i t i o n L a b e l < / C o n d i t i o n L a b e l > - 
-         < D a t e L a b e l > D a t e L a b e l < / D a t e L a b e l > - 
-         < F i n i s h e d B y L a b e l > F i n i s h e d B y L a b e l < / F i n i s h e d B y L a b e l > - 
-         < F i n i s h e d O n L a b e l > F i n i s h e d O n L a b e l < / F i n i s h e d O n L a b e l > - 
-         < I n s p e c t i o n L a b e l > I n s p e c t i o n L a b e l < / I n s p e c t i o n L a b e l > - 
-         < I t e m L a b e l > I t e m L a b e l < / I t e m L a b e l > - 
-         < I t e m T r a c k i n g L a b e l > I t e m T r a c k i n g L a b e l < / I t e m T r a c k i n g L a b e l > - 
-         < P a g e L a b e l > P a g e L a b e l < / P a g e L a b e l > - 
-         < R e p o r t T i t l e L a b e l > R e p o r t T i t l e L a b e l < / R e p o r t T i t l e L a b e l > - 
-         < R e s u l t L a b e l > R e s u l t L a b e l < / R e s u l t L a b e l > - 
-         < T e s t L a b e l > T e s t L a b e l < / T e s t L a b e l > - 
-         < T e s t V a l u e L a b e l > T e s t V a l u e L a b e l < / T e s t V a l u e L a b e l > - 
-     < / L a b e l s > - 
-     < C u r r e n t I n s p e c t i o n > - 
-         < A p p r o v e r N a m e L a b e l > A p p r o v e r N a m e L a b e l < / A p p r o v e r N a m e L a b e l > - 
-         < A p p r o v e r S i g n a t u r e L a b e l > A p p r o v e r S i g n a t u r e L a b e l < / A p p r o v e r S i g n a t u r e L a b e l > - 
-         < C O A C o n t a c t _ A l l > C O A C o n t a c t _ A l l < / C O A C o n t a c t _ A l l > - 
-         < C O A C o n t a c t _ R o w 1 > C O A C o n t a c t _ R o w 1 < / C O A C o n t a c t _ R o w 1 > - 
-         < C O A C o n t a c t _ R o w 2 > C O A C o n t a c t _ R o w 2 < / C O A C o n t a c t _ R o w 2 > - 
-         < C O A C o n t a c t _ R o w 3 > C O A C o n t a c t _ R o w 3 < / C O A C o n t a c t _ R o w 3 > - 
-         < C O A C o n t a c t _ R o w 4 > C O A C o n t a c t _ R o w 4 < / C O A C o n t a c t _ R o w 4 > - 
-         < C O A C o n t a c t _ R o w 5 > C O A C o n t a c t _ R o w 5 < / C O A C o n t a c t _ R o w 5 > - 
-         < C O A C o n t a c t _ R o w 6 > C O A C o n t a c t _ R o w 6 < / C O A C o n t a c t _ R o w 6 > - 
-         < C O A C o n t a c t _ R o w 7 > C O A C o n t a c t _ R o w 7 < / C O A C o n t a c t _ R o w 7 > - 
-         < C O A C o n t a c t _ R o w 8 > C O A C o n t a c t _ R o w 8 < / C O A C o n t a c t _ R o w 8 > - 
-         < C o m p a n y I n f o r m a t i o n _ A l l > C o m p a n y I n f o r m a t i o n _ A l l < / C o m p a n y I n f o r m a t i o n _ A l l > - 
-         < C o m p a n y I n f o r m a t i o n _ R o w 1 > C o m p a n y I n f o r m a t i o n _ R o w 1 < / C o m p a n y I n f o r m a t i o n _ R o w 1 > - 
-         < C o m p a n y I n f o r m a t i o n _ R o w 2 > C o m p a n y I n f o r m a t i o n _ R o w 2 < / C o m p a n y I n f o r m a t i o n _ R o w 2 > - 
-         < C o m p a n y I n f o r m a t i o n _ R o w 3 > C o m p a n y I n f o r m a t i o n _ R o w 3 < / C o m p a n y I n f o r m a t i o n _ R o w 3 > - 
-         < C o m p a n y I n f o r m a t i o n _ R o w 4 > C o m p a n y I n f o r m a t i o n _ R o w 4 < / C o m p a n y I n f o r m a t i o n _ R o w 4 > - 
-         < C o m p a n y I n f o r m a t i o n _ R o w 5 > C o m p a n y I n f o r m a t i o n _ R o w 5 < / C o m p a n y I n f o r m a t i o n _ R o w 5 > - 
-         < C o m p a n y I n f o r m a t i o n _ R o w 6 > C o m p a n y I n f o r m a t i o n _ R o w 6 < / C o m p a n y I n f o r m a t i o n _ R o w 6 > - 
-         < C o m p a n y I n f o r m a t i o n _ R o w 7 > C o m p a n y I n f o r m a t i o n _ R o w 7 < / C o m p a n y I n f o r m a t i o n _ R o w 7 > - 
-         < C o m p a n y I n f o r m a t i o n _ R o w 8 > C o m p a n y I n f o r m a t i o n _ R o w 8 < / C o m p a n y I n f o r m a t i o n _ R o w 8 > - 
-         < C o m p a n y L o g o   / > - 
-         < E m a i l L a b e l > E m a i l L a b e l < / E m a i l L a b e l > - 
-         < E m a i l V a l u e > E m a i l V a l u e < / E m a i l V a l u e > - 
-         < F i n i s h e d B y N a m e L a b e l > F i n i s h e d B y N a m e L a b e l < / F i n i s h e d B y N a m e L a b e l > - 
-         < F i n i s h e d B y S i g n a t u r e L a b e l > F i n i s h e d B y S i g n a t u r e L a b e l < / F i n i s h e d B y S i g n a t u r e L a b e l > - 
-         < H o m e P a g e L a b e l > H o m e P a g e L a b e l < / H o m e P a g e L a b e l > - 
-         < H o m e P a g e V a l u e > H o m e P a g e V a l u e < / H o m e P a g e V a l u e > - 
-         < I n s p e c t i o n I n f o r m a t i o n > I n s p e c t i o n I n f o r m a t i o n < / I n s p e c t i o n I n f o r m a t i o n > - 
-         < I t e m D e s c r i p t i o n > I t e m D e s c r i p t i o n < / I t e m D e s c r i p t i o n > - 
-         < I t e m T r a c k i n g D e s c r i p t i o n > I t e m T r a c k i n g D e s c r i p t i o n < / I t e m T r a c k i n g D e s c r i p t i o n > - 
-         < P h o n e N o L a b e l > P h o n e N o L a b e l < / P h o n e N o L a b e l > - 
-         < P h o n e N o V a l u e > P h o n e N o V a l u e < / P h o n e N o V a l u e > - 
-         < Q l t y I n s p e c t i o n T e m p l a t e _ D e s c r i p t i o n > Q l t y I n s p e c t i o n T e m p l a t e _ D e s c r i p t i o n < / Q l t y I n s p e c t i o n T e m p l a t e _ D e s c r i p t i o n > - 
-         < Q l t y I n s p e c t i o n _ D e s c r i p t i o n > Q l t y I n s p e c t i o n _ D e s c r i p t i o n < / Q l t y I n s p e c t i o n _ D e s c r i p t i o n > - 
-         < Q l t y I n s p e c t i o n _ D i r e c t o r _ N a m e > Q l t y I n s p e c t i o n _ D i r e c t o r _ N a m e < / Q l t y I n s p e c t i o n _ D i r e c t o r _ N a m e > - 
-         < Q l t y I n s p e c t i o n _ D i r e c t o r _ T i t l e > Q l t y I n s p e c t i o n _ D i r e c t o r _ T i t l e < / Q l t y I n s p e c t i o n _ D i r e c t o r _ T i t l e > - 
-         < Q l t y I n s p e c t i o n _ F i n i s h e d _ B y _ E m a i l > Q l t y I n s p e c t i o n _ F i n i s h e d _ B y _ E m a i l < / Q l t y I n s p e c t i o n _ F i n i s h e d _ B y _ E m a i l > - 
-         < Q l t y I n s p e c t i o n _ F i n i s h e d _ B y _ P h o n e > Q l t y I n s p e c t i o n _ F i n i s h e d _ B y _ P h o n e < / Q l t y I n s p e c t i o n _ F i n i s h e d _ B y _ P h o n e > - 
-         < Q l t y I n s p e c t i o n _ F i n i s h e d _ B y _ T i t l e > Q l t y I n s p e c t i o n _ F i n i s h e d _ B y _ T i t l e < / Q l t y I n s p e c t i o n _ F i n i s h e d _ B y _ T i t l e > - 
-         < Q l t y I n s p e c t i o n _ F i n i s h e d _ B y _ U s e r N a m e > Q l t y I n s p e c t i o n _ F i n i s h e d _ B y _ U s e r N a m e < / Q l t y I n s p e c t i o n _ F i n i s h e d _ B y _ U s e r N a m e > - 
-         < Q l t y I n s p e c t i o n _ F i n i s h e d _ B y _ U s e r _ I D > Q l t y I n s p e c t i o n _ F i n i s h e d _ B y _ U s e r _ I D < / Q l t y I n s p e c t i o n _ F i n i s h e d _ B y _ U s e r _ I D > - 
-         < Q l t y I n s p e c t i o n _ F i n i s h e d _ D a t e > Q l t y I n s p e c t i o n _ F i n i s h e d _ D a t e < / Q l t y I n s p e c t i o n _ F i n i s h e d _ D a t e > - 
-         < Q l t y I n s p e c t i o n _ N o > Q l t y I n s p e c t i o n _ N o < / Q l t y I n s p e c t i o n _ N o > - 
-         < Q l t y I n s p e c t i o n _ R e i n s p e c t i o n N o > Q l t y I n s p e c t i o n _ R e i n s p e c t i o n N o < / Q l t y I n s p e c t i o n _ R e i n s p e c t i o n N o > - 
-         < Q l t y I n s p e c t i o n _ R e s u l t _ C o d e > Q l t y I n s p e c t i o n _ R e s u l t _ C o d e < / Q l t y I n s p e c t i o n _ R e s u l t _ C o d e > - 
-         < Q l t y I n s p e c t i o n _ R e s u l t _ D e s c r i p t i o n > Q l t y I n s p e c t i o n _ R e s u l t _ D e s c r i p t i o n < / Q l t y I n s p e c t i o n _ R e s u l t _ D e s c r i p t i o n > - 
-         < Q l t y I n s p e c t i o n _ S o u r c e _ C u s t o m _ 1 > Q l t y I n s p e c t i o n _ S o u r c e _ C u s t o m _ 1 < / Q l t y I n s p e c t i o n _ S o u r c e _ C u s t o m _ 1 > - 
-         < Q l t y I n s p e c t i o n _ S o u r c e _ C u s t o m _ 1 0 > Q l t y I n s p e c t i o n _ S o u r c e _ C u s t o m _ 1 0 < / Q l t y I n s p e c t i o n _ S o u r c e _ C u s t o m _ 1 0 > - 
-         < Q l t y I n s p e c t i o n _ S o u r c e _ C u s t o m _ 2 > Q l t y I n s p e c t i o n _ S o u r c e _ C u s t o m _ 2 < / Q l t y I n s p e c t i o n _ S o u r c e _ C u s t o m _ 2 > - 
-         < Q l t y I n s p e c t i o n _ S o u r c e _ C u s t o m _ 3 > Q l t y I n s p e c t i o n _ S o u r c e _ C u s t o m _ 3 < / Q l t y I n s p e c t i o n _ S o u r c e _ C u s t o m _ 3 > - 
-         < Q l t y I n s p e c t i o n _ S o u r c e _ C u s t o m _ 4 > Q l t y I n s p e c t i o n _ S o u r c e _ C u s t o m _ 4 < / Q l t y I n s p e c t i o n _ S o u r c e _ C u s t o m _ 4 > - 
-         < Q l t y I n s p e c t i o n _ S o u r c e _ C u s t o m _ 5 > Q l t y I n s p e c t i o n _ S o u r c e _ C u s t o m _ 5 < / Q l t y I n s p e c t i o n _ S o u r c e _ C u s t o m _ 5 > - 
-         < Q l t y I n s p e c t i o n _ S o u r c e _ C u s t o m _ 6 > Q l t y I n s p e c t i o n _ S o u r c e _ C u s t o m _ 6 < / Q l t y I n s p e c t i o n _ S o u r c e _ C u s t o m _ 6 > - 
-         < Q l t y I n s p e c t i o n _ S o u r c e _ C u s t o m _ 7 > Q l t y I n s p e c t i o n _ S o u r c e _ C u s t o m _ 7 < / Q l t y I n s p e c t i o n _ S o u r c e _ C u s t o m _ 7 > - 
-         < Q l t y I n s p e c t i o n _ S o u r c e _ C u s t o m _ 8 > Q l t y I n s p e c t i o n _ S o u r c e _ C u s t o m _ 8 < / Q l t y I n s p e c t i o n _ S o u r c e _ C u s t o m _ 8 > - 
-         < Q l t y I n s p e c t i o n _ S o u r c e _ C u s t o m _ 9 > Q l t y I n s p e c t i o n _ S o u r c e _ C u s t o m _ 9 < / Q l t y I n s p e c t i o n _ S o u r c e _ C u s t o m _ 9 > - 
-         < Q l t y I n s p e c t i o n _ S o u r c e _ D o c u m e n t _ N o _ > Q l t y I n s p e c t i o n _ S o u r c e _ D o c u m e n t _ N o _ < / Q l t y I n s p e c t i o n _ S o u r c e _ D o c u m e n t _ N o _ > - 
-         < Q l t y I n s p e c t i o n _ S o u r c e _ I t e m _ D e s c r i p t i o n > Q l t y I n s p e c t i o n _ S o u r c e _ I t e m _ D e s c r i p t i o n < / Q l t y I n s p e c t i o n _ S o u r c e _ I t e m _ D e s c r i p t i o n > - 
-         < Q l t y I n s p e c t i o n _ S o u r c e _ I t e m _ D e s c r i p t i o n 2 > Q l t y I n s p e c t i o n _ S o u r c e _ I t e m _ D e s c r i p t i o n 2 < / Q l t y I n s p e c t i o n _ S o u r c e _ I t e m _ D e s c r i p t i o n 2 > - 
-         < Q l t y I n s p e c t i o n _ S o u r c e _ I t e m _ N o _ > Q l t y I n s p e c t i o n _ S o u r c e _ I t e m _ N o _ < / Q l t y I n s p e c t i o n _ S o u r c e _ I t e m _ N o _ > - 
-         < Q l t y I n s p e c t i o n _ S o u r c e _ L o t _ N o _ > Q l t y I n s p e c t i o n _ S o u r c e _ L o t _ N o _ < / Q l t y I n s p e c t i o n _ S o u r c e _ L o t _ N o _ > - 
-         < Q l t y I n s p e c t i o n _ S o u r c e _ P a c k a g e _ N o _ > Q l t y I n s p e c t i o n _ S o u r c e _ P a c k a g e _ N o _ < / Q l t y I n s p e c t i o n _ S o u r c e _ P a c k a g e _ N o _ > - 
-         < Q l t y I n s p e c t i o n _ S o u r c e _ S e r i a l _ N o _ > Q l t y I n s p e c t i o n _ S o u r c e _ S e r i a l _ N o _ < / Q l t y I n s p e c t i o n _ S o u r c e _ S e r i a l _ N o _ > - 
-         < Q l t y I n s p e c t i o n _ S o u r c e _ T a s k _ N o _ > Q l t y I n s p e c t i o n _ S o u r c e _ T a s k _ N o _ < / Q l t y I n s p e c t i o n _ S o u r c e _ T a s k _ N o _ > - 
-         < Q l t y I n s p e c t i o n _ S o u r c e _ V a r i a n t _ C o d e > Q l t y I n s p e c t i o n _ S o u r c e _ V a r i a n t _ C o d e < / Q l t y I n s p e c t i o n _ S o u r c e _ V a r i a n t _ C o d e > - 
-         < Q l t y I n s p e c t i o n _ S t a t u s > Q l t y I n s p e c t i o n _ S t a t u s < / Q l t y I n s p e c t i o n _ S t a t u s > - 
-         < R e i n s p e c t i o n S e q u e n c e I n f o r m a t i o n > R e i n s p e c t i o n S e q u e n c e I n f o r m a t i o n < / R e i n s p e c t i o n S e q u e n c e I n f o r m a t i o n > - 
-         < C u r r e n t I n s p e c t i o n L i n e > - 
-             < C o n d i t i o n L a b e l _ 1 > C o n d i t i o n L a b e l _ 1 < / C o n d i t i o n L a b e l _ 1 > - 
-             < C o n d i t i o n L a b e l _ 2 > C o n d i t i o n L a b e l _ 2 < / C o n d i t i o n L a b e l _ 2 > - 
-             < F i e l d _ C o d e > F i e l d _ C o d e < / F i e l d _ C o d e > - 
-             < F i e l d _ D e s c r i p t i o n > F i e l d _ D e s c r i p t i o n < / F i e l d _ D e s c r i p t i o n > - 
-             < F i e l d _ H a s E n t e r e d V a l u e > F i e l d _ H a s E n t e r e d V a l u e < / F i e l d _ H a s E n t e r e d V a l u e > - 
-             < F i e l d _ I f P e r s o n E m a i l > F i e l d _ I f P e r s o n E m a i l < / F i e l d _ I f P e r s o n E m a i l > - 
-             < F i e l d _ I f P e r s o n N a m e > F i e l d _ I f P e r s o n N a m e < / F i e l d _ I f P e r s o n N a m e > - 
-             < F i e l d _ I f P e r s o n P h o n e > F i e l d _ I f P e r s o n P h o n e < / F i e l d _ I f P e r s o n P h o n e > - 
-             < F i e l d _ I f P e r s o n T i t l e > F i e l d _ I f P e r s o n T i t l e < / F i e l d _ I f P e r s o n T i t l e > - 
-             < F i e l d _ I s L a b e l > F i e l d _ I s L a b e l < / F i e l d _ I s L a b e l > - 
-             < F i e l d _ I s P e r s o n F i e l d > F i e l d _ I s P e r s o n F i e l d < / F i e l d _ I s P e r s o n F i e l d > - 
-             < F i e l d _ I s T e x t > F i e l d _ I s T e x t < / F i e l d _ I s T e x t > - 
-             < F i e l d _ L i n e C o m m e n t a r y > F i e l d _ L i n e C o m m e n t a r y < / F i e l d _ L i n e C o m m e n t a r y > - 
-             < F i e l d _ M o d i f i e d B y U s e r E m a i l > F i e l d _ M o d i f i e d B y U s e r E m a i l < / F i e l d _ M o d i f i e d B y U s e r E m a i l > - 
-             < F i e l d _ M o d i f i e d B y U s e r I D > F i e l d _ M o d i f i e d B y U s e r I D < / F i e l d _ M o d i f i e d B y U s e r I D > - 
-             < F i e l d _ M o d i f i e d B y U s e r J o b T i t l e > F i e l d _ M o d i f i e d B y U s e r J o b T i t l e < / F i e l d _ M o d i f i e d B y U s e r J o b T i t l e > - 
-             < F i e l d _ M o d i f i e d B y U s e r N a m e > F i e l d _ M o d i f i e d B y U s e r N a m e < / F i e l d _ M o d i f i e d B y U s e r N a m e > - 
-             < F i e l d _ M o d i f i e d B y U s e r P h o n e > F i e l d _ M o d i f i e d B y U s e r P h o n e < / F i e l d _ M o d i f i e d B y U s e r P h o n e > - 
-             < F i e l d _ M o d i f i e d D a t e T i m e > F i e l d _ M o d i f i e d D a t e T i m e < / F i e l d _ M o d i f i e d D a t e T i m e > - 
-             < F i e l d _ T y p e > F i e l d _ T y p e < / F i e l d _ T y p e > - 
-             < L a b e l F i e l d _ D e s c r i p t i o n > L a b e l F i e l d _ D e s c r i p t i o n < / L a b e l F i e l d _ D e s c r i p t i o n > - 
-             < N u m e r i c _ V a l u e > N u m e r i c _ V a l u e < / N u m e r i c _ V a l u e > - 
-             < P r o m p t e d R e s u l t C a p t i o n _ 1 > P r o m p t e d R e s u l t C a p t i o n _ 1 < / P r o m p t e d R e s u l t C a p t i o n _ 1 > - 
-             < P r o m p t e d R e s u l t C a p t i o n _ 1 0 > P r o m p t e d R e s u l t C a p t i o n _ 1 0 < / P r o m p t e d R e s u l t C a p t i o n _ 1 0 > - 
-             < P r o m p t e d R e s u l t C a p t i o n _ 2 > P r o m p t e d R e s u l t C a p t i o n _ 2 < / P r o m p t e d R e s u l t C a p t i o n _ 2 > - 
-             < P r o m p t e d R e s u l t C a p t i o n _ 3 > P r o m p t e d R e s u l t C a p t i o n _ 3 < / P r o m p t e d R e s u l t C a p t i o n _ 3 > - 
-             < P r o m p t e d R e s u l t C a p t i o n _ 4 > P r o m p t e d R e s u l t C a p t i o n _ 4 < / P r o m p t e d R e s u l t C a p t i o n _ 4 > - 
-             < P r o m p t e d R e s u l t C a p t i o n _ 5 > P r o m p t e d R e s u l t C a p t i o n _ 5 < / P r o m p t e d R e s u l t C a p t i o n _ 5 > - 
-             < P r o m p t e d R e s u l t C a p t i o n _ 6 > P r o m p t e d R e s u l t C a p t i o n _ 6 < / P r o m p t e d R e s u l t C a p t i o n _ 6 > - 
-             < P r o m p t e d R e s u l t C a p t i o n _ 7 > P r o m p t e d R e s u l t C a p t i o n _ 7 < / P r o m p t e d R e s u l t C a p t i o n _ 7 > - 
-             < P r o m p t e d R e s u l t C a p t i o n _ 8 > P r o m p t e d R e s u l t C a p t i o n _ 8 < / P r o m p t e d R e s u l t C a p t i o n _ 8 > - 
-             < P r o m p t e d R e s u l t C a p t i o n _ 9 > P r o m p t e d R e s u l t C a p t i o n _ 9 < / P r o m p t e d R e s u l t C a p t i o n _ 9 > - 
-             < P r o m p t e d R e s u l t C o n d i t i o n D e s c r i p t i o n _ 1 > P r o m p t e d R e s u l t C o n d i t i o n D e s c r i p t i o n _ 1 < / P r o m p t e d R e s u l t C o n d i t i o n D e s c r i p t i o n _ 1 > - 
-             < P r o m p t e d R e s u l t C o n d i t i o n D e s c r i p t i o n _ 1 0 > P r o m p t e d R e s u l t C o n d i t i o n D e s c r i p t i o n _ 1 0 < / P r o m p t e d R e s u l t C o n d i t i o n D e s c r i p t i o n _ 1 0 > - 
-             < P r o m p t e d R e s u l t C o n d i t i o n D e s c r i p t i o n _ 2 > P r o m p t e d R e s u l t C o n d i t i o n D e s c r i p t i o n _ 2 < / P r o m p t e d R e s u l t C o n d i t i o n D e s c r i p t i o n _ 2 > - 
-             < P r o m p t e d R e s u l t C o n d i t i o n D e s c r i p t i o n _ 3 > P r o m p t e d R e s u l t C o n d i t i o n D e s c r i p t i o n _ 3 < / P r o m p t e d R e s u l t C o n d i t i o n D e s c r i p t i o n _ 3 > - 
-             < P r o m p t e d R e s u l t C o n d i t i o n D e s c r i p t i o n _ 4 > P r o m p t e d R e s u l t C o n d i t i o n D e s c r i p t i o n _ 4 < / P r o m p t e d R e s u l t C o n d i t i o n D e s c r i p t i o n _ 4 > - 
-             < P r o m p t e d R e s u l t C o n d i t i o n D e s c r i p t i o n _ 5 > P r o m p t e d R e s u l t C o n d i t i o n D e s c r i p t i o n _ 5 < / P r o m p t e d R e s u l t C o n d i t i o n D e s c r i p t i o n _ 5 > - 
-             < P r o m p t e d R e s u l t C o n d i t i o n D e s c r i p t i o n _ 6 > P r o m p t e d R e s u l t C o n d i t i o n D e s c r i p t i o n _ 6 < / P r o m p t e d R e s u l t C o n d i t i o n D e s c r i p t i o n _ 6 > - 
-             < P r o m p t e d R e s u l t C o n d i t i o n D e s c r i p t i o n _ 7 > P r o m p t e d R e s u l t C o n d i t i o n D e s c r i p t i o n _ 7 < / P r o m p t e d R e s u l t C o n d i t i o n D e s c r i p t i o n _ 7 > - 
-             < P r o m p t e d R e s u l t C o n d i t i o n D e s c r i p t i o n _ 8 > P r o m p t e d R e s u l t C o n d i t i o n D e s c r i p t i o n _ 8 < / P r o m p t e d R e s u l t C o n d i t i o n D e s c r i p t i o n _ 8 > - 
-             < P r o m p t e d R e s u l t C o n d i t i o n D e s c r i p t i o n _ 9 > P r o m p t e d R e s u l t C o n d i t i o n D e s c r i p t i o n _ 9 < / P r o m p t e d R e s u l t C o n d i t i o n D e s c r i p t i o n _ 9 > - 
-             < P r o m p t e d R e s u l t V i s i b l e _ 1 > P r o m p t e d R e s u l t V i s i b l e _ 1 < / P r o m p t e d R e s u l t V i s i b l e _ 1 > - 
-             < P r o m p t e d R e s u l t V i s i b l e _ 1 0 > P r o m p t e d R e s u l t V i s i b l e _ 1 0 < / P r o m p t e d R e s u l t V i s i b l e _ 1 0 > - 
-             < P r o m p t e d R e s u l t V i s i b l e _ 2 > P r o m p t e d R e s u l t V i s i b l e _ 2 < / P r o m p t e d R e s u l t V i s i b l e _ 2 > - 
-             < P r o m p t e d R e s u l t V i s i b l e _ 3 > P r o m p t e d R e s u l t V i s i b l e _ 3 < / P r o m p t e d R e s u l t V i s i b l e _ 3 > - 
-             < P r o m p t e d R e s u l t V i s i b l e _ 4 > P r o m p t e d R e s u l t V i s i b l e _ 4 < / P r o m p t e d R e s u l t V i s i b l e _ 4 > - 
-             < P r o m p t e d R e s u l t V i s i b l e _ 5 > P r o m p t e d R e s u l t V i s i b l e _ 5 < / P r o m p t e d R e s u l t V i s i b l e _ 5 > - 
-             < P r o m p t e d R e s u l t V i s i b l e _ 6 > P r o m p t e d R e s u l t V i s i b l e _ 6 < / P r o m p t e d R e s u l t V i s i b l e _ 6 > - 
-             < P r o m p t e d R e s u l t V i s i b l e _ 7 > P r o m p t e d R e s u l t V i s i b l e _ 7 < / P r o m p t e d R e s u l t V i s i b l e _ 7 > - 
-             < P r o m p t e d R e s u l t V i s i b l e _ 8 > P r o m p t e d R e s u l t V i s i b l e _ 8 < / P r o m p t e d R e s u l t V i s i b l e _ 8 > - 
-             < P r o m p t e d R e s u l t V i s i b l e _ 9 > P r o m p t e d R e s u l t V i s i b l e _ 9 < / P r o m p t e d R e s u l t V i s i b l e _ 9 > - 
-             < T e s t _ R e s u l t > T e s t _ R e s u l t < / T e s t _ R e s u l t > - 
-             < T e s t _ R e s u l t D e s c r i p t i o n > T e s t _ R e s u l t D e s c r i p t i o n < / T e s t _ R e s u l t D e s c r i p t i o n > - 
-             < T e s t _ V a l u e > T e s t _ V a l u e < / T e s t _ V a l u e > - 
-             < W o r d D e s c r i p t i o n > W o r d D e s c r i p t i o n < / W o r d D e s c r i p t i o n > - 
-             < W o r d R e s u l t D e s c r i p t i o n > W o r d R e s u l t D e s c r i p t i o n < / W o r d R e s u l t D e s c r i p t i o n > - 
-             < W o r d U n f a v o r a b l e R e s u l t D e s c r i p t i o n > W o r d U n f a v o r a b l e R e s u l t D e s c r i p t i o n < / W o r d U n f a v o r a b l e R e s u l t D e s c r i p t i o n > - 
-         < / C u r r e n t I n s p e c t i o n L i n e > - 
-     < / C u r r e n t I n s p e c t i o n > - 
- < / N a v W o r d R e p o r t X m l P a r t > 
-</file>
-
-<file path=customXml/item3.xml>��< ? x m l   v e r s i o n = " 1 . 0 "   e n c o d i n g = " u t f - 1 6 " ? > < N a v W o r d R e p o r t X m l P a r t   x m l n s = " u r n : m i c r o s o f t - d y n a m i c s - b u s i n e s s c e n t r a l / i n t e r n a l / e x t e n d e d / r e p o r t s / Q l t y _ C e r t i f i c a t e _ o f _ A n a l y s i s / 2 0 4 0 1 / " > - 
-     < B C R e p o r t I n f o r m a t i o n > - 
-         < R e p o r t M e t a d a t a > - 
-             < E x t e n s i o n I d > E x t e n s i o n   I D < / E x t e n s i o n I d > - 
-             < E x t e n s i o n N a m e > E x t e n s i o n   N a m e < / E x t e n s i o n N a m e > - 
-             < E x t e n s i o n P u b l i s h e r > E x t e n s i o n   P u b l i s h e r < / E x t e n s i o n P u b l i s h e r > - 
-             < E x t e n s i o n V e r s i o n > E x t e n s i o n   V e r s i o n < / E x t e n s i o n V e r s i o n > - 
-             < R e p o r t I d > R e p o r t   I D < / R e p o r t I d > - 
-             < R e p o r t N a m e > R e p o r t   N a m e < / R e p o r t N a m e > - 
-             < A b o u t T h i s R e p o r t T i t l e > A b o u t   T h i s   R e p o r t   T i t l e < / A b o u t T h i s R e p o r t T i t l e > - 
-             < A b o u t T h i s R e p o r t T e x t > A b o u t   T h i s   R e p o r t   T e x t < / A b o u t T h i s R e p o r t T e x t > - 
-             < R e p o r t H e l p L i n k > R e p o r t   H e l p   L i n k < / R e p o r t H e l p L i n k > - 
-         < / R e p o r t M e t a d a t a > - 
-         < R e p o r t R e q u e s t > - 
-             < T e n a n t E n t r a I d > T e n a n t   E n t r a   I d < / T e n a n t E n t r a I d > - 
-             < E n v i r o n m e n t N a m e > E n v i r o n m e n t   N a m e < / E n v i r o n m e n t N a m e > - 
-             < E n v i r o n m e n t T y p e > E n v i r o n m e n t   T y p e < / E n v i r o n m e n t T y p e > - 
-             < C o m p a n y N a m e > C o m p a n y   N a m e < / C o m p a n y N a m e > - 
-             < C o m p a n y D i s p l a y N a m e > C o m p a n y   D i s p l a y   N a m e < / C o m p a n y D i s p l a y N a m e > - 
-             < C o m p a n y I d > C o m p a n y   I D < / C o m p a n y I d > - 
-             < U s e r N a m e > U s e r   N a m e < / U s e r N a m e > - 
-             < D a t e A n d T i m e > D a t e   a n d   T i m e < / D a t e A n d T i m e > - 
-             < L a n g u a g e > L a n g u a g e < / L a n g u a g e > - 
-             < F o r m a t R e g i o n > F o r m a t   R e g i o n < / F o r m a t R e g i o n > - 
-             < D a t e T i m e V a l u e s > - 
-                 < Y e a r > Y e a r < / Y e a r > - 
-                 < M o n t h N u m b e r > M o n t h   N u m b e r < / M o n t h N u m b e r > - 
-                 < D a y N u m b e r > D a y   N u m b e r < / D a y N u m b e r > - 
-                 < H o u r > H o u r < / H o u r > - 
-                 < M i n u t e > M i n u t e < / M i n u t e > - 
-             < / D a t e T i m e V a l u e s > - 
-         < / R e p o r t R e q u e s t > - 
-     < / B C R e p o r t I n f o r m a t i o n > - 
-     < L a b e l s > - 
-         < C o n d i t i o n L a b e l   E l e m e n t T y p e = " P a r a m e t e r "   E l e m e n t I d = " 1 4 2 4 6 4 8 2 8 8 "   D a t a T y p e = " S t r i n g " > C o n d i t i o n L a b e l < / C o n d i t i o n L a b e l > - 
-         < D a t e L a b e l   E l e m e n t T y p e = " P a r a m e t e r "   E l e m e n t I d = " 7 9 3 8 1 7 7 7 7 "   D a t a T y p e = " S t r i n g " > D a t e L a b e l < / D a t e L a b e l > - 
-         < F i n i s h e d B y L a b e l   E l e m e n t T y p e = " P a r a m e t e r "   E l e m e n t I d = " 1 2 1 8 3 5 9 1 8 "   D a t a T y p e = " S t r i n g " > F i n i s h e d B y L a b e l < / F i n i s h e d B y L a b e l > - 
-         < F i n i s h e d O n L a b e l   E l e m e n t T y p e = " P a r a m e t e r "   E l e m e n t I d = " 1 9 3 5 3 2 6 4 3 2 "   D a t a T y p e = " S t r i n g " > F i n i s h e d O n L a b e l < / F i n i s h e d O n L a b e l > - 
-         < I n s p e c t i o n L a b e l   E l e m e n t T y p e = " P a r a m e t e r "   E l e m e n t I d = " 1 5 4 9 8 3 1 5 2 5 "   D a t a T y p e = " S t r i n g " > I n s p e c t i o n L a b e l < / I n s p e c t i o n L a b e l > - 
-         < I t e m L a b e l   E l e m e n t T y p e = " P a r a m e t e r "   E l e m e n t I d = " 1 0 8 2 0 2 8 9 7 4 "   D a t a T y p e = " S t r i n g " > I t e m L a b e l < / I t e m L a b e l > - 
-         < I t e m T r a c k i n g L a b e l   E l e m e n t T y p e = " P a r a m e t e r "   E l e m e n t I d = " 9 3 5 5 3 4 6 7 1 "   D a t a T y p e = " S t r i n g " > I t e m T r a c k i n g L a b e l < / I t e m T r a c k i n g L a b e l > - 
-         < P a g e L a b e l   E l e m e n t T y p e = " P a r a m e t e r "   E l e m e n t I d = " 1 8 8 0 8 2 7 5 0 4 "   D a t a T y p e = " S t r i n g " > P a g e L a b e l < / P a g e L a b e l > - 
-         < R e p o r t T i t l e L a b e l   E l e m e n t T y p e = " P a r a m e t e r "   E l e m e n t I d = " 1 2 9 7 0 8 9 6 2 7 "   D a t a T y p e = " S t r i n g " > R e p o r t T i t l e L a b e l < / R e p o r t T i t l e L a b e l > - 
-         < R e s u l t L a b e l   E l e m e n t T y p e = " P a r a m e t e r "   E l e m e n t I d = " 4 0 7 6 0 6 8 8 6 "   D a t a T y p e = " S t r i n g " > R e s u l t L a b e l < / R e s u l t L a b e l > - 
-         < T e s t L a b e l   E l e m e n t T y p e = " P a r a m e t e r "   E l e m e n t I d = " 1 5 2 2 4 8 5 9 "   D a t a T y p e = " S t r i n g " > T e s t L a b e l < / T e s t L a b e l > - 
-         < T e s t V a l u e L a b e l   E l e m e n t T y p e = " P a r a m e t e r "   E l e m e n t I d = " 1 1 6 2 1 3 2 5 7 0 "   D a t a T y p e = " S t r i n g " > T e s t V a l u e L a b e l < / T e s t V a l u e L a b e l > - 
-     < / L a b e l s > - 
-     < T o o l t i p s > - 
-         < T o o l t i p   c o l u m n = " Q l t y I n s p e c t i o n T e m p l a t e _ D e s c r i p t i o n "   E l e m e n t I d = " 1 6 5 2 0 6 9 5 9 8 " > - 
-             < T o o l t i p T e x t   l a n g = " e n - U S " > S p e c i f i e s   a n   e x p l a n a t i o n   o f   t h e   Q u a l i t y   I n s p e c t i o n   T e m p l a t e .   Y o u   c a n   e n t e r   a   m a x i m u m   o f   1 0 0   c h a r a c t e r s ,   b o t h   n u m b e r s   a n d   l e t t e r s . < / T o o l t i p T e x t > - 
-         < / T o o l t i p > - 
-         < T o o l t i p   c o l u m n = " Q l t y I n s p e c t i o n _ D e s c r i p t i o n "   E l e m e n t I d = " 7 3 9 0 1 9 9 1 0 " > - 
-             < T o o l t i p T e x t   l a n g = " e n - U S " > S p e c i f i e s   a   d e s c r i p t i o n   o f   t h e   Q u a l i t y   I n s p e c t i o n   i t s e l f . < / T o o l t i p T e x t > - 
-         < / T o o l t i p > - 
-         < T o o l t i p   c o l u m n = " Q l t y I n s p e c t i o n _ S t a t u s "   E l e m e n t I d = " 8 5 1 7 5 2 7 6 8 " > - 
-             < T o o l t i p T e x t   l a n g = " e n - U S " > S p e c i f i e s   t h e   s t a t u s   o f   t h e   i n s p e c t i o n .   N o   a d d i t i o n a l   c h a n g e s   c a n   b e   m a d e   t o   a   f i n i s h e d   Q u a l i t y   I n s p e c t i o n . < / T o o l t i p T e x t > - 
-         < / T o o l t i p > - 
-         < T o o l t i p   c o l u m n = " Q l t y I n s p e c t i o n _ R e s u l t _ C o d e "   E l e m e n t I d = " 1 8 0 7 0 7 7 0 6 5 " > - 
-             < T o o l t i p T e x t   l a n g = " e n - U S " > S p e c i f i e s   t h e   r e s u l t   i s   a u t o m a t i c a l l y   d e t e r m i n e d   b a s e d   o n   t h e   t e s t   v a l u e   a n d   r e s u l t   c o n f i g u r a t i o n . < / T o o l t i p T e x t > - 
-         < / T o o l t i p > - 
-         < T o o l t i p   c o l u m n = " Q l t y I n s p e c t i o n _ R e s u l t _ D e s c r i p t i o n "   E l e m e n t I d = " 8 1 0 5 3 8 1 8 8 " > - 
-             < T o o l t i p T e x t   l a n g = " e n - U S " > S p e c i f i e s   t h e   r e s u l t   d e s c r i p t i o n   f o r   t h i s   t e s t   r e s u l t .   T h e   r e s u l t   i s   a u t o m a t i c a l l y   d e t e r m i n e d   b a s e d   o n   t h e   t e s t   v a l u e   a n d   r e s u l t   c o n f i g u r a t i o n . < / T o o l t i p T e x t > - 
-         < / T o o l t i p > - 
-         < T o o l t i p   c o l u m n = " Q l t y I n s p e c t i o n _ N o "   E l e m e n t I d = " 2 1 2 0 6 1 5 7 4 9 " > - 
-             < T o o l t i p T e x t   l a n g = " e n - U S " > S p e c i f i e s   t h e   q u a l i t y   i n s p e c t i o n   d o c u m e n t   n u m b e r . < / T o o l t i p T e x t > - 
-         < / T o o l t i p > - 
-         < T o o l t i p   c o l u m n = " Q l t y I n s p e c t i o n _ R e i n s p e c t i o n N o "   E l e m e n t I d = " 7 5 1 7 3 5 6 " > - 
-             < T o o l t i p T e x t   l a n g = " e n - U S " > S p e c i f i e s   t h e   r e - i n s p e c t i o n   c o u n t e r . < / T o o l t i p T e x t > - 
-         < / T o o l t i p > - 
-         < T o o l t i p   c o l u m n = " Q l t y I n s p e c t i o n _ F i n i s h e d _ B y _ U s e r _ I D "   E l e m e n t I d = " 1 7 5 0 5 1 6 3 3 8 " > - 
-             < T o o l t i p T e x t   l a n g = " e n - U S " > S p e c i f i e s   t h e   u s e r   t h a t   f i n i s h e d   t h e   i n s p e c t i o n . < / T o o l t i p T e x t > - 
-         < / T o o l t i p > - 
-         < T o o l t i p   c o l u m n = " Q l t y I n s p e c t i o n _ F i n i s h e d _ D a t e "   E l e m e n t I d = " 1 8 3 4 1 2 2 7 6 5 " > - 
-             < T o o l t i p T e x t   l a n g = " e n - U S " > S p e c i f i e s   t h e   d a t e   t h a t   t h e   i n s p e c t i o n   w a s   f i n i s h e d . < / T o o l t i p T e x t > - 
-         < / T o o l t i p > - 
-         < T o o l t i p   c o l u m n = " Q l t y I n s p e c t i o n _ S o u r c e _ I t e m _ N o _ "   E l e m e n t I d = " 1 2 6 8 0 5 0 5 1 8 " > - 
-             < T o o l t i p T e x t   l a n g = " e n - U S " > S p e c i f i e s   t h e   i t e m   t h a t   t h e   Q u a l i t y   I n s p e c t i o n   i s   f o r .   W h e n   u s e d   w i t h   p r o d u c t i o n   o r d e r s   t h i s   t y p i c a l l y   r e f e r s   t o   t h e   i t e m   b e i n g   p r o d u c e d . < / T o o l t i p T e x t > - 
-         < / T o o l t i p > - 
-         < T o o l t i p   c o l u m n = " Q l t y I n s p e c t i o n _ S o u r c e _ I t e m _ D e s c r i p t i o n "   E l e m e n t I d = " 6 4 6 8 9 0 6 3 0 " > - 
-             < T o o l t i p T e x t   l a n g = " e n - U S " > S p e c i f i e s   a   d e s c r i p t i o n   o f   t h e   i t e m . < / T o o l t i p T e x t > - 
-         < / T o o l t i p > - 
-         < T o o l t i p   c o l u m n = " Q l t y I n s p e c t i o n _ S o u r c e _ I t e m _ D e s c r i p t i o n 2 "   E l e m e n t I d = " 1 2 7 9 3 6 9 3 5 2 " > - 
-             < T o o l t i p T e x t   l a n g = " e n - U S " > S p e c i f i e s   i n f o r m a t i o n   i n   a d d i t i o n   t o   t h e   d e s c r i p t i o n . < / T o o l t i p T e x t > - 
-         < / T o o l t i p > - 
-         < T o o l t i p   c o l u m n = " Q l t y I n s p e c t i o n _ S o u r c e _ V a r i a n t _ C o d e "   E l e m e n t I d = " 1 6 0 8 4 0 3 8 2 1 " > - 
-             < T o o l t i p T e x t   l a n g = " e n - U S " > S p e c i f i e s   t h e   i t e m   v a r i a n t   t h a t   t h e   Q u a l i t y   I n s p e c t i o n   i s   f o r .   W h e n   u s e d   w i t h   p r o d u c t i o n   o r d e r s   t h i s   t y p i c a l l y   r e f e r s   t o   t h e   i t e m   b e i n g   p r o d u c e d . < / T o o l t i p T e x t > - 
-         < / T o o l t i p > - 
-         < T o o l t i p   c o l u m n = " Q l t y I n s p e c t i o n _ S o u r c e _ L o t _ N o _ "   E l e m e n t I d = " 1 1 2 3 5 5 1 3 1 2 " > - 
-             < T o o l t i p T e x t   l a n g = " e n - U S " > S p e c i f i e s   t h e   l o t   n u m b e r   t h a t   t h e   q u a l i t y   i n s p e c t i o n   i s   f o r .   T h i s   i s   o n l y   u s e d   f o r   l o t   t r a c k e d   i t e m s . < / T o o l t i p T e x t > - 
-         < / T o o l t i p > - 
-         < T o o l t i p   c o l u m n = " Q l t y I n s p e c t i o n _ S o u r c e _ S e r i a l _ N o _ "   E l e m e n t I d = " 1 5 2 0 5 9 1 4 4 7 " > - 
-             < T o o l t i p T e x t   l a n g = " e n - U S " > S p e c i f i e s   t h e   s e r i a l   n u m b e r   t h a t   t h e   q u a l i t y   i n s p e c t i o n   i s   f o r .   T h i s   i s   o n l y   u s e d   f o r   s e r i a l   t r a c k e d   i t e m s . < / T o o l t i p T e x t > - 
-         < / T o o l t i p > - 
-         < T o o l t i p   c o l u m n = " Q l t y I n s p e c t i o n _ S o u r c e _ P a c k a g e _ N o _ "   E l e m e n t I d = " 1 9 6 1 1 2 9 9 7 " > - 
-             < T o o l t i p T e x t   l a n g = " e n - U S " > S p e c i f i e s   t h e   p a c k a g e   n u m b e r   t h a t   t h e   q u a l i t y   i n s p e c t i o n   i s   f o r .   T h i s   i s   o n l y   u s e d   f o r   p a c k a g e   t r a c k e d   i t e m s . < / T o o l t i p T e x t > - 
-         < / T o o l t i p > - 
-         < T o o l t i p   c o l u m n = " Q l t y I n s p e c t i o n _ S o u r c e _ D o c u m e n t _ N o _ "   E l e m e n t I d = " 1 6 7 5 9 1 6 2 8 8 " > - 
-             < T o o l t i p T e x t   l a n g = " e n - U S " > S p e c i f i e s   a   r e f e r e n c e   t o   t h e   d o c u m e n t   t h a t   t h i s   Q u a l i t y   I n s p e c t i o n   i s   r e f e r r i n g   t o .   T h i s   t y p i c a l l y   r e f e r s   t o   a   p r o d u c t i o n   o r d e r   d o c u m e n t   n u m b e r . < / T o o l t i p T e x t > - 
-         < / T o o l t i p > - 
-         < T o o l t i p   c o l u m n = " Q l t y I n s p e c t i o n _ S o u r c e _ T a s k _ N o _ "   E l e m e n t I d = " 3 8 4 6 4 4 1 8 2 " > - 
-             < T o o l t i p T e x t   l a n g = " e n - U S " > S p e c i f i e s   a   r e f e r e n c e   t o   t h e   s o u r c e   t a s k   n o .   t h a t   t h i s   Q u a l i t y   I n s p e c t i o n   i s   r e f e r r i n g   t o .   T h i s   t y p i c a l l y   r e f e r s   t o   a n   o p e r a t i o n . < / T o o l t i p T e x t > - 
-         < / T o o l t i p > - 
-         < T o o l t i p   c o l u m n = " Q l t y I n s p e c t i o n _ S o u r c e _ C u s t o m _ 1 "   E l e m e n t I d = " 5 4 6 4 5 3 7 6 5 " > - 
-             < T o o l t i p T e x t   l a n g = " e n - U S " > S p e c i f i e s   a d d i t i o n a l   i n f o r m a t i o n   f r o m   a   s o u r c e   r e c o r d . < / T o o l t i p T e x t > - 
-         < / T o o l t i p > - 
-         < T o o l t i p   c o l u m n = " Q l t y I n s p e c t i o n _ S o u r c e _ C u s t o m _ 2 "   E l e m e n t I d = " 1 8 3 5 4 2 3 6 8 0 " > - 
-             < T o o l t i p T e x t   l a n g = " e n - U S " > S p e c i f i e s   a d d i t i o n a l   i n f o r m a t i o n   f r o m   a   s o u r c e   r e c o r d . < / T o o l t i p T e x t > - 
-         < / T o o l t i p > - 
-         < T o o l t i p   c o l u m n = " Q l t y I n s p e c t i o n _ S o u r c e _ C u s t o m _ 3 "   E l e m e n t I d = " 1 8 2 1 8 4 6 9 9 9 " > - 
-             < T o o l t i p T e x t   l a n g = " e n - U S " > S p e c i f i e s   a d d i t i o n a l   i n f o r m a t i o n   f r o m   a   s o u r c e   r e c o r d . < / T o o l t i p T e x t > - 
-         < / T o o l t i p > - 
-         < T o o l t i p   c o l u m n = " Q l t y I n s p e c t i o n _ S o u r c e _ C u s t o m _ 4 "   E l e m e n t I d = " 1 3 6 6 6 3 6 0 8 6 " > - 
-             < T o o l t i p T e x t   l a n g = " e n - U S " > S p e c i f i e s   a d d i t i o n a l   i n f o r m a t i o n   f r o m   a   s o u r c e   r e c o r d . < / T o o l t i p T e x t > - 
-         < / T o o l t i p > - 
-         < T o o l t i p   c o l u m n = " Q l t y I n s p e c t i o n _ S o u r c e _ C u s t o m _ 5 "   E l e m e n t I d = " 2 0 0 4 3 3 2 7 0 3 " > - 
-             < T o o l t i p T e x t   l a n g = " e n - U S " > S p e c i f i e s   a d d i t i o n a l   i n f o r m a t i o n   f r o m   a   s o u r c e   r e c o r d . < / T o o l t i p T e x t > - 
-         < / T o o l t i p > - 
-         < T o o l t i p   c o l u m n = " Q l t y I n s p e c t i o n _ S o u r c e _ C u s t o m _ 6 "   E l e m e n t I d = " 9 1 2 4 2 8 5 2 " > - 
-             < T o o l t i p T e x t   l a n g = " e n - U S " > S p e c i f i e s   a d d i t i o n a l   i n f o r m a t i o n   f r o m   a   s o u r c e   r e c o r d . < / T o o l t i p T e x t > - 
-         < / T o o l t i p > - 
-         < T o o l t i p   c o l u m n = " Q l t y I n s p e c t i o n _ S o u r c e _ C u s t o m _ 7 "   E l e m e n t I d = " 7 2 8 9 3 9 4 6 9 " > - 
-             < T o o l t i p T e x t   l a n g = " e n - U S " > S p e c i f i e s   a d d i t i o n a l   i n f o r m a t i o n   f r o m   a   s o u r c e   r e c o r d . < / T o o l t i p T e x t > - 
-         < / T o o l t i p > - 
-         < T o o l t i p   c o l u m n = " Q l t y I n s p e c t i o n _ S o u r c e _ C u s t o m _ 8 "   E l e m e n t I d = " 3 7 7 5 4 4 7 4 2 " > - 
-             < T o o l t i p T e x t   l a n g = " e n - U S " > S p e c i f i e s   a d d i t i o n a l   i n f o r m a t i o n   f r o m   a   s o u r c e   r e c o r d . < / T o o l t i p T e x t > - 
-         < / T o o l t i p > - 
-         < T o o l t i p   c o l u m n = " Q l t y I n s p e c t i o n _ S o u r c e _ C u s t o m _ 9 "   E l e m e n t I d = " 2 6 0 1 5 1 8 7 5 " > - 
-             < T o o l t i p T e x t   l a n g = " e n - U S " > S p e c i f i e s   a d d i t i o n a l   i n f o r m a t i o n   f r o m   a   s o u r c e   r e c o r d . < / T o o l t i p T e x t > - 
-         < / T o o l t i p > - 
-         < T o o l t i p   c o l u m n = " Q l t y I n s p e c t i o n _ S o u r c e _ C u s t o m _ 1 0 "   E l e m e n t I d = " 1 5 3 7 6 5 2 9 2 5 " > - 
-             < T o o l t i p T e x t   l a n g = " e n - U S " > S p e c i f i e s   a d d i t i o n a l   i n f o r m a t i o n   f r o m   a   s o u r c e   r e c o r d . < / T o o l t i p T e x t > - 
-         < / T o o l t i p > - 
-         < T o o l t i p   c o l u m n = " F i e l d _ C o d e "   E l e m e n t I d = " 1 3 2 7 2 5 5 7 3 " > - 
-             < T o o l t i p T e x t   l a n g = " e n - U S " > S p e c i f i e s   t h e   f i e l d / q u e s t i o n / m e t r i c   i n   t h i s   t e s t . < / T o o l t i p T e x t > - 
-         < / T o o l t i p > - 
-         < T o o l t i p   c o l u m n = " F i e l d _ D e s c r i p t i o n "   E l e m e n t I d = " 1 4 6 8 6 2 1 2 9 8 " > - 
-             < T o o l t i p T e x t   l a n g = " e n - U S " > S p e c i f i e s   a   d e s c r i p t i o n   o f   t h e   f i e l d   a s   i t   i s   u s e d   o n   t h e   t e s t . < / T o o l t i p T e x t > - 
-         < / T o o l t i p > - 
-         < T o o l t i p   c o l u m n = " N u m e r i c _ V a l u e "   E l e m e n t I d = " 4 6 0 4 1 2 6 4 6 " > - 
-             < T o o l t i p T e x t   l a n g = " e n - U S " > S p e c i f i e s   a n   e v a l u a t e d   n u m e r i c   v a l u e   o f   T e s t   V a l u e   f o r   u s e   i n   c a l c u l a t i o n s   a n d   a n a l y s i s .   T h i s   v a l u e   i s   a u t o m a t i c a l l y   c a l c u l a t e d   w h e n   t h e   T e s t   V a l u e   i s   e n t e r e d   o r   m o d i f i e d   b a s e d   o n   t h e   c o n f i g u r a t i o n   o f   t h e   T e s t   V a l u e   a n d   i s   n o t   d i r e c t l y   e d i t a b l e . < / T o o l t i p T e x t > - 
-         < / T o o l t i p > - 
-         < T o o l t i p   c o l u m n = " F i e l d _ T y p e "   E l e m e n t I d = " 1 3 2 8 1 6 4 0 1 6 " > - 
-             < T o o l t i p T e x t   l a n g = " e n - U S " > S p e c i f i e s   t h e   d a t a   t y p e   o f   t h e   v a l u e s   y o u   c a n   e n t e r   o r   s e l e c t   f o r   t h i s   t e s t .   U s e   D e c i m a l   f o r   n u m e r i c a l   m e a s u r e m e n t s .   U s e   C h o i c e   t o   g i v e   a   l i s t   o f   o p t i o n s   t o   c h o o s e   f r o m .   I f   y o u   w a n t   t o   c h o o s e   o p t i o n s   f r o m   a n   e x i s t i n g   t a b l e ,   u s e   T a b l e   L o o k u p . < / T o o l t i p T e x t > - 
-         < / T o o l t i p > - 
-         < T o o l t i p   c o l u m n = " T e s t _ R e s u l t "   E l e m e n t I d = " 1 2 7 1 0 6 2 1 4 1 " > - 
-             < T o o l t i p T e x t   l a n g = " e n - U S " > S p e c i f i e s   t h e   r e s u l t   i s   a u t o m a t i c a l l y   d e t e r m i n e d   b a s e d   o n   t h e   t e s t   v a l u e   a n d   r e s u l t   c o n f i g u r a t i o n . < / T o o l t i p T e x t > - 
-         < / T o o l t i p > - 
-     < / T o o l t i p s > - 
-     < C u r r e n t I n s p e c t i o n   E l e m e n t T y p e = " D a t a I t e m "   E l e m e n t I d = " 1 7 4 7 8 9 7 9 7 8 " > - 
-         < A p p r o v e r N a m e L a b e l   E l e m e n t T y p e = " C o l u m n "   E l e m e n t I d = " 1 8 9 7 9 9 2 7 8 5 "   D a t a T y p e = " T e x t " > A p p r o v e r N a m e L a b e l < / A p p r o v e r N a m e L a b e l > - 
-         < A p p r o v e r S i g n a t u r e L a b e l   E l e m e n t T y p e = " C o l u m n "   E l e m e n t I d = " 1 0 3 4 5 1 7 9 4 "   D a t a T y p e = " T e x t " > A p p r o v e r S i g n a t u r e L a b e l < / A p p r o v e r S i g n a t u r e L a b e l > - 
-         < C O A C o n t a c t _ A l l   E l e m e n t T y p e = " C o l u m n "   E l e m e n t I d = " 1 5 9 3 9 3 0 3 4 6 "   D a t a T y p e = " T e x t " > C O A C o n t a c t _ A l l < / C O A C o n t a c t _ A l l > - 
-         < C O A C o n t a c t _ R o w 1   E l e m e n t T y p e = " C o l u m n "   E l e m e n t I d = " 1 2 7 0 2 3 9 7 3 2 "   D a t a T y p e = " T e x t " > C O A C o n t a c t _ R o w 1 < / C O A C o n t a c t _ R o w 1 > - 
-         < C O A C o n t a c t _ R o w 2   E l e m e n t T y p e = " C o l u m n "   E l e m e n t I d = " 6 4 2 8 5 0 1 1 9 "   D a t a T y p e = " T e x t " > C O A C o n t a c t _ R o w 2 < / C O A C o n t a c t _ R o w 2 > - 
-         < C O A C o n t a c t _ R o w 3   E l e m e n t T y p e = " C o l u m n "   E l e m e n t I d = " 5 1 5 3 5 0 2 "   D a t a T y p e = " T e x t " > C O A C o n t a c t _ R o w 3 < / C O A C o n t a c t _ R o w 3 > - 
-         < C O A C o n t a c t _ R o w 4   E l e m e n t T y p e = " C o l u m n "   E l e m e n t I d = " 1 1 1 1 6 3 7 7 1 3 "   D a t a T y p e = " T e x t " > C O A C o n t a c t _ R o w 4 < / C O A C o n t a c t _ R o w 4 > - 
-         < C O A C o n t a c t _ R o w 5   E l e m e n t T y p e = " C o l u m n "   E l e m e n t I d = " 4 7 3 9 4 1 0 9 6 "   D a t a T y p e = " T e x t " > C O A C o n t a c t _ R o w 5 < / C O A C o n t a c t _ R o w 5 > - 
-         < C O A C o n t a c t _ R o w 6   E l e m e n t T y p e = " C o l u m n "   E l e m e n t I d = " 1 9 0 7 9 3 6 3 4 9 "   D a t a T y p e = " T e x t " > C O A C o n t a c t _ R o w 6 < / C O A C o n t a c t _ R o w 6 > - 
-         < C O A C o n t a c t _ R o w 7   E l e m e n t T y p e = " C o l u m n "   E l e m e n t I d = " 1 7 4 9 3 3 4 3 3 0 "   D a t a T y p e = " T e x t " > C O A C o n t a c t _ R o w 7 < / C O A C o n t a c t _ R o w 7 > - 
-         < C O A C o n t a c t _ R o w 8   E l e m e n t T y p e = " C o l u m n "   E l e m e n t I d = " 1 4 3 9 1 4 8 7 5 5 "   D a t a T y p e = " T e x t " > C O A C o n t a c t _ R o w 8 < / C O A C o n t a c t _ R o w 8 > - 
-         < C o m p a n y I n f o r m a t i o n _ A l l   E l e m e n t T y p e = " C o l u m n "   E l e m e n t I d = " 7 6 1 9 7 4 8 2 4 "   D a t a T y p e = " T e x t " > C o m p a n y I n f o r m a t i o n _ A l l < / C o m p a n y I n f o r m a t i o n _ A l l > - 
-         < C o m p a n y I n f o r m a t i o n _ R o w 1   E l e m e n t T y p e = " C o l u m n "   E l e m e n t I d = " 1 8 4 3 2 1 2 8 9 4 "   D a t a T y p e = " T e x t " > C o m p a n y I n f o r m a t i o n _ R o w 1 < / C o m p a n y I n f o r m a t i o n _ R o w 1 > - 
-         < C o m p a n y I n f o r m a t i o n _ R o w 2   E l e m e n t T y p e = " C o l u m n "   E l e m e n t I d = " 1 8 1 4 0 5 7 7 8 5 "   D a t a T y p e = " T e x t " > C o m p a n y I n f o r m a t i o n _ R o w 2 < / C o m p a n y I n f o r m a t i o n _ R o w 2 > - 
-         < C o m p a n y I n f o r m a t i o n _ R o w 3   E l e m e n t T y p e = " C o l u m n "   E l e m e n t I d = " 1 1 7 6 3 6 1 1 6 8 "   D a t a T y p e = " T e x t " > C o m p a n y I n f o r m a t i o n _ R o w 3 < / C o m p a n y I n f o r m a t i o n _ R o w 3 > - 
-         < C o m p a n y I n f o r m a t i o n _ R o w 4   E l e m e n t T y p e = " C o l u m n "   E l e m e n t I d = " 1 3 4 5 2 7 0 1 9 1 "   D a t a T y p e = " T e x t " > C o m p a n y I n f o r m a t i o n _ R o w 4 < / C o m p a n y I n f o r m a t i o n _ R o w 4 > - 
-         < C o m p a n y I n f o r m a t i o n _ R o w 5   E l e m e n t T y p e = " C o l u m n "   E l e m e n t I d = " 7 0 7 5 7 3 5 7 4 "   D a t a T y p e = " T e x t " > C o m p a n y I n f o r m a t i o n _ R o w 5 < / C o m p a n y I n f o r m a t i o n _ R o w 5 > - 
-         < C o m p a n y I n f o r m a t i o n _ R o w 6   E l e m e n t T y p e = " C o l u m n "   E l e m e n t I d = " 6 9 8 7 6 9 5 7 "   D a t a T y p e = " T e x t " > C o m p a n y I n f o r m a t i o n _ R o w 6 < / C o m p a n y I n f o r m a t i o n _ R o w 6 > - 
-         < C o m p a n y I n f o r m a t i o n _ R o w 7   E l e m e n t T y p e = " C o l u m n "   E l e m e n t I d = " 5 6 7 8 1 9 6 6 0 "   D a t a T y p e = " T e x t " > C o m p a n y I n f o r m a t i o n _ R o w 7 < / C o m p a n y I n f o r m a t i o n _ R o w 7 > - 
-         < C o m p a n y I n f o r m a t i o n _ R o w 8   E l e m e n t T y p e = " C o l u m n "   E l e m e n t I d = " 3 9 8 9 1 0 6 3 7 "   D a t a T y p e = " T e x t " > C o m p a n y I n f o r m a t i o n _ R o w 8 < / C o m p a n y I n f o r m a t i o n _ R o w 8 > - 
-         < C o m p a n y L o g o   E l e m e n t T y p e = " C o l u m n "   E l e m e n t I d = " 2 3 7 6 9 1 5 1 "   D a t a T y p e = " B l o b " / > - 
-         < E m a i l L a b e l   E l e m e n t T y p e = " C o l u m n "   E l e m e n t I d = " 7 7 1 8 8 7 1 3 5 "   D a t a T y p e = " T e x t " > E m a i l L a b e l < / E m a i l L a b e l > - 
-         < E m a i l V a l u e   E l e m e n t T y p e = " C o l u m n "   E l e m e n t I d = " 3 8 8 1 2 2 7 6 2 "   D a t a T y p e = " T e x t " > E m a i l V a l u e < / E m a i l V a l u e > - 
-         < F i n i s h e d B y N a m e L a b e l   E l e m e n t T y p e = " C o l u m n "   E l e m e n t I d = " 2 1 0 1 0 0 9 6 5 1 "   D a t a T y p e = " T e x t " > F i n i s h e d B y N a m e L a b e l < / F i n i s h e d B y N a m e L a b e l > - 
-         < F i n i s h e d B y S i g n a t u r e L a b e l   E l e m e n t T y p e = " C o l u m n "   E l e m e n t I d = " 2 0 7 1 3 1 2 7 2 2 "   D a t a T y p e = " T e x t " > F i n i s h e d B y S i g n a t u r e L a b e l < / F i n i s h e d B y S i g n a t u r e L a b e l > - 
-         < H o m e P a g e L a b e l   E l e m e n t T y p e = " C o l u m n "   E l e m e n t I d = " 4 6 2 3 7 4 2 3 1 "   D a t a T y p e = " T e x t " > H o m e P a g e L a b e l < / H o m e P a g e L a b e l > - 
-         < H o m e P a g e V a l u e   E l e m e n t T y p e = " C o l u m n "   E l e m e n t I d = " 5 3 3 5 1 4 0 3 4 "   D a t a T y p e = " T e x t " > H o m e P a g e V a l u e < / H o m e P a g e V a l u e > - 
-         < I n s p e c t i o n I n f o r m a t i o n   E l e m e n t T y p e = " C o l u m n "   E l e m e n t I d = " 1 5 3 2 8 6 0 1 9 9 "   D a t a T y p e = " T e x t " > I n s p e c t i o n I n f o r m a t i o n < / I n s p e c t i o n I n f o r m a t i o n > - 
-         < I t e m D e s c r i p t i o n   E l e m e n t T y p e = " C o l u m n "   E l e m e n t I d = " 1 9 6 5 3 9 3 7 9 0 "   D a t a T y p e = " T e x t " > I t e m D e s c r i p t i o n < / I t e m D e s c r i p t i o n > - 
-         < I t e m T r a c k i n g D e s c r i p t i o n   E l e m e n t T y p e = " C o l u m n "   E l e m e n t I d = " 1 1 1 7 1 0 3 3 4 5 "   D a t a T y p e = " T e x t " > I t e m T r a c k i n g D e s c r i p t i o n < / I t e m T r a c k i n g D e s c r i p t i o n > - 
-         < P h o n e N o L a b e l   E l e m e n t T y p e = " C o l u m n "   E l e m e n t I d = " 1 6 1 4 5 2 6 0 7 8 "   D a t a T y p e = " T e x t " > P h o n e N o L a b e l < / P h o n e N o L a b e l > - 
-         < P h o n e N o V a l u e   E l e m e n t T y p e = " C o l u m n "   E l e m e n t I d = " 1 2 8 6 6 4 9 7 8 1 "   D a t a T y p e = " T e x t " > P h o n e N o V a l u e < / P h o n e N o V a l u e > - 
-         < Q l t y I n s p e c t i o n T e m p l a t e _ D e s c r i p t i o n   E l e m e n t T y p e = " C o l u m n "   E l e m e n t I d = " 1 6 5 2 0 6 9 5 9 8 "   D a t a T y p e = " T e x t " > Q l t y I n s p e c t i o n T e m p l a t e _ D e s c r i p t i o n < / Q l t y I n s p e c t i o n T e m p l a t e _ D e s c r i p t i o n > - 
-         < Q l t y I n s p e c t i o n _ D e s c r i p t i o n   E l e m e n t T y p e = " C o l u m n "   E l e m e n t I d = " 7 3 9 0 1 9 9 1 0 "   D a t a T y p e = " T e x t " > Q l t y I n s p e c t i o n _ D e s c r i p t i o n < / Q l t y I n s p e c t i o n _ D e s c r i p t i o n > - 
-         < Q l t y I n s p e c t i o n _ D i r e c t o r _ N a m e   E l e m e n t T y p e = " C o l u m n "   E l e m e n t I d = " 1 2 5 9 7 6 1 4 6 0 "   D a t a T y p e = " T e x t " > Q l t y I n s p e c t i o n _ D i r e c t o r _ N a m e < / Q l t y I n s p e c t i o n _ D i r e c t o r _ N a m e > - 
-         < Q l t y I n s p e c t i o n _ D i r e c t o r _ T i t l e   E l e m e n t T y p e = " C o l u m n "   E l e m e n t I d = " 2 6 7 7 1 7 5 2 5 "   D a t a T y p e = " T e x t " > Q l t y I n s p e c t i o n _ D i r e c t o r _ T i t l e < / Q l t y I n s p e c t i o n _ D i r e c t o r _ T i t l e > - 
-         < Q l t y I n s p e c t i o n _ F i n i s h e d _ B y _ E m a i l   E l e m e n t T y p e = " C o l u m n "   E l e m e n t I d = " 1 5 2 1 1 3 4 6 3 1 "   D a t a T y p e = " T e x t " > Q l t y I n s p e c t i o n _ F i n i s h e d _ B y _ E m a i l < / Q l t y I n s p e c t i o n _ F i n i s h e d _ B y _ E m a i l > - 
-         < Q l t y I n s p e c t i o n _ F i n i s h e d _ B y _ P h o n e   E l e m e n t T y p e = " C o l u m n "   E l e m e n t I d = " 3 4 7 5 5 7 6 2 5 "   D a t a T y p e = " T e x t " > Q l t y I n s p e c t i o n _ F i n i s h e d _ B y _ P h o n e < / Q l t y I n s p e c t i o n _ F i n i s h e d _ B y _ P h o n e > - 
-         < Q l t y I n s p e c t i o n _ F i n i s h e d _ B y _ T i t l e   E l e m e n t T y p e = " C o l u m n "   E l e m e n t I d = " 4 6 0 0 4 5 6 8 3 "   D a t a T y p e = " T e x t " > Q l t y I n s p e c t i o n _ F i n i s h e d _ B y _ T i t l e < / Q l t y I n s p e c t i o n _ F i n i s h e d _ B y _ T i t l e > - 
-         < Q l t y I n s p e c t i o n _ F i n i s h e d _ B y _ U s e r N a m e   E l e m e n t T y p e = " C o l u m n "   E l e m e n t I d = " 1 9 5 3 6 1 2 5 3 1 "   D a t a T y p e = " T e x t " > Q l t y I n s p e c t i o n _ F i n i s h e d _ B y _ U s e r N a m e < / Q l t y I n s p e c t i o n _ F i n i s h e d _ B y _ U s e r N a m e > - 
-         < Q l t y I n s p e c t i o n _ F i n i s h e d _ B y _ U s e r _ I D   E l e m e n t T y p e = " C o l u m n "   E l e m e n t I d = " 1 7 5 0 5 1 6 3 3 8 "   D a t a T y p e = " C o d e " > Q l t y I n s p e c t i o n _ F i n i s h e d _ B y _ U s e r _ I D < / Q l t y I n s p e c t i o n _ F i n i s h e d _ B y _ U s e r _ I D > - 
-         < Q l t y I n s p e c t i o n _ F i n i s h e d _ D a t e   E l e m e n t T y p e = " C o l u m n "   E l e m e n t I d = " 1 8 3 4 1 2 2 7 6 5 "   D a t a T y p e = " D a t e T i m e " > Q l t y I n s p e c t i o n _ F i n i s h e d _ D a t e < / Q l t y I n s p e c t i o n _ F i n i s h e d _ D a t e > - 
-         < Q l t y I n s p e c t i o n _ N o   E l e m e n t T y p e = " C o l u m n "   E l e m e n t I d = " 2 1 2 0 6 1 5 7 4 9 "   D a t a T y p e = " C o d e " > Q l t y I n s p e c t i o n _ N o < / Q l t y I n s p e c t i o n _ N o > - 
-         < Q l t y I n s p e c t i o n _ R e i n s p e c t i o n N o   E l e m e n t T y p e = " C o l u m n "   E l e m e n t I d = " 7 5 1 7 3 5 6 "   D a t a T y p e = " I n t e g e r " > Q l t y I n s p e c t i o n _ R e i n s p e c t i o n N o < / Q l t y I n s p e c t i o n _ R e i n s p e c t i o n N o > - 
-         < Q l t y I n s p e c t i o n _ R e s u l t _ C o d e   E l e m e n t T y p e = " C o l u m n "   E l e m e n t I d = " 1 8 0 7 0 7 7 0 6 5 "   D a t a T y p e = " C o d e " > Q l t y I n s p e c t i o n _ R e s u l t _ C o d e < / Q l t y I n s p e c t i o n _ R e s u l t _ C o d e > - 
-         < Q l t y I n s p e c t i o n _ R e s u l t _ D e s c r i p t i o n   E l e m e n t T y p e = " C o l u m n "   E l e m e n t I d = " 8 1 0 5 3 8 1 8 8 "   D a t a T y p e = " T e x t " > Q l t y I n s p e c t i o n _ R e s u l t _ D e s c r i p t i o n < / Q l t y I n s p e c t i o n _ R e s u l t _ D e s c r i p t i o n > - 
-         < Q l t y I n s p e c t i o n _ S o u r c e _ C u s t o m _ 1   E l e m e n t T y p e = " C o l u m n "   E l e m e n t I d = " 5 4 6 4 5 3 7 6 5 "   D a t a T y p e = " T e x t " > Q l t y I n s p e c t i o n _ S o u r c e _ C u s t o m _ 1 < / Q l t y I n s p e c t i o n _ S o u r c e _ C u s t o m _ 1 > - 
-         < Q l t y I n s p e c t i o n _ S o u r c e _ C u s t o m _ 1 0   E l e m e n t T y p e = " C o l u m n "   E l e m e n t I d = " 1 5 3 7 6 5 2 9 2 5 "   D a t a T y p e = " D e c i m a l " > Q l t y I n s p e c t i o n _ S o u r c e _ C u s t o m _ 1 0 < / Q l t y I n s p e c t i o n _ S o u r c e _ C u s t o m _ 1 0 > - 
-         < Q l t y I n s p e c t i o n _ S o u r c e _ C u s t o m _ 2   E l e m e n t T y p e = " C o l u m n "   E l e m e n t I d = " 1 8 3 5 4 2 3 6 8 0 "   D a t a T y p e = " T e x t " > Q l t y I n s p e c t i o n _ S o u r c e _ C u s t o m _ 2 < / Q l t y I n s p e c t i o n _ S o u r c e _ C u s t o m _ 2 > - 
-         < Q l t y I n s p e c t i o n _ S o u r c e _ C u s t o m _ 3   E l e m e n t T y p e = " C o l u m n "   E l e m e n t I d = " 1 8 2 1 8 4 6 9 9 9 "   D a t a T y p e = " T e x t " > Q l t y I n s p e c t i o n _ S o u r c e _ C u s t o m _ 3 < / Q l t y I n s p e c t i o n _ S o u r c e _ C u s t o m _ 3 > - 
-         < Q l t y I n s p e c t i o n _ S o u r c e _ C u s t o m _ 4   E l e m e n t T y p e = " C o l u m n "   E l e m e n t I d = " 1 3 6 6 6 3 6 0 8 6 "   D a t a T y p e = " T e x t " > Q l t y I n s p e c t i o n _ S o u r c e _ C u s t o m _ 4 < / Q l t y I n s p e c t i o n _ S o u r c e _ C u s t o m _ 4 > - 
-         < Q l t y I n s p e c t i o n _ S o u r c e _ C u s t o m _ 5   E l e m e n t T y p e = " C o l u m n "   E l e m e n t I d = " 2 0 0 4 3 3 2 7 0 3 "   D a t a T y p e = " T e x t " > Q l t y I n s p e c t i o n _ S o u r c e _ C u s t o m _ 5 < / Q l t y I n s p e c t i o n _ S o u r c e _ C u s t o m _ 5 > - 
-         < Q l t y I n s p e c t i o n _ S o u r c e _ C u s t o m _ 6   E l e m e n t T y p e = " C o l u m n "   E l e m e n t I d = " 9 1 2 4 2 8 5 2 "   D a t a T y p e = " T e x t " > Q l t y I n s p e c t i o n _ S o u r c e _ C u s t o m _ 6 < / Q l t y I n s p e c t i o n _ S o u r c e _ C u s t o m _ 6 > - 
-         < Q l t y I n s p e c t i o n _ S o u r c e _ C u s t o m _ 7   E l e m e n t T y p e = " C o l u m n "   E l e m e n t I d = " 7 2 8 9 3 9 4 6 9 "   D a t a T y p e = " I n t e g e r " > Q l t y I n s p e c t i o n _ S o u r c e _ C u s t o m _ 7 < / Q l t y I n s p e c t i o n _ S o u r c e _ C u s t o m _ 7 > - 
-         < Q l t y I n s p e c t i o n _ S o u r c e _ C u s t o m _ 8   E l e m e n t T y p e = " C o l u m n "   E l e m e n t I d = " 3 7 7 5 4 4 7 4 2 "   D a t a T y p e = " I n t e g e r " > Q l t y I n s p e c t i o n _ S o u r c e _ C u s t o m _ 8 < / Q l t y I n s p e c t i o n _ S o u r c e _ C u s t o m _ 8 > - 
-         < Q l t y I n s p e c t i o n _ S o u r c e _ C u s t o m _ 9   E l e m e n t T y p e = " C o l u m n "   E l e m e n t I d = " 2 6 0 1 5 1 8 7 5 "   D a t a T y p e = " D e c i m a l " > Q l t y I n s p e c t i o n _ S o u r c e _ C u s t o m _ 9 < / Q l t y I n s p e c t i o n _ S o u r c e _ C u s t o m _ 9 > - 
-         < Q l t y I n s p e c t i o n _ S o u r c e _ D o c u m e n t _ N o _   E l e m e n t T y p e = " C o l u m n "   E l e m e n t I d = " 1 6 7 5 9 1 6 2 8 8 "   D a t a T y p e = " C o d e " > Q l t y I n s p e c t i o n _ S o u r c e _ D o c u m e n t _ N o _ < / Q l t y I n s p e c t i o n _ S o u r c e _ D o c u m e n t _ N o _ > - 
-         < Q l t y I n s p e c t i o n _ S o u r c e _ I t e m _ D e s c r i p t i o n   E l e m e n t T y p e = " C o l u m n "   E l e m e n t I d = " 6 4 6 8 9 0 6 3 0 "   D a t a T y p e = " T e x t " > Q l t y I n s p e c t i o n _ S o u r c e _ I t e m _ D e s c r i p t i o n < / Q l t y I n s p e c t i o n _ S o u r c e _ I t e m _ D e s c r i p t i o n > - 
-         < Q l t y I n s p e c t i o n _ S o u r c e _ I t e m _ D e s c r i p t i o n 2   E l e m e n t T y p e = " C o l u m n "   E l e m e n t I d = " 1 2 7 9 3 6 9 3 5 2 "   D a t a T y p e = " T e x t " > Q l t y I n s p e c t i o n _ S o u r c e _ I t e m _ D e s c r i p t i o n 2 < / Q l t y I n s p e c t i o n _ S o u r c e _ I t e m _ D e s c r i p t i o n 2 > - 
-         < Q l t y I n s p e c t i o n _ S o u r c e _ I t e m _ N o _   E l e m e n t T y p e = " C o l u m n "   E l e m e n t I d = " 1 2 6 8 0 5 0 5 1 8 "   D a t a T y p e = " C o d e " > Q l t y I n s p e c t i o n _ S o u r c e _ I t e m _ N o _ < / Q l t y I n s p e c t i o n _ S o u r c e _ I t e m _ N o _ > - 
-         < Q l t y I n s p e c t i o n _ S o u r c e _ L o t _ N o _   E l e m e n t T y p e = " C o l u m n "   E l e m e n t I d = " 1 1 2 3 5 5 1 3 1 2 "   D a t a T y p e = " C o d e " > Q l t y I n s p e c t i o n _ S o u r c e _ L o t _ N o _ < / Q l t y I n s p e c t i o n _ S o u r c e _ L o t _ N o _ > - 
-         < Q l t y I n s p e c t i o n _ S o u r c e _ P a c k a g e _ N o _   E l e m e n t T y p e = " C o l u m n "   E l e m e n t I d = " 1 9 6 1 1 2 9 9 7 "   D a t a T y p e = " C o d e " > Q l t y I n s p e c t i o n _ S o u r c e _ P a c k a g e _ N o _ < / Q l t y I n s p e c t i o n _ S o u r c e _ P a c k a g e _ N o _ > - 
-         < Q l t y I n s p e c t i o n _ S o u r c e _ S e r i a l _ N o _   E l e m e n t T y p e = " C o l u m n "   E l e m e n t I d = " 1 5 2 0 5 9 1 4 4 7 "   D a t a T y p e = " C o d e " > Q l t y I n s p e c t i o n _ S o u r c e _ S e r i a l _ N o _ < / Q l t y I n s p e c t i o n _ S o u r c e _ S e r i a l _ N o _ > - 
-         < Q l t y I n s p e c t i o n _ S o u r c e _ T a s k _ N o _   E l e m e n t T y p e = " C o l u m n "   E l e m e n t I d = " 3 8 4 6 4 4 1 8 2 "   D a t a T y p e = " C o d e " > Q l t y I n s p e c t i o n _ S o u r c e _ T a s k _ N o _ < / Q l t y I n s p e c t i o n _ S o u r c e _ T a s k _ N o _ > - 
-         < Q l t y I n s p e c t i o n _ S o u r c e _ V a r i a n t _ C o d e   E l e m e n t T y p e = " C o l u m n "   E l e m e n t I d = " 1 6 0 8 4 0 3 8 2 1 "   D a t a T y p e = " C o d e " > Q l t y I n s p e c t i o n _ S o u r c e _ V a r i a n t _ C o d e < / Q l t y I n s p e c t i o n _ S o u r c e _ V a r i a n t _ C o d e > - 
-         < Q l t y I n s p e c t i o n _ S t a t u s   E l e m e n t T y p e = " C o l u m n "   E l e m e n t I d = " 8 5 1 7 5 2 7 6 8 "   D a t a T y p e = " E n u m " > Q l t y I n s p e c t i o n _ S t a t u s < / Q l t y I n s p e c t i o n _ S t a t u s > - 
-         < R e i n s p e c t i o n S e q u e n c e I n f o r m a t i o n   E l e m e n t T y p e = " C o l u m n "   E l e m e n t I d = " 7 4 9 5 1 6 5 4 3 "   D a t a T y p e = " T e x t " > R e i n s p e c t i o n S e q u e n c e I n f o r m a t i o n < / R e i n s p e c t i o n S e q u e n c e I n f o r m a t i o n > - 
-         < C u r r e n t I n s p e c t i o n L i n e   E l e m e n t T y p e = " D a t a I t e m "   E l e m e n t I d = " 1 1 9 3 2 1 9 5 9 6 " > - 
-             < C o n d i t i o n L a b e l _ 1   E l e m e n t T y p e = " C o l u m n "   E l e m e n t I d = " 1 2 2 7 8 8 1 1 9 4 "   D a t a T y p e = " T e x t " > C o n d i t i o n L a b e l _ 1 < / C o n d i t i o n L a b e l _ 1 > - 
-             < C o n d i t i o n L a b e l _ 2   E l e m e n t T y p e = " C o l u m n "   E l e m e n t I d = " 1 8 6 5 5 7 7 8 1 1 "   D a t a T y p e = " T e x t " > C o n d i t i o n L a b e l _ 2 < / C o n d i t i o n L a b e l _ 2 > - 
-             < F i e l d _ C o d e   E l e m e n t T y p e = " C o l u m n "   E l e m e n t I d = " 1 3 2 7 2 5 5 7 3 "   D a t a T y p e = " C o d e " > F i e l d _ C o d e < / F i e l d _ C o d e > - 
-             < F i e l d _ D e s c r i p t i o n   E l e m e n t T y p e = " C o l u m n "   E l e m e n t I d = " 1 4 6 8 6 2 1 2 9 8 "   D a t a T y p e = " T e x t " > F i e l d _ D e s c r i p t i o n < / F i e l d _ D e s c r i p t i o n > - 
-             < F i e l d _ H a s E n t e r e d V a l u e   E l e m e n t T y p e = " C o l u m n "   E l e m e n t I d = " 1 7 1 6 2 6 5 8 2 4 "   D a t a T y p e = " B o o l e a n " > F i e l d _ H a s E n t e r e d V a l u e < / F i e l d _ H a s E n t e r e d V a l u e > - 
-             < F i e l d _ I f P e r s o n E m a i l   E l e m e n t T y p e = " C o l u m n "   E l e m e n t I d = " 1 3 4 6 0 5 7 6 5 0 "   D a t a T y p e = " T e x t " > F i e l d _ I f P e r s o n E m a i l < / F i e l d _ I f P e r s o n E m a i l > - 
-             < F i e l d _ I f P e r s o n N a m e   E l e m e n t T y p e = " C o l u m n "   E l e m e n t I d = " 4 1 4 7 0 2 4 4 3 "   D a t a T y p e = " T e x t " > F i e l d _ I f P e r s o n N a m e < / F i e l d _ I f P e r s o n N a m e > - 
-             < F i e l d _ I f P e r s o n P h o n e   E l e m e n t T y p e = " C o l u m n "   E l e m e n t I d = " 1 9 7 4 1 8 8 4 6 2 "   D a t a T y p e = " T e x t " > F i e l d _ I f P e r s o n P h o n e < / F i e l d _ I f P e r s o n P h o n e > - 
-             < F i e l d _ I f P e r s o n T i t l e   E l e m e n t T y p e = " C o l u m n "   E l e m e n t I d = " 1 0 0 4 6 0 9 5 4 2 "   D a t a T y p e = " T e x t " > F i e l d _ I f P e r s o n T i t l e < / F i e l d _ I f P e r s o n T i t l e > - 
-             < F i e l d _ I s L a b e l   E l e m e n t T y p e = " C o l u m n "   E l e m e n t I d = " 2 0 4 3 1 9 3 9 4 0 "   D a t a T y p e = " B o o l e a n " > F i e l d _ I s L a b e l < / F i e l d _ I s L a b e l > - 
-             < F i e l d _ I s P e r s o n F i e l d   E l e m e n t T y p e = " C o l u m n "   E l e m e n t I d = " 4 3 4 5 4 6 6 1 1 "   D a t a T y p e = " B o o l e a n " > F i e l d _ I s P e r s o n F i e l d < / F i e l d _ I s P e r s o n F i e l d > - 
-             < F i e l d _ I s T e x t   E l e m e n t T y p e = " C o l u m n "   E l e m e n t I d = " 5 9 3 6 9 2 0 1 "   D a t a T y p e = " B o o l e a n " > F i e l d _ I s T e x t < / F i e l d _ I s T e x t > - 
-             < F i e l d _ L i n e C o m m e n t a r y   E l e m e n t T y p e = " C o l u m n "   E l e m e n t I d = " 1 8 5 3 8 0 0 2 5 7 "   D a t a T y p e = " T e x t " > F i e l d _ L i n e C o m m e n t a r y < / F i e l d _ L i n e C o m m e n t a r y > - 
-             < F i e l d _ M o d i f i e d B y U s e r E m a i l   E l e m e n t T y p e = " C o l u m n "   E l e m e n t I d = " 2 0 5 3 4 9 0 5 4 5 "   D a t a T y p e = " T e x t " > F i e l d _ M o d i f i e d B y U s e r E m a i l < / F i e l d _ M o d i f i e d B y U s e r E m a i l > - 
-             < F i e l d _ M o d i f i e d B y U s e r I D   E l e m e n t T y p e = " C o l u m n "   E l e m e n t I d = " 1 3 6 3 9 8 7 2 2 2 "   D a t a T y p e = " C o d e " > F i e l d _ M o d i f i e d B y U s e r I D < / F i e l d _ M o d i f i e d B y U s e r I D > - 
-             < F i e l d _ M o d i f i e d B y U s e r J o b T i t l e   E l e m e n t T y p e = " C o l u m n "   E l e m e n t I d = " 7 1 3 3 5 4 3 4 0 "   D a t a T y p e = " T e x t " > F i e l d _ M o d i f i e d B y U s e r J o b T i t l e < / F i e l d _ M o d i f i e d B y U s e r J o b T i t l e > - 
-             < F i e l d _ M o d i f i e d B y U s e r N a m e   E l e m e n t T y p e = " C o l u m n "   E l e m e n t I d = " 7 9 8 2 2 1 9 1 6 "   D a t a T y p e = " T e x t " > F i e l d _ M o d i f i e d B y U s e r N a m e < / F i e l d _ M o d i f i e d B y U s e r N a m e > - 
-             < F i e l d _ M o d i f i e d B y U s e r P h o n e   E l e m e n t T y p e = " C o l u m n "   E l e m e n t I d = " 1 2 9 4 9 7 8 5 4 5 "   D a t a T y p e = " T e x t " > F i e l d _ M o d i f i e d B y U s e r P h o n e < / F i e l d _ M o d i f i e d B y U s e r P h o n e > - 
-             < F i e l d _ M o d i f i e d D a t e T i m e   E l e m e n t T y p e = " C o l u m n "   E l e m e n t I d = " 1 6 5 4 4 9 3 6 9 6 "   D a t a T y p e = " D a t e T i m e " > F i e l d _ M o d i f i e d D a t e T i m e < / F i e l d _ M o d i f i e d D a t e T i m e > - 
-             < F i e l d _ T y p e   E l e m e n t T y p e = " C o l u m n "   E l e m e n t I d = " 1 3 2 8 1 6 4 0 1 6 "   D a t a T y p e = " E n u m " > F i e l d _ T y p e < / F i e l d _ T y p e > - 
-             < L a b e l F i e l d _ D e s c r i p t i o n   E l e m e n t T y p e = " C o l u m n "   E l e m e n t I d = " 3 2 9 5 4 9 8 4 0 "   D a t a T y p e = " T e x t " > L a b e l F i e l d _ D e s c r i p t i o n < / L a b e l F i e l d _ D e s c r i p t i o n > - 
-             < N u m e r i c _ V a l u e   E l e m e n t T y p e = " C o l u m n "   E l e m e n t I d = " 4 6 0 4 1 2 6 4 6 "   D a t a T y p e = " D e c i m a l " > N u m e r i c _ V a l u e < / N u m e r i c _ V a l u e > - 
-             < P r o m p t e d R e s u l t C a p t i o n _ 1   E l e m e n t T y p e = " C o l u m n "   E l e m e n t I d = " 1 5 4 8 2 0 5 1 6 9 "   D a t a T y p e = " T e x t " > P r o m p t e d R e s u l t C a p t i o n _ 1 < / P r o m p t e d R e s u l t C a p t i o n _ 1 > - 
-             < P r o m p t e d R e s u l t C a p t i o n _ 1 0   E l e m e n t T y p e = " C o l u m n "   E l e m e n t I d = " 6 6 5 1 3 7 3 2 1 "   D a t a T y p e = " T e x t " > P r o m p t e d R e s u l t C a p t i o n _ 1 0 < / P r o m p t e d R e s u l t C a p t i o n _ 1 0 > - 
-             < P r o m p t e d R e s u l t C a p t i o n _ 2   E l e m e n t T y p e = " C o l u m n "   E l e m e n t I d = " 2 1 0 9 0 6 5 5 1 0 "   D a t a T y p e = " T e x t " > P r o m p t e d R e s u l t C a p t i o n _ 2 < / P r o m p t e d R e s u l t C a p t i o n _ 2 > - 
-             < P r o m p t e d R e s u l t C a p t i o n _ 3   E l e m e n t T y p e = " C o l u m n "   E l e m e n t I d = " 1 4 7 1 3 6 8 8 9 3 "   D a t a T y p e = " T e x t " > P r o m p t e d R e s u l t C a p t i o n _ 3 < / P r o m p t e d R e s u l t C a p t i o n _ 3 > - 
-             < P r o m p t e d R e s u l t C a p t i o n _ 4   E l e m e n t T y p e = " C o l u m n "   E l e m e n t I d = " 8 3 3 6 7 2 2 7 6 "   D a t a T y p e = " T e x t " > P r o m p t e d R e s u l t C a p t i o n _ 4 < / P r o m p t e d R e s u l t C a p t i o n _ 4 > - 
-             < P r o m p t e d R e s u l t C a p t i o n _ 5   E l e m e n t T y p e = " C o l u m n "   E l e m e n t I d = " 1 9 5 9 7 5 6 5 9 "   D a t a T y p e = " T e x t " > P r o m p t e d R e s u l t C a p t i o n _ 5 < / P r o m p t e d R e s u l t C a p t i o n _ 5 > - 
-             < P r o m p t e d R e s u l t C a p t i o n _ 6   E l e m e n t T y p e = " C o l u m n "   E l e m e n t I d = " 4 4 1 7 2 0 9 5 8 "   D a t a T y p e = " T e x t " > P r o m p t e d R e s u l t C a p t i o n _ 6 < / P r o m p t e d R e s u l t C a p t i o n _ 6 > - 
-             < P r o m p t e d R e s u l t C a p t i o n _ 7   E l e m e n t T y p e = " C o l u m n "   E l e m e n t I d = " 1 0 7 9 4 1 7 5 7 5 "   D a t a T y p e = " T e x t " > P r o m p t e d R e s u l t C a p t i o n _ 7 < / P r o m p t e d R e s u l t C a p t i o n _ 7 > - 
-             < P r o m p t e d R e s u l t C a p t i o n _ 8   E l e m e n t T y p e = " C o l u m n "   E l e m e n t I d = " 1 0 3 9 0 2 9 1 2 "   D a t a T y p e = " T e x t " > P r o m p t e d R e s u l t C a p t i o n _ 8 < / P r o m p t e d R e s u l t C a p t i o n _ 8 > - 
-             < P r o m p t e d R e s u l t C a p t i o n _ 9   E l e m e n t T y p e = " C o l u m n "   E l e m e n t I d = " 7 4 1 5 9 9 5 2 9 "   D a t a T y p e = " T e x t " > P r o m p t e d R e s u l t C a p t i o n _ 9 < / P r o m p t e d R e s u l t C a p t i o n _ 9 > - 
-             < P r o m p t e d R e s u l t C o n d i t i o n D e s c r i p t i o n _ 1   E l e m e n t T y p e = " C o l u m n "   E l e m e n t I d = " 1 7 7 6 7 4 4 4 3 4 "   D a t a T y p e = " T e x t " > P r o m p t e d R e s u l t C o n d i t i o n D e s c r i p t i o n _ 1 < / P r o m p t e d R e s u l t C o n d i t i o n D e s c r i p t i o n _ 1 > - 
-             < P r o m p t e d R e s u l t C o n d i t i o n D e s c r i p t i o n _ 1 0   E l e m e n t T y p e = " C o l u m n "   E l e m e n t I d = " 1 0 2 8 7 8 8 8 8 2 "   D a t a T y p e = " T e x t " > P r o m p t e d R e s u l t C o n d i t i o n D e s c r i p t i o n _ 1 0 < / P r o m p t e d R e s u l t C o n d i t i o n D e s c r i p t i o n _ 1 0 > - 
-             < P r o m p t e d R e s u l t C o n d i t i o n D e s c r i p t i o n _ 2   E l e m e n t T y p e = " C o l u m n "   E l e m e n t I d = " 1 1 3 9 0 4 7 8 1 7 "   D a t a T y p e = " T e x t " > P r o m p t e d R e s u l t C o n d i t i o n D e s c r i p t i o n _ 2 < / P r o m p t e d R e s u l t C o n d i t i o n D e s c r i p t i o n _ 2 > - 
-             < P r o m p t e d R e s u l t C o n d i t i o n D e s c r i p t i o n _ 3   E l e m e n t T y p e = " C o l u m n "   E l e m e n t I d = " 5 0 1 3 5 1 2 0 0 "   D a t a T y p e = " T e x t " > P r o m p t e d R e s u l t C o n d i t i o n D e s c r i p t i o n _ 3 < / P r o m p t e d R e s u l t C o n d i t i o n D e s c r i p t i o n _ 3 > - 
-             < P r o m p t e d R e s u l t C o n d i t i o n D e s c r i p t i o n _ 4   E l e m e n t T y p e = " C o l u m n "   E l e m e n t I d = " 6 7 0 2 6 0 2 2 3 "   D a t a T y p e = " T e x t " > P r o m p t e d R e s u l t C o n d i t i o n D e s c r i p t i o n _ 4 < / P r o m p t e d R e s u l t C o n d i t i o n D e s c r i p t i o n _ 4 > - 
-             < P r o m p t e d R e s u l t C o n d i t i o n D e s c r i p t i o n _ 5   E l e m e n t T y p e = " C o l u m n "   E l e m e n t I d = " 3 2 5 6 3 6 0 6 "   D a t a T y p e = " T e x t " > P r o m p t e d R e s u l t C o n d i t i o n D e s c r i p t i o n _ 5 < / P r o m p t e d R e s u l t C o n d i t i o n D e s c r i p t i o n _ 5 > - 
-             < P r o m p t e d R e s u l t C o n d i t i o n D e s c r i p t i o n _ 6   E l e m e n t T y p e = " C o l u m n "   E l e m e n t I d = " 6 0 5 1 3 3 0 1 1 "   D a t a T y p e = " T e x t " > P r o m p t e d R e s u l t C o n d i t i o n D e s c r i p t i o n _ 6 < / P r o m p t e d R e s u l t C o n d i t i o n D e s c r i p t i o n _ 6 > - 
-             < P r o m p t e d R e s u l t C o n d i t i o n D e s c r i p t i o n _ 7   E l e m e n t T y p e = " C o l u m n "   E l e m e n t I d = " 1 2 4 2 8 2 9 6 2 8 "   D a t a T y p e = " T e x t " > P r o m p t e d R e s u l t C o n d i t i o n D e s c r i p t i o n _ 7 < / P r o m p t e d R e s u l t C o n d i t i o n D e s c r i p t i o n _ 7 > - 
-             < P r o m p t e d R e s u l t C o n d i t i o n D e s c r i p t i o n _ 8   E l e m e n t T y p e = " C o l u m n "   E l e m e n t I d = " 1 0 7 3 9 2 0 6 0 5 "   D a t a T y p e = " T e x t " > P r o m p t e d R e s u l t C o n d i t i o n D e s c r i p t i o n _ 8 < / P r o m p t e d R e s u l t C o n d i t i o n D e s c r i p t i o n _ 8 > - 
-             < P r o m p t e d R e s u l t C o n d i t i o n D e s c r i p t i o n _ 9   E l e m e n t T y p e = " C o l u m n "   E l e m e n t I d = " 1 7 1 1 6 1 7 2 2 2 "   D a t a T y p e = " T e x t " > P r o m p t e d R e s u l t C o n d i t i o n D e s c r i p t i o n _ 9 < / P r o m p t e d R e s u l t C o n d i t i o n D e s c r i p t i o n _ 9 > - 
-             < P r o m p t e d R e s u l t V i s i b l e _ 1   E l e m e n t T y p e = " C o l u m n "   E l e m e n t I d = " 1 3 9 9 7 0 4 4 1 7 "   D a t a T y p e = " B o o l e a n " > P r o m p t e d R e s u l t V i s i b l e _ 1 < / P r o m p t e d R e s u l t V i s i b l e _ 1 > - 
-             < P r o m p t e d R e s u l t V i s i b l e _ 1 0   E l e m e n t T y p e = " C o l u m n "   E l e m e n t I d = " 6 6 3 6 8 2 6 1 7 "   D a t a T y p e = " B o o l e a n " > P r o m p t e d R e s u l t V i s i b l e _ 1 0 < / P r o m p t e d R e s u l t V i s i b l e _ 1 0 > - 
-             < P r o m p t e d R e s u l t V i s i b l e _ 2   E l e m e n t T y p e = " C o l u m n "   E l e m e n t I d = " 2 0 3 7 4 0 1 0 3 4 "   D a t a T y p e = " B o o l e a n " > P r o m p t e d R e s u l t V i s i b l e _ 2 < / P r o m p t e d R e s u l t V i s i b l e _ 2 > - 
-             < P r o m p t e d R e s u l t V i s i b l e _ 3   E l e m e n t T y p e = " C o l u m n "   E l e m e n t I d = " 1 6 1 9 8 6 9 6 4 5 "   D a t a T y p e = " B o o l e a n " > P r o m p t e d R e s u l t V i s i b l e _ 3 < / P r o m p t e d R e s u l t V i s i b l e _ 3 > - 
-             < P r o m p t e d R e s u l t V i s i b l e _ 4   E l e m e n t T y p e = " C o l u m n "   E l e m e n t I d = " 9 8 2 1 7 3 0 2 8 "   D a t a T y p e = " B o o l e a n " > P r o m p t e d R e s u l t V i s i b l e _ 4 < / P r o m p t e d R e s u l t V i s i b l e _ 4 > - 
-             < P r o m p t e d R e s u l t V i s i b l e _ 5   E l e m e n t T y p e = " C o l u m n "   E l e m e n t I d = " 3 4 4 4 7 6 4 1 1 "   D a t a T y p e = " B o o l e a n " > P r o m p t e d R e s u l t V i s i b l e _ 5 < / P r o m p t e d R e s u l t V i s i b l e _ 5 > - 
-             < P r o m p t e d R e s u l t V i s i b l e _ 6   E l e m e n t T y p e = " C o l u m n "   E l e m e n t I d = " 2 9 3 2 2 0 2 0 6 "   D a t a T y p e = " B o o l e a n " > P r o m p t e d R e s u l t V i s i b l e _ 6 < / P r o m p t e d R e s u l t V i s i b l e _ 6 > - 
-             < P r o m p t e d R e s u l t V i s i b l e _ 7   E l e m e n t T y p e = " C o l u m n "   E l e m e n t I d = " 9 3 0 9 1 6 8 2 3 "   D a t a T y p e = " B o o l e a n " > P r o m p t e d R e s u l t V i s i b l e _ 7 < / P r o m p t e d R e s u l t V i s i b l e _ 7 > - 
-             < P r o m p t e d R e s u l t V i s i b l e _ 8   E l e m e n t T y p e = " C o l u m n "   E l e m e n t I d = " 4 4 5 9 7 8 4 0 "   D a t a T y p e = " B o o l e a n " > P r o m p t e d R e s u l t V i s i b l e _ 8 < / P r o m p t e d R e s u l t V i s i b l e _ 8 > - 
-             < P r o m p t e d R e s u l t V i s i b l e _ 9   E l e m e n t T y p e = " C o l u m n "   E l e m e n t I d = " 5 9 3 0 9 8 7 7 7 "   D a t a T y p e = " B o o l e a n " > P r o m p t e d R e s u l t V i s i b l e _ 9 < / P r o m p t e d R e s u l t V i s i b l e _ 9 > - 
-             < T e s t _ R e s u l t   E l e m e n t T y p e = " C o l u m n "   E l e m e n t I d = " 1 2 7 1 0 6 2 1 4 1 "   D a t a T y p e = " C o d e " > T e s t _ R e s u l t < / T e s t _ R e s u l t > - 
-             < T e s t _ R e s u l t D e s c r i p t i o n   E l e m e n t T y p e = " C o l u m n "   E l e m e n t I d = " 1 9 4 3 4 5 8 6 8 5 "   D a t a T y p e = " T e x t " > T e s t _ R e s u l t D e s c r i p t i o n < / T e s t _ R e s u l t D e s c r i p t i o n > - 
-             < T e s t _ V a l u e   E l e m e n t T y p e = " C o l u m n "   E l e m e n t I d = " 8 1 3 5 6 4 5 2 1 "   D a t a T y p e = " T e x t " > T e s t _ V a l u e < / T e s t _ V a l u e > - 
-             < W o r d D e s c r i p t i o n   E l e m e n t T y p e = " C o l u m n "   E l e m e n t I d = " 5 4 4 0 8 2 0 6 7 "   D a t a T y p e = " T e x t " > W o r d D e s c r i p t i o n < / W o r d D e s c r i p t i o n > - 
-             < W o r d R e s u l t D e s c r i p t i o n   E l e m e n t T y p e = " C o l u m n "   E l e m e n t I d = " 1 8 0 3 6 6 7 3 7 2 "   D a t a T y p e = " T e x t " > W o r d R e s u l t D e s c r i p t i o n < / W o r d R e s u l t D e s c r i p t i o n > - 
-             < W o r d U n f a v o r a b l e R e s u l t D e s c r i p t i o n   E l e m e n t T y p e = " C o l u m n "   E l e m e n t I d = " 1 9 9 9 9 7 2 3 5 3 "   D a t a T y p e = " T e x t " > W o r d U n f a v o r a b l e R e s u l t D e s c r i p t i o n < / W o r d U n f a v o r a b l e R e s u l t D e s c r i p t i o n > - 
-         < / C u r r e n t I n s p e c t i o n L i n e > - 
-     < / C u r r e n t I n s p e c t i o n > - 
- < / N a v W o r d R e p o r t X m l P a r t > 
-</file>
-
 <file path=customXml/itemProps1.xml><?xml version="1.0" encoding="utf-8"?>
-<ds:datastoreItem xmlns:ds="http://schemas.openxmlformats.org/officeDocument/2006/customXml" ds:itemID="{17CE75AC-9DC5-435C-A40B-AC945788E8B7}">
+<ds:datastoreItem xmlns:ds="http://schemas.openxmlformats.org/officeDocument/2006/customXml" ds:itemID="{2E90A802-7B58-47C9-A22B-9D7F7F3F9F36}">
   <ds:schemaRefs>
-    <ds:schemaRef ds:uri="http://schemas.openxmlformats.org/officeDocument/2006/bibliography"/>
+    <ds:schemaRef ds:uri="urn:microsoft-dynamics-businesscentral/internal/extended/reports/Qlty_Certificate_of_Analysis/20401/"/>
   </ds:schemaRefs>
 </ds:datastoreItem>
 </file>
@@ -7953,9 +7965,9 @@
 </file>
 
 <file path=customXml/itemProps3.xml><?xml version="1.0" encoding="utf-8"?>
-<ds:datastoreItem xmlns:ds="http://schemas.openxmlformats.org/officeDocument/2006/customXml" ds:itemID="{2E90A802-7B58-47C9-A22B-9D7F7F3F9F36}">
+<ds:datastoreItem xmlns:ds="http://schemas.openxmlformats.org/officeDocument/2006/customXml" ds:itemID="{17CE75AC-9DC5-435C-A40B-AC945788E8B7}">
   <ds:schemaRefs>
-    <ds:schemaRef ds:uri="urn:microsoft-dynamics-businesscentral/internal/extended/reports/Qlty_Certificate_of_Analysis/20401/"/>
+    <ds:schemaRef ds:uri="http://schemas.openxmlformats.org/officeDocument/2006/bibliography"/>
   </ds:schemaRefs>
 </ds:datastoreItem>
 </file>

</xml_diff>

<commit_message>
[Quality Management] Word layouts improvements (#8275)
## What & why

Improvements:
1. Header content
2. Layouts naming
3. Extract common code to methods

<img width="818" height="1011" alt="image"
src="https://github.com/user-attachments/assets/68b02116-a0b5-4b7a-a2eb-b8bc76a63f03"
/>

## Linked work

Fixes 

[AB#611315](https://dynamicssmb2.visualstudio.com/1fcb79e7-ab07-432a-a3c6-6cf5a88ba4a5/_workitems/edit/611315)
</commit_message>
<xml_diff>
--- a/src/Apps/W1/Quality Management/app/src/Reports/QltyCertificateOfAnalysis.docx
+++ b/src/Apps/W1/Quality Management/app/src/Reports/QltyCertificateOfAnalysis.docx
@@ -48,14 +48,12 @@
                     <w:lang w:val="da-DK"/>
                   </w:rPr>
                 </w:pPr>
-                <w:proofErr w:type="spellStart"/>
                 <w:r>
                   <w:rPr>
                     <w:bCs/>
                   </w:rPr>
                   <w:t>InspectionLabel</w:t>
                 </w:r>
-                <w:proofErr w:type="spellEnd"/>
               </w:p>
             </w:tc>
           </w:sdtContent>
@@ -77,14 +75,13 @@
             <w:rPr>
               <w:bCs/>
             </w:rPr>
-            <w:alias w:val="ItemLabel"/>
-            <w:tag w:val="#BC:InsertDataItem,Labels/ItemLabel"/>
-            <w:id w:val="498628940"/>
+            <w:alias w:val="InspectionDescriptionLabel"/>
+            <w:tag w:val="#BC:InsertDataItem,Labels/InspectionDescriptionLabel"/>
+            <w:id w:val="-796517401"/>
             <w:placeholder>
-              <w:docPart w:val="FF71EE4101DE474BB9E0488A463E2526"/>
+              <w:docPart w:val="DefaultPlaceholder_-1854013440"/>
             </w:placeholder>
-            <w:dataBinding w:prefixMappings="xmlns:ns0='urn:microsoft-dynamics-nav/reports/Qlty_Certificate_of_Analysis/20401/'" w:xpath="/ns0:NavWordReportXmlPart[1]/ns0:Labels[1]/ns0:ItemLabel[1]" w:storeItemID="{F00BF611-06BA-436C-902A-C0D5E8DF929B}"/>
-            <w15:color w:val="808080"/>
+            <w:dataBinding w:prefixMappings="xmlns:ns0='urn:microsoft-dynamics-nav/reports/Qlty_Certificate_of_Analysis/20401/' " w:xpath="/ns0:NavWordReportXmlPart[1]/ns0:Labels[1]/ns0:InspectionDescriptionLabel[1]" w:storeItemID="{F00BF611-06BA-436C-902A-C0D5E8DF929B}"/>
             <w:text/>
           </w:sdtPr>
           <w:sdtContent>
@@ -95,17 +92,15 @@
               <w:p>
                 <w:pPr>
                   <w:rPr>
-                    <w:rFonts w:asciiTheme="majorHAnsi" w:hAnsiTheme="majorHAnsi"/>
+                    <w:bCs/>
                   </w:rPr>
                 </w:pPr>
-                <w:proofErr w:type="spellStart"/>
                 <w:r>
                   <w:rPr>
                     <w:bCs/>
                   </w:rPr>
-                  <w:t>ItemLabel</w:t>
+                  <w:t>InspectionDescriptionLabel</w:t>
                 </w:r>
-                <w:proofErr w:type="spellEnd"/>
               </w:p>
             </w:tc>
           </w:sdtContent>
@@ -118,48 +113,46 @@
             <w:pPr>
               <w:rPr>
                 <w:bCs/>
+                <w:lang w:val="da-DK"/>
               </w:rPr>
             </w:pPr>
           </w:p>
         </w:tc>
-        <w:tc>
-          <w:tcPr>
-            <w:tcW w:w="3441" w:type="dxa"/>
-          </w:tcPr>
-          <w:p>
-            <w:pPr>
-              <w:rPr>
-                <w:rFonts w:asciiTheme="majorHAnsi" w:hAnsiTheme="majorHAnsi"/>
-              </w:rPr>
-            </w:pPr>
-            <w:sdt>
-              <w:sdtPr>
-                <w:rPr>
-                  <w:bCs/>
-                </w:rPr>
-                <w:alias w:val="ItemTrackingLabel"/>
-                <w:tag w:val="#BC:InsertDataItem,Labels/ItemTrackingLabel"/>
-                <w:id w:val="-1559471266"/>
-                <w:placeholder>
-                  <w:docPart w:val="720D8BC7856F435891DBD9A3EFEBC90B"/>
-                </w:placeholder>
-                <w:dataBinding w:prefixMappings="xmlns:ns0='urn:microsoft-dynamics-nav/reports/Qlty_Certificate_of_Analysis/20401/'" w:xpath="/ns0:NavWordReportXmlPart[1]/ns0:Labels[1]/ns0:ItemTrackingLabel[1]" w:storeItemID="{F00BF611-06BA-436C-902A-C0D5E8DF929B}"/>
-                <w15:color w:val="808080"/>
-                <w:text/>
-              </w:sdtPr>
-              <w:sdtContent>
-                <w:proofErr w:type="spellStart"/>
+        <w:sdt>
+          <w:sdtPr>
+            <w:rPr>
+              <w:bCs/>
+            </w:rPr>
+            <w:alias w:val="ResultLabel"/>
+            <w:tag w:val="#BC:InsertDataItem,Labels/ResultLabel"/>
+            <w:id w:val="-1826118094"/>
+            <w:placeholder>
+              <w:docPart w:val="DefaultPlaceholder_-1854013440"/>
+            </w:placeholder>
+            <w:dataBinding w:prefixMappings="xmlns:ns0='urn:microsoft-dynamics-nav/reports/Qlty_Certificate_of_Analysis/20401/' " w:xpath="/ns0:NavWordReportXmlPart[1]/ns0:Labels[1]/ns0:ResultLabel[1]" w:storeItemID="{F00BF611-06BA-436C-902A-C0D5E8DF929B}"/>
+            <w:text/>
+          </w:sdtPr>
+          <w:sdtContent>
+            <w:tc>
+              <w:tcPr>
+                <w:tcW w:w="3441" w:type="dxa"/>
+              </w:tcPr>
+              <w:p>
+                <w:pPr>
+                  <w:rPr>
+                    <w:bCs/>
+                  </w:rPr>
+                </w:pPr>
                 <w:r>
                   <w:rPr>
                     <w:bCs/>
                   </w:rPr>
-                  <w:t>ItemTrackingLabel</w:t>
+                  <w:t>ResultLabel</w:t>
                 </w:r>
-                <w:proofErr w:type="spellEnd"/>
-              </w:sdtContent>
-            </w:sdt>
-          </w:p>
-        </w:tc>
+              </w:p>
+            </w:tc>
+          </w:sdtContent>
+        </w:sdt>
       </w:tr>
       <w:tr>
         <w:tc>
@@ -180,11 +173,9 @@
                 <w:text/>
               </w:sdtPr>
               <w:sdtContent>
-                <w:proofErr w:type="spellStart"/>
                 <w:r>
                   <w:t>QltyInspection_No</w:t>
                 </w:r>
-                <w:proofErr w:type="spellEnd"/>
               </w:sdtContent>
             </w:sdt>
             <w:r>
@@ -198,14 +189,12 @@
                 <w:placeholder>
                   <w:docPart w:val="CCFB25846BB14C249ED55F1742B218CA"/>
                 </w:placeholder>
-                <w15:dataBinding w:prefixMappings="xmlns:ns0='urn:microsoft-dynamics-nav/reports/Qlty_Certificate_of_Analysis/20401/' " w:xpath="/ns0:NavWordReportXmlPart[1]/ns0:CurrentInspection[1]/ns0:ReinspectionSequenceInformation[1]" w:storeItemID="{F00BF611-06BA-436C-902A-C0D5E8DF929B}" w16sdtdh:storeItemChecksum="o2KQhw=="/>
+                <w15:dataBinding w:prefixMappings="xmlns:ns0='urn:microsoft-dynamics-nav/reports/Qlty_Certificate_of_Analysis/20401/' " w:xpath="/ns0:NavWordReportXmlPart[1]/ns0:CurrentInspection[1]/ns0:ReinspectionSequenceInformation[1]" w:storeItemID="{F00BF611-06BA-436C-902A-C0D5E8DF929B}" w16sdtdh:storeItemChecksum="ezCkJw=="/>
               </w:sdtPr>
               <w:sdtContent>
-                <w:proofErr w:type="spellStart"/>
                 <w:r>
                   <w:t>ReinspectionSequenceInformation</w:t>
                 </w:r>
-                <w:proofErr w:type="spellEnd"/>
               </w:sdtContent>
             </w:sdt>
           </w:p>
@@ -216,66 +205,71 @@
           </w:tcPr>
           <w:p/>
         </w:tc>
-        <w:tc>
-          <w:tcPr>
-            <w:tcW w:w="3724" w:type="dxa"/>
-          </w:tcPr>
-          <w:sdt>
-            <w:sdtPr>
-              <w:alias w:val="ItemDescription"/>
-              <w:tag w:val="#BC:InsertDataItem,DataItems/CurrentInspection/ItemDescription"/>
-              <w:id w:val="1230270698"/>
-              <w:placeholder>
-                <w:docPart w:val="A13A81114EF64334B8E51A09F947B1C5"/>
-              </w:placeholder>
-              <w:dataBinding w:prefixMappings="xmlns:ns0='urn:microsoft-dynamics-nav/reports/Qlty_Certificate_of_Analysis/20401/'" w:xpath="/ns0:NavWordReportXmlPart[1]/ns0:CurrentInspection[1]/ns0:ItemDescription[1]" w:storeItemID="{F00BF611-06BA-436C-902A-C0D5E8DF929B}"/>
-              <w15:color w:val="808080"/>
-              <w:text/>
-            </w:sdtPr>
-            <w:sdtContent>
+        <w:sdt>
+          <w:sdtPr>
+            <w:alias w:val="QltyInspection_Description"/>
+            <w:tag w:val="#BC:InsertDataItem,DataItems/CurrentInspection/QltyInspection_Description"/>
+            <w:id w:val="-654533579"/>
+            <w:placeholder>
+              <w:docPart w:val="DefaultPlaceholder_-1854013440"/>
+            </w:placeholder>
+            <w:dataBinding w:prefixMappings="xmlns:ns0='urn:microsoft-dynamics-nav/reports/Qlty_Certificate_of_Analysis/20401/' " w:xpath="/ns0:NavWordReportXmlPart[1]/ns0:CurrentInspection[1]/ns0:QltyInspection_Description[1]" w:storeItemID="{F00BF611-06BA-436C-902A-C0D5E8DF929B}"/>
+            <w:text/>
+          </w:sdtPr>
+          <w:sdtContent>
+            <w:tc>
+              <w:tcPr>
+                <w:tcW w:w="3724" w:type="dxa"/>
+              </w:tcPr>
               <w:p>
-                <w:proofErr w:type="spellStart"/>
                 <w:r>
-                  <w:t>ItemDescription</w:t>
+                  <w:t>QltyInspection_Description</w:t>
                 </w:r>
-                <w:proofErr w:type="spellEnd"/>
               </w:p>
-            </w:sdtContent>
-          </w:sdt>
-        </w:tc>
+            </w:tc>
+          </w:sdtContent>
+        </w:sdt>
         <w:tc>
           <w:tcPr>
             <w:tcW w:w="236" w:type="dxa"/>
           </w:tcPr>
           <w:p/>
         </w:tc>
-        <w:tc>
-          <w:tcPr>
-            <w:tcW w:w="3441" w:type="dxa"/>
-          </w:tcPr>
-          <w:sdt>
-            <w:sdtPr>
-              <w:alias w:val="ItemTrackingDescription"/>
-              <w:tag w:val="#BC:InsertDataItem,DataItems/CurrentInspection/ItemTrackingDescription"/>
-              <w:id w:val="-1388635032"/>
-              <w:placeholder>
-                <w:docPart w:val="969E5DE1EBD540C9BA10B6F7575C6F06"/>
-              </w:placeholder>
-              <w:dataBinding w:prefixMappings="xmlns:ns0='urn:microsoft-dynamics-nav/reports/Qlty_Certificate_of_Analysis/20401/'" w:xpath="/ns0:NavWordReportXmlPart[1]/ns0:CurrentInspection[1]/ns0:ItemTrackingDescription[1]" w:storeItemID="{F00BF611-06BA-436C-902A-C0D5E8DF929B}"/>
-              <w15:color w:val="808080"/>
-              <w:text/>
-            </w:sdtPr>
-            <w:sdtContent>
+        <w:sdt>
+          <w:sdtPr>
+            <w:rPr>
+              <w:lang w:val="da-DK"/>
+            </w:rPr>
+            <w:alias w:val="QltyInspection_Result_Description"/>
+            <w:tag w:val="#BC:InsertDataItem,DataItems/CurrentInspection/QltyInspection_Result_Description"/>
+            <w:id w:val="-574823321"/>
+            <w:placeholder>
+              <w:docPart w:val="DefaultPlaceholder_-1854013440"/>
+            </w:placeholder>
+            <w:dataBinding w:prefixMappings="xmlns:ns0='urn:microsoft-dynamics-nav/reports/Qlty_Certificate_of_Analysis/20401/' " w:xpath="/ns0:NavWordReportXmlPart[1]/ns0:CurrentInspection[1]/ns0:QltyInspection_Result_Description[1]" w:storeItemID="{F00BF611-06BA-436C-902A-C0D5E8DF929B}"/>
+            <w:text/>
+          </w:sdtPr>
+          <w:sdtContent>
+            <w:tc>
+              <w:tcPr>
+                <w:tcW w:w="3441" w:type="dxa"/>
+              </w:tcPr>
               <w:p>
-                <w:proofErr w:type="spellStart"/>
+                <w:pPr>
+                  <w:rPr>
+                    <w:lang w:val="da-DK"/>
+                  </w:rPr>
+                </w:pPr>
                 <w:r>
-                  <w:t>ItemTrackingDescription</w:t>
+                  <w:rPr>
+                    <w:lang w:val="da-DK"/>
+                  </w:rPr>
+                  <w:t>QltyInspection_Result_Description</w:t>
                 </w:r>
-                <w:proofErr w:type="spellEnd"/>
               </w:p>
-            </w:sdtContent>
-          </w:sdt>
-        </w:tc>
+            </w:tc>
+          </w:sdtContent>
+        </w:sdt>
       </w:tr>
       <w:tr>
         <w:tc>
@@ -287,6 +281,7 @@
               <w:rPr>
                 <w:sz w:val="16"/>
                 <w:szCs w:val="16"/>
+                <w:lang w:val="da-DK"/>
               </w:rPr>
             </w:pPr>
           </w:p>
@@ -300,6 +295,7 @@
               <w:rPr>
                 <w:sz w:val="16"/>
                 <w:szCs w:val="16"/>
+                <w:lang w:val="da-DK"/>
               </w:rPr>
             </w:pPr>
           </w:p>
@@ -313,6 +309,7 @@
               <w:rPr>
                 <w:sz w:val="16"/>
                 <w:szCs w:val="16"/>
+                <w:lang w:val="da-DK"/>
               </w:rPr>
             </w:pPr>
           </w:p>
@@ -326,6 +323,7 @@
               <w:rPr>
                 <w:sz w:val="16"/>
                 <w:szCs w:val="16"/>
+                <w:lang w:val="da-DK"/>
               </w:rPr>
             </w:pPr>
           </w:p>
@@ -339,10 +337,270 @@
               <w:rPr>
                 <w:sz w:val="16"/>
                 <w:szCs w:val="16"/>
+                <w:lang w:val="da-DK"/>
               </w:rPr>
             </w:pPr>
           </w:p>
         </w:tc>
+      </w:tr>
+      <w:tr>
+        <w:sdt>
+          <w:sdtPr>
+            <w:rPr>
+              <w:b/>
+            </w:rPr>
+            <w:alias w:val="ItemLabel"/>
+            <w:tag w:val="#BC:InsertDataItem,Labels/ItemLabel"/>
+            <w:id w:val="-27641608"/>
+            <w:placeholder>
+              <w:docPart w:val="A17E3AF1DA6C4216BAD9D48E9C1759A6"/>
+            </w:placeholder>
+            <w:dataBinding w:prefixMappings="xmlns:ns0='urn:microsoft-dynamics-nav/reports/Qlty_Certificate_of_Analysis/20401/'" w:xpath="/ns0:NavWordReportXmlPart[1]/ns0:Labels[1]/ns0:ItemLabel[1]" w:storeItemID="{F00BF611-06BA-436C-902A-C0D5E8DF929B}"/>
+            <w15:color w:val="808080"/>
+            <w:text/>
+          </w:sdtPr>
+          <w:sdtContent>
+            <w:tc>
+              <w:tcPr>
+                <w:tcW w:w="2819" w:type="dxa"/>
+              </w:tcPr>
+              <w:p>
+                <w:pPr>
+                  <w:tabs>
+                    <w:tab w:val="left" w:pos="2016"/>
+                  </w:tabs>
+                  <w:rPr>
+                    <w:lang w:val="da-DK"/>
+                  </w:rPr>
+                </w:pPr>
+                <w:r>
+                  <w:rPr>
+                    <w:b/>
+                  </w:rPr>
+                  <w:t>ItemLabel</w:t>
+                </w:r>
+              </w:p>
+            </w:tc>
+          </w:sdtContent>
+        </w:sdt>
+        <w:tc>
+          <w:tcPr>
+            <w:tcW w:w="236" w:type="dxa"/>
+          </w:tcPr>
+          <w:p>
+            <w:pPr>
+              <w:rPr>
+                <w:b/>
+              </w:rPr>
+            </w:pPr>
+          </w:p>
+        </w:tc>
+        <w:sdt>
+          <w:sdtPr>
+            <w:rPr>
+              <w:b/>
+            </w:rPr>
+            <w:alias w:val="ItemDescriptionLabel"/>
+            <w:tag w:val="#BC:InsertDataItem,Labels/ItemDescriptionLabel"/>
+            <w:id w:val="-751035663"/>
+            <w:placeholder>
+              <w:docPart w:val="DefaultPlaceholder_-1854013440"/>
+            </w:placeholder>
+            <w:dataBinding w:prefixMappings="xmlns:ns0='urn:microsoft-dynamics-nav/reports/Qlty_Certificate_of_Analysis/20401/' " w:xpath="/ns0:NavWordReportXmlPart[1]/ns0:Labels[1]/ns0:ItemDescriptionLabel[1]" w:storeItemID="{F00BF611-06BA-436C-902A-C0D5E8DF929B}"/>
+            <w:text/>
+          </w:sdtPr>
+          <w:sdtContent>
+            <w:tc>
+              <w:tcPr>
+                <w:tcW w:w="3724" w:type="dxa"/>
+              </w:tcPr>
+              <w:p>
+                <w:pPr>
+                  <w:rPr>
+                    <w:b/>
+                  </w:rPr>
+                </w:pPr>
+                <w:r>
+                  <w:rPr>
+                    <w:b/>
+                  </w:rPr>
+                  <w:t>ItemDescriptionLabel</w:t>
+                </w:r>
+              </w:p>
+            </w:tc>
+          </w:sdtContent>
+        </w:sdt>
+        <w:tc>
+          <w:tcPr>
+            <w:tcW w:w="236" w:type="dxa"/>
+          </w:tcPr>
+          <w:p>
+            <w:pPr>
+              <w:rPr>
+                <w:b/>
+                <w:bCs/>
+                <w:lang w:val="da-DK"/>
+              </w:rPr>
+            </w:pPr>
+          </w:p>
+        </w:tc>
+        <w:tc>
+          <w:tcPr>
+            <w:tcW w:w="3441" w:type="dxa"/>
+          </w:tcPr>
+          <w:p>
+            <w:pPr>
+              <w:rPr>
+                <w:b/>
+                <w:bCs/>
+                <w:lang w:val="da-DK"/>
+              </w:rPr>
+            </w:pPr>
+            <w:sdt>
+              <w:sdtPr>
+                <w:rPr>
+                  <w:b/>
+                </w:rPr>
+                <w:alias w:val="ItemTrackingLabel"/>
+                <w:tag w:val="#BC:InsertDataItem,Labels/ItemTrackingLabel"/>
+                <w:id w:val="1082493217"/>
+                <w:placeholder>
+                  <w:docPart w:val="6EA3E70EB4354D4EAD29B1FAB831AE0D"/>
+                </w:placeholder>
+                <w:dataBinding w:prefixMappings="xmlns:ns0='urn:microsoft-dynamics-nav/reports/Qlty_Certificate_of_Analysis/20401/'" w:xpath="/ns0:NavWordReportXmlPart[1]/ns0:Labels[1]/ns0:ItemTrackingLabel[1]" w:storeItemID="{F00BF611-06BA-436C-902A-C0D5E8DF929B}"/>
+                <w15:color w:val="808080"/>
+                <w:text/>
+              </w:sdtPr>
+              <w:sdtContent>
+                <w:r>
+                  <w:rPr>
+                    <w:b/>
+                  </w:rPr>
+                  <w:t>ItemTrackingLabel</w:t>
+                </w:r>
+              </w:sdtContent>
+            </w:sdt>
+          </w:p>
+        </w:tc>
+      </w:tr>
+      <w:tr>
+        <w:sdt>
+          <w:sdtPr>
+            <w:alias w:val="ItemIdentifier"/>
+            <w:tag w:val="#BC:InsertDataItem,DataItems/CurrentInspection/ItemIdentifier"/>
+            <w:id w:val="-428274953"/>
+            <w:placeholder>
+              <w:docPart w:val="DefaultPlaceholder_-1854013440"/>
+            </w:placeholder>
+            <w:dataBinding w:prefixMappings="xmlns:ns0='urn:microsoft-dynamics-nav/reports/Qlty_Certificate_of_Analysis/20401/' " w:xpath="/ns0:NavWordReportXmlPart[1]/ns0:CurrentInspection[1]/ns0:ItemIdentifier[1]" w:storeItemID="{F00BF611-06BA-436C-902A-C0D5E8DF929B}"/>
+            <w:text/>
+          </w:sdtPr>
+          <w:sdtContent>
+            <w:tc>
+              <w:tcPr>
+                <w:tcW w:w="2819" w:type="dxa"/>
+              </w:tcPr>
+              <w:p>
+                <w:pPr>
+                  <w:tabs>
+                    <w:tab w:val="left" w:pos="2016"/>
+                  </w:tabs>
+                </w:pPr>
+                <w:r>
+                  <w:t>ItemIdentifier</w:t>
+                </w:r>
+              </w:p>
+            </w:tc>
+          </w:sdtContent>
+        </w:sdt>
+        <w:tc>
+          <w:tcPr>
+            <w:tcW w:w="236" w:type="dxa"/>
+          </w:tcPr>
+          <w:p>
+            <w:pPr>
+              <w:rPr>
+                <w:b/>
+                <w:bCs/>
+                <w:lang w:val="da-DK"/>
+              </w:rPr>
+            </w:pPr>
+          </w:p>
+        </w:tc>
+        <w:tc>
+          <w:tcPr>
+            <w:tcW w:w="3724" w:type="dxa"/>
+          </w:tcPr>
+          <w:sdt>
+            <w:sdtPr>
+              <w:alias w:val="ItemDescription"/>
+              <w:tag w:val="#BC:InsertDataItem,DataItems/CurrentInspection/ItemDescription"/>
+              <w:id w:val="-1168547911"/>
+              <w:placeholder>
+                <w:docPart w:val="AC18F8A884114D9E80792C0DFFAA4E54"/>
+              </w:placeholder>
+              <w:dataBinding w:prefixMappings="xmlns:ns0='urn:microsoft-dynamics-nav/reports/Qlty_Certificate_of_Analysis/20401/'" w:xpath="/ns0:NavWordReportXmlPart[1]/ns0:CurrentInspection[1]/ns0:ItemDescription[1]" w:storeItemID="{F00BF611-06BA-436C-902A-C0D5E8DF929B}"/>
+              <w15:color w:val="808080"/>
+              <w:text/>
+            </w:sdtPr>
+            <w:sdtContent>
+              <w:p>
+                <w:r>
+                  <w:t>ItemDescription</w:t>
+                </w:r>
+              </w:p>
+            </w:sdtContent>
+          </w:sdt>
+        </w:tc>
+        <w:tc>
+          <w:tcPr>
+            <w:tcW w:w="236" w:type="dxa"/>
+          </w:tcPr>
+          <w:p>
+            <w:pPr>
+              <w:rPr>
+                <w:b/>
+                <w:bCs/>
+                <w:lang w:val="da-DK"/>
+              </w:rPr>
+            </w:pPr>
+          </w:p>
+        </w:tc>
+        <w:sdt>
+          <w:sdtPr>
+            <w:rPr>
+              <w:lang w:val="da-DK"/>
+            </w:rPr>
+            <w:alias w:val="ItemTrackingIdentifier"/>
+            <w:tag w:val="#BC:InsertDataItem,DataItems/CurrentInspection/ItemTrackingIdentifier"/>
+            <w:id w:val="-1366745750"/>
+            <w:placeholder>
+              <w:docPart w:val="DefaultPlaceholder_-1854013440"/>
+            </w:placeholder>
+            <w:dataBinding w:prefixMappings="xmlns:ns0='urn:microsoft-dynamics-nav/reports/Qlty_Certificate_of_Analysis/20401/' " w:xpath="/ns0:NavWordReportXmlPart[1]/ns0:CurrentInspection[1]/ns0:ItemTrackingIdentifier[1]" w:storeItemID="{F00BF611-06BA-436C-902A-C0D5E8DF929B}"/>
+            <w:text/>
+          </w:sdtPr>
+          <w:sdtContent>
+            <w:tc>
+              <w:tcPr>
+                <w:tcW w:w="3441" w:type="dxa"/>
+              </w:tcPr>
+              <w:p>
+                <w:pPr>
+                  <w:rPr>
+                    <w:lang w:val="da-DK"/>
+                  </w:rPr>
+                </w:pPr>
+                <w:r>
+                  <w:rPr>
+                    <w:lang w:val="da-DK"/>
+                  </w:rPr>
+                  <w:t>ItemTrackingIdentifier</w:t>
+                </w:r>
+              </w:p>
+            </w:tc>
+          </w:sdtContent>
+        </w:sdt>
       </w:tr>
       <w:tr>
         <w:tc>
@@ -351,12 +609,110 @@
           </w:tcPr>
           <w:p>
             <w:pPr>
-              <w:tabs>
-                <w:tab w:val="left" w:pos="2016"/>
-              </w:tabs>
+              <w:rPr>
+                <w:sz w:val="16"/>
+                <w:szCs w:val="16"/>
+                <w:lang w:val="da-DK"/>
+              </w:rPr>
             </w:pPr>
           </w:p>
         </w:tc>
+        <w:tc>
+          <w:tcPr>
+            <w:tcW w:w="236" w:type="dxa"/>
+          </w:tcPr>
+          <w:p>
+            <w:pPr>
+              <w:rPr>
+                <w:sz w:val="16"/>
+                <w:szCs w:val="16"/>
+                <w:lang w:val="da-DK"/>
+              </w:rPr>
+            </w:pPr>
+          </w:p>
+        </w:tc>
+        <w:tc>
+          <w:tcPr>
+            <w:tcW w:w="3724" w:type="dxa"/>
+          </w:tcPr>
+          <w:p>
+            <w:pPr>
+              <w:rPr>
+                <w:sz w:val="16"/>
+                <w:szCs w:val="16"/>
+                <w:lang w:val="da-DK"/>
+              </w:rPr>
+            </w:pPr>
+          </w:p>
+        </w:tc>
+        <w:tc>
+          <w:tcPr>
+            <w:tcW w:w="236" w:type="dxa"/>
+          </w:tcPr>
+          <w:p>
+            <w:pPr>
+              <w:rPr>
+                <w:sz w:val="16"/>
+                <w:szCs w:val="16"/>
+                <w:lang w:val="da-DK"/>
+              </w:rPr>
+            </w:pPr>
+          </w:p>
+        </w:tc>
+        <w:tc>
+          <w:tcPr>
+            <w:tcW w:w="3441" w:type="dxa"/>
+          </w:tcPr>
+          <w:p>
+            <w:pPr>
+              <w:rPr>
+                <w:sz w:val="16"/>
+                <w:szCs w:val="16"/>
+                <w:lang w:val="da-DK"/>
+              </w:rPr>
+            </w:pPr>
+          </w:p>
+        </w:tc>
+      </w:tr>
+      <w:tr>
+        <w:sdt>
+          <w:sdtPr>
+            <w:rPr>
+              <w:b/>
+            </w:rPr>
+            <w:alias w:val="StatusLabel"/>
+            <w:tag w:val="#BC:InsertDataItem,Labels/StatusLabel"/>
+            <w:id w:val="-133575429"/>
+            <w:placeholder>
+              <w:docPart w:val="DefaultPlaceholder_-1854013440"/>
+            </w:placeholder>
+            <w:dataBinding w:prefixMappings="xmlns:ns0='urn:microsoft-dynamics-nav/reports/Qlty_Certificate_of_Analysis/20401/' " w:xpath="/ns0:NavWordReportXmlPart[1]/ns0:Labels[1]/ns0:StatusLabel[1]" w:storeItemID="{F00BF611-06BA-436C-902A-C0D5E8DF929B}"/>
+            <w:text/>
+          </w:sdtPr>
+          <w:sdtContent>
+            <w:tc>
+              <w:tcPr>
+                <w:tcW w:w="2819" w:type="dxa"/>
+              </w:tcPr>
+              <w:p>
+                <w:pPr>
+                  <w:tabs>
+                    <w:tab w:val="left" w:pos="2016"/>
+                  </w:tabs>
+                  <w:rPr>
+                    <w:lang w:val="da-DK"/>
+                  </w:rPr>
+                </w:pPr>
+                <w:r>
+                  <w:rPr>
+                    <w:b/>
+                  </w:rPr>
+                  <w:t>StatusLabel</w:t>
+                </w:r>
+              </w:p>
+            </w:tc>
+          </w:sdtContent>
+        </w:sdt>
         <w:tc>
           <w:tcPr>
             <w:tcW w:w="236" w:type="dxa"/>
@@ -393,7 +749,7 @@
                 <w:tag w:val="#BC:InsertDataItem,Labels/FinishedOnLabel"/>
                 <w:id w:val="500931782"/>
                 <w:placeholder>
-                  <w:docPart w:val="956387B830824AAFBBDA5B13096155E3"/>
+                  <w:docPart w:val="46143C4E3C274C4B85CEF67A636C58EE"/>
                 </w:placeholder>
                 <w:dataBinding w:prefixMappings="xmlns:ns0='urn:microsoft-dynamics-nav/reports/Qlty_Certificate_of_Analysis/20401/'" w:xpath="/ns0:NavWordReportXmlPart[1]/ns0:Labels[1]/ns0:FinishedOnLabel[1]" w:storeItemID="{F00BF611-06BA-436C-902A-C0D5E8DF929B}"/>
                 <w15:color w:val="808080"/>
@@ -456,7 +812,7 @@
                 <w:tag w:val="#BC:InsertDataItem,Labels/FinishedByLabel"/>
                 <w:id w:val="-927343786"/>
                 <w:placeholder>
-                  <w:docPart w:val="16673B5D3190471B982ACDE7EF77C1F7"/>
+                  <w:docPart w:val="5CECB3F569504ADD9C777BBE3B7A02AC"/>
                 </w:placeholder>
                 <w:dataBinding w:prefixMappings="xmlns:ns0='urn:microsoft-dynamics-nav/reports/Qlty_Certificate_of_Analysis/20401/'" w:xpath="/ns0:NavWordReportXmlPart[1]/ns0:Labels[1]/ns0:FinishedByLabel[1]" w:storeItemID="{F00BF611-06BA-436C-902A-C0D5E8DF929B}"/>
                 <w15:color w:val="808080"/>
@@ -487,14 +843,13 @@
       <w:tr>
         <w:sdt>
           <w:sdtPr>
-            <w:alias w:val="InspectionInformation"/>
-            <w:tag w:val="#BC:InsertDataItem,DataItems/CurrentInspection/InspectionInformation"/>
-            <w:id w:val="-289510379"/>
+            <w:alias w:val="QltyInspection_Status"/>
+            <w:tag w:val="#BC:InsertDataItem,DataItems/CurrentInspection/QltyInspection_Status"/>
+            <w:id w:val="-1321263232"/>
             <w:placeholder>
-              <w:docPart w:val="D7D6E4B6FD5543DA89CF0B73B6E30292"/>
+              <w:docPart w:val="E2A83207E6E0493B8088C2691F10B4FD"/>
             </w:placeholder>
-            <w:dataBinding w:prefixMappings="xmlns:ns0='urn:microsoft-dynamics-nav/reports/Qlty_Certificate_of_Analysis/20401/'" w:xpath="/ns0:NavWordReportXmlPart[1]/ns0:CurrentInspection[1]/ns0:InspectionInformation[1]" w:storeItemID="{F00BF611-06BA-436C-902A-C0D5E8DF929B}"/>
-            <w15:color w:val="808080"/>
+            <w:dataBinding w:prefixMappings="xmlns:ns0='urn:microsoft-dynamics-nav/reports/Qlty_Certificate_of_Analysis/20401/' " w:xpath="/ns0:NavWordReportXmlPart[1]/ns0:CurrentInspection[1]/ns0:QltyInspection_Status[1]" w:storeItemID="{F00BF611-06BA-436C-902A-C0D5E8DF929B}"/>
             <w:text/>
           </w:sdtPr>
           <w:sdtContent>
@@ -503,11 +858,9 @@
                 <w:tcW w:w="2819" w:type="dxa"/>
               </w:tcPr>
               <w:p>
-                <w:proofErr w:type="spellStart"/>
                 <w:r>
-                  <w:t>InspectionInformation</w:t>
+                  <w:t>QltyInspection_Status</w:t>
                 </w:r>
-                <w:proofErr w:type="spellEnd"/>
               </w:p>
             </w:tc>
           </w:sdtContent>
@@ -520,11 +873,11 @@
         </w:tc>
         <w:sdt>
           <w:sdtPr>
-            <w:alias w:val="#Nav: /CurrentInspection/QltyInspection_Finished_Date"/>
-            <w:tag w:val="#Nav: Qlty_Certificate_of_Analysis/20401"/>
+            <w:alias w:val="QltyInspection_Finished_Date"/>
+            <w:tag w:val="#BC:InsertDataItem,DataItems/CurrentInspection/QltyInspection_Finished_Date"/>
             <w:id w:val="-850415512"/>
             <w:placeholder>
-              <w:docPart w:val="2C3F2D2C612B4B84910A5B67FA64B631"/>
+              <w:docPart w:val="D5BA0598CC71407095844CCCC08BFF32"/>
             </w:placeholder>
             <w:dataBinding w:prefixMappings="xmlns:ns0='urn:microsoft-dynamics-nav/reports/Qlty_Certificate_of_Analysis/20401/' " w:xpath="/ns0:NavWordReportXmlPart[1]/ns0:CurrentInspection[1]/ns0:QltyInspection_Finished_Date[1]" w:storeItemID="{F00BF611-06BA-436C-902A-C0D5E8DF929B}"/>
             <w:text/>
@@ -535,11 +888,9 @@
                 <w:tcW w:w="3724" w:type="dxa"/>
               </w:tcPr>
               <w:p>
-                <w:proofErr w:type="spellStart"/>
                 <w:r>
                   <w:t>QltyInspection_Finished_Date</w:t>
                 </w:r>
-                <w:proofErr w:type="spellEnd"/>
               </w:p>
             </w:tc>
           </w:sdtContent>
@@ -560,7 +911,7 @@
               <w:tag w:val="#BC:InsertDataItem,DataItems/CurrentInspection/QltyInspection_Finished_By_User_ID"/>
               <w:id w:val="-140812418"/>
               <w:placeholder>
-                <w:docPart w:val="356FDA147C3941778F5CECA01441805A"/>
+                <w:docPart w:val="AFC2392F1BBE448DA23FA9038EFD15A9"/>
               </w:placeholder>
               <w:dataBinding w:prefixMappings="xmlns:ns0='urn:microsoft-dynamics-nav/reports/Qlty_Certificate_of_Analysis/20401/'" w:xpath="/ns0:NavWordReportXmlPart[1]/ns0:CurrentInspection[1]/ns0:QltyInspection_Finished_By_User_ID[1]" w:storeItemID="{F00BF611-06BA-436C-902A-C0D5E8DF929B}"/>
               <w15:color w:val="808080"/>
@@ -568,11 +919,9 @@
             </w:sdtPr>
             <w:sdtContent>
               <w:p>
-                <w:proofErr w:type="spellStart"/>
                 <w:r>
                   <w:t>QltyInspection_Finished_By_User_ID</w:t>
                 </w:r>
-                <w:proofErr w:type="spellEnd"/>
               </w:p>
             </w:sdtContent>
           </w:sdt>
@@ -633,11 +982,9 @@
                   <w:spacing w:before="0" w:after="0"/>
                   <w:ind w:left="0"/>
                 </w:pPr>
-                <w:proofErr w:type="spellStart"/>
                 <w:r>
                   <w:t>TestLabel</w:t>
                 </w:r>
-                <w:proofErr w:type="spellEnd"/>
               </w:p>
             </w:tc>
           </w:sdtContent>
@@ -665,11 +1012,9 @@
                 <w:text/>
               </w:sdtPr>
               <w:sdtContent>
-                <w:proofErr w:type="spellStart"/>
                 <w:r>
                   <w:t>TestValueLabel</w:t>
                 </w:r>
-                <w:proofErr w:type="spellEnd"/>
               </w:sdtContent>
             </w:sdt>
           </w:p>
@@ -697,11 +1042,9 @@
                 <w:text/>
               </w:sdtPr>
               <w:sdtContent>
-                <w:proofErr w:type="spellStart"/>
                 <w:r>
                   <w:t>ResultLabel</w:t>
                 </w:r>
-                <w:proofErr w:type="spellEnd"/>
               </w:sdtContent>
             </w:sdt>
           </w:p>
@@ -854,7 +1197,6 @@
                               <w:text/>
                             </w:sdtPr>
                             <w:sdtContent>
-                              <w:proofErr w:type="spellStart"/>
                               <w:r>
                                 <w:rPr>
                                   <w:b/>
@@ -880,7 +1222,6 @@
                               <w:r>
                                 <w:t>WordDescription</w:t>
                               </w:r>
-                              <w:proofErr w:type="spellEnd"/>
                             </w:sdtContent>
                           </w:sdt>
                         </w:p>
@@ -909,14 +1250,12 @@
                               <w:pPr>
                                 <w:framePr w:hSpace="180" w:wrap="around" w:hAnchor="text" w:vAnchor="text" w:y="230"/>
                               </w:pPr>
-                              <w:proofErr w:type="spellStart"/>
                               <w:r>
                                 <w:rPr>
                                   <w:bCs/>
                                 </w:rPr>
                                 <w:t>Test_Value</w:t>
                               </w:r>
-                              <w:proofErr w:type="spellEnd"/>
                             </w:p>
                           </w:sdtContent>
                         </w:sdt>
@@ -959,6 +1298,11 @@
                           <w:sdt>
                             <w:sdtPr>
                               <w:rPr>
+                                <w:b/>
+                                <w:bCs/>
+                                <w:i/>
+                                <w:iCs/>
+                                <w:color w:val="C00000"/>
                                 <w:lang w:val="da-DK"/>
                               </w:rPr>
                               <w:alias w:val="WordUnfavorableResultDescription"/>
@@ -967,11 +1311,16 @@
                               <w:placeholder>
                                 <w:docPart w:val="DefaultPlaceholder_-1854013440"/>
                               </w:placeholder>
-                              <w15:dataBinding w:prefixMappings="xmlns:ns0='urn:microsoft-dynamics-nav/reports/Qlty_Certificate_of_Analysis/20401/' " w:xpath="/ns0:NavWordReportXmlPart[1]/ns0:CurrentInspection[1]/ns0:CurrentInspectionLine[1]/ns0:WordUnfavorableResultDescription[1]" w:storeItemID="{F00BF611-06BA-436C-902A-C0D5E8DF929B}" w16sdtdh:storeItemChecksum="o2KQhw=="/>
+                              <w15:dataBinding w:prefixMappings="xmlns:ns0='urn:microsoft-dynamics-nav/reports/Qlty_Certificate_of_Analysis/20401/' " w:xpath="/ns0:NavWordReportXmlPart[1]/ns0:CurrentInspection[1]/ns0:CurrentInspectionLine[1]/ns0:WordUnfavorableResultDescription[1]" w:storeItemID="{F00BF611-06BA-436C-902A-C0D5E8DF929B}" w16sdtdh:storeItemChecksum="ezCkJw=="/>
                             </w:sdtPr>
                             <w:sdtContent>
                               <w:r>
                                 <w:rPr>
+                                  <w:b/>
+                                  <w:bCs/>
+                                  <w:i/>
+                                  <w:iCs/>
+                                  <w:color w:val="C00000"/>
                                   <w:lang w:val="da-DK"/>
                                 </w:rPr>
                                 <w:t>WordUnfavorableResultDescription</w:t>
@@ -1123,7 +1472,6 @@
                 <w:text/>
               </w:sdtPr>
               <w:sdtContent>
-                <w:proofErr w:type="spellStart"/>
                 <w:r>
                   <w:rPr>
                     <w:b w:val="0"/>
@@ -1131,7 +1479,6 @@
                   </w:rPr>
                   <w:t>QltyInspection_Finished_By_UserName</w:t>
                 </w:r>
-                <w:proofErr w:type="spellEnd"/>
               </w:sdtContent>
             </w:sdt>
             <w:r>
@@ -1185,7 +1532,6 @@
                     <w:szCs w:val="16"/>
                   </w:rPr>
                 </w:pPr>
-                <w:proofErr w:type="spellStart"/>
                 <w:r>
                   <w:rPr>
                     <w:b w:val="0"/>
@@ -1193,7 +1539,6 @@
                   </w:rPr>
                   <w:t>QltyInspection_Director_Name</w:t>
                 </w:r>
-                <w:proofErr w:type="spellEnd"/>
               </w:p>
             </w:tc>
           </w:sdtContent>
@@ -1236,7 +1581,6 @@
                     <w:szCs w:val="18"/>
                   </w:rPr>
                 </w:pPr>
-                <w:proofErr w:type="spellStart"/>
                 <w:r>
                   <w:rPr>
                     <w:rFonts w:asciiTheme="majorHAnsi" w:hAnsiTheme="majorHAnsi"/>
@@ -1246,7 +1590,6 @@
                   </w:rPr>
                   <w:t>FinishedByNameLabel</w:t>
                 </w:r>
-                <w:proofErr w:type="spellEnd"/>
               </w:p>
             </w:tc>
           </w:sdtContent>
@@ -1297,7 +1640,6 @@
                     <w:szCs w:val="18"/>
                   </w:rPr>
                 </w:pPr>
-                <w:proofErr w:type="spellStart"/>
                 <w:r>
                   <w:rPr>
                     <w:rFonts w:asciiTheme="majorHAnsi" w:hAnsiTheme="majorHAnsi"/>
@@ -1307,7 +1649,6 @@
                   </w:rPr>
                   <w:t>ApproverNameLabel</w:t>
                 </w:r>
-                <w:proofErr w:type="spellEnd"/>
               </w:p>
             </w:tc>
           </w:sdtContent>
@@ -1396,7 +1737,6 @@
                     <w:szCs w:val="18"/>
                   </w:rPr>
                 </w:pPr>
-                <w:proofErr w:type="spellStart"/>
                 <w:r>
                   <w:rPr>
                     <w:rFonts w:asciiTheme="majorHAnsi" w:hAnsiTheme="majorHAnsi"/>
@@ -1406,7 +1746,6 @@
                   </w:rPr>
                   <w:t>FinishedBySignatureLabel</w:t>
                 </w:r>
-                <w:proofErr w:type="spellEnd"/>
               </w:p>
             </w:tc>
           </w:sdtContent>
@@ -1457,7 +1796,6 @@
                     <w:szCs w:val="18"/>
                   </w:rPr>
                 </w:pPr>
-                <w:proofErr w:type="spellStart"/>
                 <w:r>
                   <w:rPr>
                     <w:rFonts w:asciiTheme="majorHAnsi" w:hAnsiTheme="majorHAnsi"/>
@@ -1467,7 +1805,6 @@
                   </w:rPr>
                   <w:t>ApproverSignatureLabel</w:t>
                 </w:r>
-                <w:proofErr w:type="spellEnd"/>
               </w:p>
             </w:tc>
           </w:sdtContent>
@@ -1514,7 +1851,6 @@
                     <w:szCs w:val="18"/>
                   </w:rPr>
                 </w:pPr>
-                <w:proofErr w:type="spellStart"/>
                 <w:r>
                   <w:rPr>
                     <w:rFonts w:asciiTheme="majorHAnsi" w:hAnsiTheme="majorHAnsi"/>
@@ -1522,7 +1858,6 @@
                   </w:rPr>
                   <w:t>QltyInspection_Finished_Date</w:t>
                 </w:r>
-                <w:proofErr w:type="spellEnd"/>
               </w:p>
             </w:sdtContent>
           </w:sdt>
@@ -1580,7 +1915,6 @@
                     <w:szCs w:val="18"/>
                   </w:rPr>
                 </w:pPr>
-                <w:proofErr w:type="spellStart"/>
                 <w:r>
                   <w:rPr>
                     <w:rFonts w:asciiTheme="majorHAnsi" w:hAnsiTheme="majorHAnsi"/>
@@ -1588,7 +1922,6 @@
                   </w:rPr>
                   <w:t>QltyInspection_Finished_Date</w:t>
                 </w:r>
-                <w:proofErr w:type="spellEnd"/>
               </w:p>
             </w:sdtContent>
           </w:sdt>
@@ -1633,7 +1966,6 @@
                     <w:szCs w:val="18"/>
                   </w:rPr>
                 </w:pPr>
-                <w:proofErr w:type="spellStart"/>
                 <w:r>
                   <w:rPr>
                     <w:rFonts w:asciiTheme="majorHAnsi" w:hAnsiTheme="majorHAnsi"/>
@@ -1643,7 +1975,6 @@
                   </w:rPr>
                   <w:t>DateLabel</w:t>
                 </w:r>
-                <w:proofErr w:type="spellEnd"/>
               </w:p>
             </w:sdtContent>
           </w:sdt>
@@ -1696,7 +2027,6 @@
                     <w:szCs w:val="18"/>
                   </w:rPr>
                 </w:pPr>
-                <w:proofErr w:type="spellStart"/>
                 <w:r>
                   <w:rPr>
                     <w:rFonts w:asciiTheme="majorHAnsi" w:hAnsiTheme="majorHAnsi"/>
@@ -1706,7 +2036,6 @@
                   </w:rPr>
                   <w:t>DateLabel</w:t>
                 </w:r>
-                <w:proofErr w:type="spellEnd"/>
               </w:p>
             </w:sdtContent>
           </w:sdt>
@@ -1727,10 +2056,12 @@
       </w:pPr>
     </w:p>
     <w:sectPr>
-      <w:headerReference w:type="default" r:id="rId9"/>
-      <w:footerReference w:type="default" r:id="rId10"/>
-      <w:headerReference w:type="first" r:id="rId11"/>
-      <w:footerReference w:type="first" r:id="rId12"/>
+      <w:headerReference w:type="even" r:id="rId9"/>
+      <w:headerReference w:type="default" r:id="rId10"/>
+      <w:footerReference w:type="even" r:id="rId11"/>
+      <w:footerReference w:type="default" r:id="rId12"/>
+      <w:headerReference w:type="first" r:id="rId13"/>
+      <w:footerReference w:type="first" r:id="rId14"/>
       <w:pgSz w:w="11906" w:h="16838" w:code="9"/>
       <w:pgMar w:top="1890" w:right="720" w:bottom="1440" w:left="720" w:header="180" w:footer="0" w:gutter="0"/>
       <w:cols w:space="708"/>
@@ -1768,6 +2099,16 @@
 
 <file path=word/footer1.xml><?xml version="1.0" encoding="utf-8"?>
 <w:ftr xmlns:wpc="http://schemas.microsoft.com/office/word/2010/wordprocessingCanvas" xmlns:cx="http://schemas.microsoft.com/office/drawing/2014/chartex" xmlns:cx1="http://schemas.microsoft.com/office/drawing/2015/9/8/chartex" xmlns:cx2="http://schemas.microsoft.com/office/drawing/2015/10/21/chartex" xmlns:cx3="http://schemas.microsoft.com/office/drawing/2016/5/9/chartex" xmlns:cx4="http://schemas.microsoft.com/office/drawing/2016/5/10/chartex" xmlns:cx5="http://schemas.microsoft.com/office/drawing/2016/5/11/chartex" xmlns:cx6="http://schemas.microsoft.com/office/drawing/2016/5/12/chartex" xmlns:cx7="http://schemas.microsoft.com/office/drawing/2016/5/13/chartex" xmlns:cx8="http://schemas.microsoft.com/office/drawing/2016/5/14/chartex" xmlns:mc="http://schemas.openxmlformats.org/markup-compatibility/2006" xmlns:aink="http://schemas.microsoft.com/office/drawing/2016/ink" xmlns:am3d="http://schemas.microsoft.com/office/drawing/2017/model3d" xmlns:o="urn:schemas-microsoft-com:office:office" xmlns:oel="http://schemas.microsoft.com/office/2019/extlst" xmlns:r="http://schemas.openxmlformats.org/officeDocument/2006/relationships" xmlns:m="http://schemas.openxmlformats.org/officeDocument/2006/math" xmlns:v="urn:schemas-microsoft-com:vml" xmlns:wp14="http://schemas.microsoft.com/office/word/2010/wordprocessingDrawing" xmlns:wp="http://schemas.openxmlformats.org/drawingml/2006/wordprocessingDrawing" xmlns:w10="urn:schemas-microsoft-com:office:word" xmlns:w="http://schemas.openxmlformats.org/wordprocessingml/2006/main" xmlns:w14="http://schemas.microsoft.com/office/word/2010/wordml" xmlns:w15="http://schemas.microsoft.com/office/word/2012/wordml" xmlns:w16cex="http://schemas.microsoft.com/office/word/2018/wordml/cex" xmlns:w16cid="http://schemas.microsoft.com/office/word/2016/wordml/cid" xmlns:w16="http://schemas.microsoft.com/office/word/2018/wordml" xmlns:w16du="http://schemas.microsoft.com/office/word/2023/wordml/word16du" xmlns:w16sdtdh="http://schemas.microsoft.com/office/word/2020/wordml/sdtdatahash" xmlns:w16sdtfl="http://schemas.microsoft.com/office/word/2024/wordml/sdtformatlock" xmlns:w16se="http://schemas.microsoft.com/office/word/2015/wordml/symex" xmlns:wpg="http://schemas.microsoft.com/office/word/2010/wordprocessingGroup" xmlns:wpi="http://schemas.microsoft.com/office/word/2010/wordprocessingInk" xmlns:wne="http://schemas.microsoft.com/office/word/2006/wordml" xmlns:wps="http://schemas.microsoft.com/office/word/2010/wordprocessingShape" mc:Ignorable="w14 w15 w16se w16cid w16 w16cex w16sdtdh w16sdtfl w16du wp14">
+  <w:p>
+    <w:pPr>
+      <w:pStyle w:val="Footer"/>
+    </w:pPr>
+  </w:p>
+</w:ftr>
+</file>
+
+<file path=word/footer2.xml><?xml version="1.0" encoding="utf-8"?>
+<w:ftr xmlns:wpc="http://schemas.microsoft.com/office/word/2010/wordprocessingCanvas" xmlns:cx="http://schemas.microsoft.com/office/drawing/2014/chartex" xmlns:cx1="http://schemas.microsoft.com/office/drawing/2015/9/8/chartex" xmlns:cx2="http://schemas.microsoft.com/office/drawing/2015/10/21/chartex" xmlns:cx3="http://schemas.microsoft.com/office/drawing/2016/5/9/chartex" xmlns:cx4="http://schemas.microsoft.com/office/drawing/2016/5/10/chartex" xmlns:cx5="http://schemas.microsoft.com/office/drawing/2016/5/11/chartex" xmlns:cx6="http://schemas.microsoft.com/office/drawing/2016/5/12/chartex" xmlns:cx7="http://schemas.microsoft.com/office/drawing/2016/5/13/chartex" xmlns:cx8="http://schemas.microsoft.com/office/drawing/2016/5/14/chartex" xmlns:mc="http://schemas.openxmlformats.org/markup-compatibility/2006" xmlns:aink="http://schemas.microsoft.com/office/drawing/2016/ink" xmlns:am3d="http://schemas.microsoft.com/office/drawing/2017/model3d" xmlns:o="urn:schemas-microsoft-com:office:office" xmlns:oel="http://schemas.microsoft.com/office/2019/extlst" xmlns:r="http://schemas.openxmlformats.org/officeDocument/2006/relationships" xmlns:m="http://schemas.openxmlformats.org/officeDocument/2006/math" xmlns:v="urn:schemas-microsoft-com:vml" xmlns:wp14="http://schemas.microsoft.com/office/word/2010/wordprocessingDrawing" xmlns:wp="http://schemas.openxmlformats.org/drawingml/2006/wordprocessingDrawing" xmlns:w10="urn:schemas-microsoft-com:office:word" xmlns:w="http://schemas.openxmlformats.org/wordprocessingml/2006/main" xmlns:w14="http://schemas.microsoft.com/office/word/2010/wordml" xmlns:w15="http://schemas.microsoft.com/office/word/2012/wordml" xmlns:w16cex="http://schemas.microsoft.com/office/word/2018/wordml/cex" xmlns:w16cid="http://schemas.microsoft.com/office/word/2016/wordml/cid" xmlns:w16="http://schemas.microsoft.com/office/word/2018/wordml" xmlns:w16du="http://schemas.microsoft.com/office/word/2023/wordml/word16du" xmlns:w16sdtdh="http://schemas.microsoft.com/office/word/2020/wordml/sdtdatahash" xmlns:w16sdtfl="http://schemas.microsoft.com/office/word/2024/wordml/sdtformatlock" xmlns:w16se="http://schemas.microsoft.com/office/word/2015/wordml/symex" xmlns:wpg="http://schemas.microsoft.com/office/word/2010/wordprocessingGroup" xmlns:wpi="http://schemas.microsoft.com/office/word/2010/wordprocessingInk" xmlns:wne="http://schemas.microsoft.com/office/word/2006/wordml" xmlns:wps="http://schemas.microsoft.com/office/word/2010/wordprocessingShape" mc:Ignorable="w14 w15 w16se w16cid w16 w16cex w16sdtdh w16sdtfl w16du wp14">
   <w:sdt>
     <w:sdtPr>
       <w:id w:val="1775671828"/>
@@ -1803,14 +2144,12 @@
             <w:text/>
           </w:sdtPr>
           <w:sdtContent>
-            <w:proofErr w:type="spellStart"/>
             <w:r>
               <w:rPr>
                 <w:rStyle w:val="SidetalpaginaChar"/>
               </w:rPr>
               <w:t>PageLabel</w:t>
             </w:r>
-            <w:proofErr w:type="spellEnd"/>
           </w:sdtContent>
         </w:sdt>
         <w:r>
@@ -1918,7 +2257,7 @@
 </w:ftr>
 </file>
 
-<file path=word/footer2.xml><?xml version="1.0" encoding="utf-8"?>
+<file path=word/footer3.xml><?xml version="1.0" encoding="utf-8"?>
 <w:ftr xmlns:wpc="http://schemas.microsoft.com/office/word/2010/wordprocessingCanvas" xmlns:cx="http://schemas.microsoft.com/office/drawing/2014/chartex" xmlns:cx1="http://schemas.microsoft.com/office/drawing/2015/9/8/chartex" xmlns:cx2="http://schemas.microsoft.com/office/drawing/2015/10/21/chartex" xmlns:cx3="http://schemas.microsoft.com/office/drawing/2016/5/9/chartex" xmlns:cx4="http://schemas.microsoft.com/office/drawing/2016/5/10/chartex" xmlns:cx5="http://schemas.microsoft.com/office/drawing/2016/5/11/chartex" xmlns:cx6="http://schemas.microsoft.com/office/drawing/2016/5/12/chartex" xmlns:cx7="http://schemas.microsoft.com/office/drawing/2016/5/13/chartex" xmlns:cx8="http://schemas.microsoft.com/office/drawing/2016/5/14/chartex" xmlns:mc="http://schemas.openxmlformats.org/markup-compatibility/2006" xmlns:aink="http://schemas.microsoft.com/office/drawing/2016/ink" xmlns:am3d="http://schemas.microsoft.com/office/drawing/2017/model3d" xmlns:o="urn:schemas-microsoft-com:office:office" xmlns:oel="http://schemas.microsoft.com/office/2019/extlst" xmlns:r="http://schemas.openxmlformats.org/officeDocument/2006/relationships" xmlns:m="http://schemas.openxmlformats.org/officeDocument/2006/math" xmlns:v="urn:schemas-microsoft-com:vml" xmlns:wp14="http://schemas.microsoft.com/office/word/2010/wordprocessingDrawing" xmlns:wp="http://schemas.openxmlformats.org/drawingml/2006/wordprocessingDrawing" xmlns:w10="urn:schemas-microsoft-com:office:word" xmlns:w="http://schemas.openxmlformats.org/wordprocessingml/2006/main" xmlns:w14="http://schemas.microsoft.com/office/word/2010/wordml" xmlns:w15="http://schemas.microsoft.com/office/word/2012/wordml" xmlns:w16cex="http://schemas.microsoft.com/office/word/2018/wordml/cex" xmlns:w16cid="http://schemas.microsoft.com/office/word/2016/wordml/cid" xmlns:w16="http://schemas.microsoft.com/office/word/2018/wordml" xmlns:w16du="http://schemas.microsoft.com/office/word/2023/wordml/word16du" xmlns:w16sdtdh="http://schemas.microsoft.com/office/word/2020/wordml/sdtdatahash" xmlns:w16sdtfl="http://schemas.microsoft.com/office/word/2024/wordml/sdtformatlock" xmlns:w16se="http://schemas.microsoft.com/office/word/2015/wordml/symex" xmlns:wpg="http://schemas.microsoft.com/office/word/2010/wordprocessingGroup" xmlns:wpi="http://schemas.microsoft.com/office/word/2010/wordprocessingInk" xmlns:wne="http://schemas.microsoft.com/office/word/2006/wordml" xmlns:wps="http://schemas.microsoft.com/office/word/2010/wordprocessingShape" mc:Ignorable="w14 w15 w16se w16cid w16 w16cex w16sdtdh w16sdtfl w16du wp14">
   <w:tbl>
     <w:tblPr>
@@ -1956,11 +2295,9 @@
               <w:vAlign w:val="center"/>
             </w:tcPr>
             <w:p>
-              <w:proofErr w:type="spellStart"/>
               <w:r>
                 <w:t>HomePageLabel</w:t>
               </w:r>
-              <w:proofErr w:type="spellEnd"/>
             </w:p>
           </w:tc>
         </w:sdtContent>
@@ -2069,11 +2406,9 @@
               <w:text/>
             </w:sdtPr>
             <w:sdtContent>
-              <w:proofErr w:type="spellStart"/>
               <w:r>
                 <w:t>HomePageValue</w:t>
               </w:r>
-              <w:proofErr w:type="spellEnd"/>
             </w:sdtContent>
           </w:sdt>
         </w:p>
@@ -2191,14 +2526,12 @@
                   <w:text/>
                 </w:sdtPr>
                 <w:sdtContent>
-                  <w:proofErr w:type="spellStart"/>
                   <w:r>
                     <w:rPr>
                       <w:rStyle w:val="SidetalpaginaChar"/>
                     </w:rPr>
                     <w:t>PageLabel</w:t>
                   </w:r>
-                  <w:proofErr w:type="spellEnd"/>
                 </w:sdtContent>
               </w:sdt>
               <w:r>
@@ -2331,6 +2664,16 @@
 <w:hdr xmlns:wpc="http://schemas.microsoft.com/office/word/2010/wordprocessingCanvas" xmlns:cx="http://schemas.microsoft.com/office/drawing/2014/chartex" xmlns:cx1="http://schemas.microsoft.com/office/drawing/2015/9/8/chartex" xmlns:cx2="http://schemas.microsoft.com/office/drawing/2015/10/21/chartex" xmlns:cx3="http://schemas.microsoft.com/office/drawing/2016/5/9/chartex" xmlns:cx4="http://schemas.microsoft.com/office/drawing/2016/5/10/chartex" xmlns:cx5="http://schemas.microsoft.com/office/drawing/2016/5/11/chartex" xmlns:cx6="http://schemas.microsoft.com/office/drawing/2016/5/12/chartex" xmlns:cx7="http://schemas.microsoft.com/office/drawing/2016/5/13/chartex" xmlns:cx8="http://schemas.microsoft.com/office/drawing/2016/5/14/chartex" xmlns:mc="http://schemas.openxmlformats.org/markup-compatibility/2006" xmlns:aink="http://schemas.microsoft.com/office/drawing/2016/ink" xmlns:am3d="http://schemas.microsoft.com/office/drawing/2017/model3d" xmlns:o="urn:schemas-microsoft-com:office:office" xmlns:oel="http://schemas.microsoft.com/office/2019/extlst" xmlns:r="http://schemas.openxmlformats.org/officeDocument/2006/relationships" xmlns:m="http://schemas.openxmlformats.org/officeDocument/2006/math" xmlns:v="urn:schemas-microsoft-com:vml" xmlns:wp14="http://schemas.microsoft.com/office/word/2010/wordprocessingDrawing" xmlns:wp="http://schemas.openxmlformats.org/drawingml/2006/wordprocessingDrawing" xmlns:w10="urn:schemas-microsoft-com:office:word" xmlns:w="http://schemas.openxmlformats.org/wordprocessingml/2006/main" xmlns:w14="http://schemas.microsoft.com/office/word/2010/wordml" xmlns:w15="http://schemas.microsoft.com/office/word/2012/wordml" xmlns:w16cex="http://schemas.microsoft.com/office/word/2018/wordml/cex" xmlns:w16cid="http://schemas.microsoft.com/office/word/2016/wordml/cid" xmlns:w16="http://schemas.microsoft.com/office/word/2018/wordml" xmlns:w16du="http://schemas.microsoft.com/office/word/2023/wordml/word16du" xmlns:w16sdtdh="http://schemas.microsoft.com/office/word/2020/wordml/sdtdatahash" xmlns:w16sdtfl="http://schemas.microsoft.com/office/word/2024/wordml/sdtformatlock" xmlns:w16se="http://schemas.microsoft.com/office/word/2015/wordml/symex" xmlns:wpg="http://schemas.microsoft.com/office/word/2010/wordprocessingGroup" xmlns:wpi="http://schemas.microsoft.com/office/word/2010/wordprocessingInk" xmlns:wne="http://schemas.microsoft.com/office/word/2006/wordml" xmlns:wps="http://schemas.microsoft.com/office/word/2010/wordprocessingShape" mc:Ignorable="w14 w15 w16se w16cid w16 w16cex w16sdtdh w16sdtfl w16du wp14">
   <w:p>
     <w:pPr>
+      <w:pStyle w:val="Header"/>
+    </w:pPr>
+  </w:p>
+</w:hdr>
+</file>
+
+<file path=word/header2.xml><?xml version="1.0" encoding="utf-8"?>
+<w:hdr xmlns:wpc="http://schemas.microsoft.com/office/word/2010/wordprocessingCanvas" xmlns:cx="http://schemas.microsoft.com/office/drawing/2014/chartex" xmlns:cx1="http://schemas.microsoft.com/office/drawing/2015/9/8/chartex" xmlns:cx2="http://schemas.microsoft.com/office/drawing/2015/10/21/chartex" xmlns:cx3="http://schemas.microsoft.com/office/drawing/2016/5/9/chartex" xmlns:cx4="http://schemas.microsoft.com/office/drawing/2016/5/10/chartex" xmlns:cx5="http://schemas.microsoft.com/office/drawing/2016/5/11/chartex" xmlns:cx6="http://schemas.microsoft.com/office/drawing/2016/5/12/chartex" xmlns:cx7="http://schemas.microsoft.com/office/drawing/2016/5/13/chartex" xmlns:cx8="http://schemas.microsoft.com/office/drawing/2016/5/14/chartex" xmlns:mc="http://schemas.openxmlformats.org/markup-compatibility/2006" xmlns:aink="http://schemas.microsoft.com/office/drawing/2016/ink" xmlns:am3d="http://schemas.microsoft.com/office/drawing/2017/model3d" xmlns:o="urn:schemas-microsoft-com:office:office" xmlns:oel="http://schemas.microsoft.com/office/2019/extlst" xmlns:r="http://schemas.openxmlformats.org/officeDocument/2006/relationships" xmlns:m="http://schemas.openxmlformats.org/officeDocument/2006/math" xmlns:v="urn:schemas-microsoft-com:vml" xmlns:wp14="http://schemas.microsoft.com/office/word/2010/wordprocessingDrawing" xmlns:wp="http://schemas.openxmlformats.org/drawingml/2006/wordprocessingDrawing" xmlns:w10="urn:schemas-microsoft-com:office:word" xmlns:w="http://schemas.openxmlformats.org/wordprocessingml/2006/main" xmlns:w14="http://schemas.microsoft.com/office/word/2010/wordml" xmlns:w15="http://schemas.microsoft.com/office/word/2012/wordml" xmlns:w16cex="http://schemas.microsoft.com/office/word/2018/wordml/cex" xmlns:w16cid="http://schemas.microsoft.com/office/word/2016/wordml/cid" xmlns:w16="http://schemas.microsoft.com/office/word/2018/wordml" xmlns:w16du="http://schemas.microsoft.com/office/word/2023/wordml/word16du" xmlns:w16sdtdh="http://schemas.microsoft.com/office/word/2020/wordml/sdtdatahash" xmlns:w16sdtfl="http://schemas.microsoft.com/office/word/2024/wordml/sdtformatlock" xmlns:w16se="http://schemas.microsoft.com/office/word/2015/wordml/symex" xmlns:wpg="http://schemas.microsoft.com/office/word/2010/wordprocessingGroup" xmlns:wpi="http://schemas.microsoft.com/office/word/2010/wordprocessingInk" xmlns:wne="http://schemas.microsoft.com/office/word/2006/wordml" xmlns:wps="http://schemas.microsoft.com/office/word/2010/wordprocessingShape" mc:Ignorable="w14 w15 w16se w16cid w16 w16cex w16sdtdh w16sdtfl w16du wp14">
+  <w:p>
+    <w:pPr>
       <w:rPr>
         <w:rStyle w:val="Strong"/>
       </w:rPr>
@@ -2379,7 +2722,6 @@
                   <w:b/>
                 </w:rPr>
               </w:pPr>
-              <w:proofErr w:type="spellStart"/>
               <w:r>
                 <w:rPr>
                   <w:rStyle w:val="Strong"/>
@@ -2387,7 +2729,6 @@
                 </w:rPr>
                 <w:t>ReportTitleLabel</w:t>
               </w:r>
-              <w:proofErr w:type="spellEnd"/>
             </w:p>
           </w:tc>
         </w:sdtContent>
@@ -2457,11 +2798,9 @@
           </w:sdtPr>
           <w:sdtContent>
             <w:p>
-              <w:proofErr w:type="spellStart"/>
               <w:r>
                 <w:t>QltyInspection_No</w:t>
               </w:r>
-              <w:proofErr w:type="spellEnd"/>
             </w:p>
           </w:sdtContent>
         </w:sdt>
@@ -2483,7 +2822,7 @@
           <w:placeholder>
             <w:docPart w:val="DefaultPlaceholder_-1854013440"/>
           </w:placeholder>
-          <w15:dataBinding w:prefixMappings="xmlns:ns0='urn:microsoft-dynamics-nav/reports/Qlty_Certificate_of_Analysis/20401/' " w:xpath="/ns0:NavWordReportXmlPart[1]/ns0:CurrentInspection[1]/ns0:ReinspectionSequenceInformation[1]" w:storeItemID="{F00BF611-06BA-436C-902A-C0D5E8DF929B}" w16sdtdh:storeItemChecksum="o2KQhw=="/>
+          <w15:dataBinding w:prefixMappings="xmlns:ns0='urn:microsoft-dynamics-nav/reports/Qlty_Certificate_of_Analysis/20401/' " w:xpath="/ns0:NavWordReportXmlPart[1]/ns0:CurrentInspection[1]/ns0:ReinspectionSequenceInformation[1]" w:storeItemID="{F00BF611-06BA-436C-902A-C0D5E8DF929B}" w16sdtdh:storeItemChecksum="ezCkJw=="/>
         </w:sdtPr>
         <w:sdtContent>
           <w:tc>
@@ -2491,11 +2830,9 @@
               <w:tcW w:w="3595" w:type="dxa"/>
             </w:tcPr>
             <w:p>
-              <w:proofErr w:type="spellStart"/>
               <w:r>
                 <w:t>ReinspectionSequenceInformation</w:t>
               </w:r>
-              <w:proofErr w:type="spellEnd"/>
             </w:p>
           </w:tc>
         </w:sdtContent>
@@ -2513,7 +2850,7 @@
 </w:hdr>
 </file>
 
-<file path=word/header2.xml><?xml version="1.0" encoding="utf-8"?>
+<file path=word/header3.xml><?xml version="1.0" encoding="utf-8"?>
 <w:hdr xmlns:a="http://schemas.openxmlformats.org/drawingml/2006/main" xmlns:pic="http://schemas.openxmlformats.org/drawingml/2006/picture" xmlns:a14="http://schemas.microsoft.com/office/drawing/2010/main" xmlns:wpc="http://schemas.microsoft.com/office/word/2010/wordprocessingCanvas" xmlns:cx="http://schemas.microsoft.com/office/drawing/2014/chartex" xmlns:cx1="http://schemas.microsoft.com/office/drawing/2015/9/8/chartex" xmlns:cx2="http://schemas.microsoft.com/office/drawing/2015/10/21/chartex" xmlns:cx3="http://schemas.microsoft.com/office/drawing/2016/5/9/chartex" xmlns:cx4="http://schemas.microsoft.com/office/drawing/2016/5/10/chartex" xmlns:cx5="http://schemas.microsoft.com/office/drawing/2016/5/11/chartex" xmlns:cx6="http://schemas.microsoft.com/office/drawing/2016/5/12/chartex" xmlns:cx7="http://schemas.microsoft.com/office/drawing/2016/5/13/chartex" xmlns:cx8="http://schemas.microsoft.com/office/drawing/2016/5/14/chartex" xmlns:mc="http://schemas.openxmlformats.org/markup-compatibility/2006" xmlns:aink="http://schemas.microsoft.com/office/drawing/2016/ink" xmlns:am3d="http://schemas.microsoft.com/office/drawing/2017/model3d" xmlns:o="urn:schemas-microsoft-com:office:office" xmlns:oel="http://schemas.microsoft.com/office/2019/extlst" xmlns:r="http://schemas.openxmlformats.org/officeDocument/2006/relationships" xmlns:m="http://schemas.openxmlformats.org/officeDocument/2006/math" xmlns:v="urn:schemas-microsoft-com:vml" xmlns:wp14="http://schemas.microsoft.com/office/word/2010/wordprocessingDrawing" xmlns:wp="http://schemas.openxmlformats.org/drawingml/2006/wordprocessingDrawing" xmlns:w10="urn:schemas-microsoft-com:office:word" xmlns:w="http://schemas.openxmlformats.org/wordprocessingml/2006/main" xmlns:w14="http://schemas.microsoft.com/office/word/2010/wordml" xmlns:w15="http://schemas.microsoft.com/office/word/2012/wordml" xmlns:w16cex="http://schemas.microsoft.com/office/word/2018/wordml/cex" xmlns:w16cid="http://schemas.microsoft.com/office/word/2016/wordml/cid" xmlns:w16="http://schemas.microsoft.com/office/word/2018/wordml" xmlns:w16du="http://schemas.microsoft.com/office/word/2023/wordml/word16du" xmlns:w16sdtdh="http://schemas.microsoft.com/office/word/2020/wordml/sdtdatahash" xmlns:w16sdtfl="http://schemas.microsoft.com/office/word/2024/wordml/sdtformatlock" xmlns:w16se="http://schemas.microsoft.com/office/word/2015/wordml/symex" xmlns:wpg="http://schemas.microsoft.com/office/word/2010/wordprocessingGroup" xmlns:wpi="http://schemas.microsoft.com/office/word/2010/wordprocessingInk" xmlns:wne="http://schemas.microsoft.com/office/word/2006/wordml" xmlns:wps="http://schemas.microsoft.com/office/word/2010/wordprocessingShape" mc:Ignorable="w14 w15 w16se w16cid w16 w16cex w16sdtdh w16sdtfl w16du wp14">
   <w:tbl>
     <w:tblPr>
@@ -2555,7 +2892,6 @@
               <w:text/>
             </w:sdtPr>
             <w:sdtContent>
-              <w:proofErr w:type="spellStart"/>
               <w:r>
                 <w:rPr>
                   <w:b/>
@@ -2563,7 +2899,6 @@
                 </w:rPr>
                 <w:t>ReportTitleLabel</w:t>
               </w:r>
-              <w:proofErr w:type="spellEnd"/>
             </w:sdtContent>
           </w:sdt>
         </w:p>
@@ -2689,7 +3024,7 @@
           <w:placeholder>
             <w:docPart w:val="DefaultPlaceholder_-1854013440"/>
           </w:placeholder>
-          <w15:dataBinding w:prefixMappings="xmlns:ns0='urn:microsoft-dynamics-nav/reports/Qlty_Certificate_of_Analysis/20401/' " w:xpath="/ns0:NavWordReportXmlPart[1]/ns0:CurrentInspection[1]/ns0:COAContact_All[1]" w:storeItemID="{F00BF611-06BA-436C-902A-C0D5E8DF929B}" w16sdtdh:storeItemChecksum="o2KQhw=="/>
+          <w15:dataBinding w:prefixMappings="xmlns:ns0='urn:microsoft-dynamics-nav/reports/Qlty_Certificate_of_Analysis/20401/' " w:xpath="/ns0:NavWordReportXmlPart[1]/ns0:CurrentInspection[1]/ns0:COAContact_All[1]" w:storeItemID="{F00BF611-06BA-436C-902A-C0D5E8DF929B}" w16sdtdh:storeItemChecksum="ezCkJw=="/>
         </w:sdtPr>
         <w:sdtContent>
           <w:tc>
@@ -2714,11 +3049,9 @@
                   <w14:ligatures w14:val="none"/>
                 </w:rPr>
               </w:pPr>
-              <w:proofErr w:type="spellStart"/>
               <w:r>
                 <w:t>COAContact_All</w:t>
               </w:r>
-              <w:proofErr w:type="spellEnd"/>
             </w:p>
           </w:tc>
         </w:sdtContent>
@@ -2767,11 +3100,9 @@
               </w:rPr>
             </w:sdtEndPr>
             <w:sdtContent>
-              <w:proofErr w:type="spellStart"/>
               <w:r>
                 <w:t>CompanyInformation_All</w:t>
               </w:r>
-              <w:proofErr w:type="spellEnd"/>
             </w:sdtContent>
           </w:sdt>
         </w:p>
@@ -5146,64 +5477,6 @@
     </w:docPart>
     <w:docPart>
       <w:docPartPr>
-        <w:name w:val="FF71EE4101DE474BB9E0488A463E2526"/>
-        <w:category>
-          <w:name w:val="General"/>
-          <w:gallery w:val="placeholder"/>
-        </w:category>
-        <w:types>
-          <w:type w:val="bbPlcHdr"/>
-        </w:types>
-        <w:behaviors>
-          <w:behavior w:val="content"/>
-        </w:behaviors>
-        <w:guid w:val="{885FA53D-DC76-4ACB-90FD-8ED0014F6AF5}"/>
-      </w:docPartPr>
-      <w:docPartBody>
-        <w:p>
-          <w:pPr>
-            <w:pStyle w:val="FF71EE4101DE474BB9E0488A463E2526"/>
-          </w:pPr>
-          <w:r>
-            <w:rPr>
-              <w:rStyle w:val="PlaceholderText"/>
-            </w:rPr>
-            <w:t>Klik eller tryk her for at skrive tekst.</w:t>
-          </w:r>
-        </w:p>
-      </w:docPartBody>
-    </w:docPart>
-    <w:docPart>
-      <w:docPartPr>
-        <w:name w:val="720D8BC7856F435891DBD9A3EFEBC90B"/>
-        <w:category>
-          <w:name w:val="General"/>
-          <w:gallery w:val="placeholder"/>
-        </w:category>
-        <w:types>
-          <w:type w:val="bbPlcHdr"/>
-        </w:types>
-        <w:behaviors>
-          <w:behavior w:val="content"/>
-        </w:behaviors>
-        <w:guid w:val="{0BAA0E83-380E-47BA-8E79-E8470EECB0AE}"/>
-      </w:docPartPr>
-      <w:docPartBody>
-        <w:p>
-          <w:pPr>
-            <w:pStyle w:val="720D8BC7856F435891DBD9A3EFEBC90B"/>
-          </w:pPr>
-          <w:r>
-            <w:rPr>
-              <w:rStyle w:val="PlaceholderText"/>
-            </w:rPr>
-            <w:t>Klik eller tryk her for at skrive tekst.</w:t>
-          </w:r>
-        </w:p>
-      </w:docPartBody>
-    </w:docPart>
-    <w:docPart>
-      <w:docPartPr>
         <w:name w:val="653C3B5A1DC9455CAC82A8C31CEEA911"/>
         <w:category>
           <w:name w:val="General"/>
@@ -5262,209 +5535,6 @@
     </w:docPart>
     <w:docPart>
       <w:docPartPr>
-        <w:name w:val="A13A81114EF64334B8E51A09F947B1C5"/>
-        <w:category>
-          <w:name w:val="General"/>
-          <w:gallery w:val="placeholder"/>
-        </w:category>
-        <w:types>
-          <w:type w:val="bbPlcHdr"/>
-        </w:types>
-        <w:behaviors>
-          <w:behavior w:val="content"/>
-        </w:behaviors>
-        <w:guid w:val="{770ABB21-54B2-4E80-8F14-544C7E352971}"/>
-      </w:docPartPr>
-      <w:docPartBody>
-        <w:p>
-          <w:pPr>
-            <w:pStyle w:val="A13A81114EF64334B8E51A09F947B1C5"/>
-          </w:pPr>
-          <w:r>
-            <w:rPr>
-              <w:rStyle w:val="PlaceholderText"/>
-            </w:rPr>
-            <w:t>Klik eller tryk her for at skrive tekst.</w:t>
-          </w:r>
-        </w:p>
-      </w:docPartBody>
-    </w:docPart>
-    <w:docPart>
-      <w:docPartPr>
-        <w:name w:val="969E5DE1EBD540C9BA10B6F7575C6F06"/>
-        <w:category>
-          <w:name w:val="General"/>
-          <w:gallery w:val="placeholder"/>
-        </w:category>
-        <w:types>
-          <w:type w:val="bbPlcHdr"/>
-        </w:types>
-        <w:behaviors>
-          <w:behavior w:val="content"/>
-        </w:behaviors>
-        <w:guid w:val="{BA95A577-9AEF-454B-B61C-43D2C16BA4D9}"/>
-      </w:docPartPr>
-      <w:docPartBody>
-        <w:p>
-          <w:pPr>
-            <w:pStyle w:val="969E5DE1EBD540C9BA10B6F7575C6F06"/>
-          </w:pPr>
-          <w:r>
-            <w:rPr>
-              <w:rStyle w:val="PlaceholderText"/>
-            </w:rPr>
-            <w:t>Klik eller tryk her for at skrive tekst.</w:t>
-          </w:r>
-        </w:p>
-      </w:docPartBody>
-    </w:docPart>
-    <w:docPart>
-      <w:docPartPr>
-        <w:name w:val="956387B830824AAFBBDA5B13096155E3"/>
-        <w:category>
-          <w:name w:val="General"/>
-          <w:gallery w:val="placeholder"/>
-        </w:category>
-        <w:types>
-          <w:type w:val="bbPlcHdr"/>
-        </w:types>
-        <w:behaviors>
-          <w:behavior w:val="content"/>
-        </w:behaviors>
-        <w:guid w:val="{0A062631-35CA-417A-A6C0-7DD31A412C14}"/>
-      </w:docPartPr>
-      <w:docPartBody>
-        <w:p>
-          <w:pPr>
-            <w:pStyle w:val="956387B830824AAFBBDA5B13096155E3"/>
-          </w:pPr>
-          <w:r>
-            <w:rPr>
-              <w:rStyle w:val="PlaceholderText"/>
-            </w:rPr>
-            <w:t>Klik eller tryk her for at skrive tekst.</w:t>
-          </w:r>
-        </w:p>
-      </w:docPartBody>
-    </w:docPart>
-    <w:docPart>
-      <w:docPartPr>
-        <w:name w:val="16673B5D3190471B982ACDE7EF77C1F7"/>
-        <w:category>
-          <w:name w:val="General"/>
-          <w:gallery w:val="placeholder"/>
-        </w:category>
-        <w:types>
-          <w:type w:val="bbPlcHdr"/>
-        </w:types>
-        <w:behaviors>
-          <w:behavior w:val="content"/>
-        </w:behaviors>
-        <w:guid w:val="{4E6C41D8-90D6-4F74-8EAF-163AD75C750E}"/>
-      </w:docPartPr>
-      <w:docPartBody>
-        <w:p>
-          <w:pPr>
-            <w:pStyle w:val="16673B5D3190471B982ACDE7EF77C1F7"/>
-          </w:pPr>
-          <w:r>
-            <w:rPr>
-              <w:rStyle w:val="PlaceholderText"/>
-            </w:rPr>
-            <w:t>Klik eller tryk her for at skrive tekst.</w:t>
-          </w:r>
-        </w:p>
-      </w:docPartBody>
-    </w:docPart>
-    <w:docPart>
-      <w:docPartPr>
-        <w:name w:val="D7D6E4B6FD5543DA89CF0B73B6E30292"/>
-        <w:category>
-          <w:name w:val="General"/>
-          <w:gallery w:val="placeholder"/>
-        </w:category>
-        <w:types>
-          <w:type w:val="bbPlcHdr"/>
-        </w:types>
-        <w:behaviors>
-          <w:behavior w:val="content"/>
-        </w:behaviors>
-        <w:guid w:val="{0E8A05FA-7D2D-4DA0-AF3D-47E7024D56E4}"/>
-      </w:docPartPr>
-      <w:docPartBody>
-        <w:p>
-          <w:pPr>
-            <w:pStyle w:val="D7D6E4B6FD5543DA89CF0B73B6E30292"/>
-          </w:pPr>
-          <w:r>
-            <w:rPr>
-              <w:rStyle w:val="PlaceholderText"/>
-            </w:rPr>
-            <w:t>Click or tap here to enter text.</w:t>
-          </w:r>
-        </w:p>
-      </w:docPartBody>
-    </w:docPart>
-    <w:docPart>
-      <w:docPartPr>
-        <w:name w:val="2C3F2D2C612B4B84910A5B67FA64B631"/>
-        <w:category>
-          <w:name w:val="General"/>
-          <w:gallery w:val="placeholder"/>
-        </w:category>
-        <w:types>
-          <w:type w:val="bbPlcHdr"/>
-        </w:types>
-        <w:behaviors>
-          <w:behavior w:val="content"/>
-        </w:behaviors>
-        <w:guid w:val="{9EA15297-DEA2-4C56-BFB7-C10750BA00A6}"/>
-      </w:docPartPr>
-      <w:docPartBody>
-        <w:p>
-          <w:pPr>
-            <w:pStyle w:val="2C3F2D2C612B4B84910A5B67FA64B631"/>
-          </w:pPr>
-          <w:r>
-            <w:rPr>
-              <w:rStyle w:val="PlaceholderText"/>
-            </w:rPr>
-            <w:t>Click or tap here to enter text.</w:t>
-          </w:r>
-        </w:p>
-      </w:docPartBody>
-    </w:docPart>
-    <w:docPart>
-      <w:docPartPr>
-        <w:name w:val="356FDA147C3941778F5CECA01441805A"/>
-        <w:category>
-          <w:name w:val="General"/>
-          <w:gallery w:val="placeholder"/>
-        </w:category>
-        <w:types>
-          <w:type w:val="bbPlcHdr"/>
-        </w:types>
-        <w:behaviors>
-          <w:behavior w:val="content"/>
-        </w:behaviors>
-        <w:guid w:val="{44A92BCB-BBA1-4289-9168-270D71CD3829}"/>
-      </w:docPartPr>
-      <w:docPartBody>
-        <w:p>
-          <w:pPr>
-            <w:pStyle w:val="356FDA147C3941778F5CECA01441805A"/>
-          </w:pPr>
-          <w:r>
-            <w:rPr>
-              <w:rStyle w:val="PlaceholderText"/>
-            </w:rPr>
-            <w:t>Click or tap here to enter text.</w:t>
-          </w:r>
-        </w:p>
-      </w:docPartBody>
-    </w:docPart>
-    <w:docPart>
-      <w:docPartPr>
         <w:name w:val="D749E14C960744E2B461D0D5C759A3D1"/>
         <w:category>
           <w:name w:val="General"/>
@@ -5482,6 +5552,238 @@
         <w:p>
           <w:pPr>
             <w:pStyle w:val="D749E14C960744E2B461D0D5C759A3D1"/>
+          </w:pPr>
+          <w:r>
+            <w:rPr>
+              <w:rStyle w:val="PlaceholderText"/>
+            </w:rPr>
+            <w:t>Click or tap here to enter text.</w:t>
+          </w:r>
+        </w:p>
+      </w:docPartBody>
+    </w:docPart>
+    <w:docPart>
+      <w:docPartPr>
+        <w:name w:val="6EA3E70EB4354D4EAD29B1FAB831AE0D"/>
+        <w:category>
+          <w:name w:val="General"/>
+          <w:gallery w:val="placeholder"/>
+        </w:category>
+        <w:types>
+          <w:type w:val="bbPlcHdr"/>
+        </w:types>
+        <w:behaviors>
+          <w:behavior w:val="content"/>
+        </w:behaviors>
+        <w:guid w:val="{08CA86FD-738B-4B98-AB97-3CB48EEE8EE8}"/>
+      </w:docPartPr>
+      <w:docPartBody>
+        <w:p>
+          <w:pPr>
+            <w:pStyle w:val="6EA3E70EB4354D4EAD29B1FAB831AE0D"/>
+          </w:pPr>
+          <w:r>
+            <w:rPr>
+              <w:rStyle w:val="PlaceholderText"/>
+            </w:rPr>
+            <w:t>Klik eller tryk her for at skrive tekst.</w:t>
+          </w:r>
+        </w:p>
+      </w:docPartBody>
+    </w:docPart>
+    <w:docPart>
+      <w:docPartPr>
+        <w:name w:val="A17E3AF1DA6C4216BAD9D48E9C1759A6"/>
+        <w:category>
+          <w:name w:val="General"/>
+          <w:gallery w:val="placeholder"/>
+        </w:category>
+        <w:types>
+          <w:type w:val="bbPlcHdr"/>
+        </w:types>
+        <w:behaviors>
+          <w:behavior w:val="content"/>
+        </w:behaviors>
+        <w:guid w:val="{1690F5F7-BE3B-4EF1-935F-EF2FE7FFF676}"/>
+      </w:docPartPr>
+      <w:docPartBody>
+        <w:p>
+          <w:pPr>
+            <w:pStyle w:val="A17E3AF1DA6C4216BAD9D48E9C1759A6"/>
+          </w:pPr>
+          <w:r>
+            <w:rPr>
+              <w:rStyle w:val="PlaceholderText"/>
+            </w:rPr>
+            <w:t>Klik eller tryk her for at skrive tekst.</w:t>
+          </w:r>
+        </w:p>
+      </w:docPartBody>
+    </w:docPart>
+    <w:docPart>
+      <w:docPartPr>
+        <w:name w:val="AC18F8A884114D9E80792C0DFFAA4E54"/>
+        <w:category>
+          <w:name w:val="General"/>
+          <w:gallery w:val="placeholder"/>
+        </w:category>
+        <w:types>
+          <w:type w:val="bbPlcHdr"/>
+        </w:types>
+        <w:behaviors>
+          <w:behavior w:val="content"/>
+        </w:behaviors>
+        <w:guid w:val="{395BB248-CF59-48C7-BD31-494A8E8462B5}"/>
+      </w:docPartPr>
+      <w:docPartBody>
+        <w:p>
+          <w:pPr>
+            <w:pStyle w:val="AC18F8A884114D9E80792C0DFFAA4E54"/>
+          </w:pPr>
+          <w:r>
+            <w:rPr>
+              <w:rStyle w:val="PlaceholderText"/>
+            </w:rPr>
+            <w:t>Klik eller tryk her for at skrive tekst.</w:t>
+          </w:r>
+        </w:p>
+      </w:docPartBody>
+    </w:docPart>
+    <w:docPart>
+      <w:docPartPr>
+        <w:name w:val="E2A83207E6E0493B8088C2691F10B4FD"/>
+        <w:category>
+          <w:name w:val="General"/>
+          <w:gallery w:val="placeholder"/>
+        </w:category>
+        <w:types>
+          <w:type w:val="bbPlcHdr"/>
+        </w:types>
+        <w:behaviors>
+          <w:behavior w:val="content"/>
+        </w:behaviors>
+        <w:guid w:val="{48EA6276-5F70-4095-B991-618C1236407B}"/>
+      </w:docPartPr>
+      <w:docPartBody>
+        <w:p>
+          <w:pPr>
+            <w:pStyle w:val="E2A83207E6E0493B8088C2691F10B4FD"/>
+          </w:pPr>
+          <w:r>
+            <w:rPr>
+              <w:rStyle w:val="PlaceholderText"/>
+            </w:rPr>
+            <w:t>Click or tap here to enter text.</w:t>
+          </w:r>
+        </w:p>
+      </w:docPartBody>
+    </w:docPart>
+    <w:docPart>
+      <w:docPartPr>
+        <w:name w:val="46143C4E3C274C4B85CEF67A636C58EE"/>
+        <w:category>
+          <w:name w:val="General"/>
+          <w:gallery w:val="placeholder"/>
+        </w:category>
+        <w:types>
+          <w:type w:val="bbPlcHdr"/>
+        </w:types>
+        <w:behaviors>
+          <w:behavior w:val="content"/>
+        </w:behaviors>
+        <w:guid w:val="{D7FF69D8-3761-4AF5-B7BF-86B9E3550266}"/>
+      </w:docPartPr>
+      <w:docPartBody>
+        <w:p>
+          <w:pPr>
+            <w:pStyle w:val="46143C4E3C274C4B85CEF67A636C58EE"/>
+          </w:pPr>
+          <w:r>
+            <w:rPr>
+              <w:rStyle w:val="PlaceholderText"/>
+            </w:rPr>
+            <w:t>Klik eller tryk her for at skrive tekst.</w:t>
+          </w:r>
+        </w:p>
+      </w:docPartBody>
+    </w:docPart>
+    <w:docPart>
+      <w:docPartPr>
+        <w:name w:val="5CECB3F569504ADD9C777BBE3B7A02AC"/>
+        <w:category>
+          <w:name w:val="General"/>
+          <w:gallery w:val="placeholder"/>
+        </w:category>
+        <w:types>
+          <w:type w:val="bbPlcHdr"/>
+        </w:types>
+        <w:behaviors>
+          <w:behavior w:val="content"/>
+        </w:behaviors>
+        <w:guid w:val="{5D40C9DC-C80E-4B0D-B1F6-3F885E7B0F15}"/>
+      </w:docPartPr>
+      <w:docPartBody>
+        <w:p>
+          <w:pPr>
+            <w:pStyle w:val="5CECB3F569504ADD9C777BBE3B7A02AC"/>
+          </w:pPr>
+          <w:r>
+            <w:rPr>
+              <w:rStyle w:val="PlaceholderText"/>
+            </w:rPr>
+            <w:t>Klik eller tryk her for at skrive tekst.</w:t>
+          </w:r>
+        </w:p>
+      </w:docPartBody>
+    </w:docPart>
+    <w:docPart>
+      <w:docPartPr>
+        <w:name w:val="D5BA0598CC71407095844CCCC08BFF32"/>
+        <w:category>
+          <w:name w:val="General"/>
+          <w:gallery w:val="placeholder"/>
+        </w:category>
+        <w:types>
+          <w:type w:val="bbPlcHdr"/>
+        </w:types>
+        <w:behaviors>
+          <w:behavior w:val="content"/>
+        </w:behaviors>
+        <w:guid w:val="{CD55F9DC-3A11-460A-A555-33AC610A98CD}"/>
+      </w:docPartPr>
+      <w:docPartBody>
+        <w:p>
+          <w:pPr>
+            <w:pStyle w:val="D5BA0598CC71407095844CCCC08BFF32"/>
+          </w:pPr>
+          <w:r>
+            <w:rPr>
+              <w:rStyle w:val="PlaceholderText"/>
+            </w:rPr>
+            <w:t>Click or tap here to enter text.</w:t>
+          </w:r>
+        </w:p>
+      </w:docPartBody>
+    </w:docPart>
+    <w:docPart>
+      <w:docPartPr>
+        <w:name w:val="AFC2392F1BBE448DA23FA9038EFD15A9"/>
+        <w:category>
+          <w:name w:val="General"/>
+          <w:gallery w:val="placeholder"/>
+        </w:category>
+        <w:types>
+          <w:type w:val="bbPlcHdr"/>
+        </w:types>
+        <w:behaviors>
+          <w:behavior w:val="content"/>
+        </w:behaviors>
+        <w:guid w:val="{DB7A4CDF-7BFE-405A-86C3-B0D1A45D77FF}"/>
+      </w:docPartPr>
+      <w:docPartBody>
+        <w:p>
+          <w:pPr>
+            <w:pStyle w:val="AFC2392F1BBE448DA23FA9038EFD15A9"/>
           </w:pPr>
           <w:r>
             <w:rPr>
@@ -5561,7 +5863,9 @@
     <w:rsid w:val="00026C03"/>
     <w:rsid w:val="000374C8"/>
     <w:rsid w:val="000522FC"/>
+    <w:rsid w:val="00052384"/>
     <w:rsid w:val="00054952"/>
+    <w:rsid w:val="00092911"/>
     <w:rsid w:val="000A48AF"/>
     <w:rsid w:val="000B64D8"/>
     <w:rsid w:val="000B7E6A"/>
@@ -5598,6 +5902,7 @@
     <w:rsid w:val="003636BB"/>
     <w:rsid w:val="003666A7"/>
     <w:rsid w:val="0037228B"/>
+    <w:rsid w:val="00387423"/>
     <w:rsid w:val="0039081A"/>
     <w:rsid w:val="0039155B"/>
     <w:rsid w:val="003A4934"/>
@@ -5615,17 +5920,23 @@
     <w:rsid w:val="004F34B6"/>
     <w:rsid w:val="00501962"/>
     <w:rsid w:val="00521E26"/>
+    <w:rsid w:val="0053191A"/>
+    <w:rsid w:val="00541444"/>
     <w:rsid w:val="00551A5E"/>
     <w:rsid w:val="005548F3"/>
     <w:rsid w:val="00586B0D"/>
     <w:rsid w:val="005D1B53"/>
     <w:rsid w:val="005F0F84"/>
     <w:rsid w:val="005F4FF1"/>
+    <w:rsid w:val="005F5EBC"/>
     <w:rsid w:val="00605CE1"/>
     <w:rsid w:val="00620CE5"/>
+    <w:rsid w:val="00645AE6"/>
     <w:rsid w:val="00676D3F"/>
     <w:rsid w:val="0069271F"/>
     <w:rsid w:val="006A2829"/>
+    <w:rsid w:val="006D552A"/>
+    <w:rsid w:val="006E3893"/>
     <w:rsid w:val="006E63E7"/>
     <w:rsid w:val="00711164"/>
     <w:rsid w:val="007168A2"/>
@@ -5633,6 +5944,7 @@
     <w:rsid w:val="007575E0"/>
     <w:rsid w:val="0077434C"/>
     <w:rsid w:val="007956A8"/>
+    <w:rsid w:val="007A6F92"/>
     <w:rsid w:val="007B47D9"/>
     <w:rsid w:val="007D165C"/>
     <w:rsid w:val="007D65A1"/>
@@ -5643,14 +5955,17 @@
     <w:rsid w:val="008603D5"/>
     <w:rsid w:val="0088055D"/>
     <w:rsid w:val="00890CEF"/>
+    <w:rsid w:val="008A4F99"/>
     <w:rsid w:val="008C7882"/>
     <w:rsid w:val="008D0B19"/>
     <w:rsid w:val="008D1223"/>
     <w:rsid w:val="008D2625"/>
     <w:rsid w:val="008D2B27"/>
     <w:rsid w:val="008E6AF9"/>
+    <w:rsid w:val="008F1383"/>
     <w:rsid w:val="008F3354"/>
     <w:rsid w:val="008F47B3"/>
+    <w:rsid w:val="00913647"/>
     <w:rsid w:val="00922075"/>
     <w:rsid w:val="00957641"/>
     <w:rsid w:val="00957FA4"/>
@@ -5660,13 +5975,16 @@
     <w:rsid w:val="00981B73"/>
     <w:rsid w:val="009958A5"/>
     <w:rsid w:val="009C43D8"/>
+    <w:rsid w:val="009D5C61"/>
     <w:rsid w:val="009F310E"/>
     <w:rsid w:val="009F3CE2"/>
     <w:rsid w:val="009F5A7A"/>
     <w:rsid w:val="00A06F7B"/>
     <w:rsid w:val="00A101D6"/>
     <w:rsid w:val="00A21A4F"/>
+    <w:rsid w:val="00A21DE2"/>
     <w:rsid w:val="00A22ACD"/>
+    <w:rsid w:val="00A22E9F"/>
     <w:rsid w:val="00A23822"/>
     <w:rsid w:val="00A327DB"/>
     <w:rsid w:val="00A42588"/>
@@ -5681,6 +5999,7 @@
     <w:rsid w:val="00AD5F1E"/>
     <w:rsid w:val="00AF1BF3"/>
     <w:rsid w:val="00AF7276"/>
+    <w:rsid w:val="00AF7653"/>
     <w:rsid w:val="00B01B39"/>
     <w:rsid w:val="00B05DFF"/>
     <w:rsid w:val="00B06C5E"/>
@@ -5693,7 +6012,9 @@
     <w:rsid w:val="00B52A3F"/>
     <w:rsid w:val="00B606BE"/>
     <w:rsid w:val="00B83A35"/>
+    <w:rsid w:val="00BB5F78"/>
     <w:rsid w:val="00C014EB"/>
+    <w:rsid w:val="00C0769B"/>
     <w:rsid w:val="00C23B53"/>
     <w:rsid w:val="00C3763E"/>
     <w:rsid w:val="00C579E4"/>
@@ -5706,30 +6027,37 @@
     <w:rsid w:val="00CC1C0E"/>
     <w:rsid w:val="00CC1DAE"/>
     <w:rsid w:val="00D16B36"/>
+    <w:rsid w:val="00D22C5B"/>
     <w:rsid w:val="00D267B3"/>
     <w:rsid w:val="00D422E3"/>
     <w:rsid w:val="00D5446D"/>
     <w:rsid w:val="00D855FC"/>
+    <w:rsid w:val="00D86269"/>
     <w:rsid w:val="00D91F2E"/>
     <w:rsid w:val="00DB4460"/>
     <w:rsid w:val="00DB47C4"/>
     <w:rsid w:val="00DC6E86"/>
+    <w:rsid w:val="00DE4368"/>
     <w:rsid w:val="00E077BC"/>
     <w:rsid w:val="00E14C23"/>
     <w:rsid w:val="00E366AF"/>
+    <w:rsid w:val="00E42075"/>
     <w:rsid w:val="00E67FA6"/>
     <w:rsid w:val="00E96395"/>
+    <w:rsid w:val="00EC0FBF"/>
     <w:rsid w:val="00EC7422"/>
     <w:rsid w:val="00ED6B2E"/>
     <w:rsid w:val="00EF476B"/>
     <w:rsid w:val="00F019AE"/>
     <w:rsid w:val="00F1246A"/>
     <w:rsid w:val="00F22E08"/>
+    <w:rsid w:val="00F33AC7"/>
     <w:rsid w:val="00F42812"/>
     <w:rsid w:val="00F42D0E"/>
     <w:rsid w:val="00F736EC"/>
     <w:rsid w:val="00FA67B4"/>
     <w:rsid w:val="00FB23A7"/>
+    <w:rsid w:val="00FC0677"/>
     <w:rsid w:val="00FC34CE"/>
     <w:rsid w:val="00FD0CC1"/>
     <w:rsid w:val="00FD2374"/>
@@ -6191,7 +6519,7 @@
     <w:basedOn w:val="DefaultParagraphFont"/>
     <w:uiPriority w:val="99"/>
     <w:semiHidden/>
-    <w:rsid w:val="008D0B19"/>
+    <w:rsid w:val="00092911"/>
     <w:rPr>
       <w:color w:val="666666"/>
     </w:rPr>
@@ -6659,6 +6987,58 @@
   <w:style w:type="paragraph" w:customStyle="1" w:styleId="9EE4012110B64D64914C22BD21A18CFD">
     <w:name w:val="9EE4012110B64D64914C22BD21A18CFD"/>
     <w:rsid w:val="008D0B19"/>
+  </w:style>
+  <w:style w:type="paragraph" w:customStyle="1" w:styleId="3287F80C78A6481AB4F1EEAEEDC55446">
+    <w:name w:val="3287F80C78A6481AB4F1EEAEEDC55446"/>
+    <w:rsid w:val="00C0769B"/>
+  </w:style>
+  <w:style w:type="paragraph" w:customStyle="1" w:styleId="4890044FDEAA4420A2FD4A48FEFC26EA">
+    <w:name w:val="4890044FDEAA4420A2FD4A48FEFC26EA"/>
+    <w:rsid w:val="00C0769B"/>
+  </w:style>
+  <w:style w:type="paragraph" w:customStyle="1" w:styleId="6EA3E70EB4354D4EAD29B1FAB831AE0D">
+    <w:name w:val="6EA3E70EB4354D4EAD29B1FAB831AE0D"/>
+    <w:rsid w:val="00C0769B"/>
+  </w:style>
+  <w:style w:type="paragraph" w:customStyle="1" w:styleId="B7AED78FDDA1453AAD0C9C455DC1F783">
+    <w:name w:val="B7AED78FDDA1453AAD0C9C455DC1F783"/>
+    <w:rsid w:val="00C0769B"/>
+  </w:style>
+  <w:style w:type="paragraph" w:customStyle="1" w:styleId="A17E3AF1DA6C4216BAD9D48E9C1759A6">
+    <w:name w:val="A17E3AF1DA6C4216BAD9D48E9C1759A6"/>
+    <w:rsid w:val="00092911"/>
+  </w:style>
+  <w:style w:type="paragraph" w:customStyle="1" w:styleId="90DA57EC2C4D45688CCFFCE6B9C1301A">
+    <w:name w:val="90DA57EC2C4D45688CCFFCE6B9C1301A"/>
+    <w:rsid w:val="00092911"/>
+  </w:style>
+  <w:style w:type="paragraph" w:customStyle="1" w:styleId="AC18F8A884114D9E80792C0DFFAA4E54">
+    <w:name w:val="AC18F8A884114D9E80792C0DFFAA4E54"/>
+    <w:rsid w:val="00092911"/>
+  </w:style>
+  <w:style w:type="paragraph" w:customStyle="1" w:styleId="056C113C46EE44F28DDFAA974FE4EF61">
+    <w:name w:val="056C113C46EE44F28DDFAA974FE4EF61"/>
+    <w:rsid w:val="00092911"/>
+  </w:style>
+  <w:style w:type="paragraph" w:customStyle="1" w:styleId="E2A83207E6E0493B8088C2691F10B4FD">
+    <w:name w:val="E2A83207E6E0493B8088C2691F10B4FD"/>
+    <w:rsid w:val="00092911"/>
+  </w:style>
+  <w:style w:type="paragraph" w:customStyle="1" w:styleId="46143C4E3C274C4B85CEF67A636C58EE">
+    <w:name w:val="46143C4E3C274C4B85CEF67A636C58EE"/>
+    <w:rsid w:val="00092911"/>
+  </w:style>
+  <w:style w:type="paragraph" w:customStyle="1" w:styleId="5CECB3F569504ADD9C777BBE3B7A02AC">
+    <w:name w:val="5CECB3F569504ADD9C777BBE3B7A02AC"/>
+    <w:rsid w:val="00092911"/>
+  </w:style>
+  <w:style w:type="paragraph" w:customStyle="1" w:styleId="D5BA0598CC71407095844CCCC08BFF32">
+    <w:name w:val="D5BA0598CC71407095844CCCC08BFF32"/>
+    <w:rsid w:val="00092911"/>
+  </w:style>
+  <w:style w:type="paragraph" w:customStyle="1" w:styleId="AFC2392F1BBE448DA23FA9038EFD15A9">
+    <w:name w:val="AFC2392F1BBE448DA23FA9038EFD15A9"/>
+    <w:rsid w:val="00092911"/>
   </w:style>
 </w:styles>
 </file>
@@ -6993,6 +7373,9 @@
   <wetp:taskpane dockstate="right" visibility="0" width="525" row="3">
     <wetp:webextensionref xmlns:r="http://schemas.openxmlformats.org/officeDocument/2006/relationships" r:id="rId2"/>
   </wetp:taskpane>
+  <wetp:taskpane dockstate="right" visibility="0" width="438" row="3">
+    <wetp:webextensionref xmlns:r="http://schemas.openxmlformats.org/officeDocument/2006/relationships" r:id="rId3"/>
+  </wetp:taskpane>
 </wetp:taskpanes>
 </file>
 
@@ -7018,13 +7401,386 @@
 </we:webextension>
 </file>
 
-<file path=customXml/item1.xml><?xml version="1.0" encoding="utf-8"?>
+<file path=word/webextensions/webextension3.xml><?xml version="1.0" encoding="utf-8"?>
+<we:webextension xmlns:we="http://schemas.microsoft.com/office/webextensions/webextension/2010/11" id="{7BA8316B-AC2D-4549-9858-99B2DA11E1E9}">
+  <we:reference id="WA200007356" version="2.0.0.1" store="Omex" storeType="OMEX"/>
+  <we:alternateReferences>
+    <we:reference id="WA200007356" version="2.0.0.1" store="WA200007356" storeType="OMEX"/>
+  </we:alternateReferences>
+  <we:properties/>
+  <we:bindings/>
+  <we:snapshot xmlns:r="http://schemas.openxmlformats.org/officeDocument/2006/relationships"/>
+</we:webextension>
+</file>
+
+<file path=customXml/item1.xml>��< ? x m l   v e r s i o n = " 1 . 0 "   e n c o d i n g = " u t f - 1 6 " ? > + 
+ < N a v W o r d R e p o r t X m l P a r t   x m l n s = " u r n : m i c r o s o f t - d y n a m i c s - n a v / r e p o r t s / Q l t y _ C e r t i f i c a t e _ o f _ A n a l y s i s / 2 0 4 0 1 / " > + 
+     < B C R e p o r t I n f o r m a t i o n > + 
+         < R e p o r t M e t a d a t a > + 
+             < E x t e n s i o n I d > E x t e n s i o n   I D < / E x t e n s i o n I d > + 
+             < E x t e n s i o n N a m e > E x t e n s i o n   N a m e < / E x t e n s i o n N a m e > + 
+             < E x t e n s i o n P u b l i s h e r > E x t e n s i o n   P u b l i s h e r < / E x t e n s i o n P u b l i s h e r > + 
+             < E x t e n s i o n V e r s i o n > E x t e n s i o n   V e r s i o n < / E x t e n s i o n V e r s i o n > + 
+             < R e p o r t I d > R e p o r t   I D < / R e p o r t I d > + 
+             < R e p o r t N a m e > R e p o r t   N a m e < / R e p o r t N a m e > + 
+             < A b o u t T h i s R e p o r t T i t l e > A b o u t   T h i s   R e p o r t   T i t l e < / A b o u t T h i s R e p o r t T i t l e > + 
+             < A b o u t T h i s R e p o r t T e x t > A b o u t   T h i s   R e p o r t   T e x t < / A b o u t T h i s R e p o r t T e x t > + 
+             < R e p o r t H e l p L i n k > R e p o r t   H e l p   L i n k < / R e p o r t H e l p L i n k > + 
+         < / R e p o r t M e t a d a t a > + 
+         < R e p o r t R e q u e s t > + 
+             < T e n a n t E n t r a I d > T e n a n t   E n t r a   I d < / T e n a n t E n t r a I d > + 
+             < E n v i r o n m e n t N a m e > E n v i r o n m e n t   N a m e < / E n v i r o n m e n t N a m e > + 
+             < E n v i r o n m e n t T y p e > E n v i r o n m e n t   T y p e < / E n v i r o n m e n t T y p e > + 
+             < C o m p a n y N a m e > C o m p a n y   N a m e < / C o m p a n y N a m e > + 
+             < C o m p a n y D i s p l a y N a m e > C o m p a n y   D i s p l a y   N a m e < / C o m p a n y D i s p l a y N a m e > + 
+             < C o m p a n y I d > C o m p a n y   I D < / C o m p a n y I d > + 
+             < U s e r N a m e > U s e r   N a m e < / U s e r N a m e > + 
+             < D a t e A n d T i m e > D a t e   a n d   T i m e < / D a t e A n d T i m e > + 
+             < L a n g u a g e > L a n g u a g e < / L a n g u a g e > + 
+             < F o r m a t R e g i o n > F o r m a t   R e g i o n < / F o r m a t R e g i o n > + 
+             < D a t e T i m e V a l u e s > + 
+                 < Y e a r > Y e a r < / Y e a r > + 
+                 < M o n t h N u m b e r > M o n t h   N u m b e r < / M o n t h N u m b e r > + 
+                 < D a y N u m b e r > D a y   N u m b e r < / D a y N u m b e r > + 
+                 < H o u r > H o u r < / H o u r > + 
+                 < M i n u t e > M i n u t e < / M i n u t e > + 
+             < / D a t e T i m e V a l u e s > + 
+         < / R e p o r t R e q u e s t > + 
+     < / B C R e p o r t I n f o r m a t i o n > + 
+     < L a b e l s > + 
+         < C o n d i t i o n L a b e l > C o n d i t i o n L a b e l < / C o n d i t i o n L a b e l > + 
+         < D a t e L a b e l > D a t e L a b e l < / D a t e L a b e l > + 
+         < F i n i s h e d B y L a b e l > F i n i s h e d B y L a b e l < / F i n i s h e d B y L a b e l > + 
+         < F i n i s h e d O n L a b e l > F i n i s h e d O n L a b e l < / F i n i s h e d O n L a b e l > + 
+         < I n s p e c t i o n D e s c r i p t i o n L a b e l > I n s p e c t i o n D e s c r i p t i o n L a b e l < / I n s p e c t i o n D e s c r i p t i o n L a b e l > + 
+         < I n s p e c t i o n L a b e l > I n s p e c t i o n L a b e l < / I n s p e c t i o n L a b e l > + 
+         < I t e m D e s c r i p t i o n L a b e l > I t e m D e s c r i p t i o n L a b e l < / I t e m D e s c r i p t i o n L a b e l > + 
+         < I t e m L a b e l > I t e m L a b e l < / I t e m L a b e l > + 
+         < I t e m T r a c k i n g L a b e l > I t e m T r a c k i n g L a b e l < / I t e m T r a c k i n g L a b e l > + 
+         < P a g e L a b e l > P a g e L a b e l < / P a g e L a b e l > + 
+         < R e p o r t T i t l e L a b e l > R e p o r t T i t l e L a b e l < / R e p o r t T i t l e L a b e l > + 
+         < R e s u l t L a b e l > R e s u l t L a b e l < / R e s u l t L a b e l > + 
+         < S t a t u s L a b e l > S t a t u s L a b e l < / S t a t u s L a b e l > + 
+         < T e s t L a b e l > T e s t L a b e l < / T e s t L a b e l > + 
+         < T e s t V a l u e L a b e l > T e s t V a l u e L a b e l < / T e s t V a l u e L a b e l > + 
+     < / L a b e l s > + 
+     < C u r r e n t I n s p e c t i o n > + 
+         < A p p r o v e r N a m e L a b e l > A p p r o v e r N a m e L a b e l < / A p p r o v e r N a m e L a b e l > + 
+         < A p p r o v e r S i g n a t u r e L a b e l > A p p r o v e r S i g n a t u r e L a b e l < / A p p r o v e r S i g n a t u r e L a b e l > + 
+         < C O A C o n t a c t _ A l l > C O A C o n t a c t _ A l l < / C O A C o n t a c t _ A l l > + 
+         < C O A C o n t a c t _ R o w 1 > C O A C o n t a c t _ R o w 1 < / C O A C o n t a c t _ R o w 1 > + 
+         < C O A C o n t a c t _ R o w 2 > C O A C o n t a c t _ R o w 2 < / C O A C o n t a c t _ R o w 2 > + 
+         < C O A C o n t a c t _ R o w 3 > C O A C o n t a c t _ R o w 3 < / C O A C o n t a c t _ R o w 3 > + 
+         < C O A C o n t a c t _ R o w 4 > C O A C o n t a c t _ R o w 4 < / C O A C o n t a c t _ R o w 4 > + 
+         < C O A C o n t a c t _ R o w 5 > C O A C o n t a c t _ R o w 5 < / C O A C o n t a c t _ R o w 5 > + 
+         < C O A C o n t a c t _ R o w 6 > C O A C o n t a c t _ R o w 6 < / C O A C o n t a c t _ R o w 6 > + 
+         < C O A C o n t a c t _ R o w 7 > C O A C o n t a c t _ R o w 7 < / C O A C o n t a c t _ R o w 7 > + 
+         < C O A C o n t a c t _ R o w 8 > C O A C o n t a c t _ R o w 8 < / C O A C o n t a c t _ R o w 8 > + 
+         < C o m p a n y I n f o r m a t i o n _ A l l > C o m p a n y I n f o r m a t i o n _ A l l < / C o m p a n y I n f o r m a t i o n _ A l l > + 
+         < C o m p a n y I n f o r m a t i o n _ R o w 1 > C o m p a n y I n f o r m a t i o n _ R o w 1 < / C o m p a n y I n f o r m a t i o n _ R o w 1 > + 
+         < C o m p a n y I n f o r m a t i o n _ R o w 2 > C o m p a n y I n f o r m a t i o n _ R o w 2 < / C o m p a n y I n f o r m a t i o n _ R o w 2 > + 
+         < C o m p a n y I n f o r m a t i o n _ R o w 3 > C o m p a n y I n f o r m a t i o n _ R o w 3 < / C o m p a n y I n f o r m a t i o n _ R o w 3 > + 
+         < C o m p a n y I n f o r m a t i o n _ R o w 4 > C o m p a n y I n f o r m a t i o n _ R o w 4 < / C o m p a n y I n f o r m a t i o n _ R o w 4 > + 
+         < C o m p a n y I n f o r m a t i o n _ R o w 5 > C o m p a n y I n f o r m a t i o n _ R o w 5 < / C o m p a n y I n f o r m a t i o n _ R o w 5 > + 
+         < C o m p a n y I n f o r m a t i o n _ R o w 6 > C o m p a n y I n f o r m a t i o n _ R o w 6 < / C o m p a n y I n f o r m a t i o n _ R o w 6 > + 
+         < C o m p a n y I n f o r m a t i o n _ R o w 7 > C o m p a n y I n f o r m a t i o n _ R o w 7 < / C o m p a n y I n f o r m a t i o n _ R o w 7 > + 
+         < C o m p a n y I n f o r m a t i o n _ R o w 8 > C o m p a n y I n f o r m a t i o n _ R o w 8 < / C o m p a n y I n f o r m a t i o n _ R o w 8 > + 
+         < C o m p a n y L o g o   / > + 
+         < E m a i l L a b e l > E m a i l L a b e l < / E m a i l L a b e l > + 
+         < E m a i l V a l u e > E m a i l V a l u e < / E m a i l V a l u e > + 
+         < F i n i s h e d B y N a m e L a b e l > F i n i s h e d B y N a m e L a b e l < / F i n i s h e d B y N a m e L a b e l > + 
+         < F i n i s h e d B y S i g n a t u r e L a b e l > F i n i s h e d B y S i g n a t u r e L a b e l < / F i n i s h e d B y S i g n a t u r e L a b e l > + 
+         < H o m e P a g e L a b e l > H o m e P a g e L a b e l < / H o m e P a g e L a b e l > + 
+         < H o m e P a g e V a l u e > H o m e P a g e V a l u e < / H o m e P a g e V a l u e > + 
+         < I t e m D e s c r i p t i o n > I t e m D e s c r i p t i o n < / I t e m D e s c r i p t i o n > + 
+         < I t e m I d e n t i f i e r > I t e m I d e n t i f i e r < / I t e m I d e n t i f i e r > + 
+         < I t e m T r a c k i n g I d e n t i f i e r > I t e m T r a c k i n g I d e n t i f i e r < / I t e m T r a c k i n g I d e n t i f i e r > + 
+         < P h o n e N o L a b e l > P h o n e N o L a b e l < / P h o n e N o L a b e l > + 
+         < P h o n e N o V a l u e > P h o n e N o V a l u e < / P h o n e N o V a l u e > + 
+         < Q l t y I n s p e c t i o n T e m p l a t e _ D e s c r i p t i o n > Q l t y I n s p e c t i o n T e m p l a t e _ D e s c r i p t i o n < / Q l t y I n s p e c t i o n T e m p l a t e _ D e s c r i p t i o n > + 
+         < Q l t y I n s p e c t i o n _ D e s c r i p t i o n > Q l t y I n s p e c t i o n _ D e s c r i p t i o n < / Q l t y I n s p e c t i o n _ D e s c r i p t i o n > + 
+         < Q l t y I n s p e c t i o n _ D i r e c t o r _ N a m e > Q l t y I n s p e c t i o n _ D i r e c t o r _ N a m e < / Q l t y I n s p e c t i o n _ D i r e c t o r _ N a m e > + 
+         < Q l t y I n s p e c t i o n _ D i r e c t o r _ T i t l e > Q l t y I n s p e c t i o n _ D i r e c t o r _ T i t l e < / Q l t y I n s p e c t i o n _ D i r e c t o r _ T i t l e > + 
+         < Q l t y I n s p e c t i o n _ F i n i s h e d _ B y _ E m a i l > Q l t y I n s p e c t i o n _ F i n i s h e d _ B y _ E m a i l < / Q l t y I n s p e c t i o n _ F i n i s h e d _ B y _ E m a i l > + 
+         < Q l t y I n s p e c t i o n _ F i n i s h e d _ B y _ P h o n e > Q l t y I n s p e c t i o n _ F i n i s h e d _ B y _ P h o n e < / Q l t y I n s p e c t i o n _ F i n i s h e d _ B y _ P h o n e > + 
+         < Q l t y I n s p e c t i o n _ F i n i s h e d _ B y _ T i t l e > Q l t y I n s p e c t i o n _ F i n i s h e d _ B y _ T i t l e < / Q l t y I n s p e c t i o n _ F i n i s h e d _ B y _ T i t l e > + 
+         < Q l t y I n s p e c t i o n _ F i n i s h e d _ B y _ U s e r N a m e > Q l t y I n s p e c t i o n _ F i n i s h e d _ B y _ U s e r N a m e < / Q l t y I n s p e c t i o n _ F i n i s h e d _ B y _ U s e r N a m e > + 
+         < Q l t y I n s p e c t i o n _ F i n i s h e d _ B y _ U s e r _ I D > Q l t y I n s p e c t i o n _ F i n i s h e d _ B y _ U s e r _ I D < / Q l t y I n s p e c t i o n _ F i n i s h e d _ B y _ U s e r _ I D > + 
+         < Q l t y I n s p e c t i o n _ F i n i s h e d _ D a t e > Q l t y I n s p e c t i o n _ F i n i s h e d _ D a t e < / Q l t y I n s p e c t i o n _ F i n i s h e d _ D a t e > + 
+         < Q l t y I n s p e c t i o n _ N o > Q l t y I n s p e c t i o n _ N o < / Q l t y I n s p e c t i o n _ N o > + 
+         < Q l t y I n s p e c t i o n _ R e i n s p e c t i o n N o > Q l t y I n s p e c t i o n _ R e i n s p e c t i o n N o < / Q l t y I n s p e c t i o n _ R e i n s p e c t i o n N o > + 
+         < Q l t y I n s p e c t i o n _ R e s u l t _ C o d e > Q l t y I n s p e c t i o n _ R e s u l t _ C o d e < / Q l t y I n s p e c t i o n _ R e s u l t _ C o d e > + 
+         < Q l t y I n s p e c t i o n _ R e s u l t _ D e s c r i p t i o n > Q l t y I n s p e c t i o n _ R e s u l t _ D e s c r i p t i o n < / Q l t y I n s p e c t i o n _ R e s u l t _ D e s c r i p t i o n > + 
+         < Q l t y I n s p e c t i o n _ S o u r c e _ C u s t o m _ 1 > Q l t y I n s p e c t i o n _ S o u r c e _ C u s t o m _ 1 < / Q l t y I n s p e c t i o n _ S o u r c e _ C u s t o m _ 1 > + 
+         < Q l t y I n s p e c t i o n _ S o u r c e _ C u s t o m _ 1 0 > Q l t y I n s p e c t i o n _ S o u r c e _ C u s t o m _ 1 0 < / Q l t y I n s p e c t i o n _ S o u r c e _ C u s t o m _ 1 0 > + 
+         < Q l t y I n s p e c t i o n _ S o u r c e _ C u s t o m _ 2 > Q l t y I n s p e c t i o n _ S o u r c e _ C u s t o m _ 2 < / Q l t y I n s p e c t i o n _ S o u r c e _ C u s t o m _ 2 > + 
+         < Q l t y I n s p e c t i o n _ S o u r c e _ C u s t o m _ 3 > Q l t y I n s p e c t i o n _ S o u r c e _ C u s t o m _ 3 < / Q l t y I n s p e c t i o n _ S o u r c e _ C u s t o m _ 3 > + 
+         < Q l t y I n s p e c t i o n _ S o u r c e _ C u s t o m _ 4 > Q l t y I n s p e c t i o n _ S o u r c e _ C u s t o m _ 4 < / Q l t y I n s p e c t i o n _ S o u r c e _ C u s t o m _ 4 > + 
+         < Q l t y I n s p e c t i o n _ S o u r c e _ C u s t o m _ 5 > Q l t y I n s p e c t i o n _ S o u r c e _ C u s t o m _ 5 < / Q l t y I n s p e c t i o n _ S o u r c e _ C u s t o m _ 5 > + 
+         < Q l t y I n s p e c t i o n _ S o u r c e _ C u s t o m _ 6 > Q l t y I n s p e c t i o n _ S o u r c e _ C u s t o m _ 6 < / Q l t y I n s p e c t i o n _ S o u r c e _ C u s t o m _ 6 > + 
+         < Q l t y I n s p e c t i o n _ S o u r c e _ C u s t o m _ 7 > Q l t y I n s p e c t i o n _ S o u r c e _ C u s t o m _ 7 < / Q l t y I n s p e c t i o n _ S o u r c e _ C u s t o m _ 7 > + 
+         < Q l t y I n s p e c t i o n _ S o u r c e _ C u s t o m _ 8 > Q l t y I n s p e c t i o n _ S o u r c e _ C u s t o m _ 8 < / Q l t y I n s p e c t i o n _ S o u r c e _ C u s t o m _ 8 > + 
+         < Q l t y I n s p e c t i o n _ S o u r c e _ C u s t o m _ 9 > Q l t y I n s p e c t i o n _ S o u r c e _ C u s t o m _ 9 < / Q l t y I n s p e c t i o n _ S o u r c e _ C u s t o m _ 9 > + 
+         < Q l t y I n s p e c t i o n _ S o u r c e _ D o c u m e n t _ N o _ > Q l t y I n s p e c t i o n _ S o u r c e _ D o c u m e n t _ N o _ < / Q l t y I n s p e c t i o n _ S o u r c e _ D o c u m e n t _ N o _ > + 
+         < Q l t y I n s p e c t i o n _ S o u r c e _ I t e m _ D e s c r i p t i o n > Q l t y I n s p e c t i o n _ S o u r c e _ I t e m _ D e s c r i p t i o n < / Q l t y I n s p e c t i o n _ S o u r c e _ I t e m _ D e s c r i p t i o n > + 
+         < Q l t y I n s p e c t i o n _ S o u r c e _ I t e m _ D e s c r i p t i o n 2 > Q l t y I n s p e c t i o n _ S o u r c e _ I t e m _ D e s c r i p t i o n 2 < / Q l t y I n s p e c t i o n _ S o u r c e _ I t e m _ D e s c r i p t i o n 2 > + 
+         < Q l t y I n s p e c t i o n _ S o u r c e _ I t e m _ N o _ > Q l t y I n s p e c t i o n _ S o u r c e _ I t e m _ N o _ < / Q l t y I n s p e c t i o n _ S o u r c e _ I t e m _ N o _ > + 
+         < Q l t y I n s p e c t i o n _ S o u r c e _ L o t _ N o _ > Q l t y I n s p e c t i o n _ S o u r c e _ L o t _ N o _ < / Q l t y I n s p e c t i o n _ S o u r c e _ L o t _ N o _ > + 
+         < Q l t y I n s p e c t i o n _ S o u r c e _ P a c k a g e _ N o _ > Q l t y I n s p e c t i o n _ S o u r c e _ P a c k a g e _ N o _ < / Q l t y I n s p e c t i o n _ S o u r c e _ P a c k a g e _ N o _ > + 
+         < Q l t y I n s p e c t i o n _ S o u r c e _ S e r i a l _ N o _ > Q l t y I n s p e c t i o n _ S o u r c e _ S e r i a l _ N o _ < / Q l t y I n s p e c t i o n _ S o u r c e _ S e r i a l _ N o _ > + 
+         < Q l t y I n s p e c t i o n _ S o u r c e _ T a s k _ N o _ > Q l t y I n s p e c t i o n _ S o u r c e _ T a s k _ N o _ < / Q l t y I n s p e c t i o n _ S o u r c e _ T a s k _ N o _ > + 
+         < Q l t y I n s p e c t i o n _ S o u r c e _ V a r i a n t _ C o d e > Q l t y I n s p e c t i o n _ S o u r c e _ V a r i a n t _ C o d e < / Q l t y I n s p e c t i o n _ S o u r c e _ V a r i a n t _ C o d e > + 
+         < Q l t y I n s p e c t i o n _ S t a t u s > Q l t y I n s p e c t i o n _ S t a t u s < / Q l t y I n s p e c t i o n _ S t a t u s > + 
+         < R e i n s p e c t i o n S e q u e n c e I n f o r m a t i o n > R e i n s p e c t i o n S e q u e n c e I n f o r m a t i o n < / R e i n s p e c t i o n S e q u e n c e I n f o r m a t i o n > + 
+         < C u r r e n t I n s p e c t i o n L i n e > + 
+             < C o n d i t i o n L a b e l _ 1 > C o n d i t i o n L a b e l _ 1 < / C o n d i t i o n L a b e l _ 1 > + 
+             < C o n d i t i o n L a b e l _ 2 > C o n d i t i o n L a b e l _ 2 < / C o n d i t i o n L a b e l _ 2 > + 
+             < F i e l d _ C o d e > F i e l d _ C o d e < / F i e l d _ C o d e > + 
+             < F i e l d _ D e s c r i p t i o n > F i e l d _ D e s c r i p t i o n < / F i e l d _ D e s c r i p t i o n > + 
+             < F i e l d _ H a s E n t e r e d V a l u e > F i e l d _ H a s E n t e r e d V a l u e < / F i e l d _ H a s E n t e r e d V a l u e > + 
+             < F i e l d _ I f P e r s o n E m a i l > F i e l d _ I f P e r s o n E m a i l < / F i e l d _ I f P e r s o n E m a i l > + 
+             < F i e l d _ I f P e r s o n N a m e > F i e l d _ I f P e r s o n N a m e < / F i e l d _ I f P e r s o n N a m e > + 
+             < F i e l d _ I f P e r s o n P h o n e > F i e l d _ I f P e r s o n P h o n e < / F i e l d _ I f P e r s o n P h o n e > + 
+             < F i e l d _ I f P e r s o n T i t l e > F i e l d _ I f P e r s o n T i t l e < / F i e l d _ I f P e r s o n T i t l e > + 
+             < F i e l d _ I s L a b e l > F i e l d _ I s L a b e l < / F i e l d _ I s L a b e l > + 
+             < F i e l d _ I s P e r s o n F i e l d > F i e l d _ I s P e r s o n F i e l d < / F i e l d _ I s P e r s o n F i e l d > + 
+             < F i e l d _ I s T e x t > F i e l d _ I s T e x t < / F i e l d _ I s T e x t > + 
+             < F i e l d _ L i n e C o m m e n t a r y > F i e l d _ L i n e C o m m e n t a r y < / F i e l d _ L i n e C o m m e n t a r y > + 
+             < F i e l d _ M o d i f i e d B y U s e r E m a i l > F i e l d _ M o d i f i e d B y U s e r E m a i l < / F i e l d _ M o d i f i e d B y U s e r E m a i l > + 
+             < F i e l d _ M o d i f i e d B y U s e r I D > F i e l d _ M o d i f i e d B y U s e r I D < / F i e l d _ M o d i f i e d B y U s e r I D > + 
+             < F i e l d _ M o d i f i e d B y U s e r J o b T i t l e > F i e l d _ M o d i f i e d B y U s e r J o b T i t l e < / F i e l d _ M o d i f i e d B y U s e r J o b T i t l e > + 
+             < F i e l d _ M o d i f i e d B y U s e r N a m e > F i e l d _ M o d i f i e d B y U s e r N a m e < / F i e l d _ M o d i f i e d B y U s e r N a m e > + 
+             < F i e l d _ M o d i f i e d B y U s e r P h o n e > F i e l d _ M o d i f i e d B y U s e r P h o n e < / F i e l d _ M o d i f i e d B y U s e r P h o n e > + 
+             < F i e l d _ M o d i f i e d D a t e T i m e > F i e l d _ M o d i f i e d D a t e T i m e < / F i e l d _ M o d i f i e d D a t e T i m e > + 
+             < F i e l d _ T y p e > F i e l d _ T y p e < / F i e l d _ T y p e > + 
+             < L a b e l F i e l d _ D e s c r i p t i o n > L a b e l F i e l d _ D e s c r i p t i o n < / L a b e l F i e l d _ D e s c r i p t i o n > + 
+             < N u m e r i c _ V a l u e > N u m e r i c _ V a l u e < / N u m e r i c _ V a l u e > + 
+             < P r o m p t e d R e s u l t C a p t i o n _ 1 > P r o m p t e d R e s u l t C a p t i o n _ 1 < / P r o m p t e d R e s u l t C a p t i o n _ 1 > + 
+             < P r o m p t e d R e s u l t C a p t i o n _ 1 0 > P r o m p t e d R e s u l t C a p t i o n _ 1 0 < / P r o m p t e d R e s u l t C a p t i o n _ 1 0 > + 
+             < P r o m p t e d R e s u l t C a p t i o n _ 2 > P r o m p t e d R e s u l t C a p t i o n _ 2 < / P r o m p t e d R e s u l t C a p t i o n _ 2 > + 
+             < P r o m p t e d R e s u l t C a p t i o n _ 3 > P r o m p t e d R e s u l t C a p t i o n _ 3 < / P r o m p t e d R e s u l t C a p t i o n _ 3 > + 
+             < P r o m p t e d R e s u l t C a p t i o n _ 4 > P r o m p t e d R e s u l t C a p t i o n _ 4 < / P r o m p t e d R e s u l t C a p t i o n _ 4 > + 
+             < P r o m p t e d R e s u l t C a p t i o n _ 5 > P r o m p t e d R e s u l t C a p t i o n _ 5 < / P r o m p t e d R e s u l t C a p t i o n _ 5 > + 
+             < P r o m p t e d R e s u l t C a p t i o n _ 6 > P r o m p t e d R e s u l t C a p t i o n _ 6 < / P r o m p t e d R e s u l t C a p t i o n _ 6 > + 
+             < P r o m p t e d R e s u l t C a p t i o n _ 7 > P r o m p t e d R e s u l t C a p t i o n _ 7 < / P r o m p t e d R e s u l t C a p t i o n _ 7 > + 
+             < P r o m p t e d R e s u l t C a p t i o n _ 8 > P r o m p t e d R e s u l t C a p t i o n _ 8 < / P r o m p t e d R e s u l t C a p t i o n _ 8 > + 
+             < P r o m p t e d R e s u l t C a p t i o n _ 9 > P r o m p t e d R e s u l t C a p t i o n _ 9 < / P r o m p t e d R e s u l t C a p t i o n _ 9 > + 
+             < P r o m p t e d R e s u l t C o n d i t i o n D e s c r i p t i o n _ 1 > P r o m p t e d R e s u l t C o n d i t i o n D e s c r i p t i o n _ 1 < / P r o m p t e d R e s u l t C o n d i t i o n D e s c r i p t i o n _ 1 > + 
+             < P r o m p t e d R e s u l t C o n d i t i o n D e s c r i p t i o n _ 1 0 > P r o m p t e d R e s u l t C o n d i t i o n D e s c r i p t i o n _ 1 0 < / P r o m p t e d R e s u l t C o n d i t i o n D e s c r i p t i o n _ 1 0 > + 
+             < P r o m p t e d R e s u l t C o n d i t i o n D e s c r i p t i o n _ 2 > P r o m p t e d R e s u l t C o n d i t i o n D e s c r i p t i o n _ 2 < / P r o m p t e d R e s u l t C o n d i t i o n D e s c r i p t i o n _ 2 > + 
+             < P r o m p t e d R e s u l t C o n d i t i o n D e s c r i p t i o n _ 3 > P r o m p t e d R e s u l t C o n d i t i o n D e s c r i p t i o n _ 3 < / P r o m p t e d R e s u l t C o n d i t i o n D e s c r i p t i o n _ 3 > + 
+             < P r o m p t e d R e s u l t C o n d i t i o n D e s c r i p t i o n _ 4 > P r o m p t e d R e s u l t C o n d i t i o n D e s c r i p t i o n _ 4 < / P r o m p t e d R e s u l t C o n d i t i o n D e s c r i p t i o n _ 4 > + 
+             < P r o m p t e d R e s u l t C o n d i t i o n D e s c r i p t i o n _ 5 > P r o m p t e d R e s u l t C o n d i t i o n D e s c r i p t i o n _ 5 < / P r o m p t e d R e s u l t C o n d i t i o n D e s c r i p t i o n _ 5 > + 
+             < P r o m p t e d R e s u l t C o n d i t i o n D e s c r i p t i o n _ 6 > P r o m p t e d R e s u l t C o n d i t i o n D e s c r i p t i o n _ 6 < / P r o m p t e d R e s u l t C o n d i t i o n D e s c r i p t i o n _ 6 > + 
+             < P r o m p t e d R e s u l t C o n d i t i o n D e s c r i p t i o n _ 7 > P r o m p t e d R e s u l t C o n d i t i o n D e s c r i p t i o n _ 7 < / P r o m p t e d R e s u l t C o n d i t i o n D e s c r i p t i o n _ 7 > + 
+             < P r o m p t e d R e s u l t C o n d i t i o n D e s c r i p t i o n _ 8 > P r o m p t e d R e s u l t C o n d i t i o n D e s c r i p t i o n _ 8 < / P r o m p t e d R e s u l t C o n d i t i o n D e s c r i p t i o n _ 8 > + 
+             < P r o m p t e d R e s u l t C o n d i t i o n D e s c r i p t i o n _ 9 > P r o m p t e d R e s u l t C o n d i t i o n D e s c r i p t i o n _ 9 < / P r o m p t e d R e s u l t C o n d i t i o n D e s c r i p t i o n _ 9 > + 
+             < P r o m p t e d R e s u l t V i s i b l e _ 1 > P r o m p t e d R e s u l t V i s i b l e _ 1 < / P r o m p t e d R e s u l t V i s i b l e _ 1 > + 
+             < P r o m p t e d R e s u l t V i s i b l e _ 1 0 > P r o m p t e d R e s u l t V i s i b l e _ 1 0 < / P r o m p t e d R e s u l t V i s i b l e _ 1 0 > + 
+             < P r o m p t e d R e s u l t V i s i b l e _ 2 > P r o m p t e d R e s u l t V i s i b l e _ 2 < / P r o m p t e d R e s u l t V i s i b l e _ 2 > + 
+             < P r o m p t e d R e s u l t V i s i b l e _ 3 > P r o m p t e d R e s u l t V i s i b l e _ 3 < / P r o m p t e d R e s u l t V i s i b l e _ 3 > + 
+             < P r o m p t e d R e s u l t V i s i b l e _ 4 > P r o m p t e d R e s u l t V i s i b l e _ 4 < / P r o m p t e d R e s u l t V i s i b l e _ 4 > + 
+             < P r o m p t e d R e s u l t V i s i b l e _ 5 > P r o m p t e d R e s u l t V i s i b l e _ 5 < / P r o m p t e d R e s u l t V i s i b l e _ 5 > + 
+             < P r o m p t e d R e s u l t V i s i b l e _ 6 > P r o m p t e d R e s u l t V i s i b l e _ 6 < / P r o m p t e d R e s u l t V i s i b l e _ 6 > + 
+             < P r o m p t e d R e s u l t V i s i b l e _ 7 > P r o m p t e d R e s u l t V i s i b l e _ 7 < / P r o m p t e d R e s u l t V i s i b l e _ 7 > + 
+             < P r o m p t e d R e s u l t V i s i b l e _ 8 > P r o m p t e d R e s u l t V i s i b l e _ 8 < / P r o m p t e d R e s u l t V i s i b l e _ 8 > + 
+             < P r o m p t e d R e s u l t V i s i b l e _ 9 > P r o m p t e d R e s u l t V i s i b l e _ 9 < / P r o m p t e d R e s u l t V i s i b l e _ 9 > + 
+             < T e s t _ R e s u l t > T e s t _ R e s u l t < / T e s t _ R e s u l t > + 
+             < T e s t _ R e s u l t D e s c r i p t i o n > T e s t _ R e s u l t D e s c r i p t i o n < / T e s t _ R e s u l t D e s c r i p t i o n > + 
+             < T e s t _ V a l u e > T e s t _ V a l u e < / T e s t _ V a l u e > + 
+             < W o r d D e s c r i p t i o n > W o r d D e s c r i p t i o n < / W o r d D e s c r i p t i o n > + 
+             < W o r d R e s u l t D e s c r i p t i o n > W o r d R e s u l t D e s c r i p t i o n < / W o r d R e s u l t D e s c r i p t i o n > + 
+             < W o r d U n f a v o r a b l e R e s u l t D e s c r i p t i o n > W o r d U n f a v o r a b l e R e s u l t D e s c r i p t i o n < / W o r d U n f a v o r a b l e R e s u l t D e s c r i p t i o n > + 
+         < / C u r r e n t I n s p e c t i o n L i n e > + 
+     < / C u r r e n t I n s p e c t i o n > + 
+ < / N a v W o r d R e p o r t X m l P a r t > 
+</file>
+
+<file path=customXml/item2.xml><?xml version="1.0" encoding="utf-8"?>
 <b:Sources xmlns:b="http://schemas.openxmlformats.org/officeDocument/2006/bibliography" xmlns="http://schemas.openxmlformats.org/officeDocument/2006/bibliography" SelectedStyle="\APASixthEditionOfficeOnline.xsl" StyleName="APA" Version="6"/>
 </file>
 
-<file path=customXml/item2.xml>��< ? x m l   v e r s i o n = " 1 . 0 "   e n c o d i n g = " u t f - 1 6 " ? > - 
- < N a v W o r d R e p o r t X m l P a r t   x m l n s = " u r n : m i c r o s o f t - d y n a m i c s - n a v / r e p o r t s / Q l t y _ C e r t i f i c a t e _ o f _ A n a l y s i s / 2 0 4 0 1 / " > +<file path=customXml/item3.xml>��< ? x m l   v e r s i o n = " 1 . 0 "   e n c o d i n g = " u t f - 1 6 " ? > < N a v W o r d R e p o r t X m l P a r t   x m l n s = " u r n : m i c r o s o f t - d y n a m i c s - b u s i n e s s c e n t r a l / i n t e r n a l / e x t e n d e d / r e p o r t s / Q l t y _ C e r t i f i c a t e _ o f _ A n a l y s i s / 2 0 4 0 1 / " >   
      < B C R e p o r t I n f o r m a t i o n >   
@@ -7092,387 +7848,38 @@
  
      < L a b e l s >   
-         < C o n d i t i o n L a b e l > C o n d i t i o n L a b e l < / C o n d i t i o n L a b e l > - 
-         < D a t e L a b e l > D a t e L a b e l < / D a t e L a b e l > - 
-         < F i n i s h e d B y L a b e l > F i n i s h e d B y L a b e l < / F i n i s h e d B y L a b e l > - 
-         < F i n i s h e d O n L a b e l > F i n i s h e d O n L a b e l < / F i n i s h e d O n L a b e l > - 
-         < I n s p e c t i o n L a b e l > I n s p e c t i o n L a b e l < / I n s p e c t i o n L a b e l > - 
-         < I t e m L a b e l > I t e m L a b e l < / I t e m L a b e l > - 
-         < I t e m T r a c k i n g L a b e l > I t e m T r a c k i n g L a b e l < / I t e m T r a c k i n g L a b e l > - 
-         < P a g e L a b e l > P a g e L a b e l < / P a g e L a b e l > - 
-         < R e p o r t T i t l e L a b e l > R e p o r t T i t l e L a b e l < / R e p o r t T i t l e L a b e l > - 
-         < R e s u l t L a b e l > R e s u l t L a b e l < / R e s u l t L a b e l > - 
-         < T e s t L a b e l > T e s t L a b e l < / T e s t L a b e l > - 
-         < T e s t V a l u e L a b e l > T e s t V a l u e L a b e l < / T e s t V a l u e L a b e l > +         < C o n d i t i o n L a b e l   E l e m e n t T y p e = " P a r a m e t e r "   E l e m e n t I d = " 1 4 2 4 6 4 8 2 8 8 "   D a t a T y p e = " S t r i n g " > C o n d i t i o n L a b e l < / C o n d i t i o n L a b e l > + 
+         < D a t e L a b e l   E l e m e n t T y p e = " P a r a m e t e r "   E l e m e n t I d = " 7 9 3 8 1 7 7 7 7 "   D a t a T y p e = " S t r i n g " > D a t e L a b e l < / D a t e L a b e l > + 
+         < F i n i s h e d B y L a b e l   E l e m e n t T y p e = " P a r a m e t e r "   E l e m e n t I d = " 1 2 1 8 3 5 9 1 8 "   D a t a T y p e = " S t r i n g " > F i n i s h e d B y L a b e l < / F i n i s h e d B y L a b e l > + 
+         < F i n i s h e d O n L a b e l   E l e m e n t T y p e = " P a r a m e t e r "   E l e m e n t I d = " 1 9 3 5 3 2 6 4 3 2 "   D a t a T y p e = " S t r i n g " > F i n i s h e d O n L a b e l < / F i n i s h e d O n L a b e l > + 
+         < I n s p e c t i o n D e s c r i p t i o n L a b e l   E l e m e n t T y p e = " P a r a m e t e r "   E l e m e n t I d = " 3 8 1 4 2 6 1 5 5 "   D a t a T y p e = " S t r i n g " > I n s p e c t i o n D e s c r i p t i o n L a b e l < / I n s p e c t i o n D e s c r i p t i o n L a b e l > + 
+         < I n s p e c t i o n L a b e l   E l e m e n t T y p e = " P a r a m e t e r "   E l e m e n t I d = " 1 5 4 9 8 3 1 5 2 5 "   D a t a T y p e = " S t r i n g " > I n s p e c t i o n L a b e l < / I n s p e c t i o n L a b e l > + 
+         < I t e m D e s c r i p t i o n L a b e l   E l e m e n t T y p e = " P a r a m e t e r "   E l e m e n t I d = " 1 5 6 7 1 7 4 7 2 8 "   D a t a T y p e = " S t r i n g " > I t e m D e s c r i p t i o n L a b e l < / I t e m D e s c r i p t i o n L a b e l > + 
+         < I t e m L a b e l   E l e m e n t T y p e = " P a r a m e t e r "   E l e m e n t I d = " 1 0 8 2 0 2 8 9 7 4 "   D a t a T y p e = " S t r i n g " > I t e m L a b e l < / I t e m L a b e l > + 
+         < I t e m T r a c k i n g L a b e l   E l e m e n t T y p e = " P a r a m e t e r "   E l e m e n t I d = " 9 3 5 5 3 4 6 7 1 "   D a t a T y p e = " S t r i n g " > I t e m T r a c k i n g L a b e l < / I t e m T r a c k i n g L a b e l > + 
+         < P a g e L a b e l   E l e m e n t T y p e = " P a r a m e t e r "   E l e m e n t I d = " 1 8 8 0 8 2 7 5 0 4 "   D a t a T y p e = " S t r i n g " > P a g e L a b e l < / P a g e L a b e l > + 
+         < R e p o r t T i t l e L a b e l   E l e m e n t T y p e = " P a r a m e t e r "   E l e m e n t I d = " 1 2 9 7 0 8 9 6 2 7 "   D a t a T y p e = " S t r i n g " > R e p o r t T i t l e L a b e l < / R e p o r t T i t l e L a b e l > + 
+         < R e s u l t L a b e l   E l e m e n t T y p e = " P a r a m e t e r "   E l e m e n t I d = " 4 0 7 6 0 6 8 8 6 "   D a t a T y p e = " S t r i n g " > R e s u l t L a b e l < / R e s u l t L a b e l > + 
+         < S t a t u s L a b e l   E l e m e n t T y p e = " P a r a m e t e r "   E l e m e n t I d = " 2 0 3 8 7 0 9 6 2 5 "   D a t a T y p e = " S t r i n g " > S t a t u s L a b e l < / S t a t u s L a b e l > + 
+         < T e s t L a b e l   E l e m e n t T y p e = " P a r a m e t e r "   E l e m e n t I d = " 1 5 2 2 4 8 5 9 "   D a t a T y p e = " S t r i n g " > T e s t L a b e l < / T e s t L a b e l > + 
+         < T e s t V a l u e L a b e l   E l e m e n t T y p e = " P a r a m e t e r "   E l e m e n t I d = " 1 1 6 2 1 3 2 5 7 0 "   D a t a T y p e = " S t r i n g " > T e s t V a l u e L a b e l < / T e s t V a l u e L a b e l >   
      < / L a b e l s >   
-     < C u r r e n t I n s p e c t i o n > - 
-         < A p p r o v e r N a m e L a b e l > A p p r o v e r N a m e L a b e l < / A p p r o v e r N a m e L a b e l > - 
-         < A p p r o v e r S i g n a t u r e L a b e l > A p p r o v e r S i g n a t u r e L a b e l < / A p p r o v e r S i g n a t u r e L a b e l > - 
-         < C O A C o n t a c t _ A l l > C O A C o n t a c t _ A l l < / C O A C o n t a c t _ A l l > - 
-         < C O A C o n t a c t _ R o w 1 > C O A C o n t a c t _ R o w 1 < / C O A C o n t a c t _ R o w 1 > - 
-         < C O A C o n t a c t _ R o w 2 > C O A C o n t a c t _ R o w 2 < / C O A C o n t a c t _ R o w 2 > - 
-         < C O A C o n t a c t _ R o w 3 > C O A C o n t a c t _ R o w 3 < / C O A C o n t a c t _ R o w 3 > - 
-         < C O A C o n t a c t _ R o w 4 > C O A C o n t a c t _ R o w 4 < / C O A C o n t a c t _ R o w 4 > - 
-         < C O A C o n t a c t _ R o w 5 > C O A C o n t a c t _ R o w 5 < / C O A C o n t a c t _ R o w 5 > - 
-         < C O A C o n t a c t _ R o w 6 > C O A C o n t a c t _ R o w 6 < / C O A C o n t a c t _ R o w 6 > - 
-         < C O A C o n t a c t _ R o w 7 > C O A C o n t a c t _ R o w 7 < / C O A C o n t a c t _ R o w 7 > - 
-         < C O A C o n t a c t _ R o w 8 > C O A C o n t a c t _ R o w 8 < / C O A C o n t a c t _ R o w 8 > - 
-         < C o m p a n y I n f o r m a t i o n _ A l l > C o m p a n y I n f o r m a t i o n _ A l l < / C o m p a n y I n f o r m a t i o n _ A l l > - 
-         < C o m p a n y I n f o r m a t i o n _ R o w 1 > C o m p a n y I n f o r m a t i o n _ R o w 1 < / C o m p a n y I n f o r m a t i o n _ R o w 1 > - 
-         < C o m p a n y I n f o r m a t i o n _ R o w 2 > C o m p a n y I n f o r m a t i o n _ R o w 2 < / C o m p a n y I n f o r m a t i o n _ R o w 2 > - 
-         < C o m p a n y I n f o r m a t i o n _ R o w 3 > C o m p a n y I n f o r m a t i o n _ R o w 3 < / C o m p a n y I n f o r m a t i o n _ R o w 3 > - 
-         < C o m p a n y I n f o r m a t i o n _ R o w 4 > C o m p a n y I n f o r m a t i o n _ R o w 4 < / C o m p a n y I n f o r m a t i o n _ R o w 4 > - 
-         < C o m p a n y I n f o r m a t i o n _ R o w 5 > C o m p a n y I n f o r m a t i o n _ R o w 5 < / C o m p a n y I n f o r m a t i o n _ R o w 5 > - 
-         < C o m p a n y I n f o r m a t i o n _ R o w 6 > C o m p a n y I n f o r m a t i o n _ R o w 6 < / C o m p a n y I n f o r m a t i o n _ R o w 6 > - 
-         < C o m p a n y I n f o r m a t i o n _ R o w 7 > C o m p a n y I n f o r m a t i o n _ R o w 7 < / C o m p a n y I n f o r m a t i o n _ R o w 7 > - 
-         < C o m p a n y I n f o r m a t i o n _ R o w 8 > C o m p a n y I n f o r m a t i o n _ R o w 8 < / C o m p a n y I n f o r m a t i o n _ R o w 8 > - 
-         < C o m p a n y L o g o   / > - 
-         < E m a i l L a b e l > E m a i l L a b e l < / E m a i l L a b e l > - 
-         < E m a i l V a l u e > E m a i l V a l u e < / E m a i l V a l u e > - 
-         < F i n i s h e d B y N a m e L a b e l > F i n i s h e d B y N a m e L a b e l < / F i n i s h e d B y N a m e L a b e l > - 
-         < F i n i s h e d B y S i g n a t u r e L a b e l > F i n i s h e d B y S i g n a t u r e L a b e l < / F i n i s h e d B y S i g n a t u r e L a b e l > - 
-         < H o m e P a g e L a b e l > H o m e P a g e L a b e l < / H o m e P a g e L a b e l > - 
-         < H o m e P a g e V a l u e > H o m e P a g e V a l u e < / H o m e P a g e V a l u e > - 
-         < I n s p e c t i o n I n f o r m a t i o n > I n s p e c t i o n I n f o r m a t i o n < / I n s p e c t i o n I n f o r m a t i o n > - 
-         < I t e m D e s c r i p t i o n > I t e m D e s c r i p t i o n < / I t e m D e s c r i p t i o n > - 
-         < I t e m T r a c k i n g D e s c r i p t i o n > I t e m T r a c k i n g D e s c r i p t i o n < / I t e m T r a c k i n g D e s c r i p t i o n > - 
-         < P h o n e N o L a b e l > P h o n e N o L a b e l < / P h o n e N o L a b e l > - 
-         < P h o n e N o V a l u e > P h o n e N o V a l u e < / P h o n e N o V a l u e > - 
-         < Q l t y I n s p e c t i o n T e m p l a t e _ D e s c r i p t i o n > Q l t y I n s p e c t i o n T e m p l a t e _ D e s c r i p t i o n < / Q l t y I n s p e c t i o n T e m p l a t e _ D e s c r i p t i o n > - 
-         < Q l t y I n s p e c t i o n _ D e s c r i p t i o n > Q l t y I n s p e c t i o n _ D e s c r i p t i o n < / Q l t y I n s p e c t i o n _ D e s c r i p t i o n > - 
-         < Q l t y I n s p e c t i o n _ D i r e c t o r _ N a m e > Q l t y I n s p e c t i o n _ D i r e c t o r _ N a m e < / Q l t y I n s p e c t i o n _ D i r e c t o r _ N a m e > - 
-         < Q l t y I n s p e c t i o n _ D i r e c t o r _ T i t l e > Q l t y I n s p e c t i o n _ D i r e c t o r _ T i t l e < / Q l t y I n s p e c t i o n _ D i r e c t o r _ T i t l e > - 
-         < Q l t y I n s p e c t i o n _ F i n i s h e d _ B y _ E m a i l > Q l t y I n s p e c t i o n _ F i n i s h e d _ B y _ E m a i l < / Q l t y I n s p e c t i o n _ F i n i s h e d _ B y _ E m a i l > - 
-         < Q l t y I n s p e c t i o n _ F i n i s h e d _ B y _ P h o n e > Q l t y I n s p e c t i o n _ F i n i s h e d _ B y _ P h o n e < / Q l t y I n s p e c t i o n _ F i n i s h e d _ B y _ P h o n e > - 
-         < Q l t y I n s p e c t i o n _ F i n i s h e d _ B y _ T i t l e > Q l t y I n s p e c t i o n _ F i n i s h e d _ B y _ T i t l e < / Q l t y I n s p e c t i o n _ F i n i s h e d _ B y _ T i t l e > - 
-         < Q l t y I n s p e c t i o n _ F i n i s h e d _ B y _ U s e r N a m e > Q l t y I n s p e c t i o n _ F i n i s h e d _ B y _ U s e r N a m e < / Q l t y I n s p e c t i o n _ F i n i s h e d _ B y _ U s e r N a m e > - 
-         < Q l t y I n s p e c t i o n _ F i n i s h e d _ B y _ U s e r _ I D > Q l t y I n s p e c t i o n _ F i n i s h e d _ B y _ U s e r _ I D < / Q l t y I n s p e c t i o n _ F i n i s h e d _ B y _ U s e r _ I D > - 
-         < Q l t y I n s p e c t i o n _ F i n i s h e d _ D a t e > Q l t y I n s p e c t i o n _ F i n i s h e d _ D a t e < / Q l t y I n s p e c t i o n _ F i n i s h e d _ D a t e > - 
-         < Q l t y I n s p e c t i o n _ N o > Q l t y I n s p e c t i o n _ N o < / Q l t y I n s p e c t i o n _ N o > - 
-         < Q l t y I n s p e c t i o n _ R e i n s p e c t i o n N o > Q l t y I n s p e c t i o n _ R e i n s p e c t i o n N o < / Q l t y I n s p e c t i o n _ R e i n s p e c t i o n N o > - 
-         < Q l t y I n s p e c t i o n _ R e s u l t _ C o d e > Q l t y I n s p e c t i o n _ R e s u l t _ C o d e < / Q l t y I n s p e c t i o n _ R e s u l t _ C o d e > - 
-         < Q l t y I n s p e c t i o n _ R e s u l t _ D e s c r i p t i o n > Q l t y I n s p e c t i o n _ R e s u l t _ D e s c r i p t i o n < / Q l t y I n s p e c t i o n _ R e s u l t _ D e s c r i p t i o n > - 
-         < Q l t y I n s p e c t i o n _ S o u r c e _ C u s t o m _ 1 > Q l t y I n s p e c t i o n _ S o u r c e _ C u s t o m _ 1 < / Q l t y I n s p e c t i o n _ S o u r c e _ C u s t o m _ 1 > - 
-         < Q l t y I n s p e c t i o n _ S o u r c e _ C u s t o m _ 1 0 > Q l t y I n s p e c t i o n _ S o u r c e _ C u s t o m _ 1 0 < / Q l t y I n s p e c t i o n _ S o u r c e _ C u s t o m _ 1 0 > - 
-         < Q l t y I n s p e c t i o n _ S o u r c e _ C u s t o m _ 2 > Q l t y I n s p e c t i o n _ S o u r c e _ C u s t o m _ 2 < / Q l t y I n s p e c t i o n _ S o u r c e _ C u s t o m _ 2 > - 
-         < Q l t y I n s p e c t i o n _ S o u r c e _ C u s t o m _ 3 > Q l t y I n s p e c t i o n _ S o u r c e _ C u s t o m _ 3 < / Q l t y I n s p e c t i o n _ S o u r c e _ C u s t o m _ 3 > - 
-         < Q l t y I n s p e c t i o n _ S o u r c e _ C u s t o m _ 4 > Q l t y I n s p e c t i o n _ S o u r c e _ C u s t o m _ 4 < / Q l t y I n s p e c t i o n _ S o u r c e _ C u s t o m _ 4 > - 
-         < Q l t y I n s p e c t i o n _ S o u r c e _ C u s t o m _ 5 > Q l t y I n s p e c t i o n _ S o u r c e _ C u s t o m _ 5 < / Q l t y I n s p e c t i o n _ S o u r c e _ C u s t o m _ 5 > - 
-         < Q l t y I n s p e c t i o n _ S o u r c e _ C u s t o m _ 6 > Q l t y I n s p e c t i o n _ S o u r c e _ C u s t o m _ 6 < / Q l t y I n s p e c t i o n _ S o u r c e _ C u s t o m _ 6 > - 
-         < Q l t y I n s p e c t i o n _ S o u r c e _ C u s t o m _ 7 > Q l t y I n s p e c t i o n _ S o u r c e _ C u s t o m _ 7 < / Q l t y I n s p e c t i o n _ S o u r c e _ C u s t o m _ 7 > - 
-         < Q l t y I n s p e c t i o n _ S o u r c e _ C u s t o m _ 8 > Q l t y I n s p e c t i o n _ S o u r c e _ C u s t o m _ 8 < / Q l t y I n s p e c t i o n _ S o u r c e _ C u s t o m _ 8 > - 
-         < Q l t y I n s p e c t i o n _ S o u r c e _ C u s t o m _ 9 > Q l t y I n s p e c t i o n _ S o u r c e _ C u s t o m _ 9 < / Q l t y I n s p e c t i o n _ S o u r c e _ C u s t o m _ 9 > - 
-         < Q l t y I n s p e c t i o n _ S o u r c e _ D o c u m e n t _ N o _ > Q l t y I n s p e c t i o n _ S o u r c e _ D o c u m e n t _ N o _ < / Q l t y I n s p e c t i o n _ S o u r c e _ D o c u m e n t _ N o _ > - 
-         < Q l t y I n s p e c t i o n _ S o u r c e _ I t e m _ D e s c r i p t i o n > Q l t y I n s p e c t i o n _ S o u r c e _ I t e m _ D e s c r i p t i o n < / Q l t y I n s p e c t i o n _ S o u r c e _ I t e m _ D e s c r i p t i o n > - 
-         < Q l t y I n s p e c t i o n _ S o u r c e _ I t e m _ D e s c r i p t i o n 2 > Q l t y I n s p e c t i o n _ S o u r c e _ I t e m _ D e s c r i p t i o n 2 < / Q l t y I n s p e c t i o n _ S o u r c e _ I t e m _ D e s c r i p t i o n 2 > - 
-         < Q l t y I n s p e c t i o n _ S o u r c e _ I t e m _ N o _ > Q l t y I n s p e c t i o n _ S o u r c e _ I t e m _ N o _ < / Q l t y I n s p e c t i o n _ S o u r c e _ I t e m _ N o _ > - 
-         < Q l t y I n s p e c t i o n _ S o u r c e _ L o t _ N o _ > Q l t y I n s p e c t i o n _ S o u r c e _ L o t _ N o _ < / Q l t y I n s p e c t i o n _ S o u r c e _ L o t _ N o _ > - 
-         < Q l t y I n s p e c t i o n _ S o u r c e _ P a c k a g e _ N o _ > Q l t y I n s p e c t i o n _ S o u r c e _ P a c k a g e _ N o _ < / Q l t y I n s p e c t i o n _ S o u r c e _ P a c k a g e _ N o _ > - 
-         < Q l t y I n s p e c t i o n _ S o u r c e _ S e r i a l _ N o _ > Q l t y I n s p e c t i o n _ S o u r c e _ S e r i a l _ N o _ < / Q l t y I n s p e c t i o n _ S o u r c e _ S e r i a l _ N o _ > - 
-         < Q l t y I n s p e c t i o n _ S o u r c e _ T a s k _ N o _ > Q l t y I n s p e c t i o n _ S o u r c e _ T a s k _ N o _ < / Q l t y I n s p e c t i o n _ S o u r c e _ T a s k _ N o _ > - 
-         < Q l t y I n s p e c t i o n _ S o u r c e _ V a r i a n t _ C o d e > Q l t y I n s p e c t i o n _ S o u r c e _ V a r i a n t _ C o d e < / Q l t y I n s p e c t i o n _ S o u r c e _ V a r i a n t _ C o d e > - 
-         < Q l t y I n s p e c t i o n _ S t a t u s > Q l t y I n s p e c t i o n _ S t a t u s < / Q l t y I n s p e c t i o n _ S t a t u s > - 
-         < R e i n s p e c t i o n S e q u e n c e I n f o r m a t i o n > R e i n s p e c t i o n S e q u e n c e I n f o r m a t i o n < / R e i n s p e c t i o n S e q u e n c e I n f o r m a t i o n > - 
-         < C u r r e n t I n s p e c t i o n L i n e > - 
-             < C o n d i t i o n L a b e l _ 1 > C o n d i t i o n L a b e l _ 1 < / C o n d i t i o n L a b e l _ 1 > - 
-             < C o n d i t i o n L a b e l _ 2 > C o n d i t i o n L a b e l _ 2 < / C o n d i t i o n L a b e l _ 2 > - 
-             < F i e l d _ C o d e > F i e l d _ C o d e < / F i e l d _ C o d e > - 
-             < F i e l d _ D e s c r i p t i o n > F i e l d _ D e s c r i p t i o n < / F i e l d _ D e s c r i p t i o n > - 
-             < F i e l d _ H a s E n t e r e d V a l u e > F i e l d _ H a s E n t e r e d V a l u e < / F i e l d _ H a s E n t e r e d V a l u e > - 
-             < F i e l d _ I f P e r s o n E m a i l > F i e l d _ I f P e r s o n E m a i l < / F i e l d _ I f P e r s o n E m a i l > - 
-             < F i e l d _ I f P e r s o n N a m e > F i e l d _ I f P e r s o n N a m e < / F i e l d _ I f P e r s o n N a m e > - 
-             < F i e l d _ I f P e r s o n P h o n e > F i e l d _ I f P e r s o n P h o n e < / F i e l d _ I f P e r s o n P h o n e > - 
-             < F i e l d _ I f P e r s o n T i t l e > F i e l d _ I f P e r s o n T i t l e < / F i e l d _ I f P e r s o n T i t l e > - 
-             < F i e l d _ I s L a b e l > F i e l d _ I s L a b e l < / F i e l d _ I s L a b e l > - 
-             < F i e l d _ I s P e r s o n F i e l d > F i e l d _ I s P e r s o n F i e l d < / F i e l d _ I s P e r s o n F i e l d > - 
-             < F i e l d _ I s T e x t > F i e l d _ I s T e x t < / F i e l d _ I s T e x t > - 
-             < F i e l d _ L i n e C o m m e n t a r y > F i e l d _ L i n e C o m m e n t a r y < / F i e l d _ L i n e C o m m e n t a r y > - 
-             < F i e l d _ M o d i f i e d B y U s e r E m a i l > F i e l d _ M o d i f i e d B y U s e r E m a i l < / F i e l d _ M o d i f i e d B y U s e r E m a i l > - 
-             < F i e l d _ M o d i f i e d B y U s e r I D > F i e l d _ M o d i f i e d B y U s e r I D < / F i e l d _ M o d i f i e d B y U s e r I D > - 
-             < F i e l d _ M o d i f i e d B y U s e r J o b T i t l e > F i e l d _ M o d i f i e d B y U s e r J o b T i t l e < / F i e l d _ M o d i f i e d B y U s e r J o b T i t l e > - 
-             < F i e l d _ M o d i f i e d B y U s e r N a m e > F i e l d _ M o d i f i e d B y U s e r N a m e < / F i e l d _ M o d i f i e d B y U s e r N a m e > - 
-             < F i e l d _ M o d i f i e d B y U s e r P h o n e > F i e l d _ M o d i f i e d B y U s e r P h o n e < / F i e l d _ M o d i f i e d B y U s e r P h o n e > - 
-             < F i e l d _ M o d i f i e d D a t e T i m e > F i e l d _ M o d i f i e d D a t e T i m e < / F i e l d _ M o d i f i e d D a t e T i m e > - 
-             < F i e l d _ T y p e > F i e l d _ T y p e < / F i e l d _ T y p e > - 
-             < L a b e l F i e l d _ D e s c r i p t i o n > L a b e l F i e l d _ D e s c r i p t i o n < / L a b e l F i e l d _ D e s c r i p t i o n > - 
-             < N u m e r i c _ V a l u e > N u m e r i c _ V a l u e < / N u m e r i c _ V a l u e > - 
-             < P r o m p t e d R e s u l t C a p t i o n _ 1 > P r o m p t e d R e s u l t C a p t i o n _ 1 < / P r o m p t e d R e s u l t C a p t i o n _ 1 > - 
-             < P r o m p t e d R e s u l t C a p t i o n _ 1 0 > P r o m p t e d R e s u l t C a p t i o n _ 1 0 < / P r o m p t e d R e s u l t C a p t i o n _ 1 0 > - 
-             < P r o m p t e d R e s u l t C a p t i o n _ 2 > P r o m p t e d R e s u l t C a p t i o n _ 2 < / P r o m p t e d R e s u l t C a p t i o n _ 2 > - 
-             < P r o m p t e d R e s u l t C a p t i o n _ 3 > P r o m p t e d R e s u l t C a p t i o n _ 3 < / P r o m p t e d R e s u l t C a p t i o n _ 3 > - 
-             < P r o m p t e d R e s u l t C a p t i o n _ 4 > P r o m p t e d R e s u l t C a p t i o n _ 4 < / P r o m p t e d R e s u l t C a p t i o n _ 4 > - 
-             < P r o m p t e d R e s u l t C a p t i o n _ 5 > P r o m p t e d R e s u l t C a p t i o n _ 5 < / P r o m p t e d R e s u l t C a p t i o n _ 5 > - 
-             < P r o m p t e d R e s u l t C a p t i o n _ 6 > P r o m p t e d R e s u l t C a p t i o n _ 6 < / P r o m p t e d R e s u l t C a p t i o n _ 6 > - 
-             < P r o m p t e d R e s u l t C a p t i o n _ 7 > P r o m p t e d R e s u l t C a p t i o n _ 7 < / P r o m p t e d R e s u l t C a p t i o n _ 7 > - 
-             < P r o m p t e d R e s u l t C a p t i o n _ 8 > P r o m p t e d R e s u l t C a p t i o n _ 8 < / P r o m p t e d R e s u l t C a p t i o n _ 8 > - 
-             < P r o m p t e d R e s u l t C a p t i o n _ 9 > P r o m p t e d R e s u l t C a p t i o n _ 9 < / P r o m p t e d R e s u l t C a p t i o n _ 9 > - 
-             < P r o m p t e d R e s u l t C o n d i t i o n D e s c r i p t i o n _ 1 > P r o m p t e d R e s u l t C o n d i t i o n D e s c r i p t i o n _ 1 < / P r o m p t e d R e s u l t C o n d i t i o n D e s c r i p t i o n _ 1 > - 
-             < P r o m p t e d R e s u l t C o n d i t i o n D e s c r i p t i o n _ 1 0 > P r o m p t e d R e s u l t C o n d i t i o n D e s c r i p t i o n _ 1 0 < / P r o m p t e d R e s u l t C o n d i t i o n D e s c r i p t i o n _ 1 0 > - 
-             < P r o m p t e d R e s u l t C o n d i t i o n D e s c r i p t i o n _ 2 > P r o m p t e d R e s u l t C o n d i t i o n D e s c r i p t i o n _ 2 < / P r o m p t e d R e s u l t C o n d i t i o n D e s c r i p t i o n _ 2 > - 
-             < P r o m p t e d R e s u l t C o n d i t i o n D e s c r i p t i o n _ 3 > P r o m p t e d R e s u l t C o n d i t i o n D e s c r i p t i o n _ 3 < / P r o m p t e d R e s u l t C o n d i t i o n D e s c r i p t i o n _ 3 > - 
-             < P r o m p t e d R e s u l t C o n d i t i o n D e s c r i p t i o n _ 4 > P r o m p t e d R e s u l t C o n d i t i o n D e s c r i p t i o n _ 4 < / P r o m p t e d R e s u l t C o n d i t i o n D e s c r i p t i o n _ 4 > - 
-             < P r o m p t e d R e s u l t C o n d i t i o n D e s c r i p t i o n _ 5 > P r o m p t e d R e s u l t C o n d i t i o n D e s c r i p t i o n _ 5 < / P r o m p t e d R e s u l t C o n d i t i o n D e s c r i p t i o n _ 5 > - 
-             < P r o m p t e d R e s u l t C o n d i t i o n D e s c r i p t i o n _ 6 > P r o m p t e d R e s u l t C o n d i t i o n D e s c r i p t i o n _ 6 < / P r o m p t e d R e s u l t C o n d i t i o n D e s c r i p t i o n _ 6 > - 
-             < P r o m p t e d R e s u l t C o n d i t i o n D e s c r i p t i o n _ 7 > P r o m p t e d R e s u l t C o n d i t i o n D e s c r i p t i o n _ 7 < / P r o m p t e d R e s u l t C o n d i t i o n D e s c r i p t i o n _ 7 > - 
-             < P r o m p t e d R e s u l t C o n d i t i o n D e s c r i p t i o n _ 8 > P r o m p t e d R e s u l t C o n d i t i o n D e s c r i p t i o n _ 8 < / P r o m p t e d R e s u l t C o n d i t i o n D e s c r i p t i o n _ 8 > - 
-             < P r o m p t e d R e s u l t C o n d i t i o n D e s c r i p t i o n _ 9 > P r o m p t e d R e s u l t C o n d i t i o n D e s c r i p t i o n _ 9 < / P r o m p t e d R e s u l t C o n d i t i o n D e s c r i p t i o n _ 9 > - 
-             < P r o m p t e d R e s u l t V i s i b l e _ 1 > P r o m p t e d R e s u l t V i s i b l e _ 1 < / P r o m p t e d R e s u l t V i s i b l e _ 1 > - 
-             < P r o m p t e d R e s u l t V i s i b l e _ 1 0 > P r o m p t e d R e s u l t V i s i b l e _ 1 0 < / P r o m p t e d R e s u l t V i s i b l e _ 1 0 > - 
-             < P r o m p t e d R e s u l t V i s i b l e _ 2 > P r o m p t e d R e s u l t V i s i b l e _ 2 < / P r o m p t e d R e s u l t V i s i b l e _ 2 > - 
-             < P r o m p t e d R e s u l t V i s i b l e _ 3 > P r o m p t e d R e s u l t V i s i b l e _ 3 < / P r o m p t e d R e s u l t V i s i b l e _ 3 > - 
-             < P r o m p t e d R e s u l t V i s i b l e _ 4 > P r o m p t e d R e s u l t V i s i b l e _ 4 < / P r o m p t e d R e s u l t V i s i b l e _ 4 > - 
-             < P r o m p t e d R e s u l t V i s i b l e _ 5 > P r o m p t e d R e s u l t V i s i b l e _ 5 < / P r o m p t e d R e s u l t V i s i b l e _ 5 > - 
-             < P r o m p t e d R e s u l t V i s i b l e _ 6 > P r o m p t e d R e s u l t V i s i b l e _ 6 < / P r o m p t e d R e s u l t V i s i b l e _ 6 > - 
-             < P r o m p t e d R e s u l t V i s i b l e _ 7 > P r o m p t e d R e s u l t V i s i b l e _ 7 < / P r o m p t e d R e s u l t V i s i b l e _ 7 > - 
-             < P r o m p t e d R e s u l t V i s i b l e _ 8 > P r o m p t e d R e s u l t V i s i b l e _ 8 < / P r o m p t e d R e s u l t V i s i b l e _ 8 > - 
-             < P r o m p t e d R e s u l t V i s i b l e _ 9 > P r o m p t e d R e s u l t V i s i b l e _ 9 < / P r o m p t e d R e s u l t V i s i b l e _ 9 > - 
-             < T e s t _ R e s u l t > T e s t _ R e s u l t < / T e s t _ R e s u l t > - 
-             < T e s t _ R e s u l t D e s c r i p t i o n > T e s t _ R e s u l t D e s c r i p t i o n < / T e s t _ R e s u l t D e s c r i p t i o n > - 
-             < T e s t _ V a l u e > T e s t _ V a l u e < / T e s t _ V a l u e > - 
-             < W o r d D e s c r i p t i o n > W o r d D e s c r i p t i o n < / W o r d D e s c r i p t i o n > - 
-             < W o r d R e s u l t D e s c r i p t i o n > W o r d R e s u l t D e s c r i p t i o n < / W o r d R e s u l t D e s c r i p t i o n > - 
-             < W o r d U n f a v o r a b l e R e s u l t D e s c r i p t i o n > W o r d U n f a v o r a b l e R e s u l t D e s c r i p t i o n < / W o r d U n f a v o r a b l e R e s u l t D e s c r i p t i o n > - 
-         < / C u r r e n t I n s p e c t i o n L i n e > - 
-     < / C u r r e n t I n s p e c t i o n > - 
- < / N a v W o r d R e p o r t X m l P a r t > 
-</file>
-
-<file path=customXml/item3.xml>��< ? x m l   v e r s i o n = " 1 . 0 "   e n c o d i n g = " u t f - 1 6 " ? > < N a v W o r d R e p o r t X m l P a r t   x m l n s = " u r n : m i c r o s o f t - d y n a m i c s - b u s i n e s s c e n t r a l / i n t e r n a l / e x t e n d e d / r e p o r t s / Q l t y _ C e r t i f i c a t e _ o f _ A n a l y s i s / 2 0 4 0 1 / " > - 
-     < B C R e p o r t I n f o r m a t i o n > - 
-         < R e p o r t M e t a d a t a > - 
-             < E x t e n s i o n I d > E x t e n s i o n   I D < / E x t e n s i o n I d > - 
-             < E x t e n s i o n N a m e > E x t e n s i o n   N a m e < / E x t e n s i o n N a m e > - 
-             < E x t e n s i o n P u b l i s h e r > E x t e n s i o n   P u b l i s h e r < / E x t e n s i o n P u b l i s h e r > - 
-             < E x t e n s i o n V e r s i o n > E x t e n s i o n   V e r s i o n < / E x t e n s i o n V e r s i o n > - 
-             < R e p o r t I d > R e p o r t   I D < / R e p o r t I d > - 
-             < R e p o r t N a m e > R e p o r t   N a m e < / R e p o r t N a m e > - 
-             < A b o u t T h i s R e p o r t T i t l e > A b o u t   T h i s   R e p o r t   T i t l e < / A b o u t T h i s R e p o r t T i t l e > - 
-             < A b o u t T h i s R e p o r t T e x t > A b o u t   T h i s   R e p o r t   T e x t < / A b o u t T h i s R e p o r t T e x t > - 
-             < R e p o r t H e l p L i n k > R e p o r t   H e l p   L i n k < / R e p o r t H e l p L i n k > - 
-         < / R e p o r t M e t a d a t a > - 
-         < R e p o r t R e q u e s t > - 
-             < T e n a n t E n t r a I d > T e n a n t   E n t r a   I d < / T e n a n t E n t r a I d > - 
-             < E n v i r o n m e n t N a m e > E n v i r o n m e n t   N a m e < / E n v i r o n m e n t N a m e > - 
-             < E n v i r o n m e n t T y p e > E n v i r o n m e n t   T y p e < / E n v i r o n m e n t T y p e > - 
-             < C o m p a n y N a m e > C o m p a n y   N a m e < / C o m p a n y N a m e > - 
-             < C o m p a n y D i s p l a y N a m e > C o m p a n y   D i s p l a y   N a m e < / C o m p a n y D i s p l a y N a m e > - 
-             < C o m p a n y I d > C o m p a n y   I D < / C o m p a n y I d > - 
-             < U s e r N a m e > U s e r   N a m e < / U s e r N a m e > - 
-             < D a t e A n d T i m e > D a t e   a n d   T i m e < / D a t e A n d T i m e > - 
-             < L a n g u a g e > L a n g u a g e < / L a n g u a g e > - 
-             < F o r m a t R e g i o n > F o r m a t   R e g i o n < / F o r m a t R e g i o n > - 
-             < D a t e T i m e V a l u e s > - 
-                 < Y e a r > Y e a r < / Y e a r > - 
-                 < M o n t h N u m b e r > M o n t h   N u m b e r < / M o n t h N u m b e r > - 
-                 < D a y N u m b e r > D a y   N u m b e r < / D a y N u m b e r > - 
-                 < H o u r > H o u r < / H o u r > - 
-                 < M i n u t e > M i n u t e < / M i n u t e > - 
-             < / D a t e T i m e V a l u e s > - 
-         < / R e p o r t R e q u e s t > - 
-     < / B C R e p o r t I n f o r m a t i o n > - 
-     < L a b e l s > - 
-         < C o n d i t i o n L a b e l   E l e m e n t T y p e = " P a r a m e t e r "   E l e m e n t I d = " 1 4 2 4 6 4 8 2 8 8 "   D a t a T y p e = " S t r i n g " > C o n d i t i o n L a b e l < / C o n d i t i o n L a b e l > - 
-         < D a t e L a b e l   E l e m e n t T y p e = " P a r a m e t e r "   E l e m e n t I d = " 7 9 3 8 1 7 7 7 7 "   D a t a T y p e = " S t r i n g " > D a t e L a b e l < / D a t e L a b e l > - 
-         < F i n i s h e d B y L a b e l   E l e m e n t T y p e = " P a r a m e t e r "   E l e m e n t I d = " 1 2 1 8 3 5 9 1 8 "   D a t a T y p e = " S t r i n g " > F i n i s h e d B y L a b e l < / F i n i s h e d B y L a b e l > - 
-         < F i n i s h e d O n L a b e l   E l e m e n t T y p e = " P a r a m e t e r "   E l e m e n t I d = " 1 9 3 5 3 2 6 4 3 2 "   D a t a T y p e = " S t r i n g " > F i n i s h e d O n L a b e l < / F i n i s h e d O n L a b e l > - 
-         < I n s p e c t i o n L a b e l   E l e m e n t T y p e = " P a r a m e t e r "   E l e m e n t I d = " 1 5 4 9 8 3 1 5 2 5 "   D a t a T y p e = " S t r i n g " > I n s p e c t i o n L a b e l < / I n s p e c t i o n L a b e l > - 
-         < I t e m L a b e l   E l e m e n t T y p e = " P a r a m e t e r "   E l e m e n t I d = " 1 0 8 2 0 2 8 9 7 4 "   D a t a T y p e = " S t r i n g " > I t e m L a b e l < / I t e m L a b e l > - 
-         < I t e m T r a c k i n g L a b e l   E l e m e n t T y p e = " P a r a m e t e r "   E l e m e n t I d = " 9 3 5 5 3 4 6 7 1 "   D a t a T y p e = " S t r i n g " > I t e m T r a c k i n g L a b e l < / I t e m T r a c k i n g L a b e l > - 
-         < P a g e L a b e l   E l e m e n t T y p e = " P a r a m e t e r "   E l e m e n t I d = " 1 8 8 0 8 2 7 5 0 4 "   D a t a T y p e = " S t r i n g " > P a g e L a b e l < / P a g e L a b e l > - 
-         < R e p o r t T i t l e L a b e l   E l e m e n t T y p e = " P a r a m e t e r "   E l e m e n t I d = " 1 2 9 7 0 8 9 6 2 7 "   D a t a T y p e = " S t r i n g " > R e p o r t T i t l e L a b e l < / R e p o r t T i t l e L a b e l > - 
-         < R e s u l t L a b e l   E l e m e n t T y p e = " P a r a m e t e r "   E l e m e n t I d = " 4 0 7 6 0 6 8 8 6 "   D a t a T y p e = " S t r i n g " > R e s u l t L a b e l < / R e s u l t L a b e l > - 
-         < T e s t L a b e l   E l e m e n t T y p e = " P a r a m e t e r "   E l e m e n t I d = " 1 5 2 2 4 8 5 9 "   D a t a T y p e = " S t r i n g " > T e s t L a b e l < / T e s t L a b e l > - 
-         < T e s t V a l u e L a b e l   E l e m e n t T y p e = " P a r a m e t e r "   E l e m e n t I d = " 1 1 6 2 1 3 2 5 7 0 "   D a t a T y p e = " S t r i n g " > T e s t V a l u e L a b e l < / T e s t V a l u e L a b e l > - 
-     < / L a b e l s > - 
      < T o o l t i p s >   
          < T o o l t i p   c o l u m n = " Q l t y I n s p e c t i o n T e m p l a t e _ D e s c r i p t i o n "   E l e m e n t I d = " 1 6 5 2 0 6 9 5 9 8 " > @@ -7643,6 +8050,12 @@
  
          < / T o o l t i p >   
+         < T o o l t i p   c o l u m n = " I t e m D e s c r i p t i o n "   E l e m e n t I d = " 1 9 6 5 3 9 3 7 9 0 " > + 
+             < T o o l t i p T e x t   l a n g = " e n - U S " > S p e c i f i e s   a   d e s c r i p t i o n   o f   t h e   i t e m . < / T o o l t i p T e x t > + 
+         < / T o o l t i p > + 
          < T o o l t i p   c o l u m n = " F i e l d _ C o d e "   E l e m e n t I d = " 1 3 2 7 2 5 5 7 3 " >   
              < T o o l t i p T e x t   l a n g = " e n - U S " > S p e c i f i e s   t h e   f i e l d / q u e s t i o n / m e t r i c   i n   t h i s   t e s t . < / T o o l t i p T e x t > @@ -7731,11 +8144,11 @@
  
          < H o m e P a g e V a l u e   E l e m e n t T y p e = " C o l u m n "   E l e m e n t I d = " 5 3 3 5 1 4 0 3 4 "   D a t a T y p e = " T e x t " > H o m e P a g e V a l u e < / H o m e P a g e V a l u e >   
-         < I n s p e c t i o n I n f o r m a t i o n   E l e m e n t T y p e = " C o l u m n "   E l e m e n t I d = " 1 5 3 2 8 6 0 1 9 9 "   D a t a T y p e = " T e x t " > I n s p e c t i o n I n f o r m a t i o n < / I n s p e c t i o n I n f o r m a t i o n > - 
          < I t e m D e s c r i p t i o n   E l e m e n t T y p e = " C o l u m n "   E l e m e n t I d = " 1 9 6 5 3 9 3 7 9 0 "   D a t a T y p e = " T e x t " > I t e m D e s c r i p t i o n < / I t e m D e s c r i p t i o n >   
-         < I t e m T r a c k i n g D e s c r i p t i o n   E l e m e n t T y p e = " C o l u m n "   E l e m e n t I d = " 1 1 1 7 1 0 3 3 4 5 "   D a t a T y p e = " T e x t " > I t e m T r a c k i n g D e s c r i p t i o n < / I t e m T r a c k i n g D e s c r i p t i o n > +         < I t e m I d e n t i f i e r   E l e m e n t T y p e = " C o l u m n "   E l e m e n t I d = " 5 0 6 2 1 1 7 7 1 "   D a t a T y p e = " T e x t " > I t e m I d e n t i f i e r < / I t e m I d e n t i f i e r > + 
+         < I t e m T r a c k i n g I d e n t i f i e r   E l e m e n t T y p e = " C o l u m n "   E l e m e n t I d = " 7 9 0 2 0 8 2 0 4 "   D a t a T y p e = " T e x t " > I t e m T r a c k i n g I d e n t i f i e r < / I t e m T r a c k i n g I d e n t i f i e r >   
          < P h o n e N o L a b e l   E l e m e n t T y p e = " C o l u m n "   E l e m e n t I d = " 1 6 1 4 5 2 6 0 7 8 "   D a t a T y p e = " T e x t " > P h o n e N o L a b e l < / P h o n e N o L a b e l >   
@@ -7937,17 +8350,17 @@
 </file>
 
 <file path=customXml/itemProps1.xml><?xml version="1.0" encoding="utf-8"?>
-<ds:datastoreItem xmlns:ds="http://schemas.openxmlformats.org/officeDocument/2006/customXml" ds:itemID="{17CE75AC-9DC5-435C-A40B-AC945788E8B7}">
+<ds:datastoreItem xmlns:ds="http://schemas.openxmlformats.org/officeDocument/2006/customXml" ds:itemID="{F00BF611-06BA-436C-902A-C0D5E8DF929B}">
   <ds:schemaRefs>
-    <ds:schemaRef ds:uri="http://schemas.openxmlformats.org/officeDocument/2006/bibliography"/>
+    <ds:schemaRef ds:uri="urn:microsoft-dynamics-nav/reports/Qlty_Certificate_of_Analysis/20401/"/>
   </ds:schemaRefs>
 </ds:datastoreItem>
 </file>
 
 <file path=customXml/itemProps2.xml><?xml version="1.0" encoding="utf-8"?>
-<ds:datastoreItem xmlns:ds="http://schemas.openxmlformats.org/officeDocument/2006/customXml" ds:itemID="{F00BF611-06BA-436C-902A-C0D5E8DF929B}">
+<ds:datastoreItem xmlns:ds="http://schemas.openxmlformats.org/officeDocument/2006/customXml" ds:itemID="{17CE75AC-9DC5-435C-A40B-AC945788E8B7}">
   <ds:schemaRefs>
-    <ds:schemaRef ds:uri="urn:microsoft-dynamics-nav/reports/Qlty_Certificate_of_Analysis/20401/"/>
+    <ds:schemaRef ds:uri="http://schemas.openxmlformats.org/officeDocument/2006/bibliography"/>
   </ds:schemaRefs>
 </ds:datastoreItem>
 </file>

</xml_diff>

<commit_message>
[Quality Management] Obsolete RDLC layouts (#8290)
## What & why

Mark RDLC layout columns and methods as obsolete in Quality Management
reports.

Fixes
[AB#611315](https://dynamicssmb2.visualstudio.com/1fcb79e7-ab07-432a-a3c6-6cf5a88ba4a5/_workitems/edit/611315)
</commit_message>
<xml_diff>
--- a/src/Apps/W1/Quality Management/app/src/Reports/QltyCertificateOfAnalysis.docx
+++ b/src/Apps/W1/Quality Management/app/src/Reports/QltyCertificateOfAnalysis.docx
@@ -7780,7 +7780,9 @@
 <b:Sources xmlns:b="http://schemas.openxmlformats.org/officeDocument/2006/bibliography" xmlns="http://schemas.openxmlformats.org/officeDocument/2006/bibliography" SelectedStyle="\APASixthEditionOfficeOnline.xsl" StyleName="APA" Version="6"/>
 </file>
 
-<file path=customXml/item3.xml>��< ? x m l   v e r s i o n = " 1 . 0 "   e n c o d i n g = " u t f - 1 6 " ? > < N a v W o r d R e p o r t X m l P a r t   x m l n s = " u r n : m i c r o s o f t - d y n a m i c s - b u s i n e s s c e n t r a l / i n t e r n a l / e x t e n d e d / r e p o r t s / Q l t y _ C e r t i f i c a t e _ o f _ A n a l y s i s / 2 0 4 0 1 / " > +<file path=customXml/item3.xml>��< ? x m l   v e r s i o n = " 1 . 0 "   e n c o d i n g = " u t f - 1 6 " ? > + 
+ < N a v W o r d R e p o r t X m l P a r t   x m l n s = " u r n : m i c r o s o f t - d y n a m i c s - b u s i n e s s c e n t r a l / i n t e r n a l / e x t e n d e d / r e p o r t s / Q l t y _ C e r t i f i c a t e _ o f _ A n a l y s i s / 2 0 4 0 1 / " >   
      < B C R e p o r t I n f o r m a t i o n >   
@@ -8130,7 +8132,7 @@
  
          < C o m p a n y I n f o r m a t i o n _ R o w 8   E l e m e n t T y p e = " C o l u m n "   E l e m e n t I d = " 3 9 8 9 1 0 6 3 7 "   D a t a T y p e = " T e x t " > C o m p a n y I n f o r m a t i o n _ R o w 8 < / C o m p a n y I n f o r m a t i o n _ R o w 8 >   
-         < C o m p a n y L o g o   E l e m e n t T y p e = " C o l u m n "   E l e m e n t I d = " 2 3 7 6 9 1 5 1 "   D a t a T y p e = " B l o b " / > +         < C o m p a n y L o g o   E l e m e n t T y p e = " C o l u m n "   E l e m e n t I d = " 2 3 7 6 9 1 5 1 "   D a t a T y p e = " B l o b "   / >   
          < E m a i l L a b e l   E l e m e n t T y p e = " C o l u m n "   E l e m e n t I d = " 7 7 1 8 8 7 1 3 5 "   D a t a T y p e = " T e x t " > E m a i l L a b e l < / E m a i l L a b e l >   
@@ -8154,7 +8156,7 @@
  
          < P h o n e N o V a l u e   E l e m e n t T y p e = " C o l u m n "   E l e m e n t I d = " 1 2 8 6 6 4 9 7 8 1 "   D a t a T y p e = " T e x t " > P h o n e N o V a l u e < / P h o n e N o V a l u e >   
-         < Q l t y I n s p e c t i o n T e m p l a t e _ D e s c r i p t i o n   E l e m e n t T y p e = " C o l u m n "   E l e m e n t I d = " 1 6 5 2 0 6 9 5 9 8 "   D a t a T y p e = " T e x t " > Q l t y I n s p e c t i o n T e m p l a t e _ D e s c r i p t i o n < / Q l t y I n s p e c t i o n T e m p l a t e _ D e s c r i p t i o n > +         < Q l t y I n s p e c t i o n T e m p l a t e _ D e s c r i p t i o n   E l e m e n t T y p e = " C o l u m n "   E l e m e n t I d = " 1 6 5 2 0 6 9 5 9 8 "   D a t a T y p e = " T e x t "   O b s o l e t e S t a t e = " P e n d i n g " > Q l t y I n s p e c t i o n T e m p l a t e _ D e s c r i p t i o n < / Q l t y I n s p e c t i o n T e m p l a t e _ D e s c r i p t i o n >   
          < Q l t y I n s p e c t i o n _ D e s c r i p t i o n   E l e m e n t T y p e = " C o l u m n "   E l e m e n t I d = " 7 3 9 0 1 9 9 1 0 "   D a t a T y p e = " T e x t " > Q l t y I n s p e c t i o n _ D e s c r i p t i o n < / Q l t y I n s p e c t i o n _ D e s c r i p t i o n >   

</xml_diff>

<commit_message>
[Quality Management] Improvements in "Value Type Text Expression" and tooltips (#8524)
## What & why

Fixes:
1. Expression Formula not copied to template, not visible on template
subform, Default Value not guarded for Text Expression tests
2. Text Expression test value is editable - manual overrides silently
lost on re-evaluation
3. Single-line text expression inspection never evaluates the expression

Improvements:
1. Quality Inspection document teaching tips
2. Setup guide text

## Linked work

Fixes
[AB#634074](https://dynamicssmb2.visualstudio.com/1fcb79e7-ab07-432a-a3c6-6cf5a88ba4a5/_workitems/edit/634074)
Fixes
[AB#634080](https://dynamicssmb2.visualstudio.com/1fcb79e7-ab07-432a-a3c6-6cf5a88ba4a5/_workitems/edit/634080)
Fixes
[AB#634083](https://dynamicssmb2.visualstudio.com/1fcb79e7-ab07-432a-a3c6-6cf5a88ba4a5/_workitems/edit/634083)
Fixes
[AB#622439](https://dynamicssmb2.visualstudio.com/1fcb79e7-ab07-432a-a3c6-6cf5a88ba4a5/_workitems/edit/622439)
</commit_message>
<xml_diff>
--- a/src/Apps/W1/Quality Management/app/src/Reports/QltyCertificateOfAnalysis.docx
+++ b/src/Apps/W1/Quality Management/app/src/Reports/QltyCertificateOfAnalysis.docx
@@ -7904,13 +7904,13 @@
  
          < T o o l t i p   c o l u m n = " Q l t y I n s p e c t i o n _ R e s u l t _ C o d e "   E l e m e n t I d = " 1 8 0 7 0 7 7 0 6 5 " >   
-             < T o o l t i p T e x t   l a n g = " e n - U S " > S p e c i f i e s   t h e   r e s u l t   i s   a u t o m a t i c a l l y   d e t e r m i n e d   b a s e d   o n   t h e   t e s t   v a l u e   a n d   r e s u l t   c o n f i g u r a t i o n . < / T o o l t i p T e x t > +             < T o o l t i p T e x t   l a n g = " e n - U S " > S p e c i f i e s   t h e   r e s u l t   a u t o m a t i c a l l y   c a l c u l a t e d   f r o m   i n s p e c t i o n   t e s t   l i n e s   b a s e d   o n   t h e i r   e v a l u a t i o n   s e q u e n c e .   T h e   c a l c u l a t i o n   p r i o r i t i z e s   l i n e s   t h a t   f a i l e d   t h e   a c c e p t a b l e   q u a l i t y   l e v e l   a n d   t h e n   l i n e s   t h a t   h a v e   t h e   l o w e s t   e v a l u a t i o n   s e q u e n c e . < / T o o l t i p T e x t >   
          < / T o o l t i p >   
          < T o o l t i p   c o l u m n = " Q l t y I n s p e c t i o n _ R e s u l t _ D e s c r i p t i o n "   E l e m e n t I d = " 8 1 0 5 3 8 1 8 8 " >   
-             < T o o l t i p T e x t   l a n g = " e n - U S " > S p e c i f i e s   t h e   r e s u l t   d e s c r i p t i o n   f o r   t h i s   t e s t   r e s u l t .   T h e   r e s u l t   i s   a u t o m a t i c a l l y   d e t e r m i n e d   b a s e d   o n   t h e   t e s t   v a l u e   a n d   r e s u l t   c o n f i g u r a t i o n . < / T o o l t i p T e x t > +             < T o o l t i p T e x t   l a n g = " e n - U S " > S p e c i f i e s   t h e   d e s c r i p t i o n   o f   t h e   i n s p e c t i o n   r e s u l t .   T h i s   v a l u e   i s   a u t o m a t i c a l l y   r e t r i e v e d   f r o m   t h e   r e s u l t   d e f i n i t i o n   b a s e d   o n   t h e   R e s u l t   C o d e   f i e l d . < / T o o l t i p T e x t >   
          < / T o o l t i p >   
@@ -8078,13 +8078,13 @@
  
          < T o o l t i p   c o l u m n = " F i e l d _ T y p e "   E l e m e n t I d = " 1 3 2 8 1 6 4 0 1 6 " >   
-             < T o o l t i p T e x t   l a n g = " e n - U S " > S p e c i f i e s   t h e   d a t a   t y p e   o f   t h e   v a l u e s   y o u   c a n   e n t e r   o r   s e l e c t   f o r   t h i s   t e s t .   U s e   D e c i m a l   f o r   n u m e r i c a l   m e a s u r e m e n t s .   U s e   C h o i c e   t o   g i v e   a   l i s t   o f   o p t i o n s   t o   c h o o s e   f r o m .   I f   y o u   w a n t   t o   c h o o s e   o p t i o n s   f r o m   a n   e x i s t i n g   t a b l e ,   u s e   T a b l e   L o o k u p . < / T o o l t i p T e x t > +             < T o o l t i p T e x t   l a n g = " e n - U S " > S p e c i f i e s   t h e   d a t a   v a l u e   t y p e   o f   t h e   t e s t .   T h e   v a l u e   i s   a u t o m a t i c a l l y   r e t r i e v e d   f r o m   t h e   T e s t   V a l u e   T y p e   f i e l d   o n   t h e   t e s t   t e m p l a t e . < / T o o l t i p T e x t >   
          < / T o o l t i p >   
          < T o o l t i p   c o l u m n = " T e s t _ R e s u l t "   E l e m e n t I d = " 1 2 7 1 0 6 2 1 4 1 " >   
-             < T o o l t i p T e x t   l a n g = " e n - U S " > S p e c i f i e s   t h e   r e s u l t   i s   a u t o m a t i c a l l y   d e t e r m i n e d   b a s e d   o n   t h e   t e s t   v a l u e   a n d   r e s u l t   c o n f i g u r a t i o n . < / T o o l t i p T e x t > +             < T o o l t i p T e x t   l a n g = " e n - U S " > S p e c i f i e s   t h e   a u t o m a t i c a l l y   c a l c u l a t e d   r e s u l t   b a s e d   o n   t h e   e v a l u a t i o n   o f   t h e   a c t u a l   t e s t   v a l u e   a g a i n s t   t h e   d e f i n e d   r e s u l t   c o n d i t i o n s . < / T o o l t i p T e x t >   
          < / T o o l t i p >   

</xml_diff>

<commit_message>
Sync from NAV 7e783113db (#151)
</commit_message>
<xml_diff>
--- a/src/Apps/W1/Quality Management/app/src/Reports/QltyCertificateOfAnalysis.docx
+++ b/src/Apps/W1/Quality Management/app/src/Reports/QltyCertificateOfAnalysis.docx
@@ -7780,7 +7780,9 @@
 <b:Sources xmlns:b="http://schemas.openxmlformats.org/officeDocument/2006/bibliography" xmlns="http://schemas.openxmlformats.org/officeDocument/2006/bibliography" SelectedStyle="\APASixthEditionOfficeOnline.xsl" StyleName="APA" Version="6"/>
 </file>
 
-<file path=customXml/item3.xml>��< ? x m l   v e r s i o n = " 1 . 0 "   e n c o d i n g = " u t f - 1 6 " ? > < N a v W o r d R e p o r t X m l P a r t   x m l n s = " u r n : m i c r o s o f t - d y n a m i c s - b u s i n e s s c e n t r a l / i n t e r n a l / e x t e n d e d / r e p o r t s / Q l t y _ C e r t i f i c a t e _ o f _ A n a l y s i s / 2 0 4 0 1 / " > +<file path=customXml/item3.xml>��< ? x m l   v e r s i o n = " 1 . 0 "   e n c o d i n g = " u t f - 1 6 " ? > + 
+ < N a v W o r d R e p o r t X m l P a r t   x m l n s = " u r n : m i c r o s o f t - d y n a m i c s - b u s i n e s s c e n t r a l / i n t e r n a l / e x t e n d e d / r e p o r t s / Q l t y _ C e r t i f i c a t e _ o f _ A n a l y s i s / 2 0 4 0 1 / " >   
      < B C R e p o r t I n f o r m a t i o n >   
@@ -7902,13 +7904,13 @@
  
          < T o o l t i p   c o l u m n = " Q l t y I n s p e c t i o n _ R e s u l t _ C o d e "   E l e m e n t I d = " 1 8 0 7 0 7 7 0 6 5 " >   
-             < T o o l t i p T e x t   l a n g = " e n - U S " > S p e c i f i e s   t h e   r e s u l t   i s   a u t o m a t i c a l l y   d e t e r m i n e d   b a s e d   o n   t h e   t e s t   v a l u e   a n d   r e s u l t   c o n f i g u r a t i o n . < / T o o l t i p T e x t > +             < T o o l t i p T e x t   l a n g = " e n - U S " > S p e c i f i e s   t h e   r e s u l t   a u t o m a t i c a l l y   c a l c u l a t e d   f r o m   i n s p e c t i o n   t e s t   l i n e s   b a s e d   o n   t h e i r   e v a l u a t i o n   s e q u e n c e .   T h e   c a l c u l a t i o n   p r i o r i t i z e s   l i n e s   t h a t   f a i l e d   t h e   a c c e p t a b l e   q u a l i t y   l e v e l   a n d   t h e n   l i n e s   t h a t   h a v e   t h e   l o w e s t   e v a l u a t i o n   s e q u e n c e . < / T o o l t i p T e x t >   
          < / T o o l t i p >   
          < T o o l t i p   c o l u m n = " Q l t y I n s p e c t i o n _ R e s u l t _ D e s c r i p t i o n "   E l e m e n t I d = " 8 1 0 5 3 8 1 8 8 " >   
-             < T o o l t i p T e x t   l a n g = " e n - U S " > S p e c i f i e s   t h e   r e s u l t   d e s c r i p t i o n   f o r   t h i s   t e s t   r e s u l t .   T h e   r e s u l t   i s   a u t o m a t i c a l l y   d e t e r m i n e d   b a s e d   o n   t h e   t e s t   v a l u e   a n d   r e s u l t   c o n f i g u r a t i o n . < / T o o l t i p T e x t > +             < T o o l t i p T e x t   l a n g = " e n - U S " > S p e c i f i e s   t h e   d e s c r i p t i o n   o f   t h e   i n s p e c t i o n   r e s u l t .   T h i s   v a l u e   i s   a u t o m a t i c a l l y   r e t r i e v e d   f r o m   t h e   r e s u l t   d e f i n i t i o n   b a s e d   o n   t h e   R e s u l t   C o d e   f i e l d . < / T o o l t i p T e x t >   
          < / T o o l t i p >   
@@ -8076,13 +8078,13 @@
  
          < T o o l t i p   c o l u m n = " F i e l d _ T y p e "   E l e m e n t I d = " 1 3 2 8 1 6 4 0 1 6 " >   
-             < T o o l t i p T e x t   l a n g = " e n - U S " > S p e c i f i e s   t h e   d a t a   t y p e   o f   t h e   v a l u e s   y o u   c a n   e n t e r   o r   s e l e c t   f o r   t h i s   t e s t .   U s e   D e c i m a l   f o r   n u m e r i c a l   m e a s u r e m e n t s .   U s e   C h o i c e   t o   g i v e   a   l i s t   o f   o p t i o n s   t o   c h o o s e   f r o m .   I f   y o u   w a n t   t o   c h o o s e   o p t i o n s   f r o m   a n   e x i s t i n g   t a b l e ,   u s e   T a b l e   L o o k u p . < / T o o l t i p T e x t > +             < T o o l t i p T e x t   l a n g = " e n - U S " > S p e c i f i e s   t h e   d a t a   v a l u e   t y p e   o f   t h e   t e s t .   T h e   v a l u e   i s   a u t o m a t i c a l l y   r e t r i e v e d   f r o m   t h e   T e s t   V a l u e   T y p e   f i e l d   o n   t h e   t e s t   t e m p l a t e . < / T o o l t i p T e x t >   
          < / T o o l t i p >   
          < T o o l t i p   c o l u m n = " T e s t _ R e s u l t "   E l e m e n t I d = " 1 2 7 1 0 6 2 1 4 1 " >   
-             < T o o l t i p T e x t   l a n g = " e n - U S " > S p e c i f i e s   t h e   r e s u l t   i s   a u t o m a t i c a l l y   d e t e r m i n e d   b a s e d   o n   t h e   t e s t   v a l u e   a n d   r e s u l t   c o n f i g u r a t i o n . < / T o o l t i p T e x t > +             < T o o l t i p T e x t   l a n g = " e n - U S " > S p e c i f i e s   t h e   a u t o m a t i c a l l y   c a l c u l a t e d   r e s u l t   b a s e d   o n   t h e   e v a l u a t i o n   o f   t h e   a c t u a l   t e s t   v a l u e   a g a i n s t   t h e   d e f i n e d   r e s u l t   c o n d i t i o n s . < / T o o l t i p T e x t >   
          < / T o o l t i p >   
@@ -8130,7 +8132,7 @@
  
          < C o m p a n y I n f o r m a t i o n _ R o w 8   E l e m e n t T y p e = " C o l u m n "   E l e m e n t I d = " 3 9 8 9 1 0 6 3 7 "   D a t a T y p e = " T e x t " > C o m p a n y I n f o r m a t i o n _ R o w 8 < / C o m p a n y I n f o r m a t i o n _ R o w 8 >   
-         < C o m p a n y L o g o   E l e m e n t T y p e = " C o l u m n "   E l e m e n t I d = " 2 3 7 6 9 1 5 1 "   D a t a T y p e = " B l o b " / > +         < C o m p a n y L o g o   E l e m e n t T y p e = " C o l u m n "   E l e m e n t I d = " 2 3 7 6 9 1 5 1 "   D a t a T y p e = " B l o b "   / >   
          < E m a i l L a b e l   E l e m e n t T y p e = " C o l u m n "   E l e m e n t I d = " 7 7 1 8 8 7 1 3 5 "   D a t a T y p e = " T e x t " > E m a i l L a b e l < / E m a i l L a b e l >   
@@ -8154,7 +8156,7 @@
  
          < P h o n e N o V a l u e   E l e m e n t T y p e = " C o l u m n "   E l e m e n t I d = " 1 2 8 6 6 4 9 7 8 1 "   D a t a T y p e = " T e x t " > P h o n e N o V a l u e < / P h o n e N o V a l u e >   
-         < Q l t y I n s p e c t i o n T e m p l a t e _ D e s c r i p t i o n   E l e m e n t T y p e = " C o l u m n "   E l e m e n t I d = " 1 6 5 2 0 6 9 5 9 8 "   D a t a T y p e = " T e x t " > Q l t y I n s p e c t i o n T e m p l a t e _ D e s c r i p t i o n < / Q l t y I n s p e c t i o n T e m p l a t e _ D e s c r i p t i o n > +         < Q l t y I n s p e c t i o n T e m p l a t e _ D e s c r i p t i o n   E l e m e n t T y p e = " C o l u m n "   E l e m e n t I d = " 1 6 5 2 0 6 9 5 9 8 "   D a t a T y p e = " T e x t "   O b s o l e t e S t a t e = " P e n d i n g " > Q l t y I n s p e c t i o n T e m p l a t e _ D e s c r i p t i o n < / Q l t y I n s p e c t i o n T e m p l a t e _ D e s c r i p t i o n >   
          < Q l t y I n s p e c t i o n _ D e s c r i p t i o n   E l e m e n t T y p e = " C o l u m n "   E l e m e n t I d = " 7 3 9 0 1 9 9 1 0 "   D a t a T y p e = " T e x t " > Q l t y I n s p e c t i o n _ D e s c r i p t i o n < / Q l t y I n s p e c t i o n _ D e s c r i p t i o n >   

</xml_diff>